<commit_message>
docs(security): the passive scans run - SSL Labs A+, Mozilla Observatory B (75)
Chapter 4 4.4.8 waited on the external scans. Two were run on 30 September
00:04-00:10 against hivelet.vercel.app, both passive (they read what a
browser reads): SSL Labs A+ (TLS 1.2 and 1.3 only, HSTS; one of Vercel's two
addresses graded A with HSTS not seen), Mozilla HTTP Observatory B, 75/100,
11 of 12 tests. The one failure is the report-only Content Security Policy,
kept that way on purpose (B-84); enforcing it as written would also block
the Google Maps embed, whose frame the policy does not allow.

Filled in 4.4.8 with tool, date and result, the other two scans left pending
for the team; S-01 and S-03 say what to expect; audit F-5 carries the detail.
Word file rebuilt.

Co-Authored-By: Claude Opus 5.5 <noreply@anthropic.com>
</commit_message>
<xml_diff>
--- a/docs/FINAL MANUSCRIPT/CHAPTER_4_RESULTS_AND_DISCUSSION.docx
+++ b/docs/FINAL MANUSCRIPT/CHAPTER_4_RESULTS_AND_DISCUSSION.docx
@@ -29423,17 +29423,17 @@
           <w:sz w:val="24"/>
           <w:szCs w:val="24"/>
         </w:rPr>
-        <w:t xml:space="preserve">[DATA PENDING: if the team runs the external security scans in </w:t>
+        <w:t xml:space="preserve">Two passive external scans, which read the public site the way a browser does, were run on 30 September 2026 as supporting evidence. </w:t>
       </w:r>
       <w:r>
         <w:rPr>
-          <w:rFonts w:ascii="Courier New" w:cs="Courier New" w:eastAsia="Courier New" w:hAnsi="Courier New"/>
-          <w:b w:val="false"/>
-          <w:bCs w:val="false"/>
-          <w:sz w:val="22"/>
-          <w:szCs w:val="22"/>
+          <w:rFonts w:ascii="Arial" w:cs="Arial" w:eastAsia="Arial" w:hAnsi="Arial"/>
+          <w:b/>
+          <w:bCs/>
+          <w:sz w:val="24"/>
+          <w:szCs w:val="24"/>
         </w:rPr>
-        <w:t xml:space="preserve">TEAM_TASKS_WE_DO_OURSELVES.md</w:t>
+        <w:t xml:space="preserve">Qualys SSL Labs graded the HTTPS setup A+</w:t>
       </w:r>
       <w:r>
         <w:rPr>
@@ -29443,7 +29443,27 @@
           <w:sz w:val="24"/>
           <w:szCs w:val="24"/>
         </w:rPr>
-        <w:t xml:space="preserve">, report their grades here as supporting evidence, with the date and tool name.]</w:t>
+        <w:t xml:space="preserve"> (TLS 1.2 and 1.3 only, HSTS present; one of the host's two addresses graded A because HSTS was not seen on it during the scan). </w:t>
+      </w:r>
+      <w:r>
+        <w:rPr>
+          <w:rFonts w:ascii="Arial" w:cs="Arial" w:eastAsia="Arial" w:hAnsi="Arial"/>
+          <w:b/>
+          <w:bCs/>
+          <w:sz w:val="24"/>
+          <w:szCs w:val="24"/>
+        </w:rPr>
+        <w:t xml:space="preserve">Mozilla HTTP Observatory graded the security headers B, 75 of 100, with 11 of 12 tests passed.</w:t>
+      </w:r>
+      <w:r>
+        <w:rPr>
+          <w:rFonts w:ascii="Arial" w:cs="Arial" w:eastAsia="Arial" w:hAnsi="Arial"/>
+          <w:b w:val="false"/>
+          <w:bCs w:val="false"/>
+          <w:sz w:val="24"/>
+          <w:szCs w:val="24"/>
+        </w:rPr>
+        <w:t xml:space="preserve"> The one failure is deliberate: the Content Security Policy is declared in report-only mode, which records what it would block without blocking it. Enforcing it as written would also block the map on the public page and has not yet been tried against a payment, so it was left for after the pilot (Chapter 5, recommendation 9). [DATA PENDING: securityheaders.com grade and PageSpeed Insights scores from the team's runs, with dates.]</w:t>
       </w:r>
     </w:p>
     <w:p>

</xml_diff>

<commit_message>
docs: Lighthouse before and after the layout fix, in the audit, Chapters 4 and 5
Lighthouse 12.8, three runs each on the live landing page (PageSpeed's
shared quota was spent): accessibility, best practices and SEO 100 on phone
and computer throughout. Desktop performance 76 -> 95 and CLS 0.50 -> 0 once
the fix was live. Mobile stays about 70: the main text waits ~5 s on a
simulated slow phone because the page is drawn by its JavaScript; the levers
(pre-render, non-blocking font CSS, smaller photos for phones) change
delivery and were not pulled the night before real users test. Chapter 5
gains recommendation 11 for them and recommendation 9 now names the map the
enforced CSP would block; the list is renumbered and every citation checked.

Co-Authored-By: Claude Opus 5.5 <noreply@anthropic.com>
</commit_message>
<xml_diff>
--- a/docs/FINAL MANUSCRIPT/CHAPTER_4_RESULTS_AND_DISCUSSION.docx
+++ b/docs/FINAL MANUSCRIPT/CHAPTER_4_RESULTS_AND_DISCUSSION.docx
@@ -14248,6 +14248,23 @@
     </w:p>
     <w:p>
       <w:pPr>
+        <w:spacing w:after="0" w:before="0" w:line="480" w:lineRule="auto"/>
+        <w:ind w:firstLine="720"/>
+        <w:jc w:val="both"/>
+      </w:pPr>
+      <w:r>
+        <w:rPr>
+          <w:rFonts w:ascii="Arial" w:cs="Arial" w:eastAsia="Arial" w:hAnsi="Arial"/>
+          <w:b w:val="false"/>
+          <w:bCs w:val="false"/>
+          <w:sz w:val="24"/>
+          <w:szCs w:val="24"/>
+        </w:rPr>
+        <w:t xml:space="preserve">Google Lighthouse (version 12.8, run on the same laptop against the live public page, three runs each, median reported) scored accessibility, best practices and search optimization 100 on both a simulated phone and a computer. It also found the page jumping as it loaded: the footer appeared on an empty page and was pushed down when the page's content arrived, a layout shift of 0.50 where 0.1 is the limit for "good", which held the computer performance score at 76. The space the page needs is now held until it loads; after the change the live page measured a layout shift of 0 and a computer performance score of 95. On the simulated slow phone the score stayed about 70, because the page's main text appears only after its code has arrived and run, about five seconds on that connection (Chapter 5, recommendation 11). The real-device timings in Table 11 are the measurement that decides how fast the system is for the owner and tenants.</w:t>
+      </w:r>
+    </w:p>
+    <w:p>
+      <w:pPr>
         <w:spacing w:after="120" w:before="240" w:line="480" w:lineRule="auto"/>
         <w:jc w:val="left"/>
       </w:pPr>
@@ -33112,7 +33129,7 @@
         </w:trPr>
         <w:tc>
           <w:tcPr>
-            <w:tcW w:type="dxa" w:w="1572"/>
+            <w:tcW w:type="dxa" w:w="1545"/>
             <w:tcBorders>
               <w:top w:val="single" w:color="1A202C" w:sz="12"/>
               <w:left w:val="none" w:color="auto" w:sz="0"/>
@@ -33146,7 +33163,7 @@
         </w:tc>
         <w:tc>
           <w:tcPr>
-            <w:tcW w:type="dxa" w:w="2812"/>
+            <w:tcW w:type="dxa" w:w="2893"/>
             <w:tcBorders>
               <w:top w:val="single" w:color="1A202C" w:sz="12"/>
               <w:left w:val="none" w:color="auto" w:sz="0"/>
@@ -33180,7 +33197,7 @@
         </w:tc>
         <w:tc>
           <w:tcPr>
-            <w:tcW w:type="dxa" w:w="2830"/>
+            <w:tcW w:type="dxa" w:w="2792"/>
             <w:tcBorders>
               <w:top w:val="single" w:color="1A202C" w:sz="12"/>
               <w:left w:val="none" w:color="auto" w:sz="0"/>
@@ -33214,7 +33231,7 @@
         </w:tc>
         <w:tc>
           <w:tcPr>
-            <w:tcW w:type="dxa" w:w="1426"/>
+            <w:tcW w:type="dxa" w:w="1410"/>
             <w:tcBorders>
               <w:top w:val="single" w:color="1A202C" w:sz="12"/>
               <w:left w:val="none" w:color="auto" w:sz="0"/>
@@ -33253,7 +33270,7 @@
         </w:trPr>
         <w:tc>
           <w:tcPr>
-            <w:tcW w:type="dxa" w:w="1572"/>
+            <w:tcW w:type="dxa" w:w="1545"/>
             <w:tcBorders>
               <w:top w:val="single" w:color="E2E8F0" w:sz="4"/>
               <w:left w:val="none" w:color="auto" w:sz="0"/>
@@ -33286,7 +33303,7 @@
         </w:tc>
         <w:tc>
           <w:tcPr>
-            <w:tcW w:type="dxa" w:w="2812"/>
+            <w:tcW w:type="dxa" w:w="2893"/>
             <w:tcBorders>
               <w:top w:val="single" w:color="E2E8F0" w:sz="4"/>
               <w:left w:val="none" w:color="auto" w:sz="0"/>
@@ -33319,7 +33336,7 @@
         </w:tc>
         <w:tc>
           <w:tcPr>
-            <w:tcW w:type="dxa" w:w="2830"/>
+            <w:tcW w:type="dxa" w:w="2792"/>
             <w:tcBorders>
               <w:top w:val="single" w:color="E2E8F0" w:sz="4"/>
               <w:left w:val="none" w:color="auto" w:sz="0"/>
@@ -33352,7 +33369,7 @@
         </w:tc>
         <w:tc>
           <w:tcPr>
-            <w:tcW w:type="dxa" w:w="1426"/>
+            <w:tcW w:type="dxa" w:w="1410"/>
             <w:tcBorders>
               <w:top w:val="single" w:color="E2E8F0" w:sz="4"/>
               <w:left w:val="none" w:color="auto" w:sz="0"/>
@@ -33390,7 +33407,7 @@
         </w:trPr>
         <w:tc>
           <w:tcPr>
-            <w:tcW w:type="dxa" w:w="1572"/>
+            <w:tcW w:type="dxa" w:w="1545"/>
             <w:tcBorders>
               <w:top w:val="single" w:color="E2E8F0" w:sz="4"/>
               <w:left w:val="none" w:color="auto" w:sz="0"/>
@@ -33423,7 +33440,7 @@
         </w:tc>
         <w:tc>
           <w:tcPr>
-            <w:tcW w:type="dxa" w:w="2812"/>
+            <w:tcW w:type="dxa" w:w="2893"/>
             <w:tcBorders>
               <w:top w:val="single" w:color="E2E8F0" w:sz="4"/>
               <w:left w:val="none" w:color="auto" w:sz="0"/>
@@ -33456,7 +33473,7 @@
         </w:tc>
         <w:tc>
           <w:tcPr>
-            <w:tcW w:type="dxa" w:w="2830"/>
+            <w:tcW w:type="dxa" w:w="2792"/>
             <w:tcBorders>
               <w:top w:val="single" w:color="E2E8F0" w:sz="4"/>
               <w:left w:val="none" w:color="auto" w:sz="0"/>
@@ -33489,7 +33506,7 @@
         </w:tc>
         <w:tc>
           <w:tcPr>
-            <w:tcW w:type="dxa" w:w="1426"/>
+            <w:tcW w:type="dxa" w:w="1410"/>
             <w:tcBorders>
               <w:top w:val="single" w:color="E2E8F0" w:sz="4"/>
               <w:left w:val="none" w:color="auto" w:sz="0"/>
@@ -33527,7 +33544,7 @@
         </w:trPr>
         <w:tc>
           <w:tcPr>
-            <w:tcW w:type="dxa" w:w="1572"/>
+            <w:tcW w:type="dxa" w:w="1545"/>
             <w:tcBorders>
               <w:top w:val="single" w:color="E2E8F0" w:sz="4"/>
               <w:left w:val="none" w:color="auto" w:sz="0"/>
@@ -33560,7 +33577,7 @@
         </w:tc>
         <w:tc>
           <w:tcPr>
-            <w:tcW w:type="dxa" w:w="2812"/>
+            <w:tcW w:type="dxa" w:w="2893"/>
             <w:tcBorders>
               <w:top w:val="single" w:color="E2E8F0" w:sz="4"/>
               <w:left w:val="none" w:color="auto" w:sz="0"/>
@@ -33593,7 +33610,7 @@
         </w:tc>
         <w:tc>
           <w:tcPr>
-            <w:tcW w:type="dxa" w:w="2830"/>
+            <w:tcW w:type="dxa" w:w="2792"/>
             <w:tcBorders>
               <w:top w:val="single" w:color="E2E8F0" w:sz="4"/>
               <w:left w:val="none" w:color="auto" w:sz="0"/>
@@ -33626,7 +33643,7 @@
         </w:tc>
         <w:tc>
           <w:tcPr>
-            <w:tcW w:type="dxa" w:w="1426"/>
+            <w:tcW w:type="dxa" w:w="1410"/>
             <w:tcBorders>
               <w:top w:val="single" w:color="E2E8F0" w:sz="4"/>
               <w:left w:val="none" w:color="auto" w:sz="0"/>
@@ -33664,7 +33681,7 @@
         </w:trPr>
         <w:tc>
           <w:tcPr>
-            <w:tcW w:type="dxa" w:w="1572"/>
+            <w:tcW w:type="dxa" w:w="1545"/>
             <w:tcBorders>
               <w:top w:val="single" w:color="E2E8F0" w:sz="4"/>
               <w:left w:val="none" w:color="auto" w:sz="0"/>
@@ -33697,7 +33714,7 @@
         </w:tc>
         <w:tc>
           <w:tcPr>
-            <w:tcW w:type="dxa" w:w="2812"/>
+            <w:tcW w:type="dxa" w:w="2893"/>
             <w:tcBorders>
               <w:top w:val="single" w:color="E2E8F0" w:sz="4"/>
               <w:left w:val="none" w:color="auto" w:sz="0"/>
@@ -33730,7 +33747,7 @@
         </w:tc>
         <w:tc>
           <w:tcPr>
-            <w:tcW w:type="dxa" w:w="2830"/>
+            <w:tcW w:type="dxa" w:w="2792"/>
             <w:tcBorders>
               <w:top w:val="single" w:color="E2E8F0" w:sz="4"/>
               <w:left w:val="none" w:color="auto" w:sz="0"/>
@@ -33763,7 +33780,7 @@
         </w:tc>
         <w:tc>
           <w:tcPr>
-            <w:tcW w:type="dxa" w:w="1426"/>
+            <w:tcW w:type="dxa" w:w="1410"/>
             <w:tcBorders>
               <w:top w:val="single" w:color="E2E8F0" w:sz="4"/>
               <w:left w:val="none" w:color="auto" w:sz="0"/>
@@ -33801,7 +33818,7 @@
         </w:trPr>
         <w:tc>
           <w:tcPr>
-            <w:tcW w:type="dxa" w:w="1572"/>
+            <w:tcW w:type="dxa" w:w="1545"/>
             <w:tcBorders>
               <w:top w:val="single" w:color="E2E8F0" w:sz="4"/>
               <w:left w:val="none" w:color="auto" w:sz="0"/>
@@ -33834,7 +33851,7 @@
         </w:tc>
         <w:tc>
           <w:tcPr>
-            <w:tcW w:type="dxa" w:w="2812"/>
+            <w:tcW w:type="dxa" w:w="2893"/>
             <w:tcBorders>
               <w:top w:val="single" w:color="E2E8F0" w:sz="4"/>
               <w:left w:val="none" w:color="auto" w:sz="0"/>
@@ -33867,7 +33884,7 @@
         </w:tc>
         <w:tc>
           <w:tcPr>
-            <w:tcW w:type="dxa" w:w="2830"/>
+            <w:tcW w:type="dxa" w:w="2792"/>
             <w:tcBorders>
               <w:top w:val="single" w:color="E2E8F0" w:sz="4"/>
               <w:left w:val="none" w:color="auto" w:sz="0"/>
@@ -33900,7 +33917,7 @@
         </w:tc>
         <w:tc>
           <w:tcPr>
-            <w:tcW w:type="dxa" w:w="1426"/>
+            <w:tcW w:type="dxa" w:w="1410"/>
             <w:tcBorders>
               <w:top w:val="single" w:color="E2E8F0" w:sz="4"/>
               <w:left w:val="none" w:color="auto" w:sz="0"/>
@@ -33938,7 +33955,7 @@
         </w:trPr>
         <w:tc>
           <w:tcPr>
-            <w:tcW w:type="dxa" w:w="1572"/>
+            <w:tcW w:type="dxa" w:w="1545"/>
             <w:tcBorders>
               <w:top w:val="single" w:color="E2E8F0" w:sz="4"/>
               <w:left w:val="none" w:color="auto" w:sz="0"/>
@@ -33971,7 +33988,7 @@
         </w:tc>
         <w:tc>
           <w:tcPr>
-            <w:tcW w:type="dxa" w:w="2812"/>
+            <w:tcW w:type="dxa" w:w="2893"/>
             <w:tcBorders>
               <w:top w:val="single" w:color="E2E8F0" w:sz="4"/>
               <w:left w:val="none" w:color="auto" w:sz="0"/>
@@ -34004,7 +34021,7 @@
         </w:tc>
         <w:tc>
           <w:tcPr>
-            <w:tcW w:type="dxa" w:w="2830"/>
+            <w:tcW w:type="dxa" w:w="2792"/>
             <w:tcBorders>
               <w:top w:val="single" w:color="E2E8F0" w:sz="4"/>
               <w:left w:val="none" w:color="auto" w:sz="0"/>
@@ -34037,7 +34054,7 @@
         </w:tc>
         <w:tc>
           <w:tcPr>
-            <w:tcW w:type="dxa" w:w="1426"/>
+            <w:tcW w:type="dxa" w:w="1410"/>
             <w:tcBorders>
               <w:top w:val="single" w:color="E2E8F0" w:sz="4"/>
               <w:left w:val="none" w:color="auto" w:sz="0"/>
@@ -34075,7 +34092,7 @@
         </w:trPr>
         <w:tc>
           <w:tcPr>
-            <w:tcW w:type="dxa" w:w="1572"/>
+            <w:tcW w:type="dxa" w:w="1545"/>
             <w:tcBorders>
               <w:top w:val="single" w:color="E2E8F0" w:sz="4"/>
               <w:left w:val="none" w:color="auto" w:sz="0"/>
@@ -34108,7 +34125,7 @@
         </w:tc>
         <w:tc>
           <w:tcPr>
-            <w:tcW w:type="dxa" w:w="2812"/>
+            <w:tcW w:type="dxa" w:w="2893"/>
             <w:tcBorders>
               <w:top w:val="single" w:color="E2E8F0" w:sz="4"/>
               <w:left w:val="none" w:color="auto" w:sz="0"/>
@@ -34141,7 +34158,7 @@
         </w:tc>
         <w:tc>
           <w:tcPr>
-            <w:tcW w:type="dxa" w:w="2830"/>
+            <w:tcW w:type="dxa" w:w="2792"/>
             <w:tcBorders>
               <w:top w:val="single" w:color="E2E8F0" w:sz="4"/>
               <w:left w:val="none" w:color="auto" w:sz="0"/>
@@ -34174,7 +34191,7 @@
         </w:tc>
         <w:tc>
           <w:tcPr>
-            <w:tcW w:type="dxa" w:w="1426"/>
+            <w:tcW w:type="dxa" w:w="1410"/>
             <w:tcBorders>
               <w:top w:val="single" w:color="E2E8F0" w:sz="4"/>
               <w:left w:val="none" w:color="auto" w:sz="0"/>
@@ -34212,7 +34229,7 @@
         </w:trPr>
         <w:tc>
           <w:tcPr>
-            <w:tcW w:type="dxa" w:w="1572"/>
+            <w:tcW w:type="dxa" w:w="1545"/>
             <w:tcBorders>
               <w:top w:val="single" w:color="E2E8F0" w:sz="4"/>
               <w:left w:val="none" w:color="auto" w:sz="0"/>
@@ -34245,7 +34262,7 @@
         </w:tc>
         <w:tc>
           <w:tcPr>
-            <w:tcW w:type="dxa" w:w="2812"/>
+            <w:tcW w:type="dxa" w:w="2893"/>
             <w:tcBorders>
               <w:top w:val="single" w:color="E2E8F0" w:sz="4"/>
               <w:left w:val="none" w:color="auto" w:sz="0"/>
@@ -34278,7 +34295,7 @@
         </w:tc>
         <w:tc>
           <w:tcPr>
-            <w:tcW w:type="dxa" w:w="2830"/>
+            <w:tcW w:type="dxa" w:w="2792"/>
             <w:tcBorders>
               <w:top w:val="single" w:color="E2E8F0" w:sz="4"/>
               <w:left w:val="none" w:color="auto" w:sz="0"/>
@@ -34311,7 +34328,7 @@
         </w:tc>
         <w:tc>
           <w:tcPr>
-            <w:tcW w:type="dxa" w:w="1426"/>
+            <w:tcW w:type="dxa" w:w="1410"/>
             <w:tcBorders>
               <w:top w:val="single" w:color="E2E8F0" w:sz="4"/>
               <w:left w:val="none" w:color="auto" w:sz="0"/>
@@ -34349,7 +34366,7 @@
         </w:trPr>
         <w:tc>
           <w:tcPr>
-            <w:tcW w:type="dxa" w:w="1572"/>
+            <w:tcW w:type="dxa" w:w="1545"/>
             <w:tcBorders>
               <w:top w:val="single" w:color="E2E8F0" w:sz="4"/>
               <w:left w:val="none" w:color="auto" w:sz="0"/>
@@ -34382,7 +34399,7 @@
         </w:tc>
         <w:tc>
           <w:tcPr>
-            <w:tcW w:type="dxa" w:w="2812"/>
+            <w:tcW w:type="dxa" w:w="2893"/>
             <w:tcBorders>
               <w:top w:val="single" w:color="E2E8F0" w:sz="4"/>
               <w:left w:val="none" w:color="auto" w:sz="0"/>
@@ -34415,7 +34432,7 @@
         </w:tc>
         <w:tc>
           <w:tcPr>
-            <w:tcW w:type="dxa" w:w="2830"/>
+            <w:tcW w:type="dxa" w:w="2792"/>
             <w:tcBorders>
               <w:top w:val="single" w:color="E2E8F0" w:sz="4"/>
               <w:left w:val="none" w:color="auto" w:sz="0"/>
@@ -34448,7 +34465,7 @@
         </w:tc>
         <w:tc>
           <w:tcPr>
-            <w:tcW w:type="dxa" w:w="1426"/>
+            <w:tcW w:type="dxa" w:w="1410"/>
             <w:tcBorders>
               <w:top w:val="single" w:color="E2E8F0" w:sz="4"/>
               <w:left w:val="none" w:color="auto" w:sz="0"/>
@@ -34486,7 +34503,7 @@
         </w:trPr>
         <w:tc>
           <w:tcPr>
-            <w:tcW w:type="dxa" w:w="1572"/>
+            <w:tcW w:type="dxa" w:w="1545"/>
             <w:tcBorders>
               <w:top w:val="single" w:color="E2E8F0" w:sz="4"/>
               <w:left w:val="none" w:color="auto" w:sz="0"/>
@@ -34519,7 +34536,7 @@
         </w:tc>
         <w:tc>
           <w:tcPr>
-            <w:tcW w:type="dxa" w:w="2812"/>
+            <w:tcW w:type="dxa" w:w="2893"/>
             <w:tcBorders>
               <w:top w:val="single" w:color="E2E8F0" w:sz="4"/>
               <w:left w:val="none" w:color="auto" w:sz="0"/>
@@ -34552,7 +34569,7 @@
         </w:tc>
         <w:tc>
           <w:tcPr>
-            <w:tcW w:type="dxa" w:w="2830"/>
+            <w:tcW w:type="dxa" w:w="2792"/>
             <w:tcBorders>
               <w:top w:val="single" w:color="E2E8F0" w:sz="4"/>
               <w:left w:val="none" w:color="auto" w:sz="0"/>
@@ -34585,7 +34602,7 @@
         </w:tc>
         <w:tc>
           <w:tcPr>
-            <w:tcW w:type="dxa" w:w="1426"/>
+            <w:tcW w:type="dxa" w:w="1410"/>
             <w:tcBorders>
               <w:top w:val="single" w:color="E2E8F0" w:sz="4"/>
               <w:left w:val="none" w:color="auto" w:sz="0"/>
@@ -34623,7 +34640,7 @@
         </w:trPr>
         <w:tc>
           <w:tcPr>
-            <w:tcW w:type="dxa" w:w="1572"/>
+            <w:tcW w:type="dxa" w:w="1545"/>
             <w:tcBorders>
               <w:top w:val="single" w:color="E2E8F0" w:sz="4"/>
               <w:left w:val="none" w:color="auto" w:sz="0"/>
@@ -34656,7 +34673,7 @@
         </w:tc>
         <w:tc>
           <w:tcPr>
-            <w:tcW w:type="dxa" w:w="2812"/>
+            <w:tcW w:type="dxa" w:w="2893"/>
             <w:tcBorders>
               <w:top w:val="single" w:color="E2E8F0" w:sz="4"/>
               <w:left w:val="none" w:color="auto" w:sz="0"/>
@@ -34689,7 +34706,7 @@
         </w:tc>
         <w:tc>
           <w:tcPr>
-            <w:tcW w:type="dxa" w:w="2830"/>
+            <w:tcW w:type="dxa" w:w="2792"/>
             <w:tcBorders>
               <w:top w:val="single" w:color="E2E8F0" w:sz="4"/>
               <w:left w:val="none" w:color="auto" w:sz="0"/>
@@ -34722,7 +34739,7 @@
         </w:tc>
         <w:tc>
           <w:tcPr>
-            <w:tcW w:type="dxa" w:w="1426"/>
+            <w:tcW w:type="dxa" w:w="1410"/>
             <w:tcBorders>
               <w:top w:val="single" w:color="E2E8F0" w:sz="4"/>
               <w:left w:val="none" w:color="auto" w:sz="0"/>
@@ -34760,7 +34777,7 @@
         </w:trPr>
         <w:tc>
           <w:tcPr>
-            <w:tcW w:type="dxa" w:w="1572"/>
+            <w:tcW w:type="dxa" w:w="1545"/>
             <w:tcBorders>
               <w:top w:val="single" w:color="E2E8F0" w:sz="4"/>
               <w:left w:val="none" w:color="auto" w:sz="0"/>
@@ -34793,7 +34810,7 @@
         </w:tc>
         <w:tc>
           <w:tcPr>
-            <w:tcW w:type="dxa" w:w="2812"/>
+            <w:tcW w:type="dxa" w:w="2893"/>
             <w:tcBorders>
               <w:top w:val="single" w:color="E2E8F0" w:sz="4"/>
               <w:left w:val="none" w:color="auto" w:sz="0"/>
@@ -34826,7 +34843,7 @@
         </w:tc>
         <w:tc>
           <w:tcPr>
-            <w:tcW w:type="dxa" w:w="2830"/>
+            <w:tcW w:type="dxa" w:w="2792"/>
             <w:tcBorders>
               <w:top w:val="single" w:color="E2E8F0" w:sz="4"/>
               <w:left w:val="none" w:color="auto" w:sz="0"/>
@@ -34859,7 +34876,7 @@
         </w:tc>
         <w:tc>
           <w:tcPr>
-            <w:tcW w:type="dxa" w:w="1426"/>
+            <w:tcW w:type="dxa" w:w="1410"/>
             <w:tcBorders>
               <w:top w:val="single" w:color="E2E8F0" w:sz="4"/>
               <w:left w:val="none" w:color="auto" w:sz="0"/>
@@ -34897,7 +34914,7 @@
         </w:trPr>
         <w:tc>
           <w:tcPr>
-            <w:tcW w:type="dxa" w:w="1572"/>
+            <w:tcW w:type="dxa" w:w="1545"/>
             <w:tcBorders>
               <w:top w:val="single" w:color="E2E8F0" w:sz="4"/>
               <w:left w:val="none" w:color="auto" w:sz="0"/>
@@ -34930,7 +34947,7 @@
         </w:tc>
         <w:tc>
           <w:tcPr>
-            <w:tcW w:type="dxa" w:w="2812"/>
+            <w:tcW w:type="dxa" w:w="2893"/>
             <w:tcBorders>
               <w:top w:val="single" w:color="E2E8F0" w:sz="4"/>
               <w:left w:val="none" w:color="auto" w:sz="0"/>
@@ -34963,7 +34980,7 @@
         </w:tc>
         <w:tc>
           <w:tcPr>
-            <w:tcW w:type="dxa" w:w="2830"/>
+            <w:tcW w:type="dxa" w:w="2792"/>
             <w:tcBorders>
               <w:top w:val="single" w:color="E2E8F0" w:sz="4"/>
               <w:left w:val="none" w:color="auto" w:sz="0"/>
@@ -34996,7 +35013,7 @@
         </w:tc>
         <w:tc>
           <w:tcPr>
-            <w:tcW w:type="dxa" w:w="1426"/>
+            <w:tcW w:type="dxa" w:w="1410"/>
             <w:tcBorders>
               <w:top w:val="single" w:color="E2E8F0" w:sz="4"/>
               <w:left w:val="none" w:color="auto" w:sz="0"/>
@@ -35034,7 +35051,7 @@
         </w:trPr>
         <w:tc>
           <w:tcPr>
-            <w:tcW w:type="dxa" w:w="1572"/>
+            <w:tcW w:type="dxa" w:w="1545"/>
             <w:tcBorders>
               <w:top w:val="single" w:color="E2E8F0" w:sz="4"/>
               <w:left w:val="none" w:color="auto" w:sz="0"/>
@@ -35067,7 +35084,7 @@
         </w:tc>
         <w:tc>
           <w:tcPr>
-            <w:tcW w:type="dxa" w:w="2812"/>
+            <w:tcW w:type="dxa" w:w="2893"/>
             <w:tcBorders>
               <w:top w:val="single" w:color="E2E8F0" w:sz="4"/>
               <w:left w:val="none" w:color="auto" w:sz="0"/>
@@ -35100,7 +35117,7 @@
         </w:tc>
         <w:tc>
           <w:tcPr>
-            <w:tcW w:type="dxa" w:w="2830"/>
+            <w:tcW w:type="dxa" w:w="2792"/>
             <w:tcBorders>
               <w:top w:val="single" w:color="E2E8F0" w:sz="4"/>
               <w:left w:val="none" w:color="auto" w:sz="0"/>
@@ -35133,7 +35150,7 @@
         </w:tc>
         <w:tc>
           <w:tcPr>
-            <w:tcW w:type="dxa" w:w="1426"/>
+            <w:tcW w:type="dxa" w:w="1410"/>
             <w:tcBorders>
               <w:top w:val="single" w:color="E2E8F0" w:sz="4"/>
               <w:left w:val="none" w:color="auto" w:sz="0"/>
@@ -35171,7 +35188,7 @@
         </w:trPr>
         <w:tc>
           <w:tcPr>
-            <w:tcW w:type="dxa" w:w="1572"/>
+            <w:tcW w:type="dxa" w:w="1545"/>
             <w:tcBorders>
               <w:top w:val="single" w:color="E2E8F0" w:sz="4"/>
               <w:left w:val="none" w:color="auto" w:sz="0"/>
@@ -35204,7 +35221,7 @@
         </w:tc>
         <w:tc>
           <w:tcPr>
-            <w:tcW w:type="dxa" w:w="2812"/>
+            <w:tcW w:type="dxa" w:w="2893"/>
             <w:tcBorders>
               <w:top w:val="single" w:color="E2E8F0" w:sz="4"/>
               <w:left w:val="none" w:color="auto" w:sz="0"/>
@@ -35237,7 +35254,7 @@
         </w:tc>
         <w:tc>
           <w:tcPr>
-            <w:tcW w:type="dxa" w:w="2830"/>
+            <w:tcW w:type="dxa" w:w="2792"/>
             <w:tcBorders>
               <w:top w:val="single" w:color="E2E8F0" w:sz="4"/>
               <w:left w:val="none" w:color="auto" w:sz="0"/>
@@ -35270,7 +35287,7 @@
         </w:tc>
         <w:tc>
           <w:tcPr>
-            <w:tcW w:type="dxa" w:w="1426"/>
+            <w:tcW w:type="dxa" w:w="1410"/>
             <w:tcBorders>
               <w:top w:val="single" w:color="E2E8F0" w:sz="4"/>
               <w:left w:val="none" w:color="auto" w:sz="0"/>
@@ -35308,7 +35325,7 @@
         </w:trPr>
         <w:tc>
           <w:tcPr>
-            <w:tcW w:type="dxa" w:w="1572"/>
+            <w:tcW w:type="dxa" w:w="1545"/>
             <w:tcBorders>
               <w:top w:val="single" w:color="E2E8F0" w:sz="4"/>
               <w:left w:val="none" w:color="auto" w:sz="0"/>
@@ -35341,7 +35358,7 @@
         </w:tc>
         <w:tc>
           <w:tcPr>
-            <w:tcW w:type="dxa" w:w="2812"/>
+            <w:tcW w:type="dxa" w:w="2893"/>
             <w:tcBorders>
               <w:top w:val="single" w:color="E2E8F0" w:sz="4"/>
               <w:left w:val="none" w:color="auto" w:sz="0"/>
@@ -35374,7 +35391,7 @@
         </w:tc>
         <w:tc>
           <w:tcPr>
-            <w:tcW w:type="dxa" w:w="2830"/>
+            <w:tcW w:type="dxa" w:w="2792"/>
             <w:tcBorders>
               <w:top w:val="single" w:color="E2E8F0" w:sz="4"/>
               <w:left w:val="none" w:color="auto" w:sz="0"/>
@@ -35407,7 +35424,7 @@
         </w:tc>
         <w:tc>
           <w:tcPr>
-            <w:tcW w:type="dxa" w:w="1426"/>
+            <w:tcW w:type="dxa" w:w="1410"/>
             <w:tcBorders>
               <w:top w:val="single" w:color="E2E8F0" w:sz="4"/>
               <w:left w:val="none" w:color="auto" w:sz="0"/>
@@ -35445,7 +35462,7 @@
         </w:trPr>
         <w:tc>
           <w:tcPr>
-            <w:tcW w:type="dxa" w:w="1572"/>
+            <w:tcW w:type="dxa" w:w="1545"/>
             <w:tcBorders>
               <w:top w:val="single" w:color="E2E8F0" w:sz="4"/>
               <w:left w:val="none" w:color="auto" w:sz="0"/>
@@ -35478,7 +35495,7 @@
         </w:tc>
         <w:tc>
           <w:tcPr>
-            <w:tcW w:type="dxa" w:w="2812"/>
+            <w:tcW w:type="dxa" w:w="2893"/>
             <w:tcBorders>
               <w:top w:val="single" w:color="E2E8F0" w:sz="4"/>
               <w:left w:val="none" w:color="auto" w:sz="0"/>
@@ -35511,7 +35528,7 @@
         </w:tc>
         <w:tc>
           <w:tcPr>
-            <w:tcW w:type="dxa" w:w="2830"/>
+            <w:tcW w:type="dxa" w:w="2792"/>
             <w:tcBorders>
               <w:top w:val="single" w:color="E2E8F0" w:sz="4"/>
               <w:left w:val="none" w:color="auto" w:sz="0"/>
@@ -35544,7 +35561,7 @@
         </w:tc>
         <w:tc>
           <w:tcPr>
-            <w:tcW w:type="dxa" w:w="1426"/>
+            <w:tcW w:type="dxa" w:w="1410"/>
             <w:tcBorders>
               <w:top w:val="single" w:color="E2E8F0" w:sz="4"/>
               <w:left w:val="none" w:color="auto" w:sz="0"/>
@@ -35582,7 +35599,7 @@
         </w:trPr>
         <w:tc>
           <w:tcPr>
-            <w:tcW w:type="dxa" w:w="1572"/>
+            <w:tcW w:type="dxa" w:w="1545"/>
             <w:tcBorders>
               <w:top w:val="single" w:color="E2E8F0" w:sz="4"/>
               <w:left w:val="none" w:color="auto" w:sz="0"/>
@@ -35615,7 +35632,7 @@
         </w:tc>
         <w:tc>
           <w:tcPr>
-            <w:tcW w:type="dxa" w:w="2812"/>
+            <w:tcW w:type="dxa" w:w="2893"/>
             <w:tcBorders>
               <w:top w:val="single" w:color="E2E8F0" w:sz="4"/>
               <w:left w:val="none" w:color="auto" w:sz="0"/>
@@ -35648,7 +35665,7 @@
         </w:tc>
         <w:tc>
           <w:tcPr>
-            <w:tcW w:type="dxa" w:w="2830"/>
+            <w:tcW w:type="dxa" w:w="2792"/>
             <w:tcBorders>
               <w:top w:val="single" w:color="E2E8F0" w:sz="4"/>
               <w:left w:val="none" w:color="auto" w:sz="0"/>
@@ -35681,7 +35698,7 @@
         </w:tc>
         <w:tc>
           <w:tcPr>
-            <w:tcW w:type="dxa" w:w="1426"/>
+            <w:tcW w:type="dxa" w:w="1410"/>
             <w:tcBorders>
               <w:top w:val="single" w:color="E2E8F0" w:sz="4"/>
               <w:left w:val="none" w:color="auto" w:sz="0"/>
@@ -35719,7 +35736,7 @@
         </w:trPr>
         <w:tc>
           <w:tcPr>
-            <w:tcW w:type="dxa" w:w="1572"/>
+            <w:tcW w:type="dxa" w:w="1545"/>
             <w:tcBorders>
               <w:top w:val="single" w:color="E2E8F0" w:sz="4"/>
               <w:left w:val="none" w:color="auto" w:sz="0"/>
@@ -35752,7 +35769,7 @@
         </w:tc>
         <w:tc>
           <w:tcPr>
-            <w:tcW w:type="dxa" w:w="2812"/>
+            <w:tcW w:type="dxa" w:w="2893"/>
             <w:tcBorders>
               <w:top w:val="single" w:color="E2E8F0" w:sz="4"/>
               <w:left w:val="none" w:color="auto" w:sz="0"/>
@@ -35785,7 +35802,7 @@
         </w:tc>
         <w:tc>
           <w:tcPr>
-            <w:tcW w:type="dxa" w:w="2830"/>
+            <w:tcW w:type="dxa" w:w="2792"/>
             <w:tcBorders>
               <w:top w:val="single" w:color="E2E8F0" w:sz="4"/>
               <w:left w:val="none" w:color="auto" w:sz="0"/>
@@ -35818,7 +35835,7 @@
         </w:tc>
         <w:tc>
           <w:tcPr>
-            <w:tcW w:type="dxa" w:w="1426"/>
+            <w:tcW w:type="dxa" w:w="1410"/>
             <w:tcBorders>
               <w:top w:val="single" w:color="E2E8F0" w:sz="4"/>
               <w:left w:val="none" w:color="auto" w:sz="0"/>
@@ -35856,7 +35873,7 @@
         </w:trPr>
         <w:tc>
           <w:tcPr>
-            <w:tcW w:type="dxa" w:w="1572"/>
+            <w:tcW w:type="dxa" w:w="1545"/>
             <w:tcBorders>
               <w:top w:val="single" w:color="E2E8F0" w:sz="4"/>
               <w:left w:val="none" w:color="auto" w:sz="0"/>
@@ -35889,7 +35906,7 @@
         </w:tc>
         <w:tc>
           <w:tcPr>
-            <w:tcW w:type="dxa" w:w="2812"/>
+            <w:tcW w:type="dxa" w:w="2893"/>
             <w:tcBorders>
               <w:top w:val="single" w:color="E2E8F0" w:sz="4"/>
               <w:left w:val="none" w:color="auto" w:sz="0"/>
@@ -35922,7 +35939,7 @@
         </w:tc>
         <w:tc>
           <w:tcPr>
-            <w:tcW w:type="dxa" w:w="2830"/>
+            <w:tcW w:type="dxa" w:w="2792"/>
             <w:tcBorders>
               <w:top w:val="single" w:color="E2E8F0" w:sz="4"/>
               <w:left w:val="none" w:color="auto" w:sz="0"/>
@@ -35955,7 +35972,7 @@
         </w:tc>
         <w:tc>
           <w:tcPr>
-            <w:tcW w:type="dxa" w:w="1426"/>
+            <w:tcW w:type="dxa" w:w="1410"/>
             <w:tcBorders>
               <w:top w:val="single" w:color="E2E8F0" w:sz="4"/>
               <w:left w:val="none" w:color="auto" w:sz="0"/>
@@ -35993,7 +36010,7 @@
         </w:trPr>
         <w:tc>
           <w:tcPr>
-            <w:tcW w:type="dxa" w:w="1572"/>
+            <w:tcW w:type="dxa" w:w="1545"/>
             <w:tcBorders>
               <w:top w:val="single" w:color="E2E8F0" w:sz="4"/>
               <w:left w:val="none" w:color="auto" w:sz="0"/>
@@ -36026,7 +36043,7 @@
         </w:tc>
         <w:tc>
           <w:tcPr>
-            <w:tcW w:type="dxa" w:w="2812"/>
+            <w:tcW w:type="dxa" w:w="2893"/>
             <w:tcBorders>
               <w:top w:val="single" w:color="E2E8F0" w:sz="4"/>
               <w:left w:val="none" w:color="auto" w:sz="0"/>
@@ -36059,7 +36076,7 @@
         </w:tc>
         <w:tc>
           <w:tcPr>
-            <w:tcW w:type="dxa" w:w="2830"/>
+            <w:tcW w:type="dxa" w:w="2792"/>
             <w:tcBorders>
               <w:top w:val="single" w:color="E2E8F0" w:sz="4"/>
               <w:left w:val="none" w:color="auto" w:sz="0"/>
@@ -36092,7 +36109,7 @@
         </w:tc>
         <w:tc>
           <w:tcPr>
-            <w:tcW w:type="dxa" w:w="1426"/>
+            <w:tcW w:type="dxa" w:w="1410"/>
             <w:tcBorders>
               <w:top w:val="single" w:color="E2E8F0" w:sz="4"/>
               <w:left w:val="none" w:color="auto" w:sz="0"/>
@@ -36130,7 +36147,7 @@
         </w:trPr>
         <w:tc>
           <w:tcPr>
-            <w:tcW w:type="dxa" w:w="1572"/>
+            <w:tcW w:type="dxa" w:w="1545"/>
             <w:tcBorders>
               <w:top w:val="single" w:color="E2E8F0" w:sz="4"/>
               <w:left w:val="none" w:color="auto" w:sz="0"/>
@@ -36163,7 +36180,7 @@
         </w:tc>
         <w:tc>
           <w:tcPr>
-            <w:tcW w:type="dxa" w:w="2812"/>
+            <w:tcW w:type="dxa" w:w="2893"/>
             <w:tcBorders>
               <w:top w:val="single" w:color="E2E8F0" w:sz="4"/>
               <w:left w:val="none" w:color="auto" w:sz="0"/>
@@ -36196,7 +36213,7 @@
         </w:tc>
         <w:tc>
           <w:tcPr>
-            <w:tcW w:type="dxa" w:w="2830"/>
+            <w:tcW w:type="dxa" w:w="2792"/>
             <w:tcBorders>
               <w:top w:val="single" w:color="E2E8F0" w:sz="4"/>
               <w:left w:val="none" w:color="auto" w:sz="0"/>
@@ -36229,7 +36246,7 @@
         </w:tc>
         <w:tc>
           <w:tcPr>
-            <w:tcW w:type="dxa" w:w="1426"/>
+            <w:tcW w:type="dxa" w:w="1410"/>
             <w:tcBorders>
               <w:top w:val="single" w:color="E2E8F0" w:sz="4"/>
               <w:left w:val="none" w:color="auto" w:sz="0"/>
@@ -36267,7 +36284,7 @@
         </w:trPr>
         <w:tc>
           <w:tcPr>
-            <w:tcW w:type="dxa" w:w="1572"/>
+            <w:tcW w:type="dxa" w:w="1545"/>
             <w:tcBorders>
               <w:top w:val="single" w:color="E2E8F0" w:sz="4"/>
               <w:left w:val="none" w:color="auto" w:sz="0"/>
@@ -36300,7 +36317,7 @@
         </w:tc>
         <w:tc>
           <w:tcPr>
-            <w:tcW w:type="dxa" w:w="2812"/>
+            <w:tcW w:type="dxa" w:w="2893"/>
             <w:tcBorders>
               <w:top w:val="single" w:color="E2E8F0" w:sz="4"/>
               <w:left w:val="none" w:color="auto" w:sz="0"/>
@@ -36333,7 +36350,7 @@
         </w:tc>
         <w:tc>
           <w:tcPr>
-            <w:tcW w:type="dxa" w:w="2830"/>
+            <w:tcW w:type="dxa" w:w="2792"/>
             <w:tcBorders>
               <w:top w:val="single" w:color="E2E8F0" w:sz="4"/>
               <w:left w:val="none" w:color="auto" w:sz="0"/>
@@ -36366,7 +36383,7 @@
         </w:tc>
         <w:tc>
           <w:tcPr>
-            <w:tcW w:type="dxa" w:w="1426"/>
+            <w:tcW w:type="dxa" w:w="1410"/>
             <w:tcBorders>
               <w:top w:val="single" w:color="E2E8F0" w:sz="4"/>
               <w:left w:val="none" w:color="auto" w:sz="0"/>
@@ -36404,133 +36421,133 @@
         </w:trPr>
         <w:tc>
           <w:tcPr>
-            <w:tcW w:type="dxa" w:w="1572"/>
-            <w:tcBorders>
-              <w:top w:val="single" w:color="E2E8F0" w:sz="4"/>
-              <w:left w:val="none" w:color="auto" w:sz="0"/>
-              <w:bottom w:val="single" w:color="E2E8F0" w:sz="4"/>
-              <w:right w:val="none" w:color="auto" w:sz="0"/>
-            </w:tcBorders>
-            <w:tcMar>
-              <w:top w:type="dxa" w:w="120"/>
-              <w:left w:type="dxa" w:w="160"/>
-              <w:bottom w:type="dxa" w:w="120"/>
-              <w:right w:type="dxa" w:w="160"/>
-            </w:tcMar>
-          </w:tcPr>
-          <w:p>
-            <w:pPr>
-              <w:spacing w:line="240" w:lineRule="auto"/>
-              <w:jc w:val="left"/>
-            </w:pPr>
-            <w:r>
-              <w:rPr>
-                <w:rFonts w:ascii="Arial" w:cs="Arial" w:eastAsia="Arial" w:hAnsi="Arial"/>
-                <w:b w:val="false"/>
-                <w:bCs w:val="false"/>
-                <w:sz w:val="20"/>
-                <w:szCs w:val="20"/>
-              </w:rPr>
-              <w:t xml:space="preserve">Pre-testing audit, 29 Sep 2026</w:t>
-            </w:r>
-          </w:p>
-        </w:tc>
-        <w:tc>
-          <w:tcPr>
-            <w:tcW w:type="dxa" w:w="2812"/>
-            <w:tcBorders>
-              <w:top w:val="single" w:color="E2E8F0" w:sz="4"/>
-              <w:left w:val="none" w:color="auto" w:sz="0"/>
-              <w:bottom w:val="single" w:color="E2E8F0" w:sz="4"/>
-              <w:right w:val="none" w:color="auto" w:sz="0"/>
-            </w:tcBorders>
-            <w:tcMar>
-              <w:top w:type="dxa" w:w="120"/>
-              <w:left w:type="dxa" w:w="160"/>
-              <w:bottom w:type="dxa" w:w="120"/>
-              <w:right w:type="dxa" w:w="160"/>
-            </w:tcMar>
-          </w:tcPr>
-          <w:p>
-            <w:pPr>
-              <w:spacing w:line="240" w:lineRule="auto"/>
-              <w:jc w:val="left"/>
-            </w:pPr>
-            <w:r>
-              <w:rPr>
-                <w:rFonts w:ascii="Arial" w:cs="Arial" w:eastAsia="Arial" w:hAnsi="Arial"/>
-                <w:b w:val="false"/>
-                <w:bCs w:val="false"/>
-                <w:sz w:val="20"/>
-                <w:szCs w:val="20"/>
-              </w:rPr>
-              <w:t xml:space="preserve">A tenant who forgot their password had no way back in, and the owner no way to help</w:t>
-            </w:r>
-          </w:p>
-        </w:tc>
-        <w:tc>
-          <w:tcPr>
-            <w:tcW w:type="dxa" w:w="2830"/>
-            <w:tcBorders>
-              <w:top w:val="single" w:color="E2E8F0" w:sz="4"/>
-              <w:left w:val="none" w:color="auto" w:sz="0"/>
-              <w:bottom w:val="single" w:color="E2E8F0" w:sz="4"/>
-              <w:right w:val="none" w:color="auto" w:sz="0"/>
-            </w:tcBorders>
-            <w:tcMar>
-              <w:top w:type="dxa" w:w="120"/>
-              <w:left w:type="dxa" w:w="160"/>
-              <w:bottom w:type="dxa" w:w="120"/>
-              <w:right w:type="dxa" w:w="160"/>
-            </w:tcMar>
-          </w:tcPr>
-          <w:p>
-            <w:pPr>
-              <w:spacing w:line="240" w:lineRule="auto"/>
-              <w:jc w:val="left"/>
-            </w:pPr>
-            <w:r>
-              <w:rPr>
-                <w:rFonts w:ascii="Arial" w:cs="Arial" w:eastAsia="Arial" w:hAnsi="Arial"/>
-                <w:b w:val="false"/>
-                <w:bCs w:val="false"/>
-                <w:sz w:val="20"/>
-                <w:szCs w:val="20"/>
-              </w:rPr>
-              <w:t xml:space="preserve">The owner can reset a tenant's password from the tenant list; the tenant gets a one-time password and chooses their own at next sign-in</w:t>
-            </w:r>
-          </w:p>
-        </w:tc>
-        <w:tc>
-          <w:tcPr>
-            <w:tcW w:type="dxa" w:w="1426"/>
-            <w:tcBorders>
-              <w:top w:val="single" w:color="E2E8F0" w:sz="4"/>
-              <w:left w:val="none" w:color="auto" w:sz="0"/>
-              <w:bottom w:val="single" w:color="E2E8F0" w:sz="4"/>
-              <w:right w:val="none" w:color="auto" w:sz="0"/>
-            </w:tcBorders>
-            <w:tcMar>
-              <w:top w:type="dxa" w:w="120"/>
-              <w:left w:type="dxa" w:w="160"/>
-              <w:bottom w:type="dxa" w:w="120"/>
-              <w:right w:type="dxa" w:w="160"/>
-            </w:tcMar>
-          </w:tcPr>
-          <w:p>
-            <w:pPr>
-              <w:spacing w:line="240" w:lineRule="auto"/>
-              <w:jc w:val="left"/>
-            </w:pPr>
-            <w:r>
-              <w:rPr>
-                <w:rFonts w:ascii="Arial" w:cs="Arial" w:eastAsia="Arial" w:hAnsi="Arial"/>
-                <w:b w:val="false"/>
-                <w:bCs w:val="false"/>
-                <w:sz w:val="20"/>
-                <w:szCs w:val="20"/>
-              </w:rPr>
-              <w:t xml:space="preserve">Usability, Security</w:t>
+            <w:tcW w:type="dxa" w:w="1545"/>
+            <w:tcBorders>
+              <w:top w:val="single" w:color="E2E8F0" w:sz="4"/>
+              <w:left w:val="none" w:color="auto" w:sz="0"/>
+              <w:bottom w:val="single" w:color="E2E8F0" w:sz="4"/>
+              <w:right w:val="none" w:color="auto" w:sz="0"/>
+            </w:tcBorders>
+            <w:tcMar>
+              <w:top w:type="dxa" w:w="120"/>
+              <w:left w:type="dxa" w:w="160"/>
+              <w:bottom w:type="dxa" w:w="120"/>
+              <w:right w:type="dxa" w:w="160"/>
+            </w:tcMar>
+          </w:tcPr>
+          <w:p>
+            <w:pPr>
+              <w:spacing w:line="240" w:lineRule="auto"/>
+              <w:jc w:val="left"/>
+            </w:pPr>
+            <w:r>
+              <w:rPr>
+                <w:rFonts w:ascii="Arial" w:cs="Arial" w:eastAsia="Arial" w:hAnsi="Arial"/>
+                <w:b w:val="false"/>
+                <w:bCs w:val="false"/>
+                <w:sz w:val="20"/>
+                <w:szCs w:val="20"/>
+              </w:rPr>
+              <w:t xml:space="preserve">Lighthouse audit, 30 Sep 2026</w:t>
+            </w:r>
+          </w:p>
+        </w:tc>
+        <w:tc>
+          <w:tcPr>
+            <w:tcW w:type="dxa" w:w="2893"/>
+            <w:tcBorders>
+              <w:top w:val="single" w:color="E2E8F0" w:sz="4"/>
+              <w:left w:val="none" w:color="auto" w:sz="0"/>
+              <w:bottom w:val="single" w:color="E2E8F0" w:sz="4"/>
+              <w:right w:val="none" w:color="auto" w:sz="0"/>
+            </w:tcBorders>
+            <w:tcMar>
+              <w:top w:type="dxa" w:w="120"/>
+              <w:left w:type="dxa" w:w="160"/>
+              <w:bottom w:type="dxa" w:w="120"/>
+              <w:right w:type="dxa" w:w="160"/>
+            </w:tcMar>
+          </w:tcPr>
+          <w:p>
+            <w:pPr>
+              <w:spacing w:line="240" w:lineRule="auto"/>
+              <w:jc w:val="left"/>
+            </w:pPr>
+            <w:r>
+              <w:rPr>
+                <w:rFonts w:ascii="Arial" w:cs="Arial" w:eastAsia="Arial" w:hAnsi="Arial"/>
+                <w:b w:val="false"/>
+                <w:bCs w:val="false"/>
+                <w:sz w:val="20"/>
+                <w:szCs w:val="20"/>
+              </w:rPr>
+              <w:t xml:space="preserve">The public page jumped while it loaded: the footer showed on an empty page and was pushed down when the page arrived (layout shift 0.50; desktop performance score 76)</w:t>
+            </w:r>
+          </w:p>
+        </w:tc>
+        <w:tc>
+          <w:tcPr>
+            <w:tcW w:type="dxa" w:w="2792"/>
+            <w:tcBorders>
+              <w:top w:val="single" w:color="E2E8F0" w:sz="4"/>
+              <w:left w:val="none" w:color="auto" w:sz="0"/>
+              <w:bottom w:val="single" w:color="E2E8F0" w:sz="4"/>
+              <w:right w:val="none" w:color="auto" w:sz="0"/>
+            </w:tcBorders>
+            <w:tcMar>
+              <w:top w:type="dxa" w:w="120"/>
+              <w:left w:type="dxa" w:w="160"/>
+              <w:bottom w:type="dxa" w:w="120"/>
+              <w:right w:type="dxa" w:w="160"/>
+            </w:tcMar>
+          </w:tcPr>
+          <w:p>
+            <w:pPr>
+              <w:spacing w:line="240" w:lineRule="auto"/>
+              <w:jc w:val="left"/>
+            </w:pPr>
+            <w:r>
+              <w:rPr>
+                <w:rFonts w:ascii="Arial" w:cs="Arial" w:eastAsia="Arial" w:hAnsi="Arial"/>
+                <w:b w:val="false"/>
+                <w:bCs w:val="false"/>
+                <w:sz w:val="20"/>
+                <w:szCs w:val="20"/>
+              </w:rPr>
+              <w:t xml:space="preserve">The page's space is held until it loads; layout shift 0, desktop performance score 95, measured on the live site</w:t>
+            </w:r>
+          </w:p>
+        </w:tc>
+        <w:tc>
+          <w:tcPr>
+            <w:tcW w:type="dxa" w:w="1410"/>
+            <w:tcBorders>
+              <w:top w:val="single" w:color="E2E8F0" w:sz="4"/>
+              <w:left w:val="none" w:color="auto" w:sz="0"/>
+              <w:bottom w:val="single" w:color="E2E8F0" w:sz="4"/>
+              <w:right w:val="none" w:color="auto" w:sz="0"/>
+            </w:tcBorders>
+            <w:tcMar>
+              <w:top w:type="dxa" w:w="120"/>
+              <w:left w:type="dxa" w:w="160"/>
+              <w:bottom w:type="dxa" w:w="120"/>
+              <w:right w:type="dxa" w:w="160"/>
+            </w:tcMar>
+          </w:tcPr>
+          <w:p>
+            <w:pPr>
+              <w:spacing w:line="240" w:lineRule="auto"/>
+              <w:jc w:val="left"/>
+            </w:pPr>
+            <w:r>
+              <w:rPr>
+                <w:rFonts w:ascii="Arial" w:cs="Arial" w:eastAsia="Arial" w:hAnsi="Arial"/>
+                <w:b w:val="false"/>
+                <w:bCs w:val="false"/>
+                <w:sz w:val="20"/>
+                <w:szCs w:val="20"/>
+              </w:rPr>
+              <w:t xml:space="preserve">Performance Efficiency, Usability</w:t>
             </w:r>
           </w:p>
         </w:tc>
@@ -36541,7 +36558,7 @@
         </w:trPr>
         <w:tc>
           <w:tcPr>
-            <w:tcW w:type="dxa" w:w="1572"/>
+            <w:tcW w:type="dxa" w:w="1545"/>
             <w:tcBorders>
               <w:top w:val="single" w:color="E2E8F0" w:sz="4"/>
               <w:left w:val="none" w:color="auto" w:sz="0"/>
@@ -36574,100 +36591,100 @@
         </w:tc>
         <w:tc>
           <w:tcPr>
-            <w:tcW w:type="dxa" w:w="2812"/>
-            <w:tcBorders>
-              <w:top w:val="single" w:color="E2E8F0" w:sz="4"/>
-              <w:left w:val="none" w:color="auto" w:sz="0"/>
-              <w:bottom w:val="single" w:color="E2E8F0" w:sz="4"/>
-              <w:right w:val="none" w:color="auto" w:sz="0"/>
-            </w:tcBorders>
-            <w:tcMar>
-              <w:top w:type="dxa" w:w="120"/>
-              <w:left w:type="dxa" w:w="160"/>
-              <w:bottom w:type="dxa" w:w="120"/>
-              <w:right w:type="dxa" w:w="160"/>
-            </w:tcMar>
-          </w:tcPr>
-          <w:p>
-            <w:pPr>
-              <w:spacing w:line="240" w:lineRule="auto"/>
-              <w:jc w:val="left"/>
-            </w:pPr>
-            <w:r>
-              <w:rPr>
-                <w:rFonts w:ascii="Arial" w:cs="Arial" w:eastAsia="Arial" w:hAnsi="Arial"/>
-                <w:b w:val="false"/>
-                <w:bCs w:val="false"/>
-                <w:sz w:val="20"/>
-                <w:szCs w:val="20"/>
-              </w:rPr>
-              <w:t xml:space="preserve">The window that makes a tenant set their own password did not say which password it wanted, and had no way out</w:t>
-            </w:r>
-          </w:p>
-        </w:tc>
-        <w:tc>
-          <w:tcPr>
-            <w:tcW w:type="dxa" w:w="2830"/>
-            <w:tcBorders>
-              <w:top w:val="single" w:color="E2E8F0" w:sz="4"/>
-              <w:left w:val="none" w:color="auto" w:sz="0"/>
-              <w:bottom w:val="single" w:color="E2E8F0" w:sz="4"/>
-              <w:right w:val="none" w:color="auto" w:sz="0"/>
-            </w:tcBorders>
-            <w:tcMar>
-              <w:top w:type="dxa" w:w="120"/>
-              <w:left w:type="dxa" w:w="160"/>
-              <w:bottom w:type="dxa" w:w="120"/>
-              <w:right w:type="dxa" w:w="160"/>
-            </w:tcMar>
-          </w:tcPr>
-          <w:p>
-            <w:pPr>
-              <w:spacing w:line="240" w:lineRule="auto"/>
-              <w:jc w:val="left"/>
-            </w:pPr>
-            <w:r>
-              <w:rPr>
-                <w:rFonts w:ascii="Arial" w:cs="Arial" w:eastAsia="Arial" w:hAnsi="Arial"/>
-                <w:b w:val="false"/>
-                <w:bCs w:val="false"/>
-                <w:sz w:val="20"/>
-                <w:szCs w:val="20"/>
-              </w:rPr>
-              <w:t xml:space="preserve">It asks for the starting password by name and offers Sign out</w:t>
-            </w:r>
-          </w:p>
-        </w:tc>
-        <w:tc>
-          <w:tcPr>
-            <w:tcW w:type="dxa" w:w="1426"/>
-            <w:tcBorders>
-              <w:top w:val="single" w:color="E2E8F0" w:sz="4"/>
-              <w:left w:val="none" w:color="auto" w:sz="0"/>
-              <w:bottom w:val="single" w:color="E2E8F0" w:sz="4"/>
-              <w:right w:val="none" w:color="auto" w:sz="0"/>
-            </w:tcBorders>
-            <w:tcMar>
-              <w:top w:type="dxa" w:w="120"/>
-              <w:left w:type="dxa" w:w="160"/>
-              <w:bottom w:type="dxa" w:w="120"/>
-              <w:right w:type="dxa" w:w="160"/>
-            </w:tcMar>
-          </w:tcPr>
-          <w:p>
-            <w:pPr>
-              <w:spacing w:line="240" w:lineRule="auto"/>
-              <w:jc w:val="left"/>
-            </w:pPr>
-            <w:r>
-              <w:rPr>
-                <w:rFonts w:ascii="Arial" w:cs="Arial" w:eastAsia="Arial" w:hAnsi="Arial"/>
-                <w:b w:val="false"/>
-                <w:bCs w:val="false"/>
-                <w:sz w:val="20"/>
-                <w:szCs w:val="20"/>
-              </w:rPr>
-              <w:t xml:space="preserve">Usability</w:t>
+            <w:tcW w:type="dxa" w:w="2893"/>
+            <w:tcBorders>
+              <w:top w:val="single" w:color="E2E8F0" w:sz="4"/>
+              <w:left w:val="none" w:color="auto" w:sz="0"/>
+              <w:bottom w:val="single" w:color="E2E8F0" w:sz="4"/>
+              <w:right w:val="none" w:color="auto" w:sz="0"/>
+            </w:tcBorders>
+            <w:tcMar>
+              <w:top w:type="dxa" w:w="120"/>
+              <w:left w:type="dxa" w:w="160"/>
+              <w:bottom w:type="dxa" w:w="120"/>
+              <w:right w:type="dxa" w:w="160"/>
+            </w:tcMar>
+          </w:tcPr>
+          <w:p>
+            <w:pPr>
+              <w:spacing w:line="240" w:lineRule="auto"/>
+              <w:jc w:val="left"/>
+            </w:pPr>
+            <w:r>
+              <w:rPr>
+                <w:rFonts w:ascii="Arial" w:cs="Arial" w:eastAsia="Arial" w:hAnsi="Arial"/>
+                <w:b w:val="false"/>
+                <w:bCs w:val="false"/>
+                <w:sz w:val="20"/>
+                <w:szCs w:val="20"/>
+              </w:rPr>
+              <w:t xml:space="preserve">A tenant who forgot their password had no way back in, and the owner no way to help</w:t>
+            </w:r>
+          </w:p>
+        </w:tc>
+        <w:tc>
+          <w:tcPr>
+            <w:tcW w:type="dxa" w:w="2792"/>
+            <w:tcBorders>
+              <w:top w:val="single" w:color="E2E8F0" w:sz="4"/>
+              <w:left w:val="none" w:color="auto" w:sz="0"/>
+              <w:bottom w:val="single" w:color="E2E8F0" w:sz="4"/>
+              <w:right w:val="none" w:color="auto" w:sz="0"/>
+            </w:tcBorders>
+            <w:tcMar>
+              <w:top w:type="dxa" w:w="120"/>
+              <w:left w:type="dxa" w:w="160"/>
+              <w:bottom w:type="dxa" w:w="120"/>
+              <w:right w:type="dxa" w:w="160"/>
+            </w:tcMar>
+          </w:tcPr>
+          <w:p>
+            <w:pPr>
+              <w:spacing w:line="240" w:lineRule="auto"/>
+              <w:jc w:val="left"/>
+            </w:pPr>
+            <w:r>
+              <w:rPr>
+                <w:rFonts w:ascii="Arial" w:cs="Arial" w:eastAsia="Arial" w:hAnsi="Arial"/>
+                <w:b w:val="false"/>
+                <w:bCs w:val="false"/>
+                <w:sz w:val="20"/>
+                <w:szCs w:val="20"/>
+              </w:rPr>
+              <w:t xml:space="preserve">The owner can reset a tenant's password from the tenant list; the tenant gets a one-time password and chooses their own at next sign-in</w:t>
+            </w:r>
+          </w:p>
+        </w:tc>
+        <w:tc>
+          <w:tcPr>
+            <w:tcW w:type="dxa" w:w="1410"/>
+            <w:tcBorders>
+              <w:top w:val="single" w:color="E2E8F0" w:sz="4"/>
+              <w:left w:val="none" w:color="auto" w:sz="0"/>
+              <w:bottom w:val="single" w:color="E2E8F0" w:sz="4"/>
+              <w:right w:val="none" w:color="auto" w:sz="0"/>
+            </w:tcBorders>
+            <w:tcMar>
+              <w:top w:type="dxa" w:w="120"/>
+              <w:left w:type="dxa" w:w="160"/>
+              <w:bottom w:type="dxa" w:w="120"/>
+              <w:right w:type="dxa" w:w="160"/>
+            </w:tcMar>
+          </w:tcPr>
+          <w:p>
+            <w:pPr>
+              <w:spacing w:line="240" w:lineRule="auto"/>
+              <w:jc w:val="left"/>
+            </w:pPr>
+            <w:r>
+              <w:rPr>
+                <w:rFonts w:ascii="Arial" w:cs="Arial" w:eastAsia="Arial" w:hAnsi="Arial"/>
+                <w:b w:val="false"/>
+                <w:bCs w:val="false"/>
+                <w:sz w:val="20"/>
+                <w:szCs w:val="20"/>
+              </w:rPr>
+              <w:t xml:space="preserve">Usability, Security</w:t>
             </w:r>
           </w:p>
         </w:tc>
@@ -36678,7 +36695,7 @@
         </w:trPr>
         <w:tc>
           <w:tcPr>
-            <w:tcW w:type="dxa" w:w="1572"/>
+            <w:tcW w:type="dxa" w:w="1545"/>
             <w:tcBorders>
               <w:top w:val="single" w:color="E2E8F0" w:sz="4"/>
               <w:left w:val="none" w:color="auto" w:sz="0"/>
@@ -36711,100 +36728,100 @@
         </w:tc>
         <w:tc>
           <w:tcPr>
-            <w:tcW w:type="dxa" w:w="2812"/>
-            <w:tcBorders>
-              <w:top w:val="single" w:color="E2E8F0" w:sz="4"/>
-              <w:left w:val="none" w:color="auto" w:sz="0"/>
-              <w:bottom w:val="single" w:color="E2E8F0" w:sz="4"/>
-              <w:right w:val="none" w:color="auto" w:sz="0"/>
-            </w:tcBorders>
-            <w:tcMar>
-              <w:top w:type="dxa" w:w="120"/>
-              <w:left w:type="dxa" w:w="160"/>
-              <w:bottom w:type="dxa" w:w="120"/>
-              <w:right w:type="dxa" w:w="160"/>
-            </w:tcMar>
-          </w:tcPr>
-          <w:p>
-            <w:pPr>
-              <w:spacing w:line="240" w:lineRule="auto"/>
-              <w:jc w:val="left"/>
-            </w:pPr>
-            <w:r>
-              <w:rPr>
-                <w:rFonts w:ascii="Arial" w:cs="Arial" w:eastAsia="Arial" w:hAnsi="Arial"/>
-                <w:b w:val="false"/>
-                <w:bCs w:val="false"/>
-                <w:sz w:val="20"/>
-                <w:szCs w:val="20"/>
-              </w:rPr>
-              <w:t xml:space="preserve">On a weak signal a page or a save could wait for minutes with no message</w:t>
-            </w:r>
-          </w:p>
-        </w:tc>
-        <w:tc>
-          <w:tcPr>
-            <w:tcW w:type="dxa" w:w="2830"/>
-            <w:tcBorders>
-              <w:top w:val="single" w:color="E2E8F0" w:sz="4"/>
-              <w:left w:val="none" w:color="auto" w:sz="0"/>
-              <w:bottom w:val="single" w:color="E2E8F0" w:sz="4"/>
-              <w:right w:val="none" w:color="auto" w:sz="0"/>
-            </w:tcBorders>
-            <w:tcMar>
-              <w:top w:type="dxa" w:w="120"/>
-              <w:left w:type="dxa" w:w="160"/>
-              <w:bottom w:type="dxa" w:w="120"/>
-              <w:right w:type="dxa" w:w="160"/>
-            </w:tcMar>
-          </w:tcPr>
-          <w:p>
-            <w:pPr>
-              <w:spacing w:line="240" w:lineRule="auto"/>
-              <w:jc w:val="left"/>
-            </w:pPr>
-            <w:r>
-              <w:rPr>
-                <w:rFonts w:ascii="Arial" w:cs="Arial" w:eastAsia="Arial" w:hAnsi="Arial"/>
-                <w:b w:val="false"/>
-                <w:bCs w:val="false"/>
-                <w:sz w:val="20"/>
-                <w:szCs w:val="20"/>
-              </w:rPr>
-              <w:t xml:space="preserve">Pages stop after 25 seconds and saves after 45, each with a message; a save that may have arrived asks the reader to check before sending it again</w:t>
-            </w:r>
-          </w:p>
-        </w:tc>
-        <w:tc>
-          <w:tcPr>
-            <w:tcW w:type="dxa" w:w="1426"/>
-            <w:tcBorders>
-              <w:top w:val="single" w:color="E2E8F0" w:sz="4"/>
-              <w:left w:val="none" w:color="auto" w:sz="0"/>
-              <w:bottom w:val="single" w:color="E2E8F0" w:sz="4"/>
-              <w:right w:val="none" w:color="auto" w:sz="0"/>
-            </w:tcBorders>
-            <w:tcMar>
-              <w:top w:type="dxa" w:w="120"/>
-              <w:left w:type="dxa" w:w="160"/>
-              <w:bottom w:type="dxa" w:w="120"/>
-              <w:right w:type="dxa" w:w="160"/>
-            </w:tcMar>
-          </w:tcPr>
-          <w:p>
-            <w:pPr>
-              <w:spacing w:line="240" w:lineRule="auto"/>
-              <w:jc w:val="left"/>
-            </w:pPr>
-            <w:r>
-              <w:rPr>
-                <w:rFonts w:ascii="Arial" w:cs="Arial" w:eastAsia="Arial" w:hAnsi="Arial"/>
-                <w:b w:val="false"/>
-                <w:bCs w:val="false"/>
-                <w:sz w:val="20"/>
-                <w:szCs w:val="20"/>
-              </w:rPr>
-              <w:t xml:space="preserve">Reliability, Usability</w:t>
+            <w:tcW w:type="dxa" w:w="2893"/>
+            <w:tcBorders>
+              <w:top w:val="single" w:color="E2E8F0" w:sz="4"/>
+              <w:left w:val="none" w:color="auto" w:sz="0"/>
+              <w:bottom w:val="single" w:color="E2E8F0" w:sz="4"/>
+              <w:right w:val="none" w:color="auto" w:sz="0"/>
+            </w:tcBorders>
+            <w:tcMar>
+              <w:top w:type="dxa" w:w="120"/>
+              <w:left w:type="dxa" w:w="160"/>
+              <w:bottom w:type="dxa" w:w="120"/>
+              <w:right w:type="dxa" w:w="160"/>
+            </w:tcMar>
+          </w:tcPr>
+          <w:p>
+            <w:pPr>
+              <w:spacing w:line="240" w:lineRule="auto"/>
+              <w:jc w:val="left"/>
+            </w:pPr>
+            <w:r>
+              <w:rPr>
+                <w:rFonts w:ascii="Arial" w:cs="Arial" w:eastAsia="Arial" w:hAnsi="Arial"/>
+                <w:b w:val="false"/>
+                <w:bCs w:val="false"/>
+                <w:sz w:val="20"/>
+                <w:szCs w:val="20"/>
+              </w:rPr>
+              <w:t xml:space="preserve">The window that makes a tenant set their own password did not say which password it wanted, and had no way out</w:t>
+            </w:r>
+          </w:p>
+        </w:tc>
+        <w:tc>
+          <w:tcPr>
+            <w:tcW w:type="dxa" w:w="2792"/>
+            <w:tcBorders>
+              <w:top w:val="single" w:color="E2E8F0" w:sz="4"/>
+              <w:left w:val="none" w:color="auto" w:sz="0"/>
+              <w:bottom w:val="single" w:color="E2E8F0" w:sz="4"/>
+              <w:right w:val="none" w:color="auto" w:sz="0"/>
+            </w:tcBorders>
+            <w:tcMar>
+              <w:top w:type="dxa" w:w="120"/>
+              <w:left w:type="dxa" w:w="160"/>
+              <w:bottom w:type="dxa" w:w="120"/>
+              <w:right w:type="dxa" w:w="160"/>
+            </w:tcMar>
+          </w:tcPr>
+          <w:p>
+            <w:pPr>
+              <w:spacing w:line="240" w:lineRule="auto"/>
+              <w:jc w:val="left"/>
+            </w:pPr>
+            <w:r>
+              <w:rPr>
+                <w:rFonts w:ascii="Arial" w:cs="Arial" w:eastAsia="Arial" w:hAnsi="Arial"/>
+                <w:b w:val="false"/>
+                <w:bCs w:val="false"/>
+                <w:sz w:val="20"/>
+                <w:szCs w:val="20"/>
+              </w:rPr>
+              <w:t xml:space="preserve">It asks for the starting password by name and offers Sign out</w:t>
+            </w:r>
+          </w:p>
+        </w:tc>
+        <w:tc>
+          <w:tcPr>
+            <w:tcW w:type="dxa" w:w="1410"/>
+            <w:tcBorders>
+              <w:top w:val="single" w:color="E2E8F0" w:sz="4"/>
+              <w:left w:val="none" w:color="auto" w:sz="0"/>
+              <w:bottom w:val="single" w:color="E2E8F0" w:sz="4"/>
+              <w:right w:val="none" w:color="auto" w:sz="0"/>
+            </w:tcBorders>
+            <w:tcMar>
+              <w:top w:type="dxa" w:w="120"/>
+              <w:left w:type="dxa" w:w="160"/>
+              <w:bottom w:type="dxa" w:w="120"/>
+              <w:right w:type="dxa" w:w="160"/>
+            </w:tcMar>
+          </w:tcPr>
+          <w:p>
+            <w:pPr>
+              <w:spacing w:line="240" w:lineRule="auto"/>
+              <w:jc w:val="left"/>
+            </w:pPr>
+            <w:r>
+              <w:rPr>
+                <w:rFonts w:ascii="Arial" w:cs="Arial" w:eastAsia="Arial" w:hAnsi="Arial"/>
+                <w:b w:val="false"/>
+                <w:bCs w:val="false"/>
+                <w:sz w:val="20"/>
+                <w:szCs w:val="20"/>
+              </w:rPr>
+              <w:t xml:space="preserve">Usability</w:t>
             </w:r>
           </w:p>
         </w:tc>
@@ -36815,7 +36832,144 @@
         </w:trPr>
         <w:tc>
           <w:tcPr>
-            <w:tcW w:type="dxa" w:w="1572"/>
+            <w:tcW w:type="dxa" w:w="1545"/>
+            <w:tcBorders>
+              <w:top w:val="single" w:color="E2E8F0" w:sz="4"/>
+              <w:left w:val="none" w:color="auto" w:sz="0"/>
+              <w:bottom w:val="single" w:color="E2E8F0" w:sz="4"/>
+              <w:right w:val="none" w:color="auto" w:sz="0"/>
+            </w:tcBorders>
+            <w:tcMar>
+              <w:top w:type="dxa" w:w="120"/>
+              <w:left w:type="dxa" w:w="160"/>
+              <w:bottom w:type="dxa" w:w="120"/>
+              <w:right w:type="dxa" w:w="160"/>
+            </w:tcMar>
+          </w:tcPr>
+          <w:p>
+            <w:pPr>
+              <w:spacing w:line="240" w:lineRule="auto"/>
+              <w:jc w:val="left"/>
+            </w:pPr>
+            <w:r>
+              <w:rPr>
+                <w:rFonts w:ascii="Arial" w:cs="Arial" w:eastAsia="Arial" w:hAnsi="Arial"/>
+                <w:b w:val="false"/>
+                <w:bCs w:val="false"/>
+                <w:sz w:val="20"/>
+                <w:szCs w:val="20"/>
+              </w:rPr>
+              <w:t xml:space="preserve">Pre-testing audit, 29 Sep 2026</w:t>
+            </w:r>
+          </w:p>
+        </w:tc>
+        <w:tc>
+          <w:tcPr>
+            <w:tcW w:type="dxa" w:w="2893"/>
+            <w:tcBorders>
+              <w:top w:val="single" w:color="E2E8F0" w:sz="4"/>
+              <w:left w:val="none" w:color="auto" w:sz="0"/>
+              <w:bottom w:val="single" w:color="E2E8F0" w:sz="4"/>
+              <w:right w:val="none" w:color="auto" w:sz="0"/>
+            </w:tcBorders>
+            <w:tcMar>
+              <w:top w:type="dxa" w:w="120"/>
+              <w:left w:type="dxa" w:w="160"/>
+              <w:bottom w:type="dxa" w:w="120"/>
+              <w:right w:type="dxa" w:w="160"/>
+            </w:tcMar>
+          </w:tcPr>
+          <w:p>
+            <w:pPr>
+              <w:spacing w:line="240" w:lineRule="auto"/>
+              <w:jc w:val="left"/>
+            </w:pPr>
+            <w:r>
+              <w:rPr>
+                <w:rFonts w:ascii="Arial" w:cs="Arial" w:eastAsia="Arial" w:hAnsi="Arial"/>
+                <w:b w:val="false"/>
+                <w:bCs w:val="false"/>
+                <w:sz w:val="20"/>
+                <w:szCs w:val="20"/>
+              </w:rPr>
+              <w:t xml:space="preserve">On a weak signal a page or a save could wait for minutes with no message</w:t>
+            </w:r>
+          </w:p>
+        </w:tc>
+        <w:tc>
+          <w:tcPr>
+            <w:tcW w:type="dxa" w:w="2792"/>
+            <w:tcBorders>
+              <w:top w:val="single" w:color="E2E8F0" w:sz="4"/>
+              <w:left w:val="none" w:color="auto" w:sz="0"/>
+              <w:bottom w:val="single" w:color="E2E8F0" w:sz="4"/>
+              <w:right w:val="none" w:color="auto" w:sz="0"/>
+            </w:tcBorders>
+            <w:tcMar>
+              <w:top w:type="dxa" w:w="120"/>
+              <w:left w:type="dxa" w:w="160"/>
+              <w:bottom w:type="dxa" w:w="120"/>
+              <w:right w:type="dxa" w:w="160"/>
+            </w:tcMar>
+          </w:tcPr>
+          <w:p>
+            <w:pPr>
+              <w:spacing w:line="240" w:lineRule="auto"/>
+              <w:jc w:val="left"/>
+            </w:pPr>
+            <w:r>
+              <w:rPr>
+                <w:rFonts w:ascii="Arial" w:cs="Arial" w:eastAsia="Arial" w:hAnsi="Arial"/>
+                <w:b w:val="false"/>
+                <w:bCs w:val="false"/>
+                <w:sz w:val="20"/>
+                <w:szCs w:val="20"/>
+              </w:rPr>
+              <w:t xml:space="preserve">Pages stop after 25 seconds and saves after 45, each with a message; a save that may have arrived asks the reader to check before sending it again</w:t>
+            </w:r>
+          </w:p>
+        </w:tc>
+        <w:tc>
+          <w:tcPr>
+            <w:tcW w:type="dxa" w:w="1410"/>
+            <w:tcBorders>
+              <w:top w:val="single" w:color="E2E8F0" w:sz="4"/>
+              <w:left w:val="none" w:color="auto" w:sz="0"/>
+              <w:bottom w:val="single" w:color="E2E8F0" w:sz="4"/>
+              <w:right w:val="none" w:color="auto" w:sz="0"/>
+            </w:tcBorders>
+            <w:tcMar>
+              <w:top w:type="dxa" w:w="120"/>
+              <w:left w:type="dxa" w:w="160"/>
+              <w:bottom w:type="dxa" w:w="120"/>
+              <w:right w:type="dxa" w:w="160"/>
+            </w:tcMar>
+          </w:tcPr>
+          <w:p>
+            <w:pPr>
+              <w:spacing w:line="240" w:lineRule="auto"/>
+              <w:jc w:val="left"/>
+            </w:pPr>
+            <w:r>
+              <w:rPr>
+                <w:rFonts w:ascii="Arial" w:cs="Arial" w:eastAsia="Arial" w:hAnsi="Arial"/>
+                <w:b w:val="false"/>
+                <w:bCs w:val="false"/>
+                <w:sz w:val="20"/>
+                <w:szCs w:val="20"/>
+              </w:rPr>
+              <w:t xml:space="preserve">Reliability, Usability</w:t>
+            </w:r>
+          </w:p>
+        </w:tc>
+      </w:tr>
+      <w:tr>
+        <w:trPr>
+          <w:cantSplit/>
+        </w:trPr>
+        <w:tc>
+          <w:tcPr>
+            <w:tcW w:type="dxa" w:w="1545"/>
             <w:tcBorders>
               <w:top w:val="single" w:color="E2E8F0" w:sz="4"/>
               <w:left w:val="none" w:color="auto" w:sz="0"/>
@@ -36848,7 +37002,7 @@
         </w:tc>
         <w:tc>
           <w:tcPr>
-            <w:tcW w:type="dxa" w:w="2812"/>
+            <w:tcW w:type="dxa" w:w="2893"/>
             <w:tcBorders>
               <w:top w:val="single" w:color="E2E8F0" w:sz="4"/>
               <w:left w:val="none" w:color="auto" w:sz="0"/>
@@ -36881,7 +37035,7 @@
         </w:tc>
         <w:tc>
           <w:tcPr>
-            <w:tcW w:type="dxa" w:w="2830"/>
+            <w:tcW w:type="dxa" w:w="2792"/>
             <w:tcBorders>
               <w:top w:val="single" w:color="E2E8F0" w:sz="4"/>
               <w:left w:val="none" w:color="auto" w:sz="0"/>
@@ -36904,7 +37058,7 @@
         </w:tc>
         <w:tc>
           <w:tcPr>
-            <w:tcW w:type="dxa" w:w="1426"/>
+            <w:tcW w:type="dxa" w:w="1410"/>
             <w:tcBorders>
               <w:top w:val="single" w:color="E2E8F0" w:sz="4"/>
               <w:left w:val="none" w:color="auto" w:sz="0"/>

</xml_diff>

<commit_message>
method: the video, the help ladder and prospective tenants, ready for Chapter 3 (FIXES H4)
Chapter 4 would otherwise report prospects' results and help-coded task outcomes
with no method in Chapter 3 behind them. H4 gives paste-ready text for each, to be
used only if it happened; Chapter 4 gets a TEAM NOTE and a Table 12 row for the
fourth group, in the order compute-survey prints it. docx rebuilt.

Co-Authored-By: Claude Opus 5.5 <noreply@anthropic.com>
</commit_message>
<xml_diff>
--- a/docs/FINAL MANUSCRIPT/CHAPTER_4_RESULTS_AND_DISCUSSION.docx
+++ b/docs/FINAL MANUSCRIPT/CHAPTER_4_RESULTS_AND_DISCUSSION.docx
@@ -4993,6 +4993,23 @@
           <w:sz w:val="24"/>
           <w:szCs w:val="24"/>
         </w:rPr>
+        <w:t xml:space="preserve">Asked afterwards what had gone wrong, Adyen Technical Support explained that GCash needs a specific acquirer account configuration in the test environment, and that some of its fields had probably been changed during Adyen's automatic setup flow, which broke the default configuration the payment method depends on (Adyen Technical Support, personal communication, September 27, 2026). The test environment runs on predefined configurations and does not carry out every step end to end, so a fault that live onboarding would catch appeared here as an immediate refusal. In the live environment the setup is more controlled: some steps are handled by Adyen Support, and the merchant may be asked for further details. Going live is therefore treated as a separate step (Chapter 5, Recommendation 5).</w:t>
+      </w:r>
+    </w:p>
+    <w:p>
+      <w:pPr>
+        <w:spacing w:after="0" w:before="0" w:line="480" w:lineRule="auto"/>
+        <w:ind w:firstLine="720"/>
+        <w:jc w:val="both"/>
+      </w:pPr>
+      <w:r>
+        <w:rPr>
+          <w:rFonts w:ascii="Arial" w:cs="Arial" w:eastAsia="Arial" w:hAnsi="Arial"/>
+          <w:b w:val="false"/>
+          <w:bCs w:val="false"/>
+          <w:sz w:val="24"/>
+          <w:szCs w:val="24"/>
+        </w:rPr>
         <w:t xml:space="preserve">On 26 September 2026 a test payment passed end to end:</w:t>
       </w:r>
     </w:p>
@@ -16983,7 +17000,7 @@
         </w:trPr>
         <w:tc>
           <w:tcPr>
-            <w:tcW w:type="dxa" w:w="3510"/>
+            <w:tcW w:type="dxa" w:w="3562"/>
             <w:tcBorders>
               <w:top w:val="single" w:color="1A202C" w:sz="12"/>
               <w:left w:val="none" w:color="auto" w:sz="0"/>
@@ -17017,7 +17034,7 @@
         </w:tc>
         <w:tc>
           <w:tcPr>
-            <w:tcW w:type="dxa" w:w="2565"/>
+            <w:tcW w:type="dxa" w:w="2539"/>
             <w:tcBorders>
               <w:top w:val="single" w:color="1A202C" w:sz="12"/>
               <w:left w:val="none" w:color="auto" w:sz="0"/>
@@ -17051,7 +17068,7 @@
         </w:tc>
         <w:tc>
           <w:tcPr>
-            <w:tcW w:type="dxa" w:w="2565"/>
+            <w:tcW w:type="dxa" w:w="2539"/>
             <w:tcBorders>
               <w:top w:val="single" w:color="1A202C" w:sz="12"/>
               <w:left w:val="none" w:color="auto" w:sz="0"/>
@@ -17090,7 +17107,7 @@
         </w:trPr>
         <w:tc>
           <w:tcPr>
-            <w:tcW w:type="dxa" w:w="3510"/>
+            <w:tcW w:type="dxa" w:w="3562"/>
             <w:tcBorders>
               <w:top w:val="single" w:color="E2E8F0" w:sz="4"/>
               <w:left w:val="none" w:color="auto" w:sz="0"/>
@@ -17123,30 +17140,30 @@
         </w:tc>
         <w:tc>
           <w:tcPr>
-            <w:tcW w:type="dxa" w:w="2565"/>
-            <w:tcBorders>
-              <w:top w:val="single" w:color="E2E8F0" w:sz="4"/>
-              <w:left w:val="none" w:color="auto" w:sz="0"/>
-              <w:bottom w:val="single" w:color="E2E8F0" w:sz="4"/>
-              <w:right w:val="none" w:color="auto" w:sz="0"/>
-            </w:tcBorders>
-            <w:tcMar>
-              <w:top w:type="dxa" w:w="120"/>
-              <w:left w:type="dxa" w:w="160"/>
-              <w:bottom w:type="dxa" w:w="120"/>
-              <w:right w:type="dxa" w:w="160"/>
-            </w:tcMar>
-          </w:tcPr>
-          <w:p>
-            <w:pPr>
-              <w:spacing w:line="240" w:lineRule="auto"/>
-              <w:jc w:val="left"/>
-            </w:pPr>
-          </w:p>
-        </w:tc>
-        <w:tc>
-          <w:tcPr>
-            <w:tcW w:type="dxa" w:w="2565"/>
+            <w:tcW w:type="dxa" w:w="2539"/>
+            <w:tcBorders>
+              <w:top w:val="single" w:color="E2E8F0" w:sz="4"/>
+              <w:left w:val="none" w:color="auto" w:sz="0"/>
+              <w:bottom w:val="single" w:color="E2E8F0" w:sz="4"/>
+              <w:right w:val="none" w:color="auto" w:sz="0"/>
+            </w:tcBorders>
+            <w:tcMar>
+              <w:top w:type="dxa" w:w="120"/>
+              <w:left w:type="dxa" w:w="160"/>
+              <w:bottom w:type="dxa" w:w="120"/>
+              <w:right w:type="dxa" w:w="160"/>
+            </w:tcMar>
+          </w:tcPr>
+          <w:p>
+            <w:pPr>
+              <w:spacing w:line="240" w:lineRule="auto"/>
+              <w:jc w:val="left"/>
+            </w:pPr>
+          </w:p>
+        </w:tc>
+        <w:tc>
+          <w:tcPr>
+            <w:tcW w:type="dxa" w:w="2539"/>
             <w:tcBorders>
               <w:top w:val="single" w:color="E2E8F0" w:sz="4"/>
               <w:left w:val="none" w:color="auto" w:sz="0"/>
@@ -17174,7 +17191,7 @@
         </w:trPr>
         <w:tc>
           <w:tcPr>
-            <w:tcW w:type="dxa" w:w="3510"/>
+            <w:tcW w:type="dxa" w:w="3562"/>
             <w:tcBorders>
               <w:top w:val="single" w:color="E2E8F0" w:sz="4"/>
               <w:left w:val="none" w:color="auto" w:sz="0"/>
@@ -17207,30 +17224,30 @@
         </w:tc>
         <w:tc>
           <w:tcPr>
-            <w:tcW w:type="dxa" w:w="2565"/>
-            <w:tcBorders>
-              <w:top w:val="single" w:color="E2E8F0" w:sz="4"/>
-              <w:left w:val="none" w:color="auto" w:sz="0"/>
-              <w:bottom w:val="single" w:color="E2E8F0" w:sz="4"/>
-              <w:right w:val="none" w:color="auto" w:sz="0"/>
-            </w:tcBorders>
-            <w:tcMar>
-              <w:top w:type="dxa" w:w="120"/>
-              <w:left w:type="dxa" w:w="160"/>
-              <w:bottom w:type="dxa" w:w="120"/>
-              <w:right w:type="dxa" w:w="160"/>
-            </w:tcMar>
-          </w:tcPr>
-          <w:p>
-            <w:pPr>
-              <w:spacing w:line="240" w:lineRule="auto"/>
-              <w:jc w:val="left"/>
-            </w:pPr>
-          </w:p>
-        </w:tc>
-        <w:tc>
-          <w:tcPr>
-            <w:tcW w:type="dxa" w:w="2565"/>
+            <w:tcW w:type="dxa" w:w="2539"/>
+            <w:tcBorders>
+              <w:top w:val="single" w:color="E2E8F0" w:sz="4"/>
+              <w:left w:val="none" w:color="auto" w:sz="0"/>
+              <w:bottom w:val="single" w:color="E2E8F0" w:sz="4"/>
+              <w:right w:val="none" w:color="auto" w:sz="0"/>
+            </w:tcBorders>
+            <w:tcMar>
+              <w:top w:type="dxa" w:w="120"/>
+              <w:left w:type="dxa" w:w="160"/>
+              <w:bottom w:type="dxa" w:w="120"/>
+              <w:right w:type="dxa" w:w="160"/>
+            </w:tcMar>
+          </w:tcPr>
+          <w:p>
+            <w:pPr>
+              <w:spacing w:line="240" w:lineRule="auto"/>
+              <w:jc w:val="left"/>
+            </w:pPr>
+          </w:p>
+        </w:tc>
+        <w:tc>
+          <w:tcPr>
+            <w:tcW w:type="dxa" w:w="2539"/>
             <w:tcBorders>
               <w:top w:val="single" w:color="E2E8F0" w:sz="4"/>
               <w:left w:val="none" w:color="auto" w:sz="0"/>
@@ -17258,7 +17275,7 @@
         </w:trPr>
         <w:tc>
           <w:tcPr>
-            <w:tcW w:type="dxa" w:w="3510"/>
+            <w:tcW w:type="dxa" w:w="3562"/>
             <w:tcBorders>
               <w:top w:val="single" w:color="E2E8F0" w:sz="4"/>
               <w:left w:val="none" w:color="auto" w:sz="0"/>
@@ -17291,30 +17308,30 @@
         </w:tc>
         <w:tc>
           <w:tcPr>
-            <w:tcW w:type="dxa" w:w="2565"/>
-            <w:tcBorders>
-              <w:top w:val="single" w:color="E2E8F0" w:sz="4"/>
-              <w:left w:val="none" w:color="auto" w:sz="0"/>
-              <w:bottom w:val="single" w:color="E2E8F0" w:sz="4"/>
-              <w:right w:val="none" w:color="auto" w:sz="0"/>
-            </w:tcBorders>
-            <w:tcMar>
-              <w:top w:type="dxa" w:w="120"/>
-              <w:left w:type="dxa" w:w="160"/>
-              <w:bottom w:type="dxa" w:w="120"/>
-              <w:right w:type="dxa" w:w="160"/>
-            </w:tcMar>
-          </w:tcPr>
-          <w:p>
-            <w:pPr>
-              <w:spacing w:line="240" w:lineRule="auto"/>
-              <w:jc w:val="left"/>
-            </w:pPr>
-          </w:p>
-        </w:tc>
-        <w:tc>
-          <w:tcPr>
-            <w:tcW w:type="dxa" w:w="2565"/>
+            <w:tcW w:type="dxa" w:w="2539"/>
+            <w:tcBorders>
+              <w:top w:val="single" w:color="E2E8F0" w:sz="4"/>
+              <w:left w:val="none" w:color="auto" w:sz="0"/>
+              <w:bottom w:val="single" w:color="E2E8F0" w:sz="4"/>
+              <w:right w:val="none" w:color="auto" w:sz="0"/>
+            </w:tcBorders>
+            <w:tcMar>
+              <w:top w:type="dxa" w:w="120"/>
+              <w:left w:type="dxa" w:w="160"/>
+              <w:bottom w:type="dxa" w:w="120"/>
+              <w:right w:type="dxa" w:w="160"/>
+            </w:tcMar>
+          </w:tcPr>
+          <w:p>
+            <w:pPr>
+              <w:spacing w:line="240" w:lineRule="auto"/>
+              <w:jc w:val="left"/>
+            </w:pPr>
+          </w:p>
+        </w:tc>
+        <w:tc>
+          <w:tcPr>
+            <w:tcW w:type="dxa" w:w="2539"/>
             <w:tcBorders>
               <w:top w:val="single" w:color="E2E8F0" w:sz="4"/>
               <w:left w:val="none" w:color="auto" w:sz="0"/>
@@ -17342,7 +17359,91 @@
         </w:trPr>
         <w:tc>
           <w:tcPr>
-            <w:tcW w:type="dxa" w:w="3510"/>
+            <w:tcW w:type="dxa" w:w="3562"/>
+            <w:tcBorders>
+              <w:top w:val="single" w:color="E2E8F0" w:sz="4"/>
+              <w:left w:val="none" w:color="auto" w:sz="0"/>
+              <w:bottom w:val="single" w:color="E2E8F0" w:sz="4"/>
+              <w:right w:val="none" w:color="auto" w:sz="0"/>
+            </w:tcBorders>
+            <w:tcMar>
+              <w:top w:type="dxa" w:w="120"/>
+              <w:left w:type="dxa" w:w="160"/>
+              <w:bottom w:type="dxa" w:w="120"/>
+              <w:right w:type="dxa" w:w="160"/>
+            </w:tcMar>
+          </w:tcPr>
+          <w:p>
+            <w:pPr>
+              <w:spacing w:line="240" w:lineRule="auto"/>
+              <w:jc w:val="left"/>
+            </w:pPr>
+            <w:r>
+              <w:rPr>
+                <w:rFonts w:ascii="Arial" w:cs="Arial" w:eastAsia="Arial" w:hAnsi="Arial"/>
+                <w:b w:val="false"/>
+                <w:bCs w:val="false"/>
+                <w:sz w:val="20"/>
+                <w:szCs w:val="20"/>
+              </w:rPr>
+              <w:t xml:space="preserve">Prospective tenants</w:t>
+            </w:r>
+          </w:p>
+        </w:tc>
+        <w:tc>
+          <w:tcPr>
+            <w:tcW w:type="dxa" w:w="2539"/>
+            <w:tcBorders>
+              <w:top w:val="single" w:color="E2E8F0" w:sz="4"/>
+              <w:left w:val="none" w:color="auto" w:sz="0"/>
+              <w:bottom w:val="single" w:color="E2E8F0" w:sz="4"/>
+              <w:right w:val="none" w:color="auto" w:sz="0"/>
+            </w:tcBorders>
+            <w:tcMar>
+              <w:top w:type="dxa" w:w="120"/>
+              <w:left w:type="dxa" w:w="160"/>
+              <w:bottom w:type="dxa" w:w="120"/>
+              <w:right w:type="dxa" w:w="160"/>
+            </w:tcMar>
+          </w:tcPr>
+          <w:p>
+            <w:pPr>
+              <w:spacing w:line="240" w:lineRule="auto"/>
+              <w:jc w:val="left"/>
+            </w:pPr>
+          </w:p>
+        </w:tc>
+        <w:tc>
+          <w:tcPr>
+            <w:tcW w:type="dxa" w:w="2539"/>
+            <w:tcBorders>
+              <w:top w:val="single" w:color="E2E8F0" w:sz="4"/>
+              <w:left w:val="none" w:color="auto" w:sz="0"/>
+              <w:bottom w:val="single" w:color="E2E8F0" w:sz="4"/>
+              <w:right w:val="none" w:color="auto" w:sz="0"/>
+            </w:tcBorders>
+            <w:tcMar>
+              <w:top w:type="dxa" w:w="120"/>
+              <w:left w:type="dxa" w:w="160"/>
+              <w:bottom w:type="dxa" w:w="120"/>
+              <w:right w:type="dxa" w:w="160"/>
+            </w:tcMar>
+          </w:tcPr>
+          <w:p>
+            <w:pPr>
+              <w:spacing w:line="240" w:lineRule="auto"/>
+              <w:jc w:val="left"/>
+            </w:pPr>
+          </w:p>
+        </w:tc>
+      </w:tr>
+      <w:tr>
+        <w:trPr>
+          <w:cantSplit/>
+        </w:trPr>
+        <w:tc>
+          <w:tcPr>
+            <w:tcW w:type="dxa" w:w="3562"/>
             <w:tcBorders>
               <w:top w:val="single" w:color="E2E8F0" w:sz="4"/>
               <w:left w:val="none" w:color="auto" w:sz="0"/>
@@ -17376,7 +17477,7 @@
         </w:tc>
         <w:tc>
           <w:tcPr>
-            <w:tcW w:type="dxa" w:w="2565"/>
+            <w:tcW w:type="dxa" w:w="2539"/>
             <w:tcBorders>
               <w:top w:val="single" w:color="E2E8F0" w:sz="4"/>
               <w:left w:val="none" w:color="auto" w:sz="0"/>
@@ -17400,7 +17501,7 @@
         </w:tc>
         <w:tc>
           <w:tcPr>
-            <w:tcW w:type="dxa" w:w="2565"/>
+            <w:tcW w:type="dxa" w:w="2539"/>
             <w:tcBorders>
               <w:top w:val="single" w:color="E2E8F0" w:sz="4"/>
               <w:left w:val="none" w:color="auto" w:sz="0"/>

</xml_diff>

<commit_message>
chapters: the tenant's month-by-month view (§4.2.4), the inquiry link as a capability URL (§4.4.8), Sign in with Google as future work (rec. 12)
§4.2.4: verified receipts only, voided never, GCash waiting shown apart, and a
month with no receipt is 'Nothing recorded', not owed (lib/tenantPaymentMonths.ts).
§4.4.8: 256-bit secret, SHA-256 stored, in the #fragment so no server log sees it,
reference code only with the matching phone, 30 look-ups per 15 minutes, one link
one conversation (services/inquiryThread.ts, routes/public.ts); W3C TAG capability
URLs, OWASP's 64-bit floor. Chapter 5: recommendation 12, later ones renumbered
(nothing cites 12 to 15). docx rebuilt.

Co-Authored-By: Claude Opus 5.5 <noreply@anthropic.com>
</commit_message>
<xml_diff>
--- a/docs/FINAL MANUSCRIPT/CHAPTER_4_RESULTS_AND_DISCUSSION.docx
+++ b/docs/FINAL MANUSCRIPT/CHAPTER_4_RESULTS_AND_DISCUSSION.docx
@@ -2976,6 +2976,43 @@
           <w:szCs w:val="24"/>
         </w:rPr>
         <w:t xml:space="preserve"> [SCREENSHOT PENDING]</w:t>
+      </w:r>
+    </w:p>
+    <w:p>
+      <w:pPr>
+        <w:spacing w:after="0" w:before="0" w:line="480" w:lineRule="auto"/>
+        <w:ind w:firstLine="720"/>
+        <w:jc w:val="both"/>
+      </w:pPr>
+      <w:r>
+        <w:rPr>
+          <w:rFonts w:ascii="Arial" w:cs="Arial" w:eastAsia="Arial" w:hAnsi="Arial"/>
+          <w:b w:val="false"/>
+          <w:bCs w:val="false"/>
+          <w:sz w:val="24"/>
+          <w:szCs w:val="24"/>
+        </w:rPr>
+        <w:t xml:space="preserve">Tenants follow the same record from their side. The tenant's payments page shows </w:t>
+      </w:r>
+      <w:r>
+        <w:rPr>
+          <w:rFonts w:ascii="Arial" w:cs="Arial" w:eastAsia="Arial" w:hAnsi="Arial"/>
+          <w:b/>
+          <w:bCs/>
+          <w:sz w:val="24"/>
+          <w:szCs w:val="24"/>
+        </w:rPr>
+        <w:t xml:space="preserve">"Your rent, month by month"</w:t>
+      </w:r>
+      <w:r>
+        <w:rPr>
+          <w:rFonts w:ascii="Arial" w:cs="Arial" w:eastAsia="Arial" w:hAnsi="Arial"/>
+          <w:b w:val="false"/>
+          <w:bCs w:val="false"/>
+          <w:sz w:val="24"/>
+          <w:szCs w:val="24"/>
+        </w:rPr>
+        <w:t xml:space="preserve">: one sentence stating how far their payments reach ("Paid up to …") and what is due, a bar for each of the last twelve months marked Paid, Due, Nothing recorded or Not due yet, and the months paid, the amount paid and the amount due now. Only receipts the owner has verified count as paid, the same rule behind the "paid up to" date; a voided receipt never counts, and a GCash payment still awaiting verification is listed separately as waiting. A month before the latest receipt with no receipt of its own is shown as "Nothing recorded", never as owed, because the records do not establish that it is.</w:t>
       </w:r>
     </w:p>
     <w:p>
@@ -29586,6 +29623,45 @@
     </w:p>
     <w:p>
       <w:pPr>
+        <w:spacing w:after="0" w:before="0" w:line="480" w:lineRule="auto"/>
+        <w:ind w:firstLine="720"/>
+        <w:jc w:val="both"/>
+      </w:pPr>
+      <w:r>
+        <w:rPr>
+          <w:rFonts w:ascii="Arial" w:cs="Arial" w:eastAsia="Arial" w:hAnsi="Arial"/>
+          <w:b w:val="false"/>
+          <w:bCs w:val="false"/>
+          <w:sz w:val="24"/>
+          <w:szCs w:val="24"/>
+        </w:rPr>
+        <w:t xml:space="preserve">The conversation a visitor has about an enquiry (Section 4.2.3) is reached without an account, so its link is itself the credential, what the W3C Technical Architecture Group calls a capability URL (</w:t>
+      </w:r>
+      <w:r>
+        <w:rPr>
+          <w:rFonts w:ascii="Arial" w:cs="Arial" w:eastAsia="Arial" w:hAnsi="Arial"/>
+          <w:b w:val="false"/>
+          <w:bCs w:val="false"/>
+          <w:i/>
+          <w:iCs/>
+          <w:sz w:val="24"/>
+          <w:szCs w:val="24"/>
+        </w:rPr>
+        <w:t xml:space="preserve">Good Practices for Capability URLs</w:t>
+      </w:r>
+      <w:r>
+        <w:rPr>
+          <w:rFonts w:ascii="Arial" w:cs="Arial" w:eastAsia="Arial" w:hAnsi="Arial"/>
+          <w:b w:val="false"/>
+          <w:bCs w:val="false"/>
+          <w:sz w:val="24"/>
+          <w:szCs w:val="24"/>
+        </w:rPr>
+        <w:t xml:space="preserve">). Its secret is 256 bits, well above the 64 bits OWASP recommends for session identifiers; only its SHA-256 hash is stored; and it travels in the address's #fragment, which browsers do not send to a server, so it never reaches a server log. The shorter reference code opens the conversation only together with the phone number given in the enquiry. Look-ups are rate-limited (30 per 15 minutes from one address), and each link opens one conversation only.</w:t>
+      </w:r>
+    </w:p>
+    <w:p>
+      <w:pPr>
         <w:spacing w:after="120" w:before="240" w:line="480" w:lineRule="auto"/>
         <w:jc w:val="left"/>
       </w:pPr>

</xml_diff>

<commit_message>
docs: manual, design and QA handoffs brought up to the 5 Oct changes
- Appendix K: "Your recent actions" (both Overviews), cancelling a
  repair (Submitted only, one an hour, optional reason), JPG/PNG photos,
  phone numbers spaced as typed and email checked on leaving, filters as
  dropdowns that apply at once (Filters drops them open on a phone),
  Show fewer, the move-out reason, the theme switch at the top of the
  public pages. "Apply filters" is gone from it.
- DESIGN_GUIDELINE and HANDOFF_TO_DESIGN: FilterSheet removed, what
  ListToolbar draws now.
- HANDOFF_TO_QA §0a: the Filters, Show as and Order rows say "applies at
  once"; eight new rows for what to test, with loydtest only, and never a
  move-out on a real tenant (B-100).
- Chapter 4 .docx regenerated (Table 23's action-history row).

check:canon, check:copies, check:rules, check:matrix pass.

Co-Authored-By: Claude Opus 5.5 <noreply@anthropic.com>
</commit_message>
<xml_diff>
--- a/docs/FINAL MANUSCRIPT/CHAPTER_4_RESULTS_AND_DISCUSSION.docx
+++ b/docs/FINAL MANUSCRIPT/CHAPTER_4_RESULTS_AND_DISCUSSION.docx
@@ -34702,7 +34702,7 @@
         </w:trPr>
         <w:tc>
           <w:tcPr>
-            <w:tcW w:type="dxa" w:w="1530"/>
+            <w:tcW w:type="dxa" w:w="1526"/>
             <w:tcBorders>
               <w:top w:val="single" w:color="1A202C" w:sz="12"/>
               <w:left w:val="none" w:color="auto" w:sz="0"/>
@@ -34736,7 +34736,7 @@
         </w:tc>
         <w:tc>
           <w:tcPr>
-            <w:tcW w:type="dxa" w:w="2796"/>
+            <w:tcW w:type="dxa" w:w="2789"/>
             <w:tcBorders>
               <w:top w:val="single" w:color="1A202C" w:sz="12"/>
               <w:left w:val="none" w:color="auto" w:sz="0"/>
@@ -34770,7 +34770,7 @@
         </w:tc>
         <w:tc>
           <w:tcPr>
-            <w:tcW w:type="dxa" w:w="3032"/>
+            <w:tcW w:type="dxa" w:w="3042"/>
             <w:tcBorders>
               <w:top w:val="single" w:color="1A202C" w:sz="12"/>
               <w:left w:val="none" w:color="auto" w:sz="0"/>
@@ -34804,7 +34804,7 @@
         </w:tc>
         <w:tc>
           <w:tcPr>
-            <w:tcW w:type="dxa" w:w="1282"/>
+            <w:tcW w:type="dxa" w:w="1283"/>
             <w:tcBorders>
               <w:top w:val="single" w:color="1A202C" w:sz="12"/>
               <w:left w:val="none" w:color="auto" w:sz="0"/>
@@ -34843,7 +34843,7 @@
         </w:trPr>
         <w:tc>
           <w:tcPr>
-            <w:tcW w:type="dxa" w:w="1530"/>
+            <w:tcW w:type="dxa" w:w="1526"/>
             <w:tcBorders>
               <w:top w:val="single" w:color="E2E8F0" w:sz="4"/>
               <w:left w:val="none" w:color="auto" w:sz="0"/>
@@ -34876,7 +34876,7 @@
         </w:tc>
         <w:tc>
           <w:tcPr>
-            <w:tcW w:type="dxa" w:w="2796"/>
+            <w:tcW w:type="dxa" w:w="2789"/>
             <w:tcBorders>
               <w:top w:val="single" w:color="E2E8F0" w:sz="4"/>
               <w:left w:val="none" w:color="auto" w:sz="0"/>
@@ -34909,7 +34909,7 @@
         </w:tc>
         <w:tc>
           <w:tcPr>
-            <w:tcW w:type="dxa" w:w="3032"/>
+            <w:tcW w:type="dxa" w:w="3042"/>
             <w:tcBorders>
               <w:top w:val="single" w:color="E2E8F0" w:sz="4"/>
               <w:left w:val="none" w:color="auto" w:sz="0"/>
@@ -34942,7 +34942,7 @@
         </w:tc>
         <w:tc>
           <w:tcPr>
-            <w:tcW w:type="dxa" w:w="1282"/>
+            <w:tcW w:type="dxa" w:w="1283"/>
             <w:tcBorders>
               <w:top w:val="single" w:color="E2E8F0" w:sz="4"/>
               <w:left w:val="none" w:color="auto" w:sz="0"/>
@@ -34980,7 +34980,7 @@
         </w:trPr>
         <w:tc>
           <w:tcPr>
-            <w:tcW w:type="dxa" w:w="1530"/>
+            <w:tcW w:type="dxa" w:w="1526"/>
             <w:tcBorders>
               <w:top w:val="single" w:color="E2E8F0" w:sz="4"/>
               <w:left w:val="none" w:color="auto" w:sz="0"/>
@@ -35013,7 +35013,7 @@
         </w:tc>
         <w:tc>
           <w:tcPr>
-            <w:tcW w:type="dxa" w:w="2796"/>
+            <w:tcW w:type="dxa" w:w="2789"/>
             <w:tcBorders>
               <w:top w:val="single" w:color="E2E8F0" w:sz="4"/>
               <w:left w:val="none" w:color="auto" w:sz="0"/>
@@ -35046,7 +35046,7 @@
         </w:tc>
         <w:tc>
           <w:tcPr>
-            <w:tcW w:type="dxa" w:w="3032"/>
+            <w:tcW w:type="dxa" w:w="3042"/>
             <w:tcBorders>
               <w:top w:val="single" w:color="E2E8F0" w:sz="4"/>
               <w:left w:val="none" w:color="auto" w:sz="0"/>
@@ -35079,7 +35079,7 @@
         </w:tc>
         <w:tc>
           <w:tcPr>
-            <w:tcW w:type="dxa" w:w="1282"/>
+            <w:tcW w:type="dxa" w:w="1283"/>
             <w:tcBorders>
               <w:top w:val="single" w:color="E2E8F0" w:sz="4"/>
               <w:left w:val="none" w:color="auto" w:sz="0"/>
@@ -35117,7 +35117,7 @@
         </w:trPr>
         <w:tc>
           <w:tcPr>
-            <w:tcW w:type="dxa" w:w="1530"/>
+            <w:tcW w:type="dxa" w:w="1526"/>
             <w:tcBorders>
               <w:top w:val="single" w:color="E2E8F0" w:sz="4"/>
               <w:left w:val="none" w:color="auto" w:sz="0"/>
@@ -35150,7 +35150,7 @@
         </w:tc>
         <w:tc>
           <w:tcPr>
-            <w:tcW w:type="dxa" w:w="2796"/>
+            <w:tcW w:type="dxa" w:w="2789"/>
             <w:tcBorders>
               <w:top w:val="single" w:color="E2E8F0" w:sz="4"/>
               <w:left w:val="none" w:color="auto" w:sz="0"/>
@@ -35183,7 +35183,7 @@
         </w:tc>
         <w:tc>
           <w:tcPr>
-            <w:tcW w:type="dxa" w:w="3032"/>
+            <w:tcW w:type="dxa" w:w="3042"/>
             <w:tcBorders>
               <w:top w:val="single" w:color="E2E8F0" w:sz="4"/>
               <w:left w:val="none" w:color="auto" w:sz="0"/>
@@ -35216,7 +35216,7 @@
         </w:tc>
         <w:tc>
           <w:tcPr>
-            <w:tcW w:type="dxa" w:w="1282"/>
+            <w:tcW w:type="dxa" w:w="1283"/>
             <w:tcBorders>
               <w:top w:val="single" w:color="E2E8F0" w:sz="4"/>
               <w:left w:val="none" w:color="auto" w:sz="0"/>
@@ -35254,7 +35254,7 @@
         </w:trPr>
         <w:tc>
           <w:tcPr>
-            <w:tcW w:type="dxa" w:w="1530"/>
+            <w:tcW w:type="dxa" w:w="1526"/>
             <w:tcBorders>
               <w:top w:val="single" w:color="E2E8F0" w:sz="4"/>
               <w:left w:val="none" w:color="auto" w:sz="0"/>
@@ -35287,7 +35287,7 @@
         </w:tc>
         <w:tc>
           <w:tcPr>
-            <w:tcW w:type="dxa" w:w="2796"/>
+            <w:tcW w:type="dxa" w:w="2789"/>
             <w:tcBorders>
               <w:top w:val="single" w:color="E2E8F0" w:sz="4"/>
               <w:left w:val="none" w:color="auto" w:sz="0"/>
@@ -35320,7 +35320,7 @@
         </w:tc>
         <w:tc>
           <w:tcPr>
-            <w:tcW w:type="dxa" w:w="3032"/>
+            <w:tcW w:type="dxa" w:w="3042"/>
             <w:tcBorders>
               <w:top w:val="single" w:color="E2E8F0" w:sz="4"/>
               <w:left w:val="none" w:color="auto" w:sz="0"/>
@@ -35353,7 +35353,7 @@
         </w:tc>
         <w:tc>
           <w:tcPr>
-            <w:tcW w:type="dxa" w:w="1282"/>
+            <w:tcW w:type="dxa" w:w="1283"/>
             <w:tcBorders>
               <w:top w:val="single" w:color="E2E8F0" w:sz="4"/>
               <w:left w:val="none" w:color="auto" w:sz="0"/>
@@ -35391,7 +35391,7 @@
         </w:trPr>
         <w:tc>
           <w:tcPr>
-            <w:tcW w:type="dxa" w:w="1530"/>
+            <w:tcW w:type="dxa" w:w="1526"/>
             <w:tcBorders>
               <w:top w:val="single" w:color="E2E8F0" w:sz="4"/>
               <w:left w:val="none" w:color="auto" w:sz="0"/>
@@ -35424,7 +35424,7 @@
         </w:tc>
         <w:tc>
           <w:tcPr>
-            <w:tcW w:type="dxa" w:w="2796"/>
+            <w:tcW w:type="dxa" w:w="2789"/>
             <w:tcBorders>
               <w:top w:val="single" w:color="E2E8F0" w:sz="4"/>
               <w:left w:val="none" w:color="auto" w:sz="0"/>
@@ -35457,7 +35457,7 @@
         </w:tc>
         <w:tc>
           <w:tcPr>
-            <w:tcW w:type="dxa" w:w="3032"/>
+            <w:tcW w:type="dxa" w:w="3042"/>
             <w:tcBorders>
               <w:top w:val="single" w:color="E2E8F0" w:sz="4"/>
               <w:left w:val="none" w:color="auto" w:sz="0"/>
@@ -35490,7 +35490,7 @@
         </w:tc>
         <w:tc>
           <w:tcPr>
-            <w:tcW w:type="dxa" w:w="1282"/>
+            <w:tcW w:type="dxa" w:w="1283"/>
             <w:tcBorders>
               <w:top w:val="single" w:color="E2E8F0" w:sz="4"/>
               <w:left w:val="none" w:color="auto" w:sz="0"/>
@@ -35528,7 +35528,7 @@
         </w:trPr>
         <w:tc>
           <w:tcPr>
-            <w:tcW w:type="dxa" w:w="1530"/>
+            <w:tcW w:type="dxa" w:w="1526"/>
             <w:tcBorders>
               <w:top w:val="single" w:color="E2E8F0" w:sz="4"/>
               <w:left w:val="none" w:color="auto" w:sz="0"/>
@@ -35561,7 +35561,7 @@
         </w:tc>
         <w:tc>
           <w:tcPr>
-            <w:tcW w:type="dxa" w:w="2796"/>
+            <w:tcW w:type="dxa" w:w="2789"/>
             <w:tcBorders>
               <w:top w:val="single" w:color="E2E8F0" w:sz="4"/>
               <w:left w:val="none" w:color="auto" w:sz="0"/>
@@ -35594,7 +35594,7 @@
         </w:tc>
         <w:tc>
           <w:tcPr>
-            <w:tcW w:type="dxa" w:w="3032"/>
+            <w:tcW w:type="dxa" w:w="3042"/>
             <w:tcBorders>
               <w:top w:val="single" w:color="E2E8F0" w:sz="4"/>
               <w:left w:val="none" w:color="auto" w:sz="0"/>
@@ -35627,7 +35627,7 @@
         </w:tc>
         <w:tc>
           <w:tcPr>
-            <w:tcW w:type="dxa" w:w="1282"/>
+            <w:tcW w:type="dxa" w:w="1283"/>
             <w:tcBorders>
               <w:top w:val="single" w:color="E2E8F0" w:sz="4"/>
               <w:left w:val="none" w:color="auto" w:sz="0"/>
@@ -35665,7 +35665,7 @@
         </w:trPr>
         <w:tc>
           <w:tcPr>
-            <w:tcW w:type="dxa" w:w="1530"/>
+            <w:tcW w:type="dxa" w:w="1526"/>
             <w:tcBorders>
               <w:top w:val="single" w:color="E2E8F0" w:sz="4"/>
               <w:left w:val="none" w:color="auto" w:sz="0"/>
@@ -35698,7 +35698,7 @@
         </w:tc>
         <w:tc>
           <w:tcPr>
-            <w:tcW w:type="dxa" w:w="2796"/>
+            <w:tcW w:type="dxa" w:w="2789"/>
             <w:tcBorders>
               <w:top w:val="single" w:color="E2E8F0" w:sz="4"/>
               <w:left w:val="none" w:color="auto" w:sz="0"/>
@@ -35731,7 +35731,7 @@
         </w:tc>
         <w:tc>
           <w:tcPr>
-            <w:tcW w:type="dxa" w:w="3032"/>
+            <w:tcW w:type="dxa" w:w="3042"/>
             <w:tcBorders>
               <w:top w:val="single" w:color="E2E8F0" w:sz="4"/>
               <w:left w:val="none" w:color="auto" w:sz="0"/>
@@ -35764,7 +35764,7 @@
         </w:tc>
         <w:tc>
           <w:tcPr>
-            <w:tcW w:type="dxa" w:w="1282"/>
+            <w:tcW w:type="dxa" w:w="1283"/>
             <w:tcBorders>
               <w:top w:val="single" w:color="E2E8F0" w:sz="4"/>
               <w:left w:val="none" w:color="auto" w:sz="0"/>
@@ -35802,7 +35802,7 @@
         </w:trPr>
         <w:tc>
           <w:tcPr>
-            <w:tcW w:type="dxa" w:w="1530"/>
+            <w:tcW w:type="dxa" w:w="1526"/>
             <w:tcBorders>
               <w:top w:val="single" w:color="E2E8F0" w:sz="4"/>
               <w:left w:val="none" w:color="auto" w:sz="0"/>
@@ -35835,7 +35835,7 @@
         </w:tc>
         <w:tc>
           <w:tcPr>
-            <w:tcW w:type="dxa" w:w="2796"/>
+            <w:tcW w:type="dxa" w:w="2789"/>
             <w:tcBorders>
               <w:top w:val="single" w:color="E2E8F0" w:sz="4"/>
               <w:left w:val="none" w:color="auto" w:sz="0"/>
@@ -35868,7 +35868,7 @@
         </w:tc>
         <w:tc>
           <w:tcPr>
-            <w:tcW w:type="dxa" w:w="3032"/>
+            <w:tcW w:type="dxa" w:w="3042"/>
             <w:tcBorders>
               <w:top w:val="single" w:color="E2E8F0" w:sz="4"/>
               <w:left w:val="none" w:color="auto" w:sz="0"/>
@@ -35901,7 +35901,7 @@
         </w:tc>
         <w:tc>
           <w:tcPr>
-            <w:tcW w:type="dxa" w:w="1282"/>
+            <w:tcW w:type="dxa" w:w="1283"/>
             <w:tcBorders>
               <w:top w:val="single" w:color="E2E8F0" w:sz="4"/>
               <w:left w:val="none" w:color="auto" w:sz="0"/>
@@ -35939,7 +35939,7 @@
         </w:trPr>
         <w:tc>
           <w:tcPr>
-            <w:tcW w:type="dxa" w:w="1530"/>
+            <w:tcW w:type="dxa" w:w="1526"/>
             <w:tcBorders>
               <w:top w:val="single" w:color="E2E8F0" w:sz="4"/>
               <w:left w:val="none" w:color="auto" w:sz="0"/>
@@ -35972,7 +35972,7 @@
         </w:tc>
         <w:tc>
           <w:tcPr>
-            <w:tcW w:type="dxa" w:w="2796"/>
+            <w:tcW w:type="dxa" w:w="2789"/>
             <w:tcBorders>
               <w:top w:val="single" w:color="E2E8F0" w:sz="4"/>
               <w:left w:val="none" w:color="auto" w:sz="0"/>
@@ -36005,7 +36005,7 @@
         </w:tc>
         <w:tc>
           <w:tcPr>
-            <w:tcW w:type="dxa" w:w="3032"/>
+            <w:tcW w:type="dxa" w:w="3042"/>
             <w:tcBorders>
               <w:top w:val="single" w:color="E2E8F0" w:sz="4"/>
               <w:left w:val="none" w:color="auto" w:sz="0"/>
@@ -36038,7 +36038,7 @@
         </w:tc>
         <w:tc>
           <w:tcPr>
-            <w:tcW w:type="dxa" w:w="1282"/>
+            <w:tcW w:type="dxa" w:w="1283"/>
             <w:tcBorders>
               <w:top w:val="single" w:color="E2E8F0" w:sz="4"/>
               <w:left w:val="none" w:color="auto" w:sz="0"/>
@@ -36076,7 +36076,7 @@
         </w:trPr>
         <w:tc>
           <w:tcPr>
-            <w:tcW w:type="dxa" w:w="1530"/>
+            <w:tcW w:type="dxa" w:w="1526"/>
             <w:tcBorders>
               <w:top w:val="single" w:color="E2E8F0" w:sz="4"/>
               <w:left w:val="none" w:color="auto" w:sz="0"/>
@@ -36109,7 +36109,7 @@
         </w:tc>
         <w:tc>
           <w:tcPr>
-            <w:tcW w:type="dxa" w:w="2796"/>
+            <w:tcW w:type="dxa" w:w="2789"/>
             <w:tcBorders>
               <w:top w:val="single" w:color="E2E8F0" w:sz="4"/>
               <w:left w:val="none" w:color="auto" w:sz="0"/>
@@ -36142,7 +36142,7 @@
         </w:tc>
         <w:tc>
           <w:tcPr>
-            <w:tcW w:type="dxa" w:w="3032"/>
+            <w:tcW w:type="dxa" w:w="3042"/>
             <w:tcBorders>
               <w:top w:val="single" w:color="E2E8F0" w:sz="4"/>
               <w:left w:val="none" w:color="auto" w:sz="0"/>
@@ -36175,7 +36175,7 @@
         </w:tc>
         <w:tc>
           <w:tcPr>
-            <w:tcW w:type="dxa" w:w="1282"/>
+            <w:tcW w:type="dxa" w:w="1283"/>
             <w:tcBorders>
               <w:top w:val="single" w:color="E2E8F0" w:sz="4"/>
               <w:left w:val="none" w:color="auto" w:sz="0"/>
@@ -36213,7 +36213,7 @@
         </w:trPr>
         <w:tc>
           <w:tcPr>
-            <w:tcW w:type="dxa" w:w="1530"/>
+            <w:tcW w:type="dxa" w:w="1526"/>
             <w:tcBorders>
               <w:top w:val="single" w:color="E2E8F0" w:sz="4"/>
               <w:left w:val="none" w:color="auto" w:sz="0"/>
@@ -36246,7 +36246,7 @@
         </w:tc>
         <w:tc>
           <w:tcPr>
-            <w:tcW w:type="dxa" w:w="2796"/>
+            <w:tcW w:type="dxa" w:w="2789"/>
             <w:tcBorders>
               <w:top w:val="single" w:color="E2E8F0" w:sz="4"/>
               <w:left w:val="none" w:color="auto" w:sz="0"/>
@@ -36279,7 +36279,7 @@
         </w:tc>
         <w:tc>
           <w:tcPr>
-            <w:tcW w:type="dxa" w:w="3032"/>
+            <w:tcW w:type="dxa" w:w="3042"/>
             <w:tcBorders>
               <w:top w:val="single" w:color="E2E8F0" w:sz="4"/>
               <w:left w:val="none" w:color="auto" w:sz="0"/>
@@ -36312,7 +36312,7 @@
         </w:tc>
         <w:tc>
           <w:tcPr>
-            <w:tcW w:type="dxa" w:w="1282"/>
+            <w:tcW w:type="dxa" w:w="1283"/>
             <w:tcBorders>
               <w:top w:val="single" w:color="E2E8F0" w:sz="4"/>
               <w:left w:val="none" w:color="auto" w:sz="0"/>
@@ -36350,7 +36350,7 @@
         </w:trPr>
         <w:tc>
           <w:tcPr>
-            <w:tcW w:type="dxa" w:w="1530"/>
+            <w:tcW w:type="dxa" w:w="1526"/>
             <w:tcBorders>
               <w:top w:val="single" w:color="E2E8F0" w:sz="4"/>
               <w:left w:val="none" w:color="auto" w:sz="0"/>
@@ -36383,7 +36383,7 @@
         </w:tc>
         <w:tc>
           <w:tcPr>
-            <w:tcW w:type="dxa" w:w="2796"/>
+            <w:tcW w:type="dxa" w:w="2789"/>
             <w:tcBorders>
               <w:top w:val="single" w:color="E2E8F0" w:sz="4"/>
               <w:left w:val="none" w:color="auto" w:sz="0"/>
@@ -36416,7 +36416,7 @@
         </w:tc>
         <w:tc>
           <w:tcPr>
-            <w:tcW w:type="dxa" w:w="3032"/>
+            <w:tcW w:type="dxa" w:w="3042"/>
             <w:tcBorders>
               <w:top w:val="single" w:color="E2E8F0" w:sz="4"/>
               <w:left w:val="none" w:color="auto" w:sz="0"/>
@@ -36449,7 +36449,7 @@
         </w:tc>
         <w:tc>
           <w:tcPr>
-            <w:tcW w:type="dxa" w:w="1282"/>
+            <w:tcW w:type="dxa" w:w="1283"/>
             <w:tcBorders>
               <w:top w:val="single" w:color="E2E8F0" w:sz="4"/>
               <w:left w:val="none" w:color="auto" w:sz="0"/>
@@ -36487,7 +36487,7 @@
         </w:trPr>
         <w:tc>
           <w:tcPr>
-            <w:tcW w:type="dxa" w:w="1530"/>
+            <w:tcW w:type="dxa" w:w="1526"/>
             <w:tcBorders>
               <w:top w:val="single" w:color="E2E8F0" w:sz="4"/>
               <w:left w:val="none" w:color="auto" w:sz="0"/>
@@ -36520,7 +36520,7 @@
         </w:tc>
         <w:tc>
           <w:tcPr>
-            <w:tcW w:type="dxa" w:w="2796"/>
+            <w:tcW w:type="dxa" w:w="2789"/>
             <w:tcBorders>
               <w:top w:val="single" w:color="E2E8F0" w:sz="4"/>
               <w:left w:val="none" w:color="auto" w:sz="0"/>
@@ -36553,7 +36553,7 @@
         </w:tc>
         <w:tc>
           <w:tcPr>
-            <w:tcW w:type="dxa" w:w="3032"/>
+            <w:tcW w:type="dxa" w:w="3042"/>
             <w:tcBorders>
               <w:top w:val="single" w:color="E2E8F0" w:sz="4"/>
               <w:left w:val="none" w:color="auto" w:sz="0"/>
@@ -36586,7 +36586,7 @@
         </w:tc>
         <w:tc>
           <w:tcPr>
-            <w:tcW w:type="dxa" w:w="1282"/>
+            <w:tcW w:type="dxa" w:w="1283"/>
             <w:tcBorders>
               <w:top w:val="single" w:color="E2E8F0" w:sz="4"/>
               <w:left w:val="none" w:color="auto" w:sz="0"/>
@@ -36624,7 +36624,7 @@
         </w:trPr>
         <w:tc>
           <w:tcPr>
-            <w:tcW w:type="dxa" w:w="1530"/>
+            <w:tcW w:type="dxa" w:w="1526"/>
             <w:tcBorders>
               <w:top w:val="single" w:color="E2E8F0" w:sz="4"/>
               <w:left w:val="none" w:color="auto" w:sz="0"/>
@@ -36657,7 +36657,7 @@
         </w:tc>
         <w:tc>
           <w:tcPr>
-            <w:tcW w:type="dxa" w:w="2796"/>
+            <w:tcW w:type="dxa" w:w="2789"/>
             <w:tcBorders>
               <w:top w:val="single" w:color="E2E8F0" w:sz="4"/>
               <w:left w:val="none" w:color="auto" w:sz="0"/>
@@ -36690,7 +36690,7 @@
         </w:tc>
         <w:tc>
           <w:tcPr>
-            <w:tcW w:type="dxa" w:w="3032"/>
+            <w:tcW w:type="dxa" w:w="3042"/>
             <w:tcBorders>
               <w:top w:val="single" w:color="E2E8F0" w:sz="4"/>
               <w:left w:val="none" w:color="auto" w:sz="0"/>
@@ -36723,7 +36723,7 @@
         </w:tc>
         <w:tc>
           <w:tcPr>
-            <w:tcW w:type="dxa" w:w="1282"/>
+            <w:tcW w:type="dxa" w:w="1283"/>
             <w:tcBorders>
               <w:top w:val="single" w:color="E2E8F0" w:sz="4"/>
               <w:left w:val="none" w:color="auto" w:sz="0"/>
@@ -36761,7 +36761,7 @@
         </w:trPr>
         <w:tc>
           <w:tcPr>
-            <w:tcW w:type="dxa" w:w="1530"/>
+            <w:tcW w:type="dxa" w:w="1526"/>
             <w:tcBorders>
               <w:top w:val="single" w:color="E2E8F0" w:sz="4"/>
               <w:left w:val="none" w:color="auto" w:sz="0"/>
@@ -36794,7 +36794,7 @@
         </w:tc>
         <w:tc>
           <w:tcPr>
-            <w:tcW w:type="dxa" w:w="2796"/>
+            <w:tcW w:type="dxa" w:w="2789"/>
             <w:tcBorders>
               <w:top w:val="single" w:color="E2E8F0" w:sz="4"/>
               <w:left w:val="none" w:color="auto" w:sz="0"/>
@@ -36827,7 +36827,7 @@
         </w:tc>
         <w:tc>
           <w:tcPr>
-            <w:tcW w:type="dxa" w:w="3032"/>
+            <w:tcW w:type="dxa" w:w="3042"/>
             <w:tcBorders>
               <w:top w:val="single" w:color="E2E8F0" w:sz="4"/>
               <w:left w:val="none" w:color="auto" w:sz="0"/>
@@ -36860,7 +36860,7 @@
         </w:tc>
         <w:tc>
           <w:tcPr>
-            <w:tcW w:type="dxa" w:w="1282"/>
+            <w:tcW w:type="dxa" w:w="1283"/>
             <w:tcBorders>
               <w:top w:val="single" w:color="E2E8F0" w:sz="4"/>
               <w:left w:val="none" w:color="auto" w:sz="0"/>
@@ -36898,7 +36898,7 @@
         </w:trPr>
         <w:tc>
           <w:tcPr>
-            <w:tcW w:type="dxa" w:w="1530"/>
+            <w:tcW w:type="dxa" w:w="1526"/>
             <w:tcBorders>
               <w:top w:val="single" w:color="E2E8F0" w:sz="4"/>
               <w:left w:val="none" w:color="auto" w:sz="0"/>
@@ -36931,7 +36931,7 @@
         </w:tc>
         <w:tc>
           <w:tcPr>
-            <w:tcW w:type="dxa" w:w="2796"/>
+            <w:tcW w:type="dxa" w:w="2789"/>
             <w:tcBorders>
               <w:top w:val="single" w:color="E2E8F0" w:sz="4"/>
               <w:left w:val="none" w:color="auto" w:sz="0"/>
@@ -36964,7 +36964,7 @@
         </w:tc>
         <w:tc>
           <w:tcPr>
-            <w:tcW w:type="dxa" w:w="3032"/>
+            <w:tcW w:type="dxa" w:w="3042"/>
             <w:tcBorders>
               <w:top w:val="single" w:color="E2E8F0" w:sz="4"/>
               <w:left w:val="none" w:color="auto" w:sz="0"/>
@@ -36997,7 +36997,7 @@
         </w:tc>
         <w:tc>
           <w:tcPr>
-            <w:tcW w:type="dxa" w:w="1282"/>
+            <w:tcW w:type="dxa" w:w="1283"/>
             <w:tcBorders>
               <w:top w:val="single" w:color="E2E8F0" w:sz="4"/>
               <w:left w:val="none" w:color="auto" w:sz="0"/>
@@ -37035,7 +37035,7 @@
         </w:trPr>
         <w:tc>
           <w:tcPr>
-            <w:tcW w:type="dxa" w:w="1530"/>
+            <w:tcW w:type="dxa" w:w="1526"/>
             <w:tcBorders>
               <w:top w:val="single" w:color="E2E8F0" w:sz="4"/>
               <w:left w:val="none" w:color="auto" w:sz="0"/>
@@ -37068,7 +37068,7 @@
         </w:tc>
         <w:tc>
           <w:tcPr>
-            <w:tcW w:type="dxa" w:w="2796"/>
+            <w:tcW w:type="dxa" w:w="2789"/>
             <w:tcBorders>
               <w:top w:val="single" w:color="E2E8F0" w:sz="4"/>
               <w:left w:val="none" w:color="auto" w:sz="0"/>
@@ -37101,7 +37101,7 @@
         </w:tc>
         <w:tc>
           <w:tcPr>
-            <w:tcW w:type="dxa" w:w="3032"/>
+            <w:tcW w:type="dxa" w:w="3042"/>
             <w:tcBorders>
               <w:top w:val="single" w:color="E2E8F0" w:sz="4"/>
               <w:left w:val="none" w:color="auto" w:sz="0"/>
@@ -37134,7 +37134,7 @@
         </w:tc>
         <w:tc>
           <w:tcPr>
-            <w:tcW w:type="dxa" w:w="1282"/>
+            <w:tcW w:type="dxa" w:w="1283"/>
             <w:tcBorders>
               <w:top w:val="single" w:color="E2E8F0" w:sz="4"/>
               <w:left w:val="none" w:color="auto" w:sz="0"/>
@@ -37172,7 +37172,7 @@
         </w:trPr>
         <w:tc>
           <w:tcPr>
-            <w:tcW w:type="dxa" w:w="1530"/>
+            <w:tcW w:type="dxa" w:w="1526"/>
             <w:tcBorders>
               <w:top w:val="single" w:color="E2E8F0" w:sz="4"/>
               <w:left w:val="none" w:color="auto" w:sz="0"/>
@@ -37205,7 +37205,7 @@
         </w:tc>
         <w:tc>
           <w:tcPr>
-            <w:tcW w:type="dxa" w:w="2796"/>
+            <w:tcW w:type="dxa" w:w="2789"/>
             <w:tcBorders>
               <w:top w:val="single" w:color="E2E8F0" w:sz="4"/>
               <w:left w:val="none" w:color="auto" w:sz="0"/>
@@ -37238,7 +37238,7 @@
         </w:tc>
         <w:tc>
           <w:tcPr>
-            <w:tcW w:type="dxa" w:w="3032"/>
+            <w:tcW w:type="dxa" w:w="3042"/>
             <w:tcBorders>
               <w:top w:val="single" w:color="E2E8F0" w:sz="4"/>
               <w:left w:val="none" w:color="auto" w:sz="0"/>
@@ -37271,7 +37271,7 @@
         </w:tc>
         <w:tc>
           <w:tcPr>
-            <w:tcW w:type="dxa" w:w="1282"/>
+            <w:tcW w:type="dxa" w:w="1283"/>
             <w:tcBorders>
               <w:top w:val="single" w:color="E2E8F0" w:sz="4"/>
               <w:left w:val="none" w:color="auto" w:sz="0"/>
@@ -37309,7 +37309,7 @@
         </w:trPr>
         <w:tc>
           <w:tcPr>
-            <w:tcW w:type="dxa" w:w="1530"/>
+            <w:tcW w:type="dxa" w:w="1526"/>
             <w:tcBorders>
               <w:top w:val="single" w:color="E2E8F0" w:sz="4"/>
               <w:left w:val="none" w:color="auto" w:sz="0"/>
@@ -37342,7 +37342,7 @@
         </w:tc>
         <w:tc>
           <w:tcPr>
-            <w:tcW w:type="dxa" w:w="2796"/>
+            <w:tcW w:type="dxa" w:w="2789"/>
             <w:tcBorders>
               <w:top w:val="single" w:color="E2E8F0" w:sz="4"/>
               <w:left w:val="none" w:color="auto" w:sz="0"/>
@@ -37375,7 +37375,7 @@
         </w:tc>
         <w:tc>
           <w:tcPr>
-            <w:tcW w:type="dxa" w:w="3032"/>
+            <w:tcW w:type="dxa" w:w="3042"/>
             <w:tcBorders>
               <w:top w:val="single" w:color="E2E8F0" w:sz="4"/>
               <w:left w:val="none" w:color="auto" w:sz="0"/>
@@ -37408,7 +37408,7 @@
         </w:tc>
         <w:tc>
           <w:tcPr>
-            <w:tcW w:type="dxa" w:w="1282"/>
+            <w:tcW w:type="dxa" w:w="1283"/>
             <w:tcBorders>
               <w:top w:val="single" w:color="E2E8F0" w:sz="4"/>
               <w:left w:val="none" w:color="auto" w:sz="0"/>
@@ -37446,7 +37446,7 @@
         </w:trPr>
         <w:tc>
           <w:tcPr>
-            <w:tcW w:type="dxa" w:w="1530"/>
+            <w:tcW w:type="dxa" w:w="1526"/>
             <w:tcBorders>
               <w:top w:val="single" w:color="E2E8F0" w:sz="4"/>
               <w:left w:val="none" w:color="auto" w:sz="0"/>
@@ -37479,7 +37479,7 @@
         </w:tc>
         <w:tc>
           <w:tcPr>
-            <w:tcW w:type="dxa" w:w="2796"/>
+            <w:tcW w:type="dxa" w:w="2789"/>
             <w:tcBorders>
               <w:top w:val="single" w:color="E2E8F0" w:sz="4"/>
               <w:left w:val="none" w:color="auto" w:sz="0"/>
@@ -37512,7 +37512,7 @@
         </w:tc>
         <w:tc>
           <w:tcPr>
-            <w:tcW w:type="dxa" w:w="3032"/>
+            <w:tcW w:type="dxa" w:w="3042"/>
             <w:tcBorders>
               <w:top w:val="single" w:color="E2E8F0" w:sz="4"/>
               <w:left w:val="none" w:color="auto" w:sz="0"/>
@@ -37545,7 +37545,7 @@
         </w:tc>
         <w:tc>
           <w:tcPr>
-            <w:tcW w:type="dxa" w:w="1282"/>
+            <w:tcW w:type="dxa" w:w="1283"/>
             <w:tcBorders>
               <w:top w:val="single" w:color="E2E8F0" w:sz="4"/>
               <w:left w:val="none" w:color="auto" w:sz="0"/>
@@ -37583,7 +37583,7 @@
         </w:trPr>
         <w:tc>
           <w:tcPr>
-            <w:tcW w:type="dxa" w:w="1530"/>
+            <w:tcW w:type="dxa" w:w="1526"/>
             <w:tcBorders>
               <w:top w:val="single" w:color="E2E8F0" w:sz="4"/>
               <w:left w:val="none" w:color="auto" w:sz="0"/>
@@ -37616,7 +37616,7 @@
         </w:tc>
         <w:tc>
           <w:tcPr>
-            <w:tcW w:type="dxa" w:w="2796"/>
+            <w:tcW w:type="dxa" w:w="2789"/>
             <w:tcBorders>
               <w:top w:val="single" w:color="E2E8F0" w:sz="4"/>
               <w:left w:val="none" w:color="auto" w:sz="0"/>
@@ -37649,7 +37649,7 @@
         </w:tc>
         <w:tc>
           <w:tcPr>
-            <w:tcW w:type="dxa" w:w="3032"/>
+            <w:tcW w:type="dxa" w:w="3042"/>
             <w:tcBorders>
               <w:top w:val="single" w:color="E2E8F0" w:sz="4"/>
               <w:left w:val="none" w:color="auto" w:sz="0"/>
@@ -37682,7 +37682,7 @@
         </w:tc>
         <w:tc>
           <w:tcPr>
-            <w:tcW w:type="dxa" w:w="1282"/>
+            <w:tcW w:type="dxa" w:w="1283"/>
             <w:tcBorders>
               <w:top w:val="single" w:color="E2E8F0" w:sz="4"/>
               <w:left w:val="none" w:color="auto" w:sz="0"/>
@@ -37720,7 +37720,7 @@
         </w:trPr>
         <w:tc>
           <w:tcPr>
-            <w:tcW w:type="dxa" w:w="1530"/>
+            <w:tcW w:type="dxa" w:w="1526"/>
             <w:tcBorders>
               <w:top w:val="single" w:color="E2E8F0" w:sz="4"/>
               <w:left w:val="none" w:color="auto" w:sz="0"/>
@@ -37753,7 +37753,7 @@
         </w:tc>
         <w:tc>
           <w:tcPr>
-            <w:tcW w:type="dxa" w:w="2796"/>
+            <w:tcW w:type="dxa" w:w="2789"/>
             <w:tcBorders>
               <w:top w:val="single" w:color="E2E8F0" w:sz="4"/>
               <w:left w:val="none" w:color="auto" w:sz="0"/>
@@ -37786,7 +37786,7 @@
         </w:tc>
         <w:tc>
           <w:tcPr>
-            <w:tcW w:type="dxa" w:w="3032"/>
+            <w:tcW w:type="dxa" w:w="3042"/>
             <w:tcBorders>
               <w:top w:val="single" w:color="E2E8F0" w:sz="4"/>
               <w:left w:val="none" w:color="auto" w:sz="0"/>
@@ -37819,7 +37819,7 @@
         </w:tc>
         <w:tc>
           <w:tcPr>
-            <w:tcW w:type="dxa" w:w="1282"/>
+            <w:tcW w:type="dxa" w:w="1283"/>
             <w:tcBorders>
               <w:top w:val="single" w:color="E2E8F0" w:sz="4"/>
               <w:left w:val="none" w:color="auto" w:sz="0"/>
@@ -37857,7 +37857,7 @@
         </w:trPr>
         <w:tc>
           <w:tcPr>
-            <w:tcW w:type="dxa" w:w="1530"/>
+            <w:tcW w:type="dxa" w:w="1526"/>
             <w:tcBorders>
               <w:top w:val="single" w:color="E2E8F0" w:sz="4"/>
               <w:left w:val="none" w:color="auto" w:sz="0"/>
@@ -37890,7 +37890,7 @@
         </w:tc>
         <w:tc>
           <w:tcPr>
-            <w:tcW w:type="dxa" w:w="2796"/>
+            <w:tcW w:type="dxa" w:w="2789"/>
             <w:tcBorders>
               <w:top w:val="single" w:color="E2E8F0" w:sz="4"/>
               <w:left w:val="none" w:color="auto" w:sz="0"/>
@@ -37923,7 +37923,7 @@
         </w:tc>
         <w:tc>
           <w:tcPr>
-            <w:tcW w:type="dxa" w:w="3032"/>
+            <w:tcW w:type="dxa" w:w="3042"/>
             <w:tcBorders>
               <w:top w:val="single" w:color="E2E8F0" w:sz="4"/>
               <w:left w:val="none" w:color="auto" w:sz="0"/>
@@ -37956,7 +37956,7 @@
         </w:tc>
         <w:tc>
           <w:tcPr>
-            <w:tcW w:type="dxa" w:w="1282"/>
+            <w:tcW w:type="dxa" w:w="1283"/>
             <w:tcBorders>
               <w:top w:val="single" w:color="E2E8F0" w:sz="4"/>
               <w:left w:val="none" w:color="auto" w:sz="0"/>
@@ -37994,7 +37994,7 @@
         </w:trPr>
         <w:tc>
           <w:tcPr>
-            <w:tcW w:type="dxa" w:w="1530"/>
+            <w:tcW w:type="dxa" w:w="1526"/>
             <w:tcBorders>
               <w:top w:val="single" w:color="E2E8F0" w:sz="4"/>
               <w:left w:val="none" w:color="auto" w:sz="0"/>
@@ -38027,7 +38027,7 @@
         </w:tc>
         <w:tc>
           <w:tcPr>
-            <w:tcW w:type="dxa" w:w="2796"/>
+            <w:tcW w:type="dxa" w:w="2789"/>
             <w:tcBorders>
               <w:top w:val="single" w:color="E2E8F0" w:sz="4"/>
               <w:left w:val="none" w:color="auto" w:sz="0"/>
@@ -38060,7 +38060,7 @@
         </w:tc>
         <w:tc>
           <w:tcPr>
-            <w:tcW w:type="dxa" w:w="3032"/>
+            <w:tcW w:type="dxa" w:w="3042"/>
             <w:tcBorders>
               <w:top w:val="single" w:color="E2E8F0" w:sz="4"/>
               <w:left w:val="none" w:color="auto" w:sz="0"/>
@@ -38093,7 +38093,7 @@
         </w:tc>
         <w:tc>
           <w:tcPr>
-            <w:tcW w:type="dxa" w:w="1282"/>
+            <w:tcW w:type="dxa" w:w="1283"/>
             <w:tcBorders>
               <w:top w:val="single" w:color="E2E8F0" w:sz="4"/>
               <w:left w:val="none" w:color="auto" w:sz="0"/>
@@ -38131,7 +38131,7 @@
         </w:trPr>
         <w:tc>
           <w:tcPr>
-            <w:tcW w:type="dxa" w:w="1530"/>
+            <w:tcW w:type="dxa" w:w="1526"/>
             <w:tcBorders>
               <w:top w:val="single" w:color="E2E8F0" w:sz="4"/>
               <w:left w:val="none" w:color="auto" w:sz="0"/>
@@ -38164,7 +38164,7 @@
         </w:tc>
         <w:tc>
           <w:tcPr>
-            <w:tcW w:type="dxa" w:w="2796"/>
+            <w:tcW w:type="dxa" w:w="2789"/>
             <w:tcBorders>
               <w:top w:val="single" w:color="E2E8F0" w:sz="4"/>
               <w:left w:val="none" w:color="auto" w:sz="0"/>
@@ -38197,7 +38197,7 @@
         </w:tc>
         <w:tc>
           <w:tcPr>
-            <w:tcW w:type="dxa" w:w="3032"/>
+            <w:tcW w:type="dxa" w:w="3042"/>
             <w:tcBorders>
               <w:top w:val="single" w:color="E2E8F0" w:sz="4"/>
               <w:left w:val="none" w:color="auto" w:sz="0"/>
@@ -38230,7 +38230,7 @@
         </w:tc>
         <w:tc>
           <w:tcPr>
-            <w:tcW w:type="dxa" w:w="1282"/>
+            <w:tcW w:type="dxa" w:w="1283"/>
             <w:tcBorders>
               <w:top w:val="single" w:color="E2E8F0" w:sz="4"/>
               <w:left w:val="none" w:color="auto" w:sz="0"/>
@@ -38268,7 +38268,7 @@
         </w:trPr>
         <w:tc>
           <w:tcPr>
-            <w:tcW w:type="dxa" w:w="1530"/>
+            <w:tcW w:type="dxa" w:w="1526"/>
             <w:tcBorders>
               <w:top w:val="single" w:color="E2E8F0" w:sz="4"/>
               <w:left w:val="none" w:color="auto" w:sz="0"/>
@@ -38301,7 +38301,7 @@
         </w:tc>
         <w:tc>
           <w:tcPr>
-            <w:tcW w:type="dxa" w:w="2796"/>
+            <w:tcW w:type="dxa" w:w="2789"/>
             <w:tcBorders>
               <w:top w:val="single" w:color="E2E8F0" w:sz="4"/>
               <w:left w:val="none" w:color="auto" w:sz="0"/>
@@ -38334,7 +38334,7 @@
         </w:tc>
         <w:tc>
           <w:tcPr>
-            <w:tcW w:type="dxa" w:w="3032"/>
+            <w:tcW w:type="dxa" w:w="3042"/>
             <w:tcBorders>
               <w:top w:val="single" w:color="E2E8F0" w:sz="4"/>
               <w:left w:val="none" w:color="auto" w:sz="0"/>
@@ -38367,7 +38367,7 @@
         </w:tc>
         <w:tc>
           <w:tcPr>
-            <w:tcW w:type="dxa" w:w="1282"/>
+            <w:tcW w:type="dxa" w:w="1283"/>
             <w:tcBorders>
               <w:top w:val="single" w:color="E2E8F0" w:sz="4"/>
               <w:left w:val="none" w:color="auto" w:sz="0"/>
@@ -38405,7 +38405,7 @@
         </w:trPr>
         <w:tc>
           <w:tcPr>
-            <w:tcW w:type="dxa" w:w="1530"/>
+            <w:tcW w:type="dxa" w:w="1526"/>
             <w:tcBorders>
               <w:top w:val="single" w:color="E2E8F0" w:sz="4"/>
               <w:left w:val="none" w:color="auto" w:sz="0"/>
@@ -38438,7 +38438,7 @@
         </w:tc>
         <w:tc>
           <w:tcPr>
-            <w:tcW w:type="dxa" w:w="2796"/>
+            <w:tcW w:type="dxa" w:w="2789"/>
             <w:tcBorders>
               <w:top w:val="single" w:color="E2E8F0" w:sz="4"/>
               <w:left w:val="none" w:color="auto" w:sz="0"/>
@@ -38471,7 +38471,7 @@
         </w:tc>
         <w:tc>
           <w:tcPr>
-            <w:tcW w:type="dxa" w:w="3032"/>
+            <w:tcW w:type="dxa" w:w="3042"/>
             <w:tcBorders>
               <w:top w:val="single" w:color="E2E8F0" w:sz="4"/>
               <w:left w:val="none" w:color="auto" w:sz="0"/>
@@ -38504,7 +38504,7 @@
         </w:tc>
         <w:tc>
           <w:tcPr>
-            <w:tcW w:type="dxa" w:w="1282"/>
+            <w:tcW w:type="dxa" w:w="1283"/>
             <w:tcBorders>
               <w:top w:val="single" w:color="E2E8F0" w:sz="4"/>
               <w:left w:val="none" w:color="auto" w:sz="0"/>
@@ -38542,7 +38542,7 @@
         </w:trPr>
         <w:tc>
           <w:tcPr>
-            <w:tcW w:type="dxa" w:w="1530"/>
+            <w:tcW w:type="dxa" w:w="1526"/>
             <w:tcBorders>
               <w:top w:val="single" w:color="E2E8F0" w:sz="4"/>
               <w:left w:val="none" w:color="auto" w:sz="0"/>
@@ -38575,7 +38575,7 @@
         </w:tc>
         <w:tc>
           <w:tcPr>
-            <w:tcW w:type="dxa" w:w="2796"/>
+            <w:tcW w:type="dxa" w:w="2789"/>
             <w:tcBorders>
               <w:top w:val="single" w:color="E2E8F0" w:sz="4"/>
               <w:left w:val="none" w:color="auto" w:sz="0"/>
@@ -38608,7 +38608,7 @@
         </w:tc>
         <w:tc>
           <w:tcPr>
-            <w:tcW w:type="dxa" w:w="3032"/>
+            <w:tcW w:type="dxa" w:w="3042"/>
             <w:tcBorders>
               <w:top w:val="single" w:color="E2E8F0" w:sz="4"/>
               <w:left w:val="none" w:color="auto" w:sz="0"/>
@@ -38641,7 +38641,7 @@
         </w:tc>
         <w:tc>
           <w:tcPr>
-            <w:tcW w:type="dxa" w:w="1282"/>
+            <w:tcW w:type="dxa" w:w="1283"/>
             <w:tcBorders>
               <w:top w:val="single" w:color="E2E8F0" w:sz="4"/>
               <w:left w:val="none" w:color="auto" w:sz="0"/>
@@ -38679,7 +38679,7 @@
         </w:trPr>
         <w:tc>
           <w:tcPr>
-            <w:tcW w:type="dxa" w:w="1530"/>
+            <w:tcW w:type="dxa" w:w="1526"/>
             <w:tcBorders>
               <w:top w:val="single" w:color="E2E8F0" w:sz="4"/>
               <w:left w:val="none" w:color="auto" w:sz="0"/>
@@ -38712,7 +38712,7 @@
         </w:tc>
         <w:tc>
           <w:tcPr>
-            <w:tcW w:type="dxa" w:w="2796"/>
+            <w:tcW w:type="dxa" w:w="2789"/>
             <w:tcBorders>
               <w:top w:val="single" w:color="E2E8F0" w:sz="4"/>
               <w:left w:val="none" w:color="auto" w:sz="0"/>
@@ -38745,7 +38745,7 @@
         </w:tc>
         <w:tc>
           <w:tcPr>
-            <w:tcW w:type="dxa" w:w="3032"/>
+            <w:tcW w:type="dxa" w:w="3042"/>
             <w:tcBorders>
               <w:top w:val="single" w:color="E2E8F0" w:sz="4"/>
               <w:left w:val="none" w:color="auto" w:sz="0"/>
@@ -38778,7 +38778,7 @@
         </w:tc>
         <w:tc>
           <w:tcPr>
-            <w:tcW w:type="dxa" w:w="1282"/>
+            <w:tcW w:type="dxa" w:w="1283"/>
             <w:tcBorders>
               <w:top w:val="single" w:color="E2E8F0" w:sz="4"/>
               <w:left w:val="none" w:color="auto" w:sz="0"/>
@@ -38816,7 +38816,7 @@
         </w:trPr>
         <w:tc>
           <w:tcPr>
-            <w:tcW w:type="dxa" w:w="1530"/>
+            <w:tcW w:type="dxa" w:w="1526"/>
             <w:tcBorders>
               <w:top w:val="single" w:color="E2E8F0" w:sz="4"/>
               <w:left w:val="none" w:color="auto" w:sz="0"/>
@@ -38849,7 +38849,7 @@
         </w:tc>
         <w:tc>
           <w:tcPr>
-            <w:tcW w:type="dxa" w:w="2796"/>
+            <w:tcW w:type="dxa" w:w="2789"/>
             <w:tcBorders>
               <w:top w:val="single" w:color="E2E8F0" w:sz="4"/>
               <w:left w:val="none" w:color="auto" w:sz="0"/>
@@ -38882,7 +38882,7 @@
         </w:tc>
         <w:tc>
           <w:tcPr>
-            <w:tcW w:type="dxa" w:w="3032"/>
+            <w:tcW w:type="dxa" w:w="3042"/>
             <w:tcBorders>
               <w:top w:val="single" w:color="E2E8F0" w:sz="4"/>
               <w:left w:val="none" w:color="auto" w:sz="0"/>
@@ -38915,7 +38915,7 @@
         </w:tc>
         <w:tc>
           <w:tcPr>
-            <w:tcW w:type="dxa" w:w="1282"/>
+            <w:tcW w:type="dxa" w:w="1283"/>
             <w:tcBorders>
               <w:top w:val="single" w:color="E2E8F0" w:sz="4"/>
               <w:left w:val="none" w:color="auto" w:sz="0"/>
@@ -38953,7 +38953,7 @@
         </w:trPr>
         <w:tc>
           <w:tcPr>
-            <w:tcW w:type="dxa" w:w="1530"/>
+            <w:tcW w:type="dxa" w:w="1526"/>
             <w:tcBorders>
               <w:top w:val="single" w:color="E2E8F0" w:sz="4"/>
               <w:left w:val="none" w:color="auto" w:sz="0"/>
@@ -38986,7 +38986,7 @@
         </w:tc>
         <w:tc>
           <w:tcPr>
-            <w:tcW w:type="dxa" w:w="2796"/>
+            <w:tcW w:type="dxa" w:w="2789"/>
             <w:tcBorders>
               <w:top w:val="single" w:color="E2E8F0" w:sz="4"/>
               <w:left w:val="none" w:color="auto" w:sz="0"/>
@@ -39019,7 +39019,7 @@
         </w:tc>
         <w:tc>
           <w:tcPr>
-            <w:tcW w:type="dxa" w:w="3032"/>
+            <w:tcW w:type="dxa" w:w="3042"/>
             <w:tcBorders>
               <w:top w:val="single" w:color="E2E8F0" w:sz="4"/>
               <w:left w:val="none" w:color="auto" w:sz="0"/>
@@ -39052,7 +39052,7 @@
         </w:tc>
         <w:tc>
           <w:tcPr>
-            <w:tcW w:type="dxa" w:w="1282"/>
+            <w:tcW w:type="dxa" w:w="1283"/>
             <w:tcBorders>
               <w:top w:val="single" w:color="E2E8F0" w:sz="4"/>
               <w:left w:val="none" w:color="auto" w:sz="0"/>
@@ -39090,7 +39090,7 @@
         </w:trPr>
         <w:tc>
           <w:tcPr>
-            <w:tcW w:type="dxa" w:w="1530"/>
+            <w:tcW w:type="dxa" w:w="1526"/>
             <w:tcBorders>
               <w:top w:val="single" w:color="E2E8F0" w:sz="4"/>
               <w:left w:val="none" w:color="auto" w:sz="0"/>
@@ -39123,7 +39123,7 @@
         </w:tc>
         <w:tc>
           <w:tcPr>
-            <w:tcW w:type="dxa" w:w="2796"/>
+            <w:tcW w:type="dxa" w:w="2789"/>
             <w:tcBorders>
               <w:top w:val="single" w:color="E2E8F0" w:sz="4"/>
               <w:left w:val="none" w:color="auto" w:sz="0"/>
@@ -39156,7 +39156,7 @@
         </w:tc>
         <w:tc>
           <w:tcPr>
-            <w:tcW w:type="dxa" w:w="3032"/>
+            <w:tcW w:type="dxa" w:w="3042"/>
             <w:tcBorders>
               <w:top w:val="single" w:color="E2E8F0" w:sz="4"/>
               <w:left w:val="none" w:color="auto" w:sz="0"/>
@@ -39189,7 +39189,7 @@
         </w:tc>
         <w:tc>
           <w:tcPr>
-            <w:tcW w:type="dxa" w:w="1282"/>
+            <w:tcW w:type="dxa" w:w="1283"/>
             <w:tcBorders>
               <w:top w:val="single" w:color="E2E8F0" w:sz="4"/>
               <w:left w:val="none" w:color="auto" w:sz="0"/>
@@ -39227,7 +39227,7 @@
         </w:trPr>
         <w:tc>
           <w:tcPr>
-            <w:tcW w:type="dxa" w:w="1530"/>
+            <w:tcW w:type="dxa" w:w="1526"/>
             <w:tcBorders>
               <w:top w:val="single" w:color="E2E8F0" w:sz="4"/>
               <w:left w:val="none" w:color="auto" w:sz="0"/>
@@ -39260,7 +39260,7 @@
         </w:tc>
         <w:tc>
           <w:tcPr>
-            <w:tcW w:type="dxa" w:w="2796"/>
+            <w:tcW w:type="dxa" w:w="2789"/>
             <w:tcBorders>
               <w:top w:val="single" w:color="E2E8F0" w:sz="4"/>
               <w:left w:val="none" w:color="auto" w:sz="0"/>
@@ -39293,7 +39293,7 @@
         </w:tc>
         <w:tc>
           <w:tcPr>
-            <w:tcW w:type="dxa" w:w="3032"/>
+            <w:tcW w:type="dxa" w:w="3042"/>
             <w:tcBorders>
               <w:top w:val="single" w:color="E2E8F0" w:sz="4"/>
               <w:left w:val="none" w:color="auto" w:sz="0"/>
@@ -39326,7 +39326,7 @@
         </w:tc>
         <w:tc>
           <w:tcPr>
-            <w:tcW w:type="dxa" w:w="1282"/>
+            <w:tcW w:type="dxa" w:w="1283"/>
             <w:tcBorders>
               <w:top w:val="single" w:color="E2E8F0" w:sz="4"/>
               <w:left w:val="none" w:color="auto" w:sz="0"/>
@@ -39364,7 +39364,7 @@
         </w:trPr>
         <w:tc>
           <w:tcPr>
-            <w:tcW w:type="dxa" w:w="1530"/>
+            <w:tcW w:type="dxa" w:w="1526"/>
             <w:tcBorders>
               <w:top w:val="single" w:color="E2E8F0" w:sz="4"/>
               <w:left w:val="none" w:color="auto" w:sz="0"/>
@@ -39397,7 +39397,7 @@
         </w:tc>
         <w:tc>
           <w:tcPr>
-            <w:tcW w:type="dxa" w:w="2796"/>
+            <w:tcW w:type="dxa" w:w="2789"/>
             <w:tcBorders>
               <w:top w:val="single" w:color="E2E8F0" w:sz="4"/>
               <w:left w:val="none" w:color="auto" w:sz="0"/>
@@ -39430,7 +39430,7 @@
         </w:tc>
         <w:tc>
           <w:tcPr>
-            <w:tcW w:type="dxa" w:w="3032"/>
+            <w:tcW w:type="dxa" w:w="3042"/>
             <w:tcBorders>
               <w:top w:val="single" w:color="E2E8F0" w:sz="4"/>
               <w:left w:val="none" w:color="auto" w:sz="0"/>
@@ -39463,7 +39463,7 @@
         </w:tc>
         <w:tc>
           <w:tcPr>
-            <w:tcW w:type="dxa" w:w="1282"/>
+            <w:tcW w:type="dxa" w:w="1283"/>
             <w:tcBorders>
               <w:top w:val="single" w:color="E2E8F0" w:sz="4"/>
               <w:left w:val="none" w:color="auto" w:sz="0"/>
@@ -39501,7 +39501,7 @@
         </w:trPr>
         <w:tc>
           <w:tcPr>
-            <w:tcW w:type="dxa" w:w="1530"/>
+            <w:tcW w:type="dxa" w:w="1526"/>
             <w:tcBorders>
               <w:top w:val="single" w:color="E2E8F0" w:sz="4"/>
               <w:left w:val="none" w:color="auto" w:sz="0"/>
@@ -39534,7 +39534,7 @@
         </w:tc>
         <w:tc>
           <w:tcPr>
-            <w:tcW w:type="dxa" w:w="2796"/>
+            <w:tcW w:type="dxa" w:w="2789"/>
             <w:tcBorders>
               <w:top w:val="single" w:color="E2E8F0" w:sz="4"/>
               <w:left w:val="none" w:color="auto" w:sz="0"/>
@@ -39567,7 +39567,7 @@
         </w:tc>
         <w:tc>
           <w:tcPr>
-            <w:tcW w:type="dxa" w:w="3032"/>
+            <w:tcW w:type="dxa" w:w="3042"/>
             <w:tcBorders>
               <w:top w:val="single" w:color="E2E8F0" w:sz="4"/>
               <w:left w:val="none" w:color="auto" w:sz="0"/>
@@ -39600,7 +39600,7 @@
         </w:tc>
         <w:tc>
           <w:tcPr>
-            <w:tcW w:type="dxa" w:w="1282"/>
+            <w:tcW w:type="dxa" w:w="1283"/>
             <w:tcBorders>
               <w:top w:val="single" w:color="E2E8F0" w:sz="4"/>
               <w:left w:val="none" w:color="auto" w:sz="0"/>
@@ -39638,7 +39638,7 @@
         </w:trPr>
         <w:tc>
           <w:tcPr>
-            <w:tcW w:type="dxa" w:w="1530"/>
+            <w:tcW w:type="dxa" w:w="1526"/>
             <w:tcBorders>
               <w:top w:val="single" w:color="E2E8F0" w:sz="4"/>
               <w:left w:val="none" w:color="auto" w:sz="0"/>
@@ -39671,7 +39671,7 @@
         </w:tc>
         <w:tc>
           <w:tcPr>
-            <w:tcW w:type="dxa" w:w="2796"/>
+            <w:tcW w:type="dxa" w:w="2789"/>
             <w:tcBorders>
               <w:top w:val="single" w:color="E2E8F0" w:sz="4"/>
               <w:left w:val="none" w:color="auto" w:sz="0"/>
@@ -39704,7 +39704,7 @@
         </w:tc>
         <w:tc>
           <w:tcPr>
-            <w:tcW w:type="dxa" w:w="3032"/>
+            <w:tcW w:type="dxa" w:w="3042"/>
             <w:tcBorders>
               <w:top w:val="single" w:color="E2E8F0" w:sz="4"/>
               <w:left w:val="none" w:color="auto" w:sz="0"/>
@@ -39737,7 +39737,7 @@
         </w:tc>
         <w:tc>
           <w:tcPr>
-            <w:tcW w:type="dxa" w:w="1282"/>
+            <w:tcW w:type="dxa" w:w="1283"/>
             <w:tcBorders>
               <w:top w:val="single" w:color="E2E8F0" w:sz="4"/>
               <w:left w:val="none" w:color="auto" w:sz="0"/>
@@ -39775,7 +39775,7 @@
         </w:trPr>
         <w:tc>
           <w:tcPr>
-            <w:tcW w:type="dxa" w:w="1530"/>
+            <w:tcW w:type="dxa" w:w="1526"/>
             <w:tcBorders>
               <w:top w:val="single" w:color="E2E8F0" w:sz="4"/>
               <w:left w:val="none" w:color="auto" w:sz="0"/>
@@ -39808,7 +39808,7 @@
         </w:tc>
         <w:tc>
           <w:tcPr>
-            <w:tcW w:type="dxa" w:w="2796"/>
+            <w:tcW w:type="dxa" w:w="2789"/>
             <w:tcBorders>
               <w:top w:val="single" w:color="E2E8F0" w:sz="4"/>
               <w:left w:val="none" w:color="auto" w:sz="0"/>
@@ -39841,7 +39841,7 @@
         </w:tc>
         <w:tc>
           <w:tcPr>
-            <w:tcW w:type="dxa" w:w="3032"/>
+            <w:tcW w:type="dxa" w:w="3042"/>
             <w:tcBorders>
               <w:top w:val="single" w:color="E2E8F0" w:sz="4"/>
               <w:left w:val="none" w:color="auto" w:sz="0"/>
@@ -39874,7 +39874,7 @@
         </w:tc>
         <w:tc>
           <w:tcPr>
-            <w:tcW w:type="dxa" w:w="1282"/>
+            <w:tcW w:type="dxa" w:w="1283"/>
             <w:tcBorders>
               <w:top w:val="single" w:color="E2E8F0" w:sz="4"/>
               <w:left w:val="none" w:color="auto" w:sz="0"/>
@@ -39912,7 +39912,7 @@
         </w:trPr>
         <w:tc>
           <w:tcPr>
-            <w:tcW w:type="dxa" w:w="1530"/>
+            <w:tcW w:type="dxa" w:w="1526"/>
             <w:tcBorders>
               <w:top w:val="single" w:color="E2E8F0" w:sz="4"/>
               <w:left w:val="none" w:color="auto" w:sz="0"/>
@@ -39945,7 +39945,7 @@
         </w:tc>
         <w:tc>
           <w:tcPr>
-            <w:tcW w:type="dxa" w:w="2796"/>
+            <w:tcW w:type="dxa" w:w="2789"/>
             <w:tcBorders>
               <w:top w:val="single" w:color="E2E8F0" w:sz="4"/>
               <w:left w:val="none" w:color="auto" w:sz="0"/>
@@ -39978,7 +39978,7 @@
         </w:tc>
         <w:tc>
           <w:tcPr>
-            <w:tcW w:type="dxa" w:w="3032"/>
+            <w:tcW w:type="dxa" w:w="3042"/>
             <w:tcBorders>
               <w:top w:val="single" w:color="E2E8F0" w:sz="4"/>
               <w:left w:val="none" w:color="auto" w:sz="0"/>
@@ -40011,7 +40011,7 @@
         </w:tc>
         <w:tc>
           <w:tcPr>
-            <w:tcW w:type="dxa" w:w="1282"/>
+            <w:tcW w:type="dxa" w:w="1283"/>
             <w:tcBorders>
               <w:top w:val="single" w:color="E2E8F0" w:sz="4"/>
               <w:left w:val="none" w:color="auto" w:sz="0"/>
@@ -40049,7 +40049,7 @@
         </w:trPr>
         <w:tc>
           <w:tcPr>
-            <w:tcW w:type="dxa" w:w="1530"/>
+            <w:tcW w:type="dxa" w:w="1526"/>
             <w:tcBorders>
               <w:top w:val="single" w:color="E2E8F0" w:sz="4"/>
               <w:left w:val="none" w:color="auto" w:sz="0"/>
@@ -40082,7 +40082,7 @@
         </w:tc>
         <w:tc>
           <w:tcPr>
-            <w:tcW w:type="dxa" w:w="2796"/>
+            <w:tcW w:type="dxa" w:w="2789"/>
             <w:tcBorders>
               <w:top w:val="single" w:color="E2E8F0" w:sz="4"/>
               <w:left w:val="none" w:color="auto" w:sz="0"/>
@@ -40115,7 +40115,7 @@
         </w:tc>
         <w:tc>
           <w:tcPr>
-            <w:tcW w:type="dxa" w:w="3032"/>
+            <w:tcW w:type="dxa" w:w="3042"/>
             <w:tcBorders>
               <w:top w:val="single" w:color="E2E8F0" w:sz="4"/>
               <w:left w:val="none" w:color="auto" w:sz="0"/>
@@ -40148,7 +40148,7 @@
         </w:tc>
         <w:tc>
           <w:tcPr>
-            <w:tcW w:type="dxa" w:w="1282"/>
+            <w:tcW w:type="dxa" w:w="1283"/>
             <w:tcBorders>
               <w:top w:val="single" w:color="E2E8F0" w:sz="4"/>
               <w:left w:val="none" w:color="auto" w:sz="0"/>
@@ -40186,7 +40186,7 @@
         </w:trPr>
         <w:tc>
           <w:tcPr>
-            <w:tcW w:type="dxa" w:w="1530"/>
+            <w:tcW w:type="dxa" w:w="1526"/>
             <w:tcBorders>
               <w:top w:val="single" w:color="E2E8F0" w:sz="4"/>
               <w:left w:val="none" w:color="auto" w:sz="0"/>
@@ -40219,7 +40219,7 @@
         </w:tc>
         <w:tc>
           <w:tcPr>
-            <w:tcW w:type="dxa" w:w="2796"/>
+            <w:tcW w:type="dxa" w:w="2789"/>
             <w:tcBorders>
               <w:top w:val="single" w:color="E2E8F0" w:sz="4"/>
               <w:left w:val="none" w:color="auto" w:sz="0"/>
@@ -40252,7 +40252,7 @@
         </w:tc>
         <w:tc>
           <w:tcPr>
-            <w:tcW w:type="dxa" w:w="3032"/>
+            <w:tcW w:type="dxa" w:w="3042"/>
             <w:tcBorders>
               <w:top w:val="single" w:color="E2E8F0" w:sz="4"/>
               <w:left w:val="none" w:color="auto" w:sz="0"/>
@@ -40285,7 +40285,7 @@
         </w:tc>
         <w:tc>
           <w:tcPr>
-            <w:tcW w:type="dxa" w:w="1282"/>
+            <w:tcW w:type="dxa" w:w="1283"/>
             <w:tcBorders>
               <w:top w:val="single" w:color="E2E8F0" w:sz="4"/>
               <w:left w:val="none" w:color="auto" w:sz="0"/>
@@ -40323,7 +40323,7 @@
         </w:trPr>
         <w:tc>
           <w:tcPr>
-            <w:tcW w:type="dxa" w:w="1530"/>
+            <w:tcW w:type="dxa" w:w="1526"/>
             <w:tcBorders>
               <w:top w:val="single" w:color="E2E8F0" w:sz="4"/>
               <w:left w:val="none" w:color="auto" w:sz="0"/>
@@ -40356,7 +40356,7 @@
         </w:tc>
         <w:tc>
           <w:tcPr>
-            <w:tcW w:type="dxa" w:w="2796"/>
+            <w:tcW w:type="dxa" w:w="2789"/>
             <w:tcBorders>
               <w:top w:val="single" w:color="E2E8F0" w:sz="4"/>
               <w:left w:val="none" w:color="auto" w:sz="0"/>
@@ -40389,7 +40389,7 @@
         </w:tc>
         <w:tc>
           <w:tcPr>
-            <w:tcW w:type="dxa" w:w="3032"/>
+            <w:tcW w:type="dxa" w:w="3042"/>
             <w:tcBorders>
               <w:top w:val="single" w:color="E2E8F0" w:sz="4"/>
               <w:left w:val="none" w:color="auto" w:sz="0"/>
@@ -40422,7 +40422,7 @@
         </w:tc>
         <w:tc>
           <w:tcPr>
-            <w:tcW w:type="dxa" w:w="1282"/>
+            <w:tcW w:type="dxa" w:w="1283"/>
             <w:tcBorders>
               <w:top w:val="single" w:color="E2E8F0" w:sz="4"/>
               <w:left w:val="none" w:color="auto" w:sz="0"/>
@@ -40460,7 +40460,7 @@
         </w:trPr>
         <w:tc>
           <w:tcPr>
-            <w:tcW w:type="dxa" w:w="1530"/>
+            <w:tcW w:type="dxa" w:w="1526"/>
             <w:tcBorders>
               <w:top w:val="single" w:color="E2E8F0" w:sz="4"/>
               <w:left w:val="none" w:color="auto" w:sz="0"/>
@@ -40493,7 +40493,7 @@
         </w:tc>
         <w:tc>
           <w:tcPr>
-            <w:tcW w:type="dxa" w:w="2796"/>
+            <w:tcW w:type="dxa" w:w="2789"/>
             <w:tcBorders>
               <w:top w:val="single" w:color="E2E8F0" w:sz="4"/>
               <w:left w:val="none" w:color="auto" w:sz="0"/>
@@ -40526,7 +40526,7 @@
         </w:tc>
         <w:tc>
           <w:tcPr>
-            <w:tcW w:type="dxa" w:w="3032"/>
+            <w:tcW w:type="dxa" w:w="3042"/>
             <w:tcBorders>
               <w:top w:val="single" w:color="E2E8F0" w:sz="4"/>
               <w:left w:val="none" w:color="auto" w:sz="0"/>
@@ -40559,7 +40559,7 @@
         </w:tc>
         <w:tc>
           <w:tcPr>
-            <w:tcW w:type="dxa" w:w="1282"/>
+            <w:tcW w:type="dxa" w:w="1283"/>
             <w:tcBorders>
               <w:top w:val="single" w:color="E2E8F0" w:sz="4"/>
               <w:left w:val="none" w:color="auto" w:sz="0"/>
@@ -40597,7 +40597,7 @@
         </w:trPr>
         <w:tc>
           <w:tcPr>
-            <w:tcW w:type="dxa" w:w="1530"/>
+            <w:tcW w:type="dxa" w:w="1526"/>
             <w:tcBorders>
               <w:top w:val="single" w:color="E2E8F0" w:sz="4"/>
               <w:left w:val="none" w:color="auto" w:sz="0"/>
@@ -40630,7 +40630,7 @@
         </w:tc>
         <w:tc>
           <w:tcPr>
-            <w:tcW w:type="dxa" w:w="2796"/>
+            <w:tcW w:type="dxa" w:w="2789"/>
             <w:tcBorders>
               <w:top w:val="single" w:color="E2E8F0" w:sz="4"/>
               <w:left w:val="none" w:color="auto" w:sz="0"/>
@@ -40663,7 +40663,7 @@
         </w:tc>
         <w:tc>
           <w:tcPr>
-            <w:tcW w:type="dxa" w:w="3032"/>
+            <w:tcW w:type="dxa" w:w="3042"/>
             <w:tcBorders>
               <w:top w:val="single" w:color="E2E8F0" w:sz="4"/>
               <w:left w:val="none" w:color="auto" w:sz="0"/>
@@ -40696,7 +40696,7 @@
         </w:tc>
         <w:tc>
           <w:tcPr>
-            <w:tcW w:type="dxa" w:w="1282"/>
+            <w:tcW w:type="dxa" w:w="1283"/>
             <w:tcBorders>
               <w:top w:val="single" w:color="E2E8F0" w:sz="4"/>
               <w:left w:val="none" w:color="auto" w:sz="0"/>
@@ -40734,7 +40734,7 @@
         </w:trPr>
         <w:tc>
           <w:tcPr>
-            <w:tcW w:type="dxa" w:w="1530"/>
+            <w:tcW w:type="dxa" w:w="1526"/>
             <w:tcBorders>
               <w:top w:val="single" w:color="E2E8F0" w:sz="4"/>
               <w:left w:val="none" w:color="auto" w:sz="0"/>
@@ -40767,100 +40767,100 @@
         </w:tc>
         <w:tc>
           <w:tcPr>
-            <w:tcW w:type="dxa" w:w="2796"/>
-            <w:tcBorders>
-              <w:top w:val="single" w:color="E2E8F0" w:sz="4"/>
-              <w:left w:val="none" w:color="auto" w:sz="0"/>
-              <w:bottom w:val="single" w:color="E2E8F0" w:sz="4"/>
-              <w:right w:val="none" w:color="auto" w:sz="0"/>
-            </w:tcBorders>
-            <w:tcMar>
-              <w:top w:type="dxa" w:w="120"/>
-              <w:left w:type="dxa" w:w="160"/>
-              <w:bottom w:type="dxa" w:w="120"/>
-              <w:right w:type="dxa" w:w="160"/>
-            </w:tcMar>
-          </w:tcPr>
-          <w:p>
-            <w:pPr>
-              <w:spacing w:line="240" w:lineRule="auto"/>
-              <w:jc w:val="left"/>
-            </w:pPr>
-            <w:r>
-              <w:rPr>
-                <w:rFonts w:ascii="Arial" w:cs="Arial" w:eastAsia="Arial" w:hAnsi="Arial"/>
-                <w:b w:val="false"/>
-                <w:bCs w:val="false"/>
-                <w:sz w:val="20"/>
-                <w:szCs w:val="20"/>
-              </w:rPr>
-              <w:t xml:space="preserve">Error handling on the history screens</w:t>
-            </w:r>
-          </w:p>
-        </w:tc>
-        <w:tc>
-          <w:tcPr>
-            <w:tcW w:type="dxa" w:w="3032"/>
-            <w:tcBorders>
-              <w:top w:val="single" w:color="E2E8F0" w:sz="4"/>
-              <w:left w:val="none" w:color="auto" w:sz="0"/>
-              <w:bottom w:val="single" w:color="E2E8F0" w:sz="4"/>
-              <w:right w:val="none" w:color="auto" w:sz="0"/>
-            </w:tcBorders>
-            <w:tcMar>
-              <w:top w:type="dxa" w:w="120"/>
-              <w:left w:type="dxa" w:w="160"/>
-              <w:bottom w:type="dxa" w:w="120"/>
-              <w:right w:type="dxa" w:w="160"/>
-            </w:tcMar>
-          </w:tcPr>
-          <w:p>
-            <w:pPr>
-              <w:spacing w:line="240" w:lineRule="auto"/>
-              <w:jc w:val="left"/>
-            </w:pPr>
-            <w:r>
-              <w:rPr>
-                <w:rFonts w:ascii="Arial" w:cs="Arial" w:eastAsia="Arial" w:hAnsi="Arial"/>
-                <w:b w:val="false"/>
-                <w:bCs w:val="false"/>
-                <w:sz w:val="20"/>
-                <w:szCs w:val="20"/>
-              </w:rPr>
-              <w:t xml:space="preserve">A refresh that fails for a moment keeps the figures already on screen; only a load the user asked for reports a failure</w:t>
-            </w:r>
-          </w:p>
-        </w:tc>
-        <w:tc>
-          <w:tcPr>
-            <w:tcW w:type="dxa" w:w="1282"/>
-            <w:tcBorders>
-              <w:top w:val="single" w:color="E2E8F0" w:sz="4"/>
-              <w:left w:val="none" w:color="auto" w:sz="0"/>
-              <w:bottom w:val="single" w:color="E2E8F0" w:sz="4"/>
-              <w:right w:val="none" w:color="auto" w:sz="0"/>
-            </w:tcBorders>
-            <w:tcMar>
-              <w:top w:type="dxa" w:w="120"/>
-              <w:left w:type="dxa" w:w="160"/>
-              <w:bottom w:type="dxa" w:w="120"/>
-              <w:right w:type="dxa" w:w="160"/>
-            </w:tcMar>
-          </w:tcPr>
-          <w:p>
-            <w:pPr>
-              <w:spacing w:line="240" w:lineRule="auto"/>
-              <w:jc w:val="left"/>
-            </w:pPr>
-            <w:r>
-              <w:rPr>
-                <w:rFonts w:ascii="Arial" w:cs="Arial" w:eastAsia="Arial" w:hAnsi="Arial"/>
-                <w:b w:val="false"/>
-                <w:bCs w:val="false"/>
-                <w:sz w:val="20"/>
-                <w:szCs w:val="20"/>
-              </w:rPr>
-              <w:t xml:space="preserve">Reliability</w:t>
+            <w:tcW w:type="dxa" w:w="2789"/>
+            <w:tcBorders>
+              <w:top w:val="single" w:color="E2E8F0" w:sz="4"/>
+              <w:left w:val="none" w:color="auto" w:sz="0"/>
+              <w:bottom w:val="single" w:color="E2E8F0" w:sz="4"/>
+              <w:right w:val="none" w:color="auto" w:sz="0"/>
+            </w:tcBorders>
+            <w:tcMar>
+              <w:top w:type="dxa" w:w="120"/>
+              <w:left w:type="dxa" w:w="160"/>
+              <w:bottom w:type="dxa" w:w="120"/>
+              <w:right w:type="dxa" w:w="160"/>
+            </w:tcMar>
+          </w:tcPr>
+          <w:p>
+            <w:pPr>
+              <w:spacing w:line="240" w:lineRule="auto"/>
+              <w:jc w:val="left"/>
+            </w:pPr>
+            <w:r>
+              <w:rPr>
+                <w:rFonts w:ascii="Arial" w:cs="Arial" w:eastAsia="Arial" w:hAnsi="Arial"/>
+                <w:b w:val="false"/>
+                <w:bCs w:val="false"/>
+                <w:sz w:val="20"/>
+                <w:szCs w:val="20"/>
+              </w:rPr>
+              <w:t xml:space="preserve">Action history, and its error handling</w:t>
+            </w:r>
+          </w:p>
+        </w:tc>
+        <w:tc>
+          <w:tcPr>
+            <w:tcW w:type="dxa" w:w="3042"/>
+            <w:tcBorders>
+              <w:top w:val="single" w:color="E2E8F0" w:sz="4"/>
+              <w:left w:val="none" w:color="auto" w:sz="0"/>
+              <w:bottom w:val="single" w:color="E2E8F0" w:sz="4"/>
+              <w:right w:val="none" w:color="auto" w:sz="0"/>
+            </w:tcBorders>
+            <w:tcMar>
+              <w:top w:type="dxa" w:w="120"/>
+              <w:left w:type="dxa" w:w="160"/>
+              <w:bottom w:type="dxa" w:w="120"/>
+              <w:right w:type="dxa" w:w="160"/>
+            </w:tcMar>
+          </w:tcPr>
+          <w:p>
+            <w:pPr>
+              <w:spacing w:line="240" w:lineRule="auto"/>
+              <w:jc w:val="left"/>
+            </w:pPr>
+            <w:r>
+              <w:rPr>
+                <w:rFonts w:ascii="Arial" w:cs="Arial" w:eastAsia="Arial" w:hAnsi="Arial"/>
+                <w:b w:val="false"/>
+                <w:bCs w:val="false"/>
+                <w:sz w:val="20"/>
+                <w:szCs w:val="20"/>
+              </w:rPr>
+              <w:t xml:space="preserve">Each person's Overview shows their own last three actions in plain words, each linking to where it happened ("Recorded a payment: 2B, October 2026, ₱8,800."); a refresh that fails for a moment keeps the figures already on screen</w:t>
+            </w:r>
+          </w:p>
+        </w:tc>
+        <w:tc>
+          <w:tcPr>
+            <w:tcW w:type="dxa" w:w="1283"/>
+            <w:tcBorders>
+              <w:top w:val="single" w:color="E2E8F0" w:sz="4"/>
+              <w:left w:val="none" w:color="auto" w:sz="0"/>
+              <w:bottom w:val="single" w:color="E2E8F0" w:sz="4"/>
+              <w:right w:val="none" w:color="auto" w:sz="0"/>
+            </w:tcBorders>
+            <w:tcMar>
+              <w:top w:type="dxa" w:w="120"/>
+              <w:left w:type="dxa" w:w="160"/>
+              <w:bottom w:type="dxa" w:w="120"/>
+              <w:right w:type="dxa" w:w="160"/>
+            </w:tcMar>
+          </w:tcPr>
+          <w:p>
+            <w:pPr>
+              <w:spacing w:line="240" w:lineRule="auto"/>
+              <w:jc w:val="left"/>
+            </w:pPr>
+            <w:r>
+              <w:rPr>
+                <w:rFonts w:ascii="Arial" w:cs="Arial" w:eastAsia="Arial" w:hAnsi="Arial"/>
+                <w:b w:val="false"/>
+                <w:bCs w:val="false"/>
+                <w:sz w:val="20"/>
+                <w:szCs w:val="20"/>
+              </w:rPr>
+              <w:t xml:space="preserve">Usability, Reliability</w:t>
             </w:r>
           </w:p>
         </w:tc>
@@ -40871,7 +40871,7 @@
         </w:trPr>
         <w:tc>
           <w:tcPr>
-            <w:tcW w:type="dxa" w:w="1530"/>
+            <w:tcW w:type="dxa" w:w="1526"/>
             <w:tcBorders>
               <w:top w:val="single" w:color="E2E8F0" w:sz="4"/>
               <w:left w:val="none" w:color="auto" w:sz="0"/>
@@ -40904,7 +40904,7 @@
         </w:tc>
         <w:tc>
           <w:tcPr>
-            <w:tcW w:type="dxa" w:w="2796"/>
+            <w:tcW w:type="dxa" w:w="2789"/>
             <w:tcBorders>
               <w:top w:val="single" w:color="E2E8F0" w:sz="4"/>
               <w:left w:val="none" w:color="auto" w:sz="0"/>
@@ -40937,7 +40937,7 @@
         </w:tc>
         <w:tc>
           <w:tcPr>
-            <w:tcW w:type="dxa" w:w="3032"/>
+            <w:tcW w:type="dxa" w:w="3042"/>
             <w:tcBorders>
               <w:top w:val="single" w:color="E2E8F0" w:sz="4"/>
               <w:left w:val="none" w:color="auto" w:sz="0"/>
@@ -40970,7 +40970,7 @@
         </w:tc>
         <w:tc>
           <w:tcPr>
-            <w:tcW w:type="dxa" w:w="1282"/>
+            <w:tcW w:type="dxa" w:w="1283"/>
             <w:tcBorders>
               <w:top w:val="single" w:color="E2E8F0" w:sz="4"/>
               <w:left w:val="none" w:color="auto" w:sz="0"/>
@@ -41008,7 +41008,7 @@
         </w:trPr>
         <w:tc>
           <w:tcPr>
-            <w:tcW w:type="dxa" w:w="1530"/>
+            <w:tcW w:type="dxa" w:w="1526"/>
             <w:tcBorders>
               <w:top w:val="single" w:color="E2E8F0" w:sz="4"/>
               <w:left w:val="none" w:color="auto" w:sz="0"/>
@@ -41041,7 +41041,7 @@
         </w:tc>
         <w:tc>
           <w:tcPr>
-            <w:tcW w:type="dxa" w:w="2796"/>
+            <w:tcW w:type="dxa" w:w="2789"/>
             <w:tcBorders>
               <w:top w:val="single" w:color="E2E8F0" w:sz="4"/>
               <w:left w:val="none" w:color="auto" w:sz="0"/>
@@ -41074,7 +41074,7 @@
         </w:tc>
         <w:tc>
           <w:tcPr>
-            <w:tcW w:type="dxa" w:w="3032"/>
+            <w:tcW w:type="dxa" w:w="3042"/>
             <w:tcBorders>
               <w:top w:val="single" w:color="E2E8F0" w:sz="4"/>
               <w:left w:val="none" w:color="auto" w:sz="0"/>
@@ -41107,7 +41107,7 @@
         </w:tc>
         <w:tc>
           <w:tcPr>
-            <w:tcW w:type="dxa" w:w="1282"/>
+            <w:tcW w:type="dxa" w:w="1283"/>
             <w:tcBorders>
               <w:top w:val="single" w:color="E2E8F0" w:sz="4"/>
               <w:left w:val="none" w:color="auto" w:sz="0"/>
@@ -41145,7 +41145,7 @@
         </w:trPr>
         <w:tc>
           <w:tcPr>
-            <w:tcW w:type="dxa" w:w="1530"/>
+            <w:tcW w:type="dxa" w:w="1526"/>
             <w:tcBorders>
               <w:top w:val="single" w:color="E2E8F0" w:sz="4"/>
               <w:left w:val="none" w:color="auto" w:sz="0"/>
@@ -41178,7 +41178,7 @@
         </w:tc>
         <w:tc>
           <w:tcPr>
-            <w:tcW w:type="dxa" w:w="2796"/>
+            <w:tcW w:type="dxa" w:w="2789"/>
             <w:tcBorders>
               <w:top w:val="single" w:color="E2E8F0" w:sz="4"/>
               <w:left w:val="none" w:color="auto" w:sz="0"/>
@@ -41211,7 +41211,7 @@
         </w:tc>
         <w:tc>
           <w:tcPr>
-            <w:tcW w:type="dxa" w:w="3032"/>
+            <w:tcW w:type="dxa" w:w="3042"/>
             <w:tcBorders>
               <w:top w:val="single" w:color="E2E8F0" w:sz="4"/>
               <w:left w:val="none" w:color="auto" w:sz="0"/>
@@ -41234,7 +41234,7 @@
         </w:tc>
         <w:tc>
           <w:tcPr>
-            <w:tcW w:type="dxa" w:w="1282"/>
+            <w:tcW w:type="dxa" w:w="1283"/>
             <w:tcBorders>
               <w:top w:val="single" w:color="E2E8F0" w:sz="4"/>
               <w:left w:val="none" w:color="auto" w:sz="0"/>

</xml_diff>

<commit_message>
Chapter 4 4.4.8: the 5 Oct Supabase security advisor and npm audit results
Security advisor: no warning; one informational note per table (RLS on,
no policy), which is the deny-all-but-the-server design. npm audit
--omit=dev: 0 vulnerabilities in root, frontend and backend. Performance
advisor (informational: unindexed foreign keys, unused indexes) not added;
at this size it changes nothing.

Co-Authored-By: Claude Opus 5.5 <noreply@anthropic.com>
</commit_message>
<xml_diff>
--- a/docs/FINAL MANUSCRIPT/CHAPTER_4_RESULTS_AND_DISCUSSION.docx
+++ b/docs/FINAL MANUSCRIPT/CHAPTER_4_RESULTS_AND_DISCUSSION.docx
@@ -31014,7 +31014,27 @@
           <w:sz w:val="24"/>
           <w:szCs w:val="24"/>
         </w:rPr>
-        <w:t xml:space="preserve">A security review of the code on 2 October 2026 read every one of the system's 71 request handlers. Every administrative route requires a signed-in administrator; every tenant route takes the tenant from the sign-in token, never from the request, and answers "not found" for another tenant's record; every request that changes data is checked against a schema before it is used; and every database function is callable by the server only. It found no high-severity problem in the code. Four low-severity improvements were made the same day: return addresses that a browser could read as another site are refused, the sign-in token's algorithm is named, a repair photo may no longer be an SVG document, and the page security policy gained two directives. Row-level security was added to three old backup tables that had been created without it (migration 076). Probed from outside without signing in, the live site refused every protected endpoint with 401, served none of its configuration or source files, and answered a request from a foreign website with a server error; that request is now refused with 403 before any route runs. The technical evaluators' review the next day led to two further input checks: phone numbers and photo formats are now checked by the server as well as the page (Table 23).</w:t>
+        <w:t xml:space="preserve">A security review of the code on 2 October 2026 read every one of the system's 71 request handlers. Every administrative route requires a signed-in administrator; every tenant route takes the tenant from the sign-in token, never from the request, and answers "not found" for another tenant's record; every request that changes data is checked against a schema before it is used; and every database function is callable by the server only. It found no high-severity problem in the code. Four low-severity improvements were made the same day: return addresses that a browser could read as another site are refused, the sign-in token's algorithm is named, a repair photo may no longer be an SVG document, and the page security policy gained two directives. Row-level security was added to three old backup tables that had been created without it (migration 076). Probed from outside without signing in, the live site refused every protected endpoint with 401, served none of its configuration or source files, and answered a request from a foreign website with a server error; that request is now refused with 403 before any route runs. The technical evaluators' review the next day led to two further input checks: phone numbers and photo formats are now checked by the server as well as the page (Table 23). On 5 October 2026, Supabase's own security advisor raised no warning on the database. Its only notes were informational, one for each of the 24 tables: row-level security is on and no policy grants access. That is the intended design: the public keys can read and write nothing, and every request goes through the server, which checks the user's role first. The same day, </w:t>
+      </w:r>
+      <w:r>
+        <w:rPr>
+          <w:rFonts w:ascii="Courier New" w:cs="Courier New" w:eastAsia="Courier New" w:hAnsi="Courier New"/>
+          <w:b w:val="false"/>
+          <w:bCs w:val="false"/>
+          <w:sz w:val="22"/>
+          <w:szCs w:val="22"/>
+        </w:rPr>
+        <w:t xml:space="preserve">npm audit</w:t>
+      </w:r>
+      <w:r>
+        <w:rPr>
+          <w:rFonts w:ascii="Arial" w:cs="Arial" w:eastAsia="Arial" w:hAnsi="Arial"/>
+          <w:b w:val="false"/>
+          <w:bCs w:val="false"/>
+          <w:sz w:val="24"/>
+          <w:szCs w:val="24"/>
+        </w:rPr>
+        <w:t xml:space="preserve"> found no known vulnerability in the production dependencies of the frontend, the backend or the project root.</w:t>
       </w:r>
     </w:p>
     <w:p>

</xml_diff>

<commit_message>
Chapter 4 Table 23: the evaluators' number row includes the emergency contact (7a660aa)
Co-Authored-By: Claude Opus 5.5 <noreply@anthropic.com>
</commit_message>
<xml_diff>
--- a/docs/FINAL MANUSCRIPT/CHAPTER_4_RESULTS_AND_DISCUSSION.docx
+++ b/docs/FINAL MANUSCRIPT/CHAPTER_4_RESULTS_AND_DISCUSSION.docx
@@ -43452,7 +43452,7 @@
         </w:trPr>
         <w:tc>
           <w:tcPr>
-            <w:tcW w:type="dxa" w:w="1526"/>
+            <w:tcW w:type="dxa" w:w="1525"/>
             <w:tcBorders>
               <w:top w:val="single" w:color="1A202C" w:sz="12"/>
               <w:left w:val="none" w:color="auto" w:sz="0"/>
@@ -43486,7 +43486,7 @@
         </w:tc>
         <w:tc>
           <w:tcPr>
-            <w:tcW w:type="dxa" w:w="2789"/>
+            <w:tcW w:type="dxa" w:w="2787"/>
             <w:tcBorders>
               <w:top w:val="single" w:color="1A202C" w:sz="12"/>
               <w:left w:val="none" w:color="auto" w:sz="0"/>
@@ -43520,7 +43520,7 @@
         </w:tc>
         <w:tc>
           <w:tcPr>
-            <w:tcW w:type="dxa" w:w="3042"/>
+            <w:tcW w:type="dxa" w:w="3047"/>
             <w:tcBorders>
               <w:top w:val="single" w:color="1A202C" w:sz="12"/>
               <w:left w:val="none" w:color="auto" w:sz="0"/>
@@ -43554,7 +43554,7 @@
         </w:tc>
         <w:tc>
           <w:tcPr>
-            <w:tcW w:type="dxa" w:w="1283"/>
+            <w:tcW w:type="dxa" w:w="1281"/>
             <w:tcBorders>
               <w:top w:val="single" w:color="1A202C" w:sz="12"/>
               <w:left w:val="none" w:color="auto" w:sz="0"/>
@@ -43593,7 +43593,7 @@
         </w:trPr>
         <w:tc>
           <w:tcPr>
-            <w:tcW w:type="dxa" w:w="1526"/>
+            <w:tcW w:type="dxa" w:w="1525"/>
             <w:tcBorders>
               <w:top w:val="single" w:color="E2E8F0" w:sz="4"/>
               <w:left w:val="none" w:color="auto" w:sz="0"/>
@@ -43626,7 +43626,7 @@
         </w:tc>
         <w:tc>
           <w:tcPr>
-            <w:tcW w:type="dxa" w:w="2789"/>
+            <w:tcW w:type="dxa" w:w="2787"/>
             <w:tcBorders>
               <w:top w:val="single" w:color="E2E8F0" w:sz="4"/>
               <w:left w:val="none" w:color="auto" w:sz="0"/>
@@ -43659,7 +43659,7 @@
         </w:tc>
         <w:tc>
           <w:tcPr>
-            <w:tcW w:type="dxa" w:w="3042"/>
+            <w:tcW w:type="dxa" w:w="3047"/>
             <w:tcBorders>
               <w:top w:val="single" w:color="E2E8F0" w:sz="4"/>
               <w:left w:val="none" w:color="auto" w:sz="0"/>
@@ -43692,7 +43692,7 @@
         </w:tc>
         <w:tc>
           <w:tcPr>
-            <w:tcW w:type="dxa" w:w="1283"/>
+            <w:tcW w:type="dxa" w:w="1281"/>
             <w:tcBorders>
               <w:top w:val="single" w:color="E2E8F0" w:sz="4"/>
               <w:left w:val="none" w:color="auto" w:sz="0"/>
@@ -43730,7 +43730,7 @@
         </w:trPr>
         <w:tc>
           <w:tcPr>
-            <w:tcW w:type="dxa" w:w="1526"/>
+            <w:tcW w:type="dxa" w:w="1525"/>
             <w:tcBorders>
               <w:top w:val="single" w:color="E2E8F0" w:sz="4"/>
               <w:left w:val="none" w:color="auto" w:sz="0"/>
@@ -43763,7 +43763,7 @@
         </w:tc>
         <w:tc>
           <w:tcPr>
-            <w:tcW w:type="dxa" w:w="2789"/>
+            <w:tcW w:type="dxa" w:w="2787"/>
             <w:tcBorders>
               <w:top w:val="single" w:color="E2E8F0" w:sz="4"/>
               <w:left w:val="none" w:color="auto" w:sz="0"/>
@@ -43796,7 +43796,7 @@
         </w:tc>
         <w:tc>
           <w:tcPr>
-            <w:tcW w:type="dxa" w:w="3042"/>
+            <w:tcW w:type="dxa" w:w="3047"/>
             <w:tcBorders>
               <w:top w:val="single" w:color="E2E8F0" w:sz="4"/>
               <w:left w:val="none" w:color="auto" w:sz="0"/>
@@ -43829,7 +43829,7 @@
         </w:tc>
         <w:tc>
           <w:tcPr>
-            <w:tcW w:type="dxa" w:w="1283"/>
+            <w:tcW w:type="dxa" w:w="1281"/>
             <w:tcBorders>
               <w:top w:val="single" w:color="E2E8F0" w:sz="4"/>
               <w:left w:val="none" w:color="auto" w:sz="0"/>
@@ -43867,7 +43867,7 @@
         </w:trPr>
         <w:tc>
           <w:tcPr>
-            <w:tcW w:type="dxa" w:w="1526"/>
+            <w:tcW w:type="dxa" w:w="1525"/>
             <w:tcBorders>
               <w:top w:val="single" w:color="E2E8F0" w:sz="4"/>
               <w:left w:val="none" w:color="auto" w:sz="0"/>
@@ -43900,7 +43900,7 @@
         </w:tc>
         <w:tc>
           <w:tcPr>
-            <w:tcW w:type="dxa" w:w="2789"/>
+            <w:tcW w:type="dxa" w:w="2787"/>
             <w:tcBorders>
               <w:top w:val="single" w:color="E2E8F0" w:sz="4"/>
               <w:left w:val="none" w:color="auto" w:sz="0"/>
@@ -43933,7 +43933,7 @@
         </w:tc>
         <w:tc>
           <w:tcPr>
-            <w:tcW w:type="dxa" w:w="3042"/>
+            <w:tcW w:type="dxa" w:w="3047"/>
             <w:tcBorders>
               <w:top w:val="single" w:color="E2E8F0" w:sz="4"/>
               <w:left w:val="none" w:color="auto" w:sz="0"/>
@@ -43966,7 +43966,7 @@
         </w:tc>
         <w:tc>
           <w:tcPr>
-            <w:tcW w:type="dxa" w:w="1283"/>
+            <w:tcW w:type="dxa" w:w="1281"/>
             <w:tcBorders>
               <w:top w:val="single" w:color="E2E8F0" w:sz="4"/>
               <w:left w:val="none" w:color="auto" w:sz="0"/>
@@ -44004,7 +44004,7 @@
         </w:trPr>
         <w:tc>
           <w:tcPr>
-            <w:tcW w:type="dxa" w:w="1526"/>
+            <w:tcW w:type="dxa" w:w="1525"/>
             <w:tcBorders>
               <w:top w:val="single" w:color="E2E8F0" w:sz="4"/>
               <w:left w:val="none" w:color="auto" w:sz="0"/>
@@ -44037,7 +44037,7 @@
         </w:tc>
         <w:tc>
           <w:tcPr>
-            <w:tcW w:type="dxa" w:w="2789"/>
+            <w:tcW w:type="dxa" w:w="2787"/>
             <w:tcBorders>
               <w:top w:val="single" w:color="E2E8F0" w:sz="4"/>
               <w:left w:val="none" w:color="auto" w:sz="0"/>
@@ -44070,7 +44070,7 @@
         </w:tc>
         <w:tc>
           <w:tcPr>
-            <w:tcW w:type="dxa" w:w="3042"/>
+            <w:tcW w:type="dxa" w:w="3047"/>
             <w:tcBorders>
               <w:top w:val="single" w:color="E2E8F0" w:sz="4"/>
               <w:left w:val="none" w:color="auto" w:sz="0"/>
@@ -44103,7 +44103,7 @@
         </w:tc>
         <w:tc>
           <w:tcPr>
-            <w:tcW w:type="dxa" w:w="1283"/>
+            <w:tcW w:type="dxa" w:w="1281"/>
             <w:tcBorders>
               <w:top w:val="single" w:color="E2E8F0" w:sz="4"/>
               <w:left w:val="none" w:color="auto" w:sz="0"/>
@@ -44141,7 +44141,7 @@
         </w:trPr>
         <w:tc>
           <w:tcPr>
-            <w:tcW w:type="dxa" w:w="1526"/>
+            <w:tcW w:type="dxa" w:w="1525"/>
             <w:tcBorders>
               <w:top w:val="single" w:color="E2E8F0" w:sz="4"/>
               <w:left w:val="none" w:color="auto" w:sz="0"/>
@@ -44174,7 +44174,7 @@
         </w:tc>
         <w:tc>
           <w:tcPr>
-            <w:tcW w:type="dxa" w:w="2789"/>
+            <w:tcW w:type="dxa" w:w="2787"/>
             <w:tcBorders>
               <w:top w:val="single" w:color="E2E8F0" w:sz="4"/>
               <w:left w:val="none" w:color="auto" w:sz="0"/>
@@ -44207,7 +44207,7 @@
         </w:tc>
         <w:tc>
           <w:tcPr>
-            <w:tcW w:type="dxa" w:w="3042"/>
+            <w:tcW w:type="dxa" w:w="3047"/>
             <w:tcBorders>
               <w:top w:val="single" w:color="E2E8F0" w:sz="4"/>
               <w:left w:val="none" w:color="auto" w:sz="0"/>
@@ -44240,7 +44240,7 @@
         </w:tc>
         <w:tc>
           <w:tcPr>
-            <w:tcW w:type="dxa" w:w="1283"/>
+            <w:tcW w:type="dxa" w:w="1281"/>
             <w:tcBorders>
               <w:top w:val="single" w:color="E2E8F0" w:sz="4"/>
               <w:left w:val="none" w:color="auto" w:sz="0"/>
@@ -44278,7 +44278,7 @@
         </w:trPr>
         <w:tc>
           <w:tcPr>
-            <w:tcW w:type="dxa" w:w="1526"/>
+            <w:tcW w:type="dxa" w:w="1525"/>
             <w:tcBorders>
               <w:top w:val="single" w:color="E2E8F0" w:sz="4"/>
               <w:left w:val="none" w:color="auto" w:sz="0"/>
@@ -44311,7 +44311,7 @@
         </w:tc>
         <w:tc>
           <w:tcPr>
-            <w:tcW w:type="dxa" w:w="2789"/>
+            <w:tcW w:type="dxa" w:w="2787"/>
             <w:tcBorders>
               <w:top w:val="single" w:color="E2E8F0" w:sz="4"/>
               <w:left w:val="none" w:color="auto" w:sz="0"/>
@@ -44344,7 +44344,7 @@
         </w:tc>
         <w:tc>
           <w:tcPr>
-            <w:tcW w:type="dxa" w:w="3042"/>
+            <w:tcW w:type="dxa" w:w="3047"/>
             <w:tcBorders>
               <w:top w:val="single" w:color="E2E8F0" w:sz="4"/>
               <w:left w:val="none" w:color="auto" w:sz="0"/>
@@ -44377,7 +44377,7 @@
         </w:tc>
         <w:tc>
           <w:tcPr>
-            <w:tcW w:type="dxa" w:w="1283"/>
+            <w:tcW w:type="dxa" w:w="1281"/>
             <w:tcBorders>
               <w:top w:val="single" w:color="E2E8F0" w:sz="4"/>
               <w:left w:val="none" w:color="auto" w:sz="0"/>
@@ -44415,7 +44415,7 @@
         </w:trPr>
         <w:tc>
           <w:tcPr>
-            <w:tcW w:type="dxa" w:w="1526"/>
+            <w:tcW w:type="dxa" w:w="1525"/>
             <w:tcBorders>
               <w:top w:val="single" w:color="E2E8F0" w:sz="4"/>
               <w:left w:val="none" w:color="auto" w:sz="0"/>
@@ -44448,7 +44448,7 @@
         </w:tc>
         <w:tc>
           <w:tcPr>
-            <w:tcW w:type="dxa" w:w="2789"/>
+            <w:tcW w:type="dxa" w:w="2787"/>
             <w:tcBorders>
               <w:top w:val="single" w:color="E2E8F0" w:sz="4"/>
               <w:left w:val="none" w:color="auto" w:sz="0"/>
@@ -44481,7 +44481,7 @@
         </w:tc>
         <w:tc>
           <w:tcPr>
-            <w:tcW w:type="dxa" w:w="3042"/>
+            <w:tcW w:type="dxa" w:w="3047"/>
             <w:tcBorders>
               <w:top w:val="single" w:color="E2E8F0" w:sz="4"/>
               <w:left w:val="none" w:color="auto" w:sz="0"/>
@@ -44514,7 +44514,7 @@
         </w:tc>
         <w:tc>
           <w:tcPr>
-            <w:tcW w:type="dxa" w:w="1283"/>
+            <w:tcW w:type="dxa" w:w="1281"/>
             <w:tcBorders>
               <w:top w:val="single" w:color="E2E8F0" w:sz="4"/>
               <w:left w:val="none" w:color="auto" w:sz="0"/>
@@ -44552,7 +44552,7 @@
         </w:trPr>
         <w:tc>
           <w:tcPr>
-            <w:tcW w:type="dxa" w:w="1526"/>
+            <w:tcW w:type="dxa" w:w="1525"/>
             <w:tcBorders>
               <w:top w:val="single" w:color="E2E8F0" w:sz="4"/>
               <w:left w:val="none" w:color="auto" w:sz="0"/>
@@ -44585,7 +44585,7 @@
         </w:tc>
         <w:tc>
           <w:tcPr>
-            <w:tcW w:type="dxa" w:w="2789"/>
+            <w:tcW w:type="dxa" w:w="2787"/>
             <w:tcBorders>
               <w:top w:val="single" w:color="E2E8F0" w:sz="4"/>
               <w:left w:val="none" w:color="auto" w:sz="0"/>
@@ -44618,7 +44618,7 @@
         </w:tc>
         <w:tc>
           <w:tcPr>
-            <w:tcW w:type="dxa" w:w="3042"/>
+            <w:tcW w:type="dxa" w:w="3047"/>
             <w:tcBorders>
               <w:top w:val="single" w:color="E2E8F0" w:sz="4"/>
               <w:left w:val="none" w:color="auto" w:sz="0"/>
@@ -44651,7 +44651,7 @@
         </w:tc>
         <w:tc>
           <w:tcPr>
-            <w:tcW w:type="dxa" w:w="1283"/>
+            <w:tcW w:type="dxa" w:w="1281"/>
             <w:tcBorders>
               <w:top w:val="single" w:color="E2E8F0" w:sz="4"/>
               <w:left w:val="none" w:color="auto" w:sz="0"/>
@@ -44689,7 +44689,7 @@
         </w:trPr>
         <w:tc>
           <w:tcPr>
-            <w:tcW w:type="dxa" w:w="1526"/>
+            <w:tcW w:type="dxa" w:w="1525"/>
             <w:tcBorders>
               <w:top w:val="single" w:color="E2E8F0" w:sz="4"/>
               <w:left w:val="none" w:color="auto" w:sz="0"/>
@@ -44722,7 +44722,7 @@
         </w:tc>
         <w:tc>
           <w:tcPr>
-            <w:tcW w:type="dxa" w:w="2789"/>
+            <w:tcW w:type="dxa" w:w="2787"/>
             <w:tcBorders>
               <w:top w:val="single" w:color="E2E8F0" w:sz="4"/>
               <w:left w:val="none" w:color="auto" w:sz="0"/>
@@ -44755,7 +44755,7 @@
         </w:tc>
         <w:tc>
           <w:tcPr>
-            <w:tcW w:type="dxa" w:w="3042"/>
+            <w:tcW w:type="dxa" w:w="3047"/>
             <w:tcBorders>
               <w:top w:val="single" w:color="E2E8F0" w:sz="4"/>
               <w:left w:val="none" w:color="auto" w:sz="0"/>
@@ -44788,7 +44788,7 @@
         </w:tc>
         <w:tc>
           <w:tcPr>
-            <w:tcW w:type="dxa" w:w="1283"/>
+            <w:tcW w:type="dxa" w:w="1281"/>
             <w:tcBorders>
               <w:top w:val="single" w:color="E2E8F0" w:sz="4"/>
               <w:left w:val="none" w:color="auto" w:sz="0"/>
@@ -44826,7 +44826,7 @@
         </w:trPr>
         <w:tc>
           <w:tcPr>
-            <w:tcW w:type="dxa" w:w="1526"/>
+            <w:tcW w:type="dxa" w:w="1525"/>
             <w:tcBorders>
               <w:top w:val="single" w:color="E2E8F0" w:sz="4"/>
               <w:left w:val="none" w:color="auto" w:sz="0"/>
@@ -44859,7 +44859,7 @@
         </w:tc>
         <w:tc>
           <w:tcPr>
-            <w:tcW w:type="dxa" w:w="2789"/>
+            <w:tcW w:type="dxa" w:w="2787"/>
             <w:tcBorders>
               <w:top w:val="single" w:color="E2E8F0" w:sz="4"/>
               <w:left w:val="none" w:color="auto" w:sz="0"/>
@@ -44892,7 +44892,7 @@
         </w:tc>
         <w:tc>
           <w:tcPr>
-            <w:tcW w:type="dxa" w:w="3042"/>
+            <w:tcW w:type="dxa" w:w="3047"/>
             <w:tcBorders>
               <w:top w:val="single" w:color="E2E8F0" w:sz="4"/>
               <w:left w:val="none" w:color="auto" w:sz="0"/>
@@ -44925,7 +44925,7 @@
         </w:tc>
         <w:tc>
           <w:tcPr>
-            <w:tcW w:type="dxa" w:w="1283"/>
+            <w:tcW w:type="dxa" w:w="1281"/>
             <w:tcBorders>
               <w:top w:val="single" w:color="E2E8F0" w:sz="4"/>
               <w:left w:val="none" w:color="auto" w:sz="0"/>
@@ -44963,7 +44963,7 @@
         </w:trPr>
         <w:tc>
           <w:tcPr>
-            <w:tcW w:type="dxa" w:w="1526"/>
+            <w:tcW w:type="dxa" w:w="1525"/>
             <w:tcBorders>
               <w:top w:val="single" w:color="E2E8F0" w:sz="4"/>
               <w:left w:val="none" w:color="auto" w:sz="0"/>
@@ -44996,7 +44996,7 @@
         </w:tc>
         <w:tc>
           <w:tcPr>
-            <w:tcW w:type="dxa" w:w="2789"/>
+            <w:tcW w:type="dxa" w:w="2787"/>
             <w:tcBorders>
               <w:top w:val="single" w:color="E2E8F0" w:sz="4"/>
               <w:left w:val="none" w:color="auto" w:sz="0"/>
@@ -45029,7 +45029,7 @@
         </w:tc>
         <w:tc>
           <w:tcPr>
-            <w:tcW w:type="dxa" w:w="3042"/>
+            <w:tcW w:type="dxa" w:w="3047"/>
             <w:tcBorders>
               <w:top w:val="single" w:color="E2E8F0" w:sz="4"/>
               <w:left w:val="none" w:color="auto" w:sz="0"/>
@@ -45062,7 +45062,7 @@
         </w:tc>
         <w:tc>
           <w:tcPr>
-            <w:tcW w:type="dxa" w:w="1283"/>
+            <w:tcW w:type="dxa" w:w="1281"/>
             <w:tcBorders>
               <w:top w:val="single" w:color="E2E8F0" w:sz="4"/>
               <w:left w:val="none" w:color="auto" w:sz="0"/>
@@ -45100,7 +45100,7 @@
         </w:trPr>
         <w:tc>
           <w:tcPr>
-            <w:tcW w:type="dxa" w:w="1526"/>
+            <w:tcW w:type="dxa" w:w="1525"/>
             <w:tcBorders>
               <w:top w:val="single" w:color="E2E8F0" w:sz="4"/>
               <w:left w:val="none" w:color="auto" w:sz="0"/>
@@ -45133,7 +45133,7 @@
         </w:tc>
         <w:tc>
           <w:tcPr>
-            <w:tcW w:type="dxa" w:w="2789"/>
+            <w:tcW w:type="dxa" w:w="2787"/>
             <w:tcBorders>
               <w:top w:val="single" w:color="E2E8F0" w:sz="4"/>
               <w:left w:val="none" w:color="auto" w:sz="0"/>
@@ -45166,7 +45166,7 @@
         </w:tc>
         <w:tc>
           <w:tcPr>
-            <w:tcW w:type="dxa" w:w="3042"/>
+            <w:tcW w:type="dxa" w:w="3047"/>
             <w:tcBorders>
               <w:top w:val="single" w:color="E2E8F0" w:sz="4"/>
               <w:left w:val="none" w:color="auto" w:sz="0"/>
@@ -45199,7 +45199,7 @@
         </w:tc>
         <w:tc>
           <w:tcPr>
-            <w:tcW w:type="dxa" w:w="1283"/>
+            <w:tcW w:type="dxa" w:w="1281"/>
             <w:tcBorders>
               <w:top w:val="single" w:color="E2E8F0" w:sz="4"/>
               <w:left w:val="none" w:color="auto" w:sz="0"/>
@@ -45237,7 +45237,7 @@
         </w:trPr>
         <w:tc>
           <w:tcPr>
-            <w:tcW w:type="dxa" w:w="1526"/>
+            <w:tcW w:type="dxa" w:w="1525"/>
             <w:tcBorders>
               <w:top w:val="single" w:color="E2E8F0" w:sz="4"/>
               <w:left w:val="none" w:color="auto" w:sz="0"/>
@@ -45270,7 +45270,7 @@
         </w:tc>
         <w:tc>
           <w:tcPr>
-            <w:tcW w:type="dxa" w:w="2789"/>
+            <w:tcW w:type="dxa" w:w="2787"/>
             <w:tcBorders>
               <w:top w:val="single" w:color="E2E8F0" w:sz="4"/>
               <w:left w:val="none" w:color="auto" w:sz="0"/>
@@ -45303,7 +45303,7 @@
         </w:tc>
         <w:tc>
           <w:tcPr>
-            <w:tcW w:type="dxa" w:w="3042"/>
+            <w:tcW w:type="dxa" w:w="3047"/>
             <w:tcBorders>
               <w:top w:val="single" w:color="E2E8F0" w:sz="4"/>
               <w:left w:val="none" w:color="auto" w:sz="0"/>
@@ -45336,7 +45336,7 @@
         </w:tc>
         <w:tc>
           <w:tcPr>
-            <w:tcW w:type="dxa" w:w="1283"/>
+            <w:tcW w:type="dxa" w:w="1281"/>
             <w:tcBorders>
               <w:top w:val="single" w:color="E2E8F0" w:sz="4"/>
               <w:left w:val="none" w:color="auto" w:sz="0"/>
@@ -45374,7 +45374,7 @@
         </w:trPr>
         <w:tc>
           <w:tcPr>
-            <w:tcW w:type="dxa" w:w="1526"/>
+            <w:tcW w:type="dxa" w:w="1525"/>
             <w:tcBorders>
               <w:top w:val="single" w:color="E2E8F0" w:sz="4"/>
               <w:left w:val="none" w:color="auto" w:sz="0"/>
@@ -45407,7 +45407,7 @@
         </w:tc>
         <w:tc>
           <w:tcPr>
-            <w:tcW w:type="dxa" w:w="2789"/>
+            <w:tcW w:type="dxa" w:w="2787"/>
             <w:tcBorders>
               <w:top w:val="single" w:color="E2E8F0" w:sz="4"/>
               <w:left w:val="none" w:color="auto" w:sz="0"/>
@@ -45440,7 +45440,7 @@
         </w:tc>
         <w:tc>
           <w:tcPr>
-            <w:tcW w:type="dxa" w:w="3042"/>
+            <w:tcW w:type="dxa" w:w="3047"/>
             <w:tcBorders>
               <w:top w:val="single" w:color="E2E8F0" w:sz="4"/>
               <w:left w:val="none" w:color="auto" w:sz="0"/>
@@ -45473,7 +45473,7 @@
         </w:tc>
         <w:tc>
           <w:tcPr>
-            <w:tcW w:type="dxa" w:w="1283"/>
+            <w:tcW w:type="dxa" w:w="1281"/>
             <w:tcBorders>
               <w:top w:val="single" w:color="E2E8F0" w:sz="4"/>
               <w:left w:val="none" w:color="auto" w:sz="0"/>
@@ -45511,7 +45511,7 @@
         </w:trPr>
         <w:tc>
           <w:tcPr>
-            <w:tcW w:type="dxa" w:w="1526"/>
+            <w:tcW w:type="dxa" w:w="1525"/>
             <w:tcBorders>
               <w:top w:val="single" w:color="E2E8F0" w:sz="4"/>
               <w:left w:val="none" w:color="auto" w:sz="0"/>
@@ -45544,7 +45544,7 @@
         </w:tc>
         <w:tc>
           <w:tcPr>
-            <w:tcW w:type="dxa" w:w="2789"/>
+            <w:tcW w:type="dxa" w:w="2787"/>
             <w:tcBorders>
               <w:top w:val="single" w:color="E2E8F0" w:sz="4"/>
               <w:left w:val="none" w:color="auto" w:sz="0"/>
@@ -45577,7 +45577,7 @@
         </w:tc>
         <w:tc>
           <w:tcPr>
-            <w:tcW w:type="dxa" w:w="3042"/>
+            <w:tcW w:type="dxa" w:w="3047"/>
             <w:tcBorders>
               <w:top w:val="single" w:color="E2E8F0" w:sz="4"/>
               <w:left w:val="none" w:color="auto" w:sz="0"/>
@@ -45610,7 +45610,7 @@
         </w:tc>
         <w:tc>
           <w:tcPr>
-            <w:tcW w:type="dxa" w:w="1283"/>
+            <w:tcW w:type="dxa" w:w="1281"/>
             <w:tcBorders>
               <w:top w:val="single" w:color="E2E8F0" w:sz="4"/>
               <w:left w:val="none" w:color="auto" w:sz="0"/>
@@ -45648,7 +45648,7 @@
         </w:trPr>
         <w:tc>
           <w:tcPr>
-            <w:tcW w:type="dxa" w:w="1526"/>
+            <w:tcW w:type="dxa" w:w="1525"/>
             <w:tcBorders>
               <w:top w:val="single" w:color="E2E8F0" w:sz="4"/>
               <w:left w:val="none" w:color="auto" w:sz="0"/>
@@ -45681,7 +45681,7 @@
         </w:tc>
         <w:tc>
           <w:tcPr>
-            <w:tcW w:type="dxa" w:w="2789"/>
+            <w:tcW w:type="dxa" w:w="2787"/>
             <w:tcBorders>
               <w:top w:val="single" w:color="E2E8F0" w:sz="4"/>
               <w:left w:val="none" w:color="auto" w:sz="0"/>
@@ -45714,7 +45714,7 @@
         </w:tc>
         <w:tc>
           <w:tcPr>
-            <w:tcW w:type="dxa" w:w="3042"/>
+            <w:tcW w:type="dxa" w:w="3047"/>
             <w:tcBorders>
               <w:top w:val="single" w:color="E2E8F0" w:sz="4"/>
               <w:left w:val="none" w:color="auto" w:sz="0"/>
@@ -45747,7 +45747,7 @@
         </w:tc>
         <w:tc>
           <w:tcPr>
-            <w:tcW w:type="dxa" w:w="1283"/>
+            <w:tcW w:type="dxa" w:w="1281"/>
             <w:tcBorders>
               <w:top w:val="single" w:color="E2E8F0" w:sz="4"/>
               <w:left w:val="none" w:color="auto" w:sz="0"/>
@@ -45785,7 +45785,7 @@
         </w:trPr>
         <w:tc>
           <w:tcPr>
-            <w:tcW w:type="dxa" w:w="1526"/>
+            <w:tcW w:type="dxa" w:w="1525"/>
             <w:tcBorders>
               <w:top w:val="single" w:color="E2E8F0" w:sz="4"/>
               <w:left w:val="none" w:color="auto" w:sz="0"/>
@@ -45818,7 +45818,7 @@
         </w:tc>
         <w:tc>
           <w:tcPr>
-            <w:tcW w:type="dxa" w:w="2789"/>
+            <w:tcW w:type="dxa" w:w="2787"/>
             <w:tcBorders>
               <w:top w:val="single" w:color="E2E8F0" w:sz="4"/>
               <w:left w:val="none" w:color="auto" w:sz="0"/>
@@ -45851,7 +45851,7 @@
         </w:tc>
         <w:tc>
           <w:tcPr>
-            <w:tcW w:type="dxa" w:w="3042"/>
+            <w:tcW w:type="dxa" w:w="3047"/>
             <w:tcBorders>
               <w:top w:val="single" w:color="E2E8F0" w:sz="4"/>
               <w:left w:val="none" w:color="auto" w:sz="0"/>
@@ -45884,7 +45884,7 @@
         </w:tc>
         <w:tc>
           <w:tcPr>
-            <w:tcW w:type="dxa" w:w="1283"/>
+            <w:tcW w:type="dxa" w:w="1281"/>
             <w:tcBorders>
               <w:top w:val="single" w:color="E2E8F0" w:sz="4"/>
               <w:left w:val="none" w:color="auto" w:sz="0"/>
@@ -45922,7 +45922,7 @@
         </w:trPr>
         <w:tc>
           <w:tcPr>
-            <w:tcW w:type="dxa" w:w="1526"/>
+            <w:tcW w:type="dxa" w:w="1525"/>
             <w:tcBorders>
               <w:top w:val="single" w:color="E2E8F0" w:sz="4"/>
               <w:left w:val="none" w:color="auto" w:sz="0"/>
@@ -45955,7 +45955,7 @@
         </w:tc>
         <w:tc>
           <w:tcPr>
-            <w:tcW w:type="dxa" w:w="2789"/>
+            <w:tcW w:type="dxa" w:w="2787"/>
             <w:tcBorders>
               <w:top w:val="single" w:color="E2E8F0" w:sz="4"/>
               <w:left w:val="none" w:color="auto" w:sz="0"/>
@@ -45988,7 +45988,7 @@
         </w:tc>
         <w:tc>
           <w:tcPr>
-            <w:tcW w:type="dxa" w:w="3042"/>
+            <w:tcW w:type="dxa" w:w="3047"/>
             <w:tcBorders>
               <w:top w:val="single" w:color="E2E8F0" w:sz="4"/>
               <w:left w:val="none" w:color="auto" w:sz="0"/>
@@ -46021,7 +46021,7 @@
         </w:tc>
         <w:tc>
           <w:tcPr>
-            <w:tcW w:type="dxa" w:w="1283"/>
+            <w:tcW w:type="dxa" w:w="1281"/>
             <w:tcBorders>
               <w:top w:val="single" w:color="E2E8F0" w:sz="4"/>
               <w:left w:val="none" w:color="auto" w:sz="0"/>
@@ -46059,7 +46059,7 @@
         </w:trPr>
         <w:tc>
           <w:tcPr>
-            <w:tcW w:type="dxa" w:w="1526"/>
+            <w:tcW w:type="dxa" w:w="1525"/>
             <w:tcBorders>
               <w:top w:val="single" w:color="E2E8F0" w:sz="4"/>
               <w:left w:val="none" w:color="auto" w:sz="0"/>
@@ -46092,7 +46092,7 @@
         </w:tc>
         <w:tc>
           <w:tcPr>
-            <w:tcW w:type="dxa" w:w="2789"/>
+            <w:tcW w:type="dxa" w:w="2787"/>
             <w:tcBorders>
               <w:top w:val="single" w:color="E2E8F0" w:sz="4"/>
               <w:left w:val="none" w:color="auto" w:sz="0"/>
@@ -46125,7 +46125,7 @@
         </w:tc>
         <w:tc>
           <w:tcPr>
-            <w:tcW w:type="dxa" w:w="3042"/>
+            <w:tcW w:type="dxa" w:w="3047"/>
             <w:tcBorders>
               <w:top w:val="single" w:color="E2E8F0" w:sz="4"/>
               <w:left w:val="none" w:color="auto" w:sz="0"/>
@@ -46158,7 +46158,7 @@
         </w:tc>
         <w:tc>
           <w:tcPr>
-            <w:tcW w:type="dxa" w:w="1283"/>
+            <w:tcW w:type="dxa" w:w="1281"/>
             <w:tcBorders>
               <w:top w:val="single" w:color="E2E8F0" w:sz="4"/>
               <w:left w:val="none" w:color="auto" w:sz="0"/>
@@ -46196,7 +46196,7 @@
         </w:trPr>
         <w:tc>
           <w:tcPr>
-            <w:tcW w:type="dxa" w:w="1526"/>
+            <w:tcW w:type="dxa" w:w="1525"/>
             <w:tcBorders>
               <w:top w:val="single" w:color="E2E8F0" w:sz="4"/>
               <w:left w:val="none" w:color="auto" w:sz="0"/>
@@ -46229,7 +46229,7 @@
         </w:tc>
         <w:tc>
           <w:tcPr>
-            <w:tcW w:type="dxa" w:w="2789"/>
+            <w:tcW w:type="dxa" w:w="2787"/>
             <w:tcBorders>
               <w:top w:val="single" w:color="E2E8F0" w:sz="4"/>
               <w:left w:val="none" w:color="auto" w:sz="0"/>
@@ -46262,7 +46262,7 @@
         </w:tc>
         <w:tc>
           <w:tcPr>
-            <w:tcW w:type="dxa" w:w="3042"/>
+            <w:tcW w:type="dxa" w:w="3047"/>
             <w:tcBorders>
               <w:top w:val="single" w:color="E2E8F0" w:sz="4"/>
               <w:left w:val="none" w:color="auto" w:sz="0"/>
@@ -46295,7 +46295,7 @@
         </w:tc>
         <w:tc>
           <w:tcPr>
-            <w:tcW w:type="dxa" w:w="1283"/>
+            <w:tcW w:type="dxa" w:w="1281"/>
             <w:tcBorders>
               <w:top w:val="single" w:color="E2E8F0" w:sz="4"/>
               <w:left w:val="none" w:color="auto" w:sz="0"/>
@@ -46333,7 +46333,7 @@
         </w:trPr>
         <w:tc>
           <w:tcPr>
-            <w:tcW w:type="dxa" w:w="1526"/>
+            <w:tcW w:type="dxa" w:w="1525"/>
             <w:tcBorders>
               <w:top w:val="single" w:color="E2E8F0" w:sz="4"/>
               <w:left w:val="none" w:color="auto" w:sz="0"/>
@@ -46366,7 +46366,7 @@
         </w:tc>
         <w:tc>
           <w:tcPr>
-            <w:tcW w:type="dxa" w:w="2789"/>
+            <w:tcW w:type="dxa" w:w="2787"/>
             <w:tcBorders>
               <w:top w:val="single" w:color="E2E8F0" w:sz="4"/>
               <w:left w:val="none" w:color="auto" w:sz="0"/>
@@ -46399,7 +46399,7 @@
         </w:tc>
         <w:tc>
           <w:tcPr>
-            <w:tcW w:type="dxa" w:w="3042"/>
+            <w:tcW w:type="dxa" w:w="3047"/>
             <w:tcBorders>
               <w:top w:val="single" w:color="E2E8F0" w:sz="4"/>
               <w:left w:val="none" w:color="auto" w:sz="0"/>
@@ -46432,7 +46432,7 @@
         </w:tc>
         <w:tc>
           <w:tcPr>
-            <w:tcW w:type="dxa" w:w="1283"/>
+            <w:tcW w:type="dxa" w:w="1281"/>
             <w:tcBorders>
               <w:top w:val="single" w:color="E2E8F0" w:sz="4"/>
               <w:left w:val="none" w:color="auto" w:sz="0"/>
@@ -46470,7 +46470,7 @@
         </w:trPr>
         <w:tc>
           <w:tcPr>
-            <w:tcW w:type="dxa" w:w="1526"/>
+            <w:tcW w:type="dxa" w:w="1525"/>
             <w:tcBorders>
               <w:top w:val="single" w:color="E2E8F0" w:sz="4"/>
               <w:left w:val="none" w:color="auto" w:sz="0"/>
@@ -46503,7 +46503,7 @@
         </w:tc>
         <w:tc>
           <w:tcPr>
-            <w:tcW w:type="dxa" w:w="2789"/>
+            <w:tcW w:type="dxa" w:w="2787"/>
             <w:tcBorders>
               <w:top w:val="single" w:color="E2E8F0" w:sz="4"/>
               <w:left w:val="none" w:color="auto" w:sz="0"/>
@@ -46536,7 +46536,7 @@
         </w:tc>
         <w:tc>
           <w:tcPr>
-            <w:tcW w:type="dxa" w:w="3042"/>
+            <w:tcW w:type="dxa" w:w="3047"/>
             <w:tcBorders>
               <w:top w:val="single" w:color="E2E8F0" w:sz="4"/>
               <w:left w:val="none" w:color="auto" w:sz="0"/>
@@ -46569,7 +46569,7 @@
         </w:tc>
         <w:tc>
           <w:tcPr>
-            <w:tcW w:type="dxa" w:w="1283"/>
+            <w:tcW w:type="dxa" w:w="1281"/>
             <w:tcBorders>
               <w:top w:val="single" w:color="E2E8F0" w:sz="4"/>
               <w:left w:val="none" w:color="auto" w:sz="0"/>
@@ -46607,7 +46607,7 @@
         </w:trPr>
         <w:tc>
           <w:tcPr>
-            <w:tcW w:type="dxa" w:w="1526"/>
+            <w:tcW w:type="dxa" w:w="1525"/>
             <w:tcBorders>
               <w:top w:val="single" w:color="E2E8F0" w:sz="4"/>
               <w:left w:val="none" w:color="auto" w:sz="0"/>
@@ -46640,7 +46640,7 @@
         </w:tc>
         <w:tc>
           <w:tcPr>
-            <w:tcW w:type="dxa" w:w="2789"/>
+            <w:tcW w:type="dxa" w:w="2787"/>
             <w:tcBorders>
               <w:top w:val="single" w:color="E2E8F0" w:sz="4"/>
               <w:left w:val="none" w:color="auto" w:sz="0"/>
@@ -46673,7 +46673,7 @@
         </w:tc>
         <w:tc>
           <w:tcPr>
-            <w:tcW w:type="dxa" w:w="3042"/>
+            <w:tcW w:type="dxa" w:w="3047"/>
             <w:tcBorders>
               <w:top w:val="single" w:color="E2E8F0" w:sz="4"/>
               <w:left w:val="none" w:color="auto" w:sz="0"/>
@@ -46706,7 +46706,7 @@
         </w:tc>
         <w:tc>
           <w:tcPr>
-            <w:tcW w:type="dxa" w:w="1283"/>
+            <w:tcW w:type="dxa" w:w="1281"/>
             <w:tcBorders>
               <w:top w:val="single" w:color="E2E8F0" w:sz="4"/>
               <w:left w:val="none" w:color="auto" w:sz="0"/>
@@ -46744,7 +46744,7 @@
         </w:trPr>
         <w:tc>
           <w:tcPr>
-            <w:tcW w:type="dxa" w:w="1526"/>
+            <w:tcW w:type="dxa" w:w="1525"/>
             <w:tcBorders>
               <w:top w:val="single" w:color="E2E8F0" w:sz="4"/>
               <w:left w:val="none" w:color="auto" w:sz="0"/>
@@ -46777,7 +46777,7 @@
         </w:tc>
         <w:tc>
           <w:tcPr>
-            <w:tcW w:type="dxa" w:w="2789"/>
+            <w:tcW w:type="dxa" w:w="2787"/>
             <w:tcBorders>
               <w:top w:val="single" w:color="E2E8F0" w:sz="4"/>
               <w:left w:val="none" w:color="auto" w:sz="0"/>
@@ -46810,7 +46810,7 @@
         </w:tc>
         <w:tc>
           <w:tcPr>
-            <w:tcW w:type="dxa" w:w="3042"/>
+            <w:tcW w:type="dxa" w:w="3047"/>
             <w:tcBorders>
               <w:top w:val="single" w:color="E2E8F0" w:sz="4"/>
               <w:left w:val="none" w:color="auto" w:sz="0"/>
@@ -46843,7 +46843,7 @@
         </w:tc>
         <w:tc>
           <w:tcPr>
-            <w:tcW w:type="dxa" w:w="1283"/>
+            <w:tcW w:type="dxa" w:w="1281"/>
             <w:tcBorders>
               <w:top w:val="single" w:color="E2E8F0" w:sz="4"/>
               <w:left w:val="none" w:color="auto" w:sz="0"/>
@@ -46881,7 +46881,7 @@
         </w:trPr>
         <w:tc>
           <w:tcPr>
-            <w:tcW w:type="dxa" w:w="1526"/>
+            <w:tcW w:type="dxa" w:w="1525"/>
             <w:tcBorders>
               <w:top w:val="single" w:color="E2E8F0" w:sz="4"/>
               <w:left w:val="none" w:color="auto" w:sz="0"/>
@@ -46914,7 +46914,7 @@
         </w:tc>
         <w:tc>
           <w:tcPr>
-            <w:tcW w:type="dxa" w:w="2789"/>
+            <w:tcW w:type="dxa" w:w="2787"/>
             <w:tcBorders>
               <w:top w:val="single" w:color="E2E8F0" w:sz="4"/>
               <w:left w:val="none" w:color="auto" w:sz="0"/>
@@ -46947,7 +46947,7 @@
         </w:tc>
         <w:tc>
           <w:tcPr>
-            <w:tcW w:type="dxa" w:w="3042"/>
+            <w:tcW w:type="dxa" w:w="3047"/>
             <w:tcBorders>
               <w:top w:val="single" w:color="E2E8F0" w:sz="4"/>
               <w:left w:val="none" w:color="auto" w:sz="0"/>
@@ -46980,7 +46980,7 @@
         </w:tc>
         <w:tc>
           <w:tcPr>
-            <w:tcW w:type="dxa" w:w="1283"/>
+            <w:tcW w:type="dxa" w:w="1281"/>
             <w:tcBorders>
               <w:top w:val="single" w:color="E2E8F0" w:sz="4"/>
               <w:left w:val="none" w:color="auto" w:sz="0"/>
@@ -47018,7 +47018,7 @@
         </w:trPr>
         <w:tc>
           <w:tcPr>
-            <w:tcW w:type="dxa" w:w="1526"/>
+            <w:tcW w:type="dxa" w:w="1525"/>
             <w:tcBorders>
               <w:top w:val="single" w:color="E2E8F0" w:sz="4"/>
               <w:left w:val="none" w:color="auto" w:sz="0"/>
@@ -47051,7 +47051,7 @@
         </w:tc>
         <w:tc>
           <w:tcPr>
-            <w:tcW w:type="dxa" w:w="2789"/>
+            <w:tcW w:type="dxa" w:w="2787"/>
             <w:tcBorders>
               <w:top w:val="single" w:color="E2E8F0" w:sz="4"/>
               <w:left w:val="none" w:color="auto" w:sz="0"/>
@@ -47084,7 +47084,7 @@
         </w:tc>
         <w:tc>
           <w:tcPr>
-            <w:tcW w:type="dxa" w:w="3042"/>
+            <w:tcW w:type="dxa" w:w="3047"/>
             <w:tcBorders>
               <w:top w:val="single" w:color="E2E8F0" w:sz="4"/>
               <w:left w:val="none" w:color="auto" w:sz="0"/>
@@ -47117,7 +47117,7 @@
         </w:tc>
         <w:tc>
           <w:tcPr>
-            <w:tcW w:type="dxa" w:w="1283"/>
+            <w:tcW w:type="dxa" w:w="1281"/>
             <w:tcBorders>
               <w:top w:val="single" w:color="E2E8F0" w:sz="4"/>
               <w:left w:val="none" w:color="auto" w:sz="0"/>
@@ -47155,7 +47155,7 @@
         </w:trPr>
         <w:tc>
           <w:tcPr>
-            <w:tcW w:type="dxa" w:w="1526"/>
+            <w:tcW w:type="dxa" w:w="1525"/>
             <w:tcBorders>
               <w:top w:val="single" w:color="E2E8F0" w:sz="4"/>
               <w:left w:val="none" w:color="auto" w:sz="0"/>
@@ -47188,7 +47188,7 @@
         </w:tc>
         <w:tc>
           <w:tcPr>
-            <w:tcW w:type="dxa" w:w="2789"/>
+            <w:tcW w:type="dxa" w:w="2787"/>
             <w:tcBorders>
               <w:top w:val="single" w:color="E2E8F0" w:sz="4"/>
               <w:left w:val="none" w:color="auto" w:sz="0"/>
@@ -47221,7 +47221,7 @@
         </w:tc>
         <w:tc>
           <w:tcPr>
-            <w:tcW w:type="dxa" w:w="3042"/>
+            <w:tcW w:type="dxa" w:w="3047"/>
             <w:tcBorders>
               <w:top w:val="single" w:color="E2E8F0" w:sz="4"/>
               <w:left w:val="none" w:color="auto" w:sz="0"/>
@@ -47254,7 +47254,7 @@
         </w:tc>
         <w:tc>
           <w:tcPr>
-            <w:tcW w:type="dxa" w:w="1283"/>
+            <w:tcW w:type="dxa" w:w="1281"/>
             <w:tcBorders>
               <w:top w:val="single" w:color="E2E8F0" w:sz="4"/>
               <w:left w:val="none" w:color="auto" w:sz="0"/>
@@ -47292,7 +47292,7 @@
         </w:trPr>
         <w:tc>
           <w:tcPr>
-            <w:tcW w:type="dxa" w:w="1526"/>
+            <w:tcW w:type="dxa" w:w="1525"/>
             <w:tcBorders>
               <w:top w:val="single" w:color="E2E8F0" w:sz="4"/>
               <w:left w:val="none" w:color="auto" w:sz="0"/>
@@ -47325,7 +47325,7 @@
         </w:tc>
         <w:tc>
           <w:tcPr>
-            <w:tcW w:type="dxa" w:w="2789"/>
+            <w:tcW w:type="dxa" w:w="2787"/>
             <w:tcBorders>
               <w:top w:val="single" w:color="E2E8F0" w:sz="4"/>
               <w:left w:val="none" w:color="auto" w:sz="0"/>
@@ -47358,7 +47358,7 @@
         </w:tc>
         <w:tc>
           <w:tcPr>
-            <w:tcW w:type="dxa" w:w="3042"/>
+            <w:tcW w:type="dxa" w:w="3047"/>
             <w:tcBorders>
               <w:top w:val="single" w:color="E2E8F0" w:sz="4"/>
               <w:left w:val="none" w:color="auto" w:sz="0"/>
@@ -47391,7 +47391,7 @@
         </w:tc>
         <w:tc>
           <w:tcPr>
-            <w:tcW w:type="dxa" w:w="1283"/>
+            <w:tcW w:type="dxa" w:w="1281"/>
             <w:tcBorders>
               <w:top w:val="single" w:color="E2E8F0" w:sz="4"/>
               <w:left w:val="none" w:color="auto" w:sz="0"/>
@@ -47429,7 +47429,7 @@
         </w:trPr>
         <w:tc>
           <w:tcPr>
-            <w:tcW w:type="dxa" w:w="1526"/>
+            <w:tcW w:type="dxa" w:w="1525"/>
             <w:tcBorders>
               <w:top w:val="single" w:color="E2E8F0" w:sz="4"/>
               <w:left w:val="none" w:color="auto" w:sz="0"/>
@@ -47462,7 +47462,7 @@
         </w:tc>
         <w:tc>
           <w:tcPr>
-            <w:tcW w:type="dxa" w:w="2789"/>
+            <w:tcW w:type="dxa" w:w="2787"/>
             <w:tcBorders>
               <w:top w:val="single" w:color="E2E8F0" w:sz="4"/>
               <w:left w:val="none" w:color="auto" w:sz="0"/>
@@ -47495,7 +47495,7 @@
         </w:tc>
         <w:tc>
           <w:tcPr>
-            <w:tcW w:type="dxa" w:w="3042"/>
+            <w:tcW w:type="dxa" w:w="3047"/>
             <w:tcBorders>
               <w:top w:val="single" w:color="E2E8F0" w:sz="4"/>
               <w:left w:val="none" w:color="auto" w:sz="0"/>
@@ -47528,7 +47528,7 @@
         </w:tc>
         <w:tc>
           <w:tcPr>
-            <w:tcW w:type="dxa" w:w="1283"/>
+            <w:tcW w:type="dxa" w:w="1281"/>
             <w:tcBorders>
               <w:top w:val="single" w:color="E2E8F0" w:sz="4"/>
               <w:left w:val="none" w:color="auto" w:sz="0"/>
@@ -47566,7 +47566,7 @@
         </w:trPr>
         <w:tc>
           <w:tcPr>
-            <w:tcW w:type="dxa" w:w="1526"/>
+            <w:tcW w:type="dxa" w:w="1525"/>
             <w:tcBorders>
               <w:top w:val="single" w:color="E2E8F0" w:sz="4"/>
               <w:left w:val="none" w:color="auto" w:sz="0"/>
@@ -47599,7 +47599,7 @@
         </w:tc>
         <w:tc>
           <w:tcPr>
-            <w:tcW w:type="dxa" w:w="2789"/>
+            <w:tcW w:type="dxa" w:w="2787"/>
             <w:tcBorders>
               <w:top w:val="single" w:color="E2E8F0" w:sz="4"/>
               <w:left w:val="none" w:color="auto" w:sz="0"/>
@@ -47632,7 +47632,7 @@
         </w:tc>
         <w:tc>
           <w:tcPr>
-            <w:tcW w:type="dxa" w:w="3042"/>
+            <w:tcW w:type="dxa" w:w="3047"/>
             <w:tcBorders>
               <w:top w:val="single" w:color="E2E8F0" w:sz="4"/>
               <w:left w:val="none" w:color="auto" w:sz="0"/>
@@ -47665,7 +47665,7 @@
         </w:tc>
         <w:tc>
           <w:tcPr>
-            <w:tcW w:type="dxa" w:w="1283"/>
+            <w:tcW w:type="dxa" w:w="1281"/>
             <w:tcBorders>
               <w:top w:val="single" w:color="E2E8F0" w:sz="4"/>
               <w:left w:val="none" w:color="auto" w:sz="0"/>
@@ -47703,7 +47703,7 @@
         </w:trPr>
         <w:tc>
           <w:tcPr>
-            <w:tcW w:type="dxa" w:w="1526"/>
+            <w:tcW w:type="dxa" w:w="1525"/>
             <w:tcBorders>
               <w:top w:val="single" w:color="E2E8F0" w:sz="4"/>
               <w:left w:val="none" w:color="auto" w:sz="0"/>
@@ -47736,7 +47736,7 @@
         </w:tc>
         <w:tc>
           <w:tcPr>
-            <w:tcW w:type="dxa" w:w="2789"/>
+            <w:tcW w:type="dxa" w:w="2787"/>
             <w:tcBorders>
               <w:top w:val="single" w:color="E2E8F0" w:sz="4"/>
               <w:left w:val="none" w:color="auto" w:sz="0"/>
@@ -47769,7 +47769,7 @@
         </w:tc>
         <w:tc>
           <w:tcPr>
-            <w:tcW w:type="dxa" w:w="3042"/>
+            <w:tcW w:type="dxa" w:w="3047"/>
             <w:tcBorders>
               <w:top w:val="single" w:color="E2E8F0" w:sz="4"/>
               <w:left w:val="none" w:color="auto" w:sz="0"/>
@@ -47802,7 +47802,7 @@
         </w:tc>
         <w:tc>
           <w:tcPr>
-            <w:tcW w:type="dxa" w:w="1283"/>
+            <w:tcW w:type="dxa" w:w="1281"/>
             <w:tcBorders>
               <w:top w:val="single" w:color="E2E8F0" w:sz="4"/>
               <w:left w:val="none" w:color="auto" w:sz="0"/>
@@ -47840,7 +47840,7 @@
         </w:trPr>
         <w:tc>
           <w:tcPr>
-            <w:tcW w:type="dxa" w:w="1526"/>
+            <w:tcW w:type="dxa" w:w="1525"/>
             <w:tcBorders>
               <w:top w:val="single" w:color="E2E8F0" w:sz="4"/>
               <w:left w:val="none" w:color="auto" w:sz="0"/>
@@ -47873,7 +47873,7 @@
         </w:tc>
         <w:tc>
           <w:tcPr>
-            <w:tcW w:type="dxa" w:w="2789"/>
+            <w:tcW w:type="dxa" w:w="2787"/>
             <w:tcBorders>
               <w:top w:val="single" w:color="E2E8F0" w:sz="4"/>
               <w:left w:val="none" w:color="auto" w:sz="0"/>
@@ -47906,7 +47906,7 @@
         </w:tc>
         <w:tc>
           <w:tcPr>
-            <w:tcW w:type="dxa" w:w="3042"/>
+            <w:tcW w:type="dxa" w:w="3047"/>
             <w:tcBorders>
               <w:top w:val="single" w:color="E2E8F0" w:sz="4"/>
               <w:left w:val="none" w:color="auto" w:sz="0"/>
@@ -47939,7 +47939,7 @@
         </w:tc>
         <w:tc>
           <w:tcPr>
-            <w:tcW w:type="dxa" w:w="1283"/>
+            <w:tcW w:type="dxa" w:w="1281"/>
             <w:tcBorders>
               <w:top w:val="single" w:color="E2E8F0" w:sz="4"/>
               <w:left w:val="none" w:color="auto" w:sz="0"/>
@@ -47977,7 +47977,7 @@
         </w:trPr>
         <w:tc>
           <w:tcPr>
-            <w:tcW w:type="dxa" w:w="1526"/>
+            <w:tcW w:type="dxa" w:w="1525"/>
             <w:tcBorders>
               <w:top w:val="single" w:color="E2E8F0" w:sz="4"/>
               <w:left w:val="none" w:color="auto" w:sz="0"/>
@@ -48010,7 +48010,7 @@
         </w:tc>
         <w:tc>
           <w:tcPr>
-            <w:tcW w:type="dxa" w:w="2789"/>
+            <w:tcW w:type="dxa" w:w="2787"/>
             <w:tcBorders>
               <w:top w:val="single" w:color="E2E8F0" w:sz="4"/>
               <w:left w:val="none" w:color="auto" w:sz="0"/>
@@ -48043,7 +48043,7 @@
         </w:tc>
         <w:tc>
           <w:tcPr>
-            <w:tcW w:type="dxa" w:w="3042"/>
+            <w:tcW w:type="dxa" w:w="3047"/>
             <w:tcBorders>
               <w:top w:val="single" w:color="E2E8F0" w:sz="4"/>
               <w:left w:val="none" w:color="auto" w:sz="0"/>
@@ -48076,7 +48076,7 @@
         </w:tc>
         <w:tc>
           <w:tcPr>
-            <w:tcW w:type="dxa" w:w="1283"/>
+            <w:tcW w:type="dxa" w:w="1281"/>
             <w:tcBorders>
               <w:top w:val="single" w:color="E2E8F0" w:sz="4"/>
               <w:left w:val="none" w:color="auto" w:sz="0"/>
@@ -48114,7 +48114,7 @@
         </w:trPr>
         <w:tc>
           <w:tcPr>
-            <w:tcW w:type="dxa" w:w="1526"/>
+            <w:tcW w:type="dxa" w:w="1525"/>
             <w:tcBorders>
               <w:top w:val="single" w:color="E2E8F0" w:sz="4"/>
               <w:left w:val="none" w:color="auto" w:sz="0"/>
@@ -48147,7 +48147,7 @@
         </w:tc>
         <w:tc>
           <w:tcPr>
-            <w:tcW w:type="dxa" w:w="2789"/>
+            <w:tcW w:type="dxa" w:w="2787"/>
             <w:tcBorders>
               <w:top w:val="single" w:color="E2E8F0" w:sz="4"/>
               <w:left w:val="none" w:color="auto" w:sz="0"/>
@@ -48180,7 +48180,7 @@
         </w:tc>
         <w:tc>
           <w:tcPr>
-            <w:tcW w:type="dxa" w:w="3042"/>
+            <w:tcW w:type="dxa" w:w="3047"/>
             <w:tcBorders>
               <w:top w:val="single" w:color="E2E8F0" w:sz="4"/>
               <w:left w:val="none" w:color="auto" w:sz="0"/>
@@ -48213,7 +48213,7 @@
         </w:tc>
         <w:tc>
           <w:tcPr>
-            <w:tcW w:type="dxa" w:w="1283"/>
+            <w:tcW w:type="dxa" w:w="1281"/>
             <w:tcBorders>
               <w:top w:val="single" w:color="E2E8F0" w:sz="4"/>
               <w:left w:val="none" w:color="auto" w:sz="0"/>
@@ -48251,7 +48251,7 @@
         </w:trPr>
         <w:tc>
           <w:tcPr>
-            <w:tcW w:type="dxa" w:w="1526"/>
+            <w:tcW w:type="dxa" w:w="1525"/>
             <w:tcBorders>
               <w:top w:val="single" w:color="E2E8F0" w:sz="4"/>
               <w:left w:val="none" w:color="auto" w:sz="0"/>
@@ -48284,7 +48284,7 @@
         </w:tc>
         <w:tc>
           <w:tcPr>
-            <w:tcW w:type="dxa" w:w="2789"/>
+            <w:tcW w:type="dxa" w:w="2787"/>
             <w:tcBorders>
               <w:top w:val="single" w:color="E2E8F0" w:sz="4"/>
               <w:left w:val="none" w:color="auto" w:sz="0"/>
@@ -48317,7 +48317,7 @@
         </w:tc>
         <w:tc>
           <w:tcPr>
-            <w:tcW w:type="dxa" w:w="3042"/>
+            <w:tcW w:type="dxa" w:w="3047"/>
             <w:tcBorders>
               <w:top w:val="single" w:color="E2E8F0" w:sz="4"/>
               <w:left w:val="none" w:color="auto" w:sz="0"/>
@@ -48350,7 +48350,7 @@
         </w:tc>
         <w:tc>
           <w:tcPr>
-            <w:tcW w:type="dxa" w:w="1283"/>
+            <w:tcW w:type="dxa" w:w="1281"/>
             <w:tcBorders>
               <w:top w:val="single" w:color="E2E8F0" w:sz="4"/>
               <w:left w:val="none" w:color="auto" w:sz="0"/>
@@ -48388,7 +48388,7 @@
         </w:trPr>
         <w:tc>
           <w:tcPr>
-            <w:tcW w:type="dxa" w:w="1526"/>
+            <w:tcW w:type="dxa" w:w="1525"/>
             <w:tcBorders>
               <w:top w:val="single" w:color="E2E8F0" w:sz="4"/>
               <w:left w:val="none" w:color="auto" w:sz="0"/>
@@ -48421,7 +48421,7 @@
         </w:tc>
         <w:tc>
           <w:tcPr>
-            <w:tcW w:type="dxa" w:w="2789"/>
+            <w:tcW w:type="dxa" w:w="2787"/>
             <w:tcBorders>
               <w:top w:val="single" w:color="E2E8F0" w:sz="4"/>
               <w:left w:val="none" w:color="auto" w:sz="0"/>
@@ -48454,7 +48454,7 @@
         </w:tc>
         <w:tc>
           <w:tcPr>
-            <w:tcW w:type="dxa" w:w="3042"/>
+            <w:tcW w:type="dxa" w:w="3047"/>
             <w:tcBorders>
               <w:top w:val="single" w:color="E2E8F0" w:sz="4"/>
               <w:left w:val="none" w:color="auto" w:sz="0"/>
@@ -48487,7 +48487,7 @@
         </w:tc>
         <w:tc>
           <w:tcPr>
-            <w:tcW w:type="dxa" w:w="1283"/>
+            <w:tcW w:type="dxa" w:w="1281"/>
             <w:tcBorders>
               <w:top w:val="single" w:color="E2E8F0" w:sz="4"/>
               <w:left w:val="none" w:color="auto" w:sz="0"/>
@@ -48525,7 +48525,7 @@
         </w:trPr>
         <w:tc>
           <w:tcPr>
-            <w:tcW w:type="dxa" w:w="1526"/>
+            <w:tcW w:type="dxa" w:w="1525"/>
             <w:tcBorders>
               <w:top w:val="single" w:color="E2E8F0" w:sz="4"/>
               <w:left w:val="none" w:color="auto" w:sz="0"/>
@@ -48558,7 +48558,7 @@
         </w:tc>
         <w:tc>
           <w:tcPr>
-            <w:tcW w:type="dxa" w:w="2789"/>
+            <w:tcW w:type="dxa" w:w="2787"/>
             <w:tcBorders>
               <w:top w:val="single" w:color="E2E8F0" w:sz="4"/>
               <w:left w:val="none" w:color="auto" w:sz="0"/>
@@ -48591,40 +48591,40 @@
         </w:tc>
         <w:tc>
           <w:tcPr>
-            <w:tcW w:type="dxa" w:w="3042"/>
-            <w:tcBorders>
-              <w:top w:val="single" w:color="E2E8F0" w:sz="4"/>
-              <w:left w:val="none" w:color="auto" w:sz="0"/>
-              <w:bottom w:val="single" w:color="E2E8F0" w:sz="4"/>
-              <w:right w:val="none" w:color="auto" w:sz="0"/>
-            </w:tcBorders>
-            <w:tcMar>
-              <w:top w:type="dxa" w:w="120"/>
-              <w:left w:type="dxa" w:w="160"/>
-              <w:bottom w:type="dxa" w:w="120"/>
-              <w:right w:type="dxa" w:w="160"/>
-            </w:tcMar>
-          </w:tcPr>
-          <w:p>
-            <w:pPr>
-              <w:spacing w:line="240" w:lineRule="auto"/>
-              <w:jc w:val="left"/>
-            </w:pPr>
-            <w:r>
-              <w:rPr>
-                <w:rFonts w:ascii="Arial" w:cs="Arial" w:eastAsia="Arial" w:hAnsi="Arial"/>
-                <w:b w:val="false"/>
-                <w:bCs w:val="false"/>
-                <w:sz w:val="20"/>
-                <w:szCs w:val="20"/>
-              </w:rPr>
-              <w:t xml:space="preserve">Numbers are spaced as they are typed (0917 123 4567); an inquiry must give a Philippine mobile number, checked on the page and again by the server</w:t>
-            </w:r>
-          </w:p>
-        </w:tc>
-        <w:tc>
-          <w:tcPr>
-            <w:tcW w:type="dxa" w:w="1283"/>
+            <w:tcW w:type="dxa" w:w="3047"/>
+            <w:tcBorders>
+              <w:top w:val="single" w:color="E2E8F0" w:sz="4"/>
+              <w:left w:val="none" w:color="auto" w:sz="0"/>
+              <w:bottom w:val="single" w:color="E2E8F0" w:sz="4"/>
+              <w:right w:val="none" w:color="auto" w:sz="0"/>
+            </w:tcBorders>
+            <w:tcMar>
+              <w:top w:type="dxa" w:w="120"/>
+              <w:left w:type="dxa" w:w="160"/>
+              <w:bottom w:type="dxa" w:w="120"/>
+              <w:right w:type="dxa" w:w="160"/>
+            </w:tcMar>
+          </w:tcPr>
+          <w:p>
+            <w:pPr>
+              <w:spacing w:line="240" w:lineRule="auto"/>
+              <w:jc w:val="left"/>
+            </w:pPr>
+            <w:r>
+              <w:rPr>
+                <w:rFonts w:ascii="Arial" w:cs="Arial" w:eastAsia="Arial" w:hAnsi="Arial"/>
+                <w:b w:val="false"/>
+                <w:bCs w:val="false"/>
+                <w:sz w:val="20"/>
+                <w:szCs w:val="20"/>
+              </w:rPr>
+              <w:t xml:space="preserve">Numbers are spaced as they are typed (0917 123 4567); an inquiry, and an emergency contact where one is given, must give a Philippine mobile number, checked on the page and again by the server</w:t>
+            </w:r>
+          </w:p>
+        </w:tc>
+        <w:tc>
+          <w:tcPr>
+            <w:tcW w:type="dxa" w:w="1281"/>
             <w:tcBorders>
               <w:top w:val="single" w:color="E2E8F0" w:sz="4"/>
               <w:left w:val="none" w:color="auto" w:sz="0"/>
@@ -48662,7 +48662,7 @@
         </w:trPr>
         <w:tc>
           <w:tcPr>
-            <w:tcW w:type="dxa" w:w="1526"/>
+            <w:tcW w:type="dxa" w:w="1525"/>
             <w:tcBorders>
               <w:top w:val="single" w:color="E2E8F0" w:sz="4"/>
               <w:left w:val="none" w:color="auto" w:sz="0"/>
@@ -48695,7 +48695,7 @@
         </w:tc>
         <w:tc>
           <w:tcPr>
-            <w:tcW w:type="dxa" w:w="2789"/>
+            <w:tcW w:type="dxa" w:w="2787"/>
             <w:tcBorders>
               <w:top w:val="single" w:color="E2E8F0" w:sz="4"/>
               <w:left w:val="none" w:color="auto" w:sz="0"/>
@@ -48728,7 +48728,7 @@
         </w:tc>
         <w:tc>
           <w:tcPr>
-            <w:tcW w:type="dxa" w:w="3042"/>
+            <w:tcW w:type="dxa" w:w="3047"/>
             <w:tcBorders>
               <w:top w:val="single" w:color="E2E8F0" w:sz="4"/>
               <w:left w:val="none" w:color="auto" w:sz="0"/>
@@ -48761,7 +48761,7 @@
         </w:tc>
         <w:tc>
           <w:tcPr>
-            <w:tcW w:type="dxa" w:w="1283"/>
+            <w:tcW w:type="dxa" w:w="1281"/>
             <w:tcBorders>
               <w:top w:val="single" w:color="E2E8F0" w:sz="4"/>
               <w:left w:val="none" w:color="auto" w:sz="0"/>
@@ -48799,7 +48799,7 @@
         </w:trPr>
         <w:tc>
           <w:tcPr>
-            <w:tcW w:type="dxa" w:w="1526"/>
+            <w:tcW w:type="dxa" w:w="1525"/>
             <w:tcBorders>
               <w:top w:val="single" w:color="E2E8F0" w:sz="4"/>
               <w:left w:val="none" w:color="auto" w:sz="0"/>
@@ -48832,7 +48832,7 @@
         </w:tc>
         <w:tc>
           <w:tcPr>
-            <w:tcW w:type="dxa" w:w="2789"/>
+            <w:tcW w:type="dxa" w:w="2787"/>
             <w:tcBorders>
               <w:top w:val="single" w:color="E2E8F0" w:sz="4"/>
               <w:left w:val="none" w:color="auto" w:sz="0"/>
@@ -48865,7 +48865,7 @@
         </w:tc>
         <w:tc>
           <w:tcPr>
-            <w:tcW w:type="dxa" w:w="3042"/>
+            <w:tcW w:type="dxa" w:w="3047"/>
             <w:tcBorders>
               <w:top w:val="single" w:color="E2E8F0" w:sz="4"/>
               <w:left w:val="none" w:color="auto" w:sz="0"/>
@@ -48898,7 +48898,7 @@
         </w:tc>
         <w:tc>
           <w:tcPr>
-            <w:tcW w:type="dxa" w:w="1283"/>
+            <w:tcW w:type="dxa" w:w="1281"/>
             <w:tcBorders>
               <w:top w:val="single" w:color="E2E8F0" w:sz="4"/>
               <w:left w:val="none" w:color="auto" w:sz="0"/>
@@ -48936,7 +48936,7 @@
         </w:trPr>
         <w:tc>
           <w:tcPr>
-            <w:tcW w:type="dxa" w:w="1526"/>
+            <w:tcW w:type="dxa" w:w="1525"/>
             <w:tcBorders>
               <w:top w:val="single" w:color="E2E8F0" w:sz="4"/>
               <w:left w:val="none" w:color="auto" w:sz="0"/>
@@ -48969,7 +48969,7 @@
         </w:tc>
         <w:tc>
           <w:tcPr>
-            <w:tcW w:type="dxa" w:w="2789"/>
+            <w:tcW w:type="dxa" w:w="2787"/>
             <w:tcBorders>
               <w:top w:val="single" w:color="E2E8F0" w:sz="4"/>
               <w:left w:val="none" w:color="auto" w:sz="0"/>
@@ -49002,7 +49002,7 @@
         </w:tc>
         <w:tc>
           <w:tcPr>
-            <w:tcW w:type="dxa" w:w="3042"/>
+            <w:tcW w:type="dxa" w:w="3047"/>
             <w:tcBorders>
               <w:top w:val="single" w:color="E2E8F0" w:sz="4"/>
               <w:left w:val="none" w:color="auto" w:sz="0"/>
@@ -49035,7 +49035,7 @@
         </w:tc>
         <w:tc>
           <w:tcPr>
-            <w:tcW w:type="dxa" w:w="1283"/>
+            <w:tcW w:type="dxa" w:w="1281"/>
             <w:tcBorders>
               <w:top w:val="single" w:color="E2E8F0" w:sz="4"/>
               <w:left w:val="none" w:color="auto" w:sz="0"/>
@@ -49073,7 +49073,7 @@
         </w:trPr>
         <w:tc>
           <w:tcPr>
-            <w:tcW w:type="dxa" w:w="1526"/>
+            <w:tcW w:type="dxa" w:w="1525"/>
             <w:tcBorders>
               <w:top w:val="single" w:color="E2E8F0" w:sz="4"/>
               <w:left w:val="none" w:color="auto" w:sz="0"/>
@@ -49106,7 +49106,7 @@
         </w:tc>
         <w:tc>
           <w:tcPr>
-            <w:tcW w:type="dxa" w:w="2789"/>
+            <w:tcW w:type="dxa" w:w="2787"/>
             <w:tcBorders>
               <w:top w:val="single" w:color="E2E8F0" w:sz="4"/>
               <w:left w:val="none" w:color="auto" w:sz="0"/>
@@ -49139,7 +49139,7 @@
         </w:tc>
         <w:tc>
           <w:tcPr>
-            <w:tcW w:type="dxa" w:w="3042"/>
+            <w:tcW w:type="dxa" w:w="3047"/>
             <w:tcBorders>
               <w:top w:val="single" w:color="E2E8F0" w:sz="4"/>
               <w:left w:val="none" w:color="auto" w:sz="0"/>
@@ -49172,7 +49172,7 @@
         </w:tc>
         <w:tc>
           <w:tcPr>
-            <w:tcW w:type="dxa" w:w="1283"/>
+            <w:tcW w:type="dxa" w:w="1281"/>
             <w:tcBorders>
               <w:top w:val="single" w:color="E2E8F0" w:sz="4"/>
               <w:left w:val="none" w:color="auto" w:sz="0"/>
@@ -49210,7 +49210,7 @@
         </w:trPr>
         <w:tc>
           <w:tcPr>
-            <w:tcW w:type="dxa" w:w="1526"/>
+            <w:tcW w:type="dxa" w:w="1525"/>
             <w:tcBorders>
               <w:top w:val="single" w:color="E2E8F0" w:sz="4"/>
               <w:left w:val="none" w:color="auto" w:sz="0"/>
@@ -49243,7 +49243,7 @@
         </w:tc>
         <w:tc>
           <w:tcPr>
-            <w:tcW w:type="dxa" w:w="2789"/>
+            <w:tcW w:type="dxa" w:w="2787"/>
             <w:tcBorders>
               <w:top w:val="single" w:color="E2E8F0" w:sz="4"/>
               <w:left w:val="none" w:color="auto" w:sz="0"/>
@@ -49276,7 +49276,7 @@
         </w:tc>
         <w:tc>
           <w:tcPr>
-            <w:tcW w:type="dxa" w:w="3042"/>
+            <w:tcW w:type="dxa" w:w="3047"/>
             <w:tcBorders>
               <w:top w:val="single" w:color="E2E8F0" w:sz="4"/>
               <w:left w:val="none" w:color="auto" w:sz="0"/>
@@ -49309,7 +49309,7 @@
         </w:tc>
         <w:tc>
           <w:tcPr>
-            <w:tcW w:type="dxa" w:w="1283"/>
+            <w:tcW w:type="dxa" w:w="1281"/>
             <w:tcBorders>
               <w:top w:val="single" w:color="E2E8F0" w:sz="4"/>
               <w:left w:val="none" w:color="auto" w:sz="0"/>
@@ -49347,7 +49347,7 @@
         </w:trPr>
         <w:tc>
           <w:tcPr>
-            <w:tcW w:type="dxa" w:w="1526"/>
+            <w:tcW w:type="dxa" w:w="1525"/>
             <w:tcBorders>
               <w:top w:val="single" w:color="E2E8F0" w:sz="4"/>
               <w:left w:val="none" w:color="auto" w:sz="0"/>
@@ -49380,7 +49380,7 @@
         </w:tc>
         <w:tc>
           <w:tcPr>
-            <w:tcW w:type="dxa" w:w="2789"/>
+            <w:tcW w:type="dxa" w:w="2787"/>
             <w:tcBorders>
               <w:top w:val="single" w:color="E2E8F0" w:sz="4"/>
               <w:left w:val="none" w:color="auto" w:sz="0"/>
@@ -49413,7 +49413,7 @@
         </w:tc>
         <w:tc>
           <w:tcPr>
-            <w:tcW w:type="dxa" w:w="3042"/>
+            <w:tcW w:type="dxa" w:w="3047"/>
             <w:tcBorders>
               <w:top w:val="single" w:color="E2E8F0" w:sz="4"/>
               <w:left w:val="none" w:color="auto" w:sz="0"/>
@@ -49446,7 +49446,7 @@
         </w:tc>
         <w:tc>
           <w:tcPr>
-            <w:tcW w:type="dxa" w:w="1283"/>
+            <w:tcW w:type="dxa" w:w="1281"/>
             <w:tcBorders>
               <w:top w:val="single" w:color="E2E8F0" w:sz="4"/>
               <w:left w:val="none" w:color="auto" w:sz="0"/>
@@ -49484,7 +49484,7 @@
         </w:trPr>
         <w:tc>
           <w:tcPr>
-            <w:tcW w:type="dxa" w:w="1526"/>
+            <w:tcW w:type="dxa" w:w="1525"/>
             <w:tcBorders>
               <w:top w:val="single" w:color="E2E8F0" w:sz="4"/>
               <w:left w:val="none" w:color="auto" w:sz="0"/>
@@ -49517,7 +49517,7 @@
         </w:tc>
         <w:tc>
           <w:tcPr>
-            <w:tcW w:type="dxa" w:w="2789"/>
+            <w:tcW w:type="dxa" w:w="2787"/>
             <w:tcBorders>
               <w:top w:val="single" w:color="E2E8F0" w:sz="4"/>
               <w:left w:val="none" w:color="auto" w:sz="0"/>
@@ -49550,7 +49550,7 @@
         </w:tc>
         <w:tc>
           <w:tcPr>
-            <w:tcW w:type="dxa" w:w="3042"/>
+            <w:tcW w:type="dxa" w:w="3047"/>
             <w:tcBorders>
               <w:top w:val="single" w:color="E2E8F0" w:sz="4"/>
               <w:left w:val="none" w:color="auto" w:sz="0"/>
@@ -49583,7 +49583,7 @@
         </w:tc>
         <w:tc>
           <w:tcPr>
-            <w:tcW w:type="dxa" w:w="1283"/>
+            <w:tcW w:type="dxa" w:w="1281"/>
             <w:tcBorders>
               <w:top w:val="single" w:color="E2E8F0" w:sz="4"/>
               <w:left w:val="none" w:color="auto" w:sz="0"/>
@@ -49621,7 +49621,7 @@
         </w:trPr>
         <w:tc>
           <w:tcPr>
-            <w:tcW w:type="dxa" w:w="1526"/>
+            <w:tcW w:type="dxa" w:w="1525"/>
             <w:tcBorders>
               <w:top w:val="single" w:color="E2E8F0" w:sz="4"/>
               <w:left w:val="none" w:color="auto" w:sz="0"/>
@@ -49654,7 +49654,7 @@
         </w:tc>
         <w:tc>
           <w:tcPr>
-            <w:tcW w:type="dxa" w:w="2789"/>
+            <w:tcW w:type="dxa" w:w="2787"/>
             <w:tcBorders>
               <w:top w:val="single" w:color="E2E8F0" w:sz="4"/>
               <w:left w:val="none" w:color="auto" w:sz="0"/>
@@ -49687,7 +49687,7 @@
         </w:tc>
         <w:tc>
           <w:tcPr>
-            <w:tcW w:type="dxa" w:w="3042"/>
+            <w:tcW w:type="dxa" w:w="3047"/>
             <w:tcBorders>
               <w:top w:val="single" w:color="E2E8F0" w:sz="4"/>
               <w:left w:val="none" w:color="auto" w:sz="0"/>
@@ -49720,7 +49720,7 @@
         </w:tc>
         <w:tc>
           <w:tcPr>
-            <w:tcW w:type="dxa" w:w="1283"/>
+            <w:tcW w:type="dxa" w:w="1281"/>
             <w:tcBorders>
               <w:top w:val="single" w:color="E2E8F0" w:sz="4"/>
               <w:left w:val="none" w:color="auto" w:sz="0"/>
@@ -49758,7 +49758,7 @@
         </w:trPr>
         <w:tc>
           <w:tcPr>
-            <w:tcW w:type="dxa" w:w="1526"/>
+            <w:tcW w:type="dxa" w:w="1525"/>
             <w:tcBorders>
               <w:top w:val="single" w:color="E2E8F0" w:sz="4"/>
               <w:left w:val="none" w:color="auto" w:sz="0"/>
@@ -49791,7 +49791,7 @@
         </w:tc>
         <w:tc>
           <w:tcPr>
-            <w:tcW w:type="dxa" w:w="2789"/>
+            <w:tcW w:type="dxa" w:w="2787"/>
             <w:tcBorders>
               <w:top w:val="single" w:color="E2E8F0" w:sz="4"/>
               <w:left w:val="none" w:color="auto" w:sz="0"/>
@@ -49824,7 +49824,7 @@
         </w:tc>
         <w:tc>
           <w:tcPr>
-            <w:tcW w:type="dxa" w:w="3042"/>
+            <w:tcW w:type="dxa" w:w="3047"/>
             <w:tcBorders>
               <w:top w:val="single" w:color="E2E8F0" w:sz="4"/>
               <w:left w:val="none" w:color="auto" w:sz="0"/>
@@ -49857,7 +49857,7 @@
         </w:tc>
         <w:tc>
           <w:tcPr>
-            <w:tcW w:type="dxa" w:w="1283"/>
+            <w:tcW w:type="dxa" w:w="1281"/>
             <w:tcBorders>
               <w:top w:val="single" w:color="E2E8F0" w:sz="4"/>
               <w:left w:val="none" w:color="auto" w:sz="0"/>
@@ -49895,7 +49895,7 @@
         </w:trPr>
         <w:tc>
           <w:tcPr>
-            <w:tcW w:type="dxa" w:w="1526"/>
+            <w:tcW w:type="dxa" w:w="1525"/>
             <w:tcBorders>
               <w:top w:val="single" w:color="E2E8F0" w:sz="4"/>
               <w:left w:val="none" w:color="auto" w:sz="0"/>
@@ -49928,7 +49928,7 @@
         </w:tc>
         <w:tc>
           <w:tcPr>
-            <w:tcW w:type="dxa" w:w="2789"/>
+            <w:tcW w:type="dxa" w:w="2787"/>
             <w:tcBorders>
               <w:top w:val="single" w:color="E2E8F0" w:sz="4"/>
               <w:left w:val="none" w:color="auto" w:sz="0"/>
@@ -49961,7 +49961,7 @@
         </w:tc>
         <w:tc>
           <w:tcPr>
-            <w:tcW w:type="dxa" w:w="3042"/>
+            <w:tcW w:type="dxa" w:w="3047"/>
             <w:tcBorders>
               <w:top w:val="single" w:color="E2E8F0" w:sz="4"/>
               <w:left w:val="none" w:color="auto" w:sz="0"/>
@@ -49984,7 +49984,7 @@
         </w:tc>
         <w:tc>
           <w:tcPr>
-            <w:tcW w:type="dxa" w:w="1283"/>
+            <w:tcW w:type="dxa" w:w="1281"/>
             <w:tcBorders>
               <w:top w:val="single" w:color="E2E8F0" w:sz="4"/>
               <w:left w:val="none" w:color="auto" w:sz="0"/>

</xml_diff>

<commit_message>
Chapter 4 Table 23: the error-handling row includes the plain refusal messages (37d739a)
Co-Authored-By: Claude Opus 5.5 <noreply@anthropic.com>
</commit_message>
<xml_diff>
--- a/docs/FINAL MANUSCRIPT/CHAPTER_4_RESULTS_AND_DISCUSSION.docx
+++ b/docs/FINAL MANUSCRIPT/CHAPTER_4_RESULTS_AND_DISCUSSION.docx
@@ -43452,7 +43452,7 @@
         </w:trPr>
         <w:tc>
           <w:tcPr>
-            <w:tcW w:type="dxa" w:w="1525"/>
+            <w:tcW w:type="dxa" w:w="1451"/>
             <w:tcBorders>
               <w:top w:val="single" w:color="1A202C" w:sz="12"/>
               <w:left w:val="none" w:color="auto" w:sz="0"/>
@@ -43486,7 +43486,7 @@
         </w:tc>
         <w:tc>
           <w:tcPr>
-            <w:tcW w:type="dxa" w:w="2787"/>
+            <w:tcW w:type="dxa" w:w="2652"/>
             <w:tcBorders>
               <w:top w:val="single" w:color="1A202C" w:sz="12"/>
               <w:left w:val="none" w:color="auto" w:sz="0"/>
@@ -43520,7 +43520,7 @@
         </w:tc>
         <w:tc>
           <w:tcPr>
-            <w:tcW w:type="dxa" w:w="3047"/>
+            <w:tcW w:type="dxa" w:w="3317"/>
             <w:tcBorders>
               <w:top w:val="single" w:color="1A202C" w:sz="12"/>
               <w:left w:val="none" w:color="auto" w:sz="0"/>
@@ -43554,7 +43554,7 @@
         </w:tc>
         <w:tc>
           <w:tcPr>
-            <w:tcW w:type="dxa" w:w="1281"/>
+            <w:tcW w:type="dxa" w:w="1220"/>
             <w:tcBorders>
               <w:top w:val="single" w:color="1A202C" w:sz="12"/>
               <w:left w:val="none" w:color="auto" w:sz="0"/>
@@ -43593,7 +43593,7 @@
         </w:trPr>
         <w:tc>
           <w:tcPr>
-            <w:tcW w:type="dxa" w:w="1525"/>
+            <w:tcW w:type="dxa" w:w="1451"/>
             <w:tcBorders>
               <w:top w:val="single" w:color="E2E8F0" w:sz="4"/>
               <w:left w:val="none" w:color="auto" w:sz="0"/>
@@ -43626,7 +43626,7 @@
         </w:tc>
         <w:tc>
           <w:tcPr>
-            <w:tcW w:type="dxa" w:w="2787"/>
+            <w:tcW w:type="dxa" w:w="2652"/>
             <w:tcBorders>
               <w:top w:val="single" w:color="E2E8F0" w:sz="4"/>
               <w:left w:val="none" w:color="auto" w:sz="0"/>
@@ -43659,7 +43659,7 @@
         </w:tc>
         <w:tc>
           <w:tcPr>
-            <w:tcW w:type="dxa" w:w="3047"/>
+            <w:tcW w:type="dxa" w:w="3317"/>
             <w:tcBorders>
               <w:top w:val="single" w:color="E2E8F0" w:sz="4"/>
               <w:left w:val="none" w:color="auto" w:sz="0"/>
@@ -43692,7 +43692,7 @@
         </w:tc>
         <w:tc>
           <w:tcPr>
-            <w:tcW w:type="dxa" w:w="1281"/>
+            <w:tcW w:type="dxa" w:w="1220"/>
             <w:tcBorders>
               <w:top w:val="single" w:color="E2E8F0" w:sz="4"/>
               <w:left w:val="none" w:color="auto" w:sz="0"/>
@@ -43730,7 +43730,7 @@
         </w:trPr>
         <w:tc>
           <w:tcPr>
-            <w:tcW w:type="dxa" w:w="1525"/>
+            <w:tcW w:type="dxa" w:w="1451"/>
             <w:tcBorders>
               <w:top w:val="single" w:color="E2E8F0" w:sz="4"/>
               <w:left w:val="none" w:color="auto" w:sz="0"/>
@@ -43763,7 +43763,7 @@
         </w:tc>
         <w:tc>
           <w:tcPr>
-            <w:tcW w:type="dxa" w:w="2787"/>
+            <w:tcW w:type="dxa" w:w="2652"/>
             <w:tcBorders>
               <w:top w:val="single" w:color="E2E8F0" w:sz="4"/>
               <w:left w:val="none" w:color="auto" w:sz="0"/>
@@ -43796,7 +43796,7 @@
         </w:tc>
         <w:tc>
           <w:tcPr>
-            <w:tcW w:type="dxa" w:w="3047"/>
+            <w:tcW w:type="dxa" w:w="3317"/>
             <w:tcBorders>
               <w:top w:val="single" w:color="E2E8F0" w:sz="4"/>
               <w:left w:val="none" w:color="auto" w:sz="0"/>
@@ -43829,7 +43829,7 @@
         </w:tc>
         <w:tc>
           <w:tcPr>
-            <w:tcW w:type="dxa" w:w="1281"/>
+            <w:tcW w:type="dxa" w:w="1220"/>
             <w:tcBorders>
               <w:top w:val="single" w:color="E2E8F0" w:sz="4"/>
               <w:left w:val="none" w:color="auto" w:sz="0"/>
@@ -43867,7 +43867,7 @@
         </w:trPr>
         <w:tc>
           <w:tcPr>
-            <w:tcW w:type="dxa" w:w="1525"/>
+            <w:tcW w:type="dxa" w:w="1451"/>
             <w:tcBorders>
               <w:top w:val="single" w:color="E2E8F0" w:sz="4"/>
               <w:left w:val="none" w:color="auto" w:sz="0"/>
@@ -43900,7 +43900,7 @@
         </w:tc>
         <w:tc>
           <w:tcPr>
-            <w:tcW w:type="dxa" w:w="2787"/>
+            <w:tcW w:type="dxa" w:w="2652"/>
             <w:tcBorders>
               <w:top w:val="single" w:color="E2E8F0" w:sz="4"/>
               <w:left w:val="none" w:color="auto" w:sz="0"/>
@@ -43933,7 +43933,7 @@
         </w:tc>
         <w:tc>
           <w:tcPr>
-            <w:tcW w:type="dxa" w:w="3047"/>
+            <w:tcW w:type="dxa" w:w="3317"/>
             <w:tcBorders>
               <w:top w:val="single" w:color="E2E8F0" w:sz="4"/>
               <w:left w:val="none" w:color="auto" w:sz="0"/>
@@ -43966,7 +43966,7 @@
         </w:tc>
         <w:tc>
           <w:tcPr>
-            <w:tcW w:type="dxa" w:w="1281"/>
+            <w:tcW w:type="dxa" w:w="1220"/>
             <w:tcBorders>
               <w:top w:val="single" w:color="E2E8F0" w:sz="4"/>
               <w:left w:val="none" w:color="auto" w:sz="0"/>
@@ -44004,7 +44004,7 @@
         </w:trPr>
         <w:tc>
           <w:tcPr>
-            <w:tcW w:type="dxa" w:w="1525"/>
+            <w:tcW w:type="dxa" w:w="1451"/>
             <w:tcBorders>
               <w:top w:val="single" w:color="E2E8F0" w:sz="4"/>
               <w:left w:val="none" w:color="auto" w:sz="0"/>
@@ -44037,7 +44037,7 @@
         </w:tc>
         <w:tc>
           <w:tcPr>
-            <w:tcW w:type="dxa" w:w="2787"/>
+            <w:tcW w:type="dxa" w:w="2652"/>
             <w:tcBorders>
               <w:top w:val="single" w:color="E2E8F0" w:sz="4"/>
               <w:left w:val="none" w:color="auto" w:sz="0"/>
@@ -44070,7 +44070,7 @@
         </w:tc>
         <w:tc>
           <w:tcPr>
-            <w:tcW w:type="dxa" w:w="3047"/>
+            <w:tcW w:type="dxa" w:w="3317"/>
             <w:tcBorders>
               <w:top w:val="single" w:color="E2E8F0" w:sz="4"/>
               <w:left w:val="none" w:color="auto" w:sz="0"/>
@@ -44103,7 +44103,7 @@
         </w:tc>
         <w:tc>
           <w:tcPr>
-            <w:tcW w:type="dxa" w:w="1281"/>
+            <w:tcW w:type="dxa" w:w="1220"/>
             <w:tcBorders>
               <w:top w:val="single" w:color="E2E8F0" w:sz="4"/>
               <w:left w:val="none" w:color="auto" w:sz="0"/>
@@ -44141,7 +44141,7 @@
         </w:trPr>
         <w:tc>
           <w:tcPr>
-            <w:tcW w:type="dxa" w:w="1525"/>
+            <w:tcW w:type="dxa" w:w="1451"/>
             <w:tcBorders>
               <w:top w:val="single" w:color="E2E8F0" w:sz="4"/>
               <w:left w:val="none" w:color="auto" w:sz="0"/>
@@ -44174,7 +44174,7 @@
         </w:tc>
         <w:tc>
           <w:tcPr>
-            <w:tcW w:type="dxa" w:w="2787"/>
+            <w:tcW w:type="dxa" w:w="2652"/>
             <w:tcBorders>
               <w:top w:val="single" w:color="E2E8F0" w:sz="4"/>
               <w:left w:val="none" w:color="auto" w:sz="0"/>
@@ -44207,7 +44207,7 @@
         </w:tc>
         <w:tc>
           <w:tcPr>
-            <w:tcW w:type="dxa" w:w="3047"/>
+            <w:tcW w:type="dxa" w:w="3317"/>
             <w:tcBorders>
               <w:top w:val="single" w:color="E2E8F0" w:sz="4"/>
               <w:left w:val="none" w:color="auto" w:sz="0"/>
@@ -44240,7 +44240,7 @@
         </w:tc>
         <w:tc>
           <w:tcPr>
-            <w:tcW w:type="dxa" w:w="1281"/>
+            <w:tcW w:type="dxa" w:w="1220"/>
             <w:tcBorders>
               <w:top w:val="single" w:color="E2E8F0" w:sz="4"/>
               <w:left w:val="none" w:color="auto" w:sz="0"/>
@@ -44278,7 +44278,7 @@
         </w:trPr>
         <w:tc>
           <w:tcPr>
-            <w:tcW w:type="dxa" w:w="1525"/>
+            <w:tcW w:type="dxa" w:w="1451"/>
             <w:tcBorders>
               <w:top w:val="single" w:color="E2E8F0" w:sz="4"/>
               <w:left w:val="none" w:color="auto" w:sz="0"/>
@@ -44311,7 +44311,7 @@
         </w:tc>
         <w:tc>
           <w:tcPr>
-            <w:tcW w:type="dxa" w:w="2787"/>
+            <w:tcW w:type="dxa" w:w="2652"/>
             <w:tcBorders>
               <w:top w:val="single" w:color="E2E8F0" w:sz="4"/>
               <w:left w:val="none" w:color="auto" w:sz="0"/>
@@ -44344,7 +44344,7 @@
         </w:tc>
         <w:tc>
           <w:tcPr>
-            <w:tcW w:type="dxa" w:w="3047"/>
+            <w:tcW w:type="dxa" w:w="3317"/>
             <w:tcBorders>
               <w:top w:val="single" w:color="E2E8F0" w:sz="4"/>
               <w:left w:val="none" w:color="auto" w:sz="0"/>
@@ -44377,7 +44377,7 @@
         </w:tc>
         <w:tc>
           <w:tcPr>
-            <w:tcW w:type="dxa" w:w="1281"/>
+            <w:tcW w:type="dxa" w:w="1220"/>
             <w:tcBorders>
               <w:top w:val="single" w:color="E2E8F0" w:sz="4"/>
               <w:left w:val="none" w:color="auto" w:sz="0"/>
@@ -44415,7 +44415,7 @@
         </w:trPr>
         <w:tc>
           <w:tcPr>
-            <w:tcW w:type="dxa" w:w="1525"/>
+            <w:tcW w:type="dxa" w:w="1451"/>
             <w:tcBorders>
               <w:top w:val="single" w:color="E2E8F0" w:sz="4"/>
               <w:left w:val="none" w:color="auto" w:sz="0"/>
@@ -44448,7 +44448,7 @@
         </w:tc>
         <w:tc>
           <w:tcPr>
-            <w:tcW w:type="dxa" w:w="2787"/>
+            <w:tcW w:type="dxa" w:w="2652"/>
             <w:tcBorders>
               <w:top w:val="single" w:color="E2E8F0" w:sz="4"/>
               <w:left w:val="none" w:color="auto" w:sz="0"/>
@@ -44481,7 +44481,7 @@
         </w:tc>
         <w:tc>
           <w:tcPr>
-            <w:tcW w:type="dxa" w:w="3047"/>
+            <w:tcW w:type="dxa" w:w="3317"/>
             <w:tcBorders>
               <w:top w:val="single" w:color="E2E8F0" w:sz="4"/>
               <w:left w:val="none" w:color="auto" w:sz="0"/>
@@ -44514,7 +44514,7 @@
         </w:tc>
         <w:tc>
           <w:tcPr>
-            <w:tcW w:type="dxa" w:w="1281"/>
+            <w:tcW w:type="dxa" w:w="1220"/>
             <w:tcBorders>
               <w:top w:val="single" w:color="E2E8F0" w:sz="4"/>
               <w:left w:val="none" w:color="auto" w:sz="0"/>
@@ -44552,7 +44552,7 @@
         </w:trPr>
         <w:tc>
           <w:tcPr>
-            <w:tcW w:type="dxa" w:w="1525"/>
+            <w:tcW w:type="dxa" w:w="1451"/>
             <w:tcBorders>
               <w:top w:val="single" w:color="E2E8F0" w:sz="4"/>
               <w:left w:val="none" w:color="auto" w:sz="0"/>
@@ -44585,7 +44585,7 @@
         </w:tc>
         <w:tc>
           <w:tcPr>
-            <w:tcW w:type="dxa" w:w="2787"/>
+            <w:tcW w:type="dxa" w:w="2652"/>
             <w:tcBorders>
               <w:top w:val="single" w:color="E2E8F0" w:sz="4"/>
               <w:left w:val="none" w:color="auto" w:sz="0"/>
@@ -44618,7 +44618,7 @@
         </w:tc>
         <w:tc>
           <w:tcPr>
-            <w:tcW w:type="dxa" w:w="3047"/>
+            <w:tcW w:type="dxa" w:w="3317"/>
             <w:tcBorders>
               <w:top w:val="single" w:color="E2E8F0" w:sz="4"/>
               <w:left w:val="none" w:color="auto" w:sz="0"/>
@@ -44651,7 +44651,7 @@
         </w:tc>
         <w:tc>
           <w:tcPr>
-            <w:tcW w:type="dxa" w:w="1281"/>
+            <w:tcW w:type="dxa" w:w="1220"/>
             <w:tcBorders>
               <w:top w:val="single" w:color="E2E8F0" w:sz="4"/>
               <w:left w:val="none" w:color="auto" w:sz="0"/>
@@ -44689,7 +44689,7 @@
         </w:trPr>
         <w:tc>
           <w:tcPr>
-            <w:tcW w:type="dxa" w:w="1525"/>
+            <w:tcW w:type="dxa" w:w="1451"/>
             <w:tcBorders>
               <w:top w:val="single" w:color="E2E8F0" w:sz="4"/>
               <w:left w:val="none" w:color="auto" w:sz="0"/>
@@ -44722,7 +44722,7 @@
         </w:tc>
         <w:tc>
           <w:tcPr>
-            <w:tcW w:type="dxa" w:w="2787"/>
+            <w:tcW w:type="dxa" w:w="2652"/>
             <w:tcBorders>
               <w:top w:val="single" w:color="E2E8F0" w:sz="4"/>
               <w:left w:val="none" w:color="auto" w:sz="0"/>
@@ -44755,7 +44755,7 @@
         </w:tc>
         <w:tc>
           <w:tcPr>
-            <w:tcW w:type="dxa" w:w="3047"/>
+            <w:tcW w:type="dxa" w:w="3317"/>
             <w:tcBorders>
               <w:top w:val="single" w:color="E2E8F0" w:sz="4"/>
               <w:left w:val="none" w:color="auto" w:sz="0"/>
@@ -44788,7 +44788,7 @@
         </w:tc>
         <w:tc>
           <w:tcPr>
-            <w:tcW w:type="dxa" w:w="1281"/>
+            <w:tcW w:type="dxa" w:w="1220"/>
             <w:tcBorders>
               <w:top w:val="single" w:color="E2E8F0" w:sz="4"/>
               <w:left w:val="none" w:color="auto" w:sz="0"/>
@@ -44826,7 +44826,7 @@
         </w:trPr>
         <w:tc>
           <w:tcPr>
-            <w:tcW w:type="dxa" w:w="1525"/>
+            <w:tcW w:type="dxa" w:w="1451"/>
             <w:tcBorders>
               <w:top w:val="single" w:color="E2E8F0" w:sz="4"/>
               <w:left w:val="none" w:color="auto" w:sz="0"/>
@@ -44859,7 +44859,7 @@
         </w:tc>
         <w:tc>
           <w:tcPr>
-            <w:tcW w:type="dxa" w:w="2787"/>
+            <w:tcW w:type="dxa" w:w="2652"/>
             <w:tcBorders>
               <w:top w:val="single" w:color="E2E8F0" w:sz="4"/>
               <w:left w:val="none" w:color="auto" w:sz="0"/>
@@ -44892,7 +44892,7 @@
         </w:tc>
         <w:tc>
           <w:tcPr>
-            <w:tcW w:type="dxa" w:w="3047"/>
+            <w:tcW w:type="dxa" w:w="3317"/>
             <w:tcBorders>
               <w:top w:val="single" w:color="E2E8F0" w:sz="4"/>
               <w:left w:val="none" w:color="auto" w:sz="0"/>
@@ -44925,7 +44925,7 @@
         </w:tc>
         <w:tc>
           <w:tcPr>
-            <w:tcW w:type="dxa" w:w="1281"/>
+            <w:tcW w:type="dxa" w:w="1220"/>
             <w:tcBorders>
               <w:top w:val="single" w:color="E2E8F0" w:sz="4"/>
               <w:left w:val="none" w:color="auto" w:sz="0"/>
@@ -44963,7 +44963,7 @@
         </w:trPr>
         <w:tc>
           <w:tcPr>
-            <w:tcW w:type="dxa" w:w="1525"/>
+            <w:tcW w:type="dxa" w:w="1451"/>
             <w:tcBorders>
               <w:top w:val="single" w:color="E2E8F0" w:sz="4"/>
               <w:left w:val="none" w:color="auto" w:sz="0"/>
@@ -44996,7 +44996,7 @@
         </w:tc>
         <w:tc>
           <w:tcPr>
-            <w:tcW w:type="dxa" w:w="2787"/>
+            <w:tcW w:type="dxa" w:w="2652"/>
             <w:tcBorders>
               <w:top w:val="single" w:color="E2E8F0" w:sz="4"/>
               <w:left w:val="none" w:color="auto" w:sz="0"/>
@@ -45029,7 +45029,7 @@
         </w:tc>
         <w:tc>
           <w:tcPr>
-            <w:tcW w:type="dxa" w:w="3047"/>
+            <w:tcW w:type="dxa" w:w="3317"/>
             <w:tcBorders>
               <w:top w:val="single" w:color="E2E8F0" w:sz="4"/>
               <w:left w:val="none" w:color="auto" w:sz="0"/>
@@ -45062,7 +45062,7 @@
         </w:tc>
         <w:tc>
           <w:tcPr>
-            <w:tcW w:type="dxa" w:w="1281"/>
+            <w:tcW w:type="dxa" w:w="1220"/>
             <w:tcBorders>
               <w:top w:val="single" w:color="E2E8F0" w:sz="4"/>
               <w:left w:val="none" w:color="auto" w:sz="0"/>
@@ -45100,7 +45100,7 @@
         </w:trPr>
         <w:tc>
           <w:tcPr>
-            <w:tcW w:type="dxa" w:w="1525"/>
+            <w:tcW w:type="dxa" w:w="1451"/>
             <w:tcBorders>
               <w:top w:val="single" w:color="E2E8F0" w:sz="4"/>
               <w:left w:val="none" w:color="auto" w:sz="0"/>
@@ -45133,7 +45133,7 @@
         </w:tc>
         <w:tc>
           <w:tcPr>
-            <w:tcW w:type="dxa" w:w="2787"/>
+            <w:tcW w:type="dxa" w:w="2652"/>
             <w:tcBorders>
               <w:top w:val="single" w:color="E2E8F0" w:sz="4"/>
               <w:left w:val="none" w:color="auto" w:sz="0"/>
@@ -45166,7 +45166,7 @@
         </w:tc>
         <w:tc>
           <w:tcPr>
-            <w:tcW w:type="dxa" w:w="3047"/>
+            <w:tcW w:type="dxa" w:w="3317"/>
             <w:tcBorders>
               <w:top w:val="single" w:color="E2E8F0" w:sz="4"/>
               <w:left w:val="none" w:color="auto" w:sz="0"/>
@@ -45199,7 +45199,7 @@
         </w:tc>
         <w:tc>
           <w:tcPr>
-            <w:tcW w:type="dxa" w:w="1281"/>
+            <w:tcW w:type="dxa" w:w="1220"/>
             <w:tcBorders>
               <w:top w:val="single" w:color="E2E8F0" w:sz="4"/>
               <w:left w:val="none" w:color="auto" w:sz="0"/>
@@ -45237,7 +45237,7 @@
         </w:trPr>
         <w:tc>
           <w:tcPr>
-            <w:tcW w:type="dxa" w:w="1525"/>
+            <w:tcW w:type="dxa" w:w="1451"/>
             <w:tcBorders>
               <w:top w:val="single" w:color="E2E8F0" w:sz="4"/>
               <w:left w:val="none" w:color="auto" w:sz="0"/>
@@ -45270,7 +45270,7 @@
         </w:tc>
         <w:tc>
           <w:tcPr>
-            <w:tcW w:type="dxa" w:w="2787"/>
+            <w:tcW w:type="dxa" w:w="2652"/>
             <w:tcBorders>
               <w:top w:val="single" w:color="E2E8F0" w:sz="4"/>
               <w:left w:val="none" w:color="auto" w:sz="0"/>
@@ -45303,7 +45303,7 @@
         </w:tc>
         <w:tc>
           <w:tcPr>
-            <w:tcW w:type="dxa" w:w="3047"/>
+            <w:tcW w:type="dxa" w:w="3317"/>
             <w:tcBorders>
               <w:top w:val="single" w:color="E2E8F0" w:sz="4"/>
               <w:left w:val="none" w:color="auto" w:sz="0"/>
@@ -45336,7 +45336,7 @@
         </w:tc>
         <w:tc>
           <w:tcPr>
-            <w:tcW w:type="dxa" w:w="1281"/>
+            <w:tcW w:type="dxa" w:w="1220"/>
             <w:tcBorders>
               <w:top w:val="single" w:color="E2E8F0" w:sz="4"/>
               <w:left w:val="none" w:color="auto" w:sz="0"/>
@@ -45374,7 +45374,7 @@
         </w:trPr>
         <w:tc>
           <w:tcPr>
-            <w:tcW w:type="dxa" w:w="1525"/>
+            <w:tcW w:type="dxa" w:w="1451"/>
             <w:tcBorders>
               <w:top w:val="single" w:color="E2E8F0" w:sz="4"/>
               <w:left w:val="none" w:color="auto" w:sz="0"/>
@@ -45407,7 +45407,7 @@
         </w:tc>
         <w:tc>
           <w:tcPr>
-            <w:tcW w:type="dxa" w:w="2787"/>
+            <w:tcW w:type="dxa" w:w="2652"/>
             <w:tcBorders>
               <w:top w:val="single" w:color="E2E8F0" w:sz="4"/>
               <w:left w:val="none" w:color="auto" w:sz="0"/>
@@ -45440,7 +45440,7 @@
         </w:tc>
         <w:tc>
           <w:tcPr>
-            <w:tcW w:type="dxa" w:w="3047"/>
+            <w:tcW w:type="dxa" w:w="3317"/>
             <w:tcBorders>
               <w:top w:val="single" w:color="E2E8F0" w:sz="4"/>
               <w:left w:val="none" w:color="auto" w:sz="0"/>
@@ -45473,7 +45473,7 @@
         </w:tc>
         <w:tc>
           <w:tcPr>
-            <w:tcW w:type="dxa" w:w="1281"/>
+            <w:tcW w:type="dxa" w:w="1220"/>
             <w:tcBorders>
               <w:top w:val="single" w:color="E2E8F0" w:sz="4"/>
               <w:left w:val="none" w:color="auto" w:sz="0"/>
@@ -45511,7 +45511,7 @@
         </w:trPr>
         <w:tc>
           <w:tcPr>
-            <w:tcW w:type="dxa" w:w="1525"/>
+            <w:tcW w:type="dxa" w:w="1451"/>
             <w:tcBorders>
               <w:top w:val="single" w:color="E2E8F0" w:sz="4"/>
               <w:left w:val="none" w:color="auto" w:sz="0"/>
@@ -45544,7 +45544,7 @@
         </w:tc>
         <w:tc>
           <w:tcPr>
-            <w:tcW w:type="dxa" w:w="2787"/>
+            <w:tcW w:type="dxa" w:w="2652"/>
             <w:tcBorders>
               <w:top w:val="single" w:color="E2E8F0" w:sz="4"/>
               <w:left w:val="none" w:color="auto" w:sz="0"/>
@@ -45577,7 +45577,7 @@
         </w:tc>
         <w:tc>
           <w:tcPr>
-            <w:tcW w:type="dxa" w:w="3047"/>
+            <w:tcW w:type="dxa" w:w="3317"/>
             <w:tcBorders>
               <w:top w:val="single" w:color="E2E8F0" w:sz="4"/>
               <w:left w:val="none" w:color="auto" w:sz="0"/>
@@ -45610,7 +45610,7 @@
         </w:tc>
         <w:tc>
           <w:tcPr>
-            <w:tcW w:type="dxa" w:w="1281"/>
+            <w:tcW w:type="dxa" w:w="1220"/>
             <w:tcBorders>
               <w:top w:val="single" w:color="E2E8F0" w:sz="4"/>
               <w:left w:val="none" w:color="auto" w:sz="0"/>
@@ -45648,7 +45648,7 @@
         </w:trPr>
         <w:tc>
           <w:tcPr>
-            <w:tcW w:type="dxa" w:w="1525"/>
+            <w:tcW w:type="dxa" w:w="1451"/>
             <w:tcBorders>
               <w:top w:val="single" w:color="E2E8F0" w:sz="4"/>
               <w:left w:val="none" w:color="auto" w:sz="0"/>
@@ -45681,7 +45681,7 @@
         </w:tc>
         <w:tc>
           <w:tcPr>
-            <w:tcW w:type="dxa" w:w="2787"/>
+            <w:tcW w:type="dxa" w:w="2652"/>
             <w:tcBorders>
               <w:top w:val="single" w:color="E2E8F0" w:sz="4"/>
               <w:left w:val="none" w:color="auto" w:sz="0"/>
@@ -45714,7 +45714,7 @@
         </w:tc>
         <w:tc>
           <w:tcPr>
-            <w:tcW w:type="dxa" w:w="3047"/>
+            <w:tcW w:type="dxa" w:w="3317"/>
             <w:tcBorders>
               <w:top w:val="single" w:color="E2E8F0" w:sz="4"/>
               <w:left w:val="none" w:color="auto" w:sz="0"/>
@@ -45747,7 +45747,7 @@
         </w:tc>
         <w:tc>
           <w:tcPr>
-            <w:tcW w:type="dxa" w:w="1281"/>
+            <w:tcW w:type="dxa" w:w="1220"/>
             <w:tcBorders>
               <w:top w:val="single" w:color="E2E8F0" w:sz="4"/>
               <w:left w:val="none" w:color="auto" w:sz="0"/>
@@ -45785,7 +45785,7 @@
         </w:trPr>
         <w:tc>
           <w:tcPr>
-            <w:tcW w:type="dxa" w:w="1525"/>
+            <w:tcW w:type="dxa" w:w="1451"/>
             <w:tcBorders>
               <w:top w:val="single" w:color="E2E8F0" w:sz="4"/>
               <w:left w:val="none" w:color="auto" w:sz="0"/>
@@ -45818,7 +45818,7 @@
         </w:tc>
         <w:tc>
           <w:tcPr>
-            <w:tcW w:type="dxa" w:w="2787"/>
+            <w:tcW w:type="dxa" w:w="2652"/>
             <w:tcBorders>
               <w:top w:val="single" w:color="E2E8F0" w:sz="4"/>
               <w:left w:val="none" w:color="auto" w:sz="0"/>
@@ -45851,7 +45851,7 @@
         </w:tc>
         <w:tc>
           <w:tcPr>
-            <w:tcW w:type="dxa" w:w="3047"/>
+            <w:tcW w:type="dxa" w:w="3317"/>
             <w:tcBorders>
               <w:top w:val="single" w:color="E2E8F0" w:sz="4"/>
               <w:left w:val="none" w:color="auto" w:sz="0"/>
@@ -45884,7 +45884,7 @@
         </w:tc>
         <w:tc>
           <w:tcPr>
-            <w:tcW w:type="dxa" w:w="1281"/>
+            <w:tcW w:type="dxa" w:w="1220"/>
             <w:tcBorders>
               <w:top w:val="single" w:color="E2E8F0" w:sz="4"/>
               <w:left w:val="none" w:color="auto" w:sz="0"/>
@@ -45922,7 +45922,7 @@
         </w:trPr>
         <w:tc>
           <w:tcPr>
-            <w:tcW w:type="dxa" w:w="1525"/>
+            <w:tcW w:type="dxa" w:w="1451"/>
             <w:tcBorders>
               <w:top w:val="single" w:color="E2E8F0" w:sz="4"/>
               <w:left w:val="none" w:color="auto" w:sz="0"/>
@@ -45955,7 +45955,7 @@
         </w:tc>
         <w:tc>
           <w:tcPr>
-            <w:tcW w:type="dxa" w:w="2787"/>
+            <w:tcW w:type="dxa" w:w="2652"/>
             <w:tcBorders>
               <w:top w:val="single" w:color="E2E8F0" w:sz="4"/>
               <w:left w:val="none" w:color="auto" w:sz="0"/>
@@ -45988,7 +45988,7 @@
         </w:tc>
         <w:tc>
           <w:tcPr>
-            <w:tcW w:type="dxa" w:w="3047"/>
+            <w:tcW w:type="dxa" w:w="3317"/>
             <w:tcBorders>
               <w:top w:val="single" w:color="E2E8F0" w:sz="4"/>
               <w:left w:val="none" w:color="auto" w:sz="0"/>
@@ -46021,7 +46021,7 @@
         </w:tc>
         <w:tc>
           <w:tcPr>
-            <w:tcW w:type="dxa" w:w="1281"/>
+            <w:tcW w:type="dxa" w:w="1220"/>
             <w:tcBorders>
               <w:top w:val="single" w:color="E2E8F0" w:sz="4"/>
               <w:left w:val="none" w:color="auto" w:sz="0"/>
@@ -46059,7 +46059,7 @@
         </w:trPr>
         <w:tc>
           <w:tcPr>
-            <w:tcW w:type="dxa" w:w="1525"/>
+            <w:tcW w:type="dxa" w:w="1451"/>
             <w:tcBorders>
               <w:top w:val="single" w:color="E2E8F0" w:sz="4"/>
               <w:left w:val="none" w:color="auto" w:sz="0"/>
@@ -46092,7 +46092,7 @@
         </w:tc>
         <w:tc>
           <w:tcPr>
-            <w:tcW w:type="dxa" w:w="2787"/>
+            <w:tcW w:type="dxa" w:w="2652"/>
             <w:tcBorders>
               <w:top w:val="single" w:color="E2E8F0" w:sz="4"/>
               <w:left w:val="none" w:color="auto" w:sz="0"/>
@@ -46125,7 +46125,7 @@
         </w:tc>
         <w:tc>
           <w:tcPr>
-            <w:tcW w:type="dxa" w:w="3047"/>
+            <w:tcW w:type="dxa" w:w="3317"/>
             <w:tcBorders>
               <w:top w:val="single" w:color="E2E8F0" w:sz="4"/>
               <w:left w:val="none" w:color="auto" w:sz="0"/>
@@ -46158,7 +46158,7 @@
         </w:tc>
         <w:tc>
           <w:tcPr>
-            <w:tcW w:type="dxa" w:w="1281"/>
+            <w:tcW w:type="dxa" w:w="1220"/>
             <w:tcBorders>
               <w:top w:val="single" w:color="E2E8F0" w:sz="4"/>
               <w:left w:val="none" w:color="auto" w:sz="0"/>
@@ -46196,7 +46196,7 @@
         </w:trPr>
         <w:tc>
           <w:tcPr>
-            <w:tcW w:type="dxa" w:w="1525"/>
+            <w:tcW w:type="dxa" w:w="1451"/>
             <w:tcBorders>
               <w:top w:val="single" w:color="E2E8F0" w:sz="4"/>
               <w:left w:val="none" w:color="auto" w:sz="0"/>
@@ -46229,7 +46229,7 @@
         </w:tc>
         <w:tc>
           <w:tcPr>
-            <w:tcW w:type="dxa" w:w="2787"/>
+            <w:tcW w:type="dxa" w:w="2652"/>
             <w:tcBorders>
               <w:top w:val="single" w:color="E2E8F0" w:sz="4"/>
               <w:left w:val="none" w:color="auto" w:sz="0"/>
@@ -46262,7 +46262,7 @@
         </w:tc>
         <w:tc>
           <w:tcPr>
-            <w:tcW w:type="dxa" w:w="3047"/>
+            <w:tcW w:type="dxa" w:w="3317"/>
             <w:tcBorders>
               <w:top w:val="single" w:color="E2E8F0" w:sz="4"/>
               <w:left w:val="none" w:color="auto" w:sz="0"/>
@@ -46295,7 +46295,7 @@
         </w:tc>
         <w:tc>
           <w:tcPr>
-            <w:tcW w:type="dxa" w:w="1281"/>
+            <w:tcW w:type="dxa" w:w="1220"/>
             <w:tcBorders>
               <w:top w:val="single" w:color="E2E8F0" w:sz="4"/>
               <w:left w:val="none" w:color="auto" w:sz="0"/>
@@ -46333,7 +46333,7 @@
         </w:trPr>
         <w:tc>
           <w:tcPr>
-            <w:tcW w:type="dxa" w:w="1525"/>
+            <w:tcW w:type="dxa" w:w="1451"/>
             <w:tcBorders>
               <w:top w:val="single" w:color="E2E8F0" w:sz="4"/>
               <w:left w:val="none" w:color="auto" w:sz="0"/>
@@ -46366,7 +46366,7 @@
         </w:tc>
         <w:tc>
           <w:tcPr>
-            <w:tcW w:type="dxa" w:w="2787"/>
+            <w:tcW w:type="dxa" w:w="2652"/>
             <w:tcBorders>
               <w:top w:val="single" w:color="E2E8F0" w:sz="4"/>
               <w:left w:val="none" w:color="auto" w:sz="0"/>
@@ -46399,7 +46399,7 @@
         </w:tc>
         <w:tc>
           <w:tcPr>
-            <w:tcW w:type="dxa" w:w="3047"/>
+            <w:tcW w:type="dxa" w:w="3317"/>
             <w:tcBorders>
               <w:top w:val="single" w:color="E2E8F0" w:sz="4"/>
               <w:left w:val="none" w:color="auto" w:sz="0"/>
@@ -46432,7 +46432,7 @@
         </w:tc>
         <w:tc>
           <w:tcPr>
-            <w:tcW w:type="dxa" w:w="1281"/>
+            <w:tcW w:type="dxa" w:w="1220"/>
             <w:tcBorders>
               <w:top w:val="single" w:color="E2E8F0" w:sz="4"/>
               <w:left w:val="none" w:color="auto" w:sz="0"/>
@@ -46470,7 +46470,7 @@
         </w:trPr>
         <w:tc>
           <w:tcPr>
-            <w:tcW w:type="dxa" w:w="1525"/>
+            <w:tcW w:type="dxa" w:w="1451"/>
             <w:tcBorders>
               <w:top w:val="single" w:color="E2E8F0" w:sz="4"/>
               <w:left w:val="none" w:color="auto" w:sz="0"/>
@@ -46503,7 +46503,7 @@
         </w:tc>
         <w:tc>
           <w:tcPr>
-            <w:tcW w:type="dxa" w:w="2787"/>
+            <w:tcW w:type="dxa" w:w="2652"/>
             <w:tcBorders>
               <w:top w:val="single" w:color="E2E8F0" w:sz="4"/>
               <w:left w:val="none" w:color="auto" w:sz="0"/>
@@ -46536,7 +46536,7 @@
         </w:tc>
         <w:tc>
           <w:tcPr>
-            <w:tcW w:type="dxa" w:w="3047"/>
+            <w:tcW w:type="dxa" w:w="3317"/>
             <w:tcBorders>
               <w:top w:val="single" w:color="E2E8F0" w:sz="4"/>
               <w:left w:val="none" w:color="auto" w:sz="0"/>
@@ -46569,7 +46569,7 @@
         </w:tc>
         <w:tc>
           <w:tcPr>
-            <w:tcW w:type="dxa" w:w="1281"/>
+            <w:tcW w:type="dxa" w:w="1220"/>
             <w:tcBorders>
               <w:top w:val="single" w:color="E2E8F0" w:sz="4"/>
               <w:left w:val="none" w:color="auto" w:sz="0"/>
@@ -46607,7 +46607,7 @@
         </w:trPr>
         <w:tc>
           <w:tcPr>
-            <w:tcW w:type="dxa" w:w="1525"/>
+            <w:tcW w:type="dxa" w:w="1451"/>
             <w:tcBorders>
               <w:top w:val="single" w:color="E2E8F0" w:sz="4"/>
               <w:left w:val="none" w:color="auto" w:sz="0"/>
@@ -46640,7 +46640,7 @@
         </w:tc>
         <w:tc>
           <w:tcPr>
-            <w:tcW w:type="dxa" w:w="2787"/>
+            <w:tcW w:type="dxa" w:w="2652"/>
             <w:tcBorders>
               <w:top w:val="single" w:color="E2E8F0" w:sz="4"/>
               <w:left w:val="none" w:color="auto" w:sz="0"/>
@@ -46673,7 +46673,7 @@
         </w:tc>
         <w:tc>
           <w:tcPr>
-            <w:tcW w:type="dxa" w:w="3047"/>
+            <w:tcW w:type="dxa" w:w="3317"/>
             <w:tcBorders>
               <w:top w:val="single" w:color="E2E8F0" w:sz="4"/>
               <w:left w:val="none" w:color="auto" w:sz="0"/>
@@ -46706,7 +46706,7 @@
         </w:tc>
         <w:tc>
           <w:tcPr>
-            <w:tcW w:type="dxa" w:w="1281"/>
+            <w:tcW w:type="dxa" w:w="1220"/>
             <w:tcBorders>
               <w:top w:val="single" w:color="E2E8F0" w:sz="4"/>
               <w:left w:val="none" w:color="auto" w:sz="0"/>
@@ -46744,7 +46744,7 @@
         </w:trPr>
         <w:tc>
           <w:tcPr>
-            <w:tcW w:type="dxa" w:w="1525"/>
+            <w:tcW w:type="dxa" w:w="1451"/>
             <w:tcBorders>
               <w:top w:val="single" w:color="E2E8F0" w:sz="4"/>
               <w:left w:val="none" w:color="auto" w:sz="0"/>
@@ -46777,7 +46777,7 @@
         </w:tc>
         <w:tc>
           <w:tcPr>
-            <w:tcW w:type="dxa" w:w="2787"/>
+            <w:tcW w:type="dxa" w:w="2652"/>
             <w:tcBorders>
               <w:top w:val="single" w:color="E2E8F0" w:sz="4"/>
               <w:left w:val="none" w:color="auto" w:sz="0"/>
@@ -46810,7 +46810,7 @@
         </w:tc>
         <w:tc>
           <w:tcPr>
-            <w:tcW w:type="dxa" w:w="3047"/>
+            <w:tcW w:type="dxa" w:w="3317"/>
             <w:tcBorders>
               <w:top w:val="single" w:color="E2E8F0" w:sz="4"/>
               <w:left w:val="none" w:color="auto" w:sz="0"/>
@@ -46843,7 +46843,7 @@
         </w:tc>
         <w:tc>
           <w:tcPr>
-            <w:tcW w:type="dxa" w:w="1281"/>
+            <w:tcW w:type="dxa" w:w="1220"/>
             <w:tcBorders>
               <w:top w:val="single" w:color="E2E8F0" w:sz="4"/>
               <w:left w:val="none" w:color="auto" w:sz="0"/>
@@ -46881,7 +46881,7 @@
         </w:trPr>
         <w:tc>
           <w:tcPr>
-            <w:tcW w:type="dxa" w:w="1525"/>
+            <w:tcW w:type="dxa" w:w="1451"/>
             <w:tcBorders>
               <w:top w:val="single" w:color="E2E8F0" w:sz="4"/>
               <w:left w:val="none" w:color="auto" w:sz="0"/>
@@ -46914,7 +46914,7 @@
         </w:tc>
         <w:tc>
           <w:tcPr>
-            <w:tcW w:type="dxa" w:w="2787"/>
+            <w:tcW w:type="dxa" w:w="2652"/>
             <w:tcBorders>
               <w:top w:val="single" w:color="E2E8F0" w:sz="4"/>
               <w:left w:val="none" w:color="auto" w:sz="0"/>
@@ -46947,7 +46947,7 @@
         </w:tc>
         <w:tc>
           <w:tcPr>
-            <w:tcW w:type="dxa" w:w="3047"/>
+            <w:tcW w:type="dxa" w:w="3317"/>
             <w:tcBorders>
               <w:top w:val="single" w:color="E2E8F0" w:sz="4"/>
               <w:left w:val="none" w:color="auto" w:sz="0"/>
@@ -46980,7 +46980,7 @@
         </w:tc>
         <w:tc>
           <w:tcPr>
-            <w:tcW w:type="dxa" w:w="1281"/>
+            <w:tcW w:type="dxa" w:w="1220"/>
             <w:tcBorders>
               <w:top w:val="single" w:color="E2E8F0" w:sz="4"/>
               <w:left w:val="none" w:color="auto" w:sz="0"/>
@@ -47018,7 +47018,7 @@
         </w:trPr>
         <w:tc>
           <w:tcPr>
-            <w:tcW w:type="dxa" w:w="1525"/>
+            <w:tcW w:type="dxa" w:w="1451"/>
             <w:tcBorders>
               <w:top w:val="single" w:color="E2E8F0" w:sz="4"/>
               <w:left w:val="none" w:color="auto" w:sz="0"/>
@@ -47051,7 +47051,7 @@
         </w:tc>
         <w:tc>
           <w:tcPr>
-            <w:tcW w:type="dxa" w:w="2787"/>
+            <w:tcW w:type="dxa" w:w="2652"/>
             <w:tcBorders>
               <w:top w:val="single" w:color="E2E8F0" w:sz="4"/>
               <w:left w:val="none" w:color="auto" w:sz="0"/>
@@ -47084,7 +47084,7 @@
         </w:tc>
         <w:tc>
           <w:tcPr>
-            <w:tcW w:type="dxa" w:w="3047"/>
+            <w:tcW w:type="dxa" w:w="3317"/>
             <w:tcBorders>
               <w:top w:val="single" w:color="E2E8F0" w:sz="4"/>
               <w:left w:val="none" w:color="auto" w:sz="0"/>
@@ -47117,7 +47117,7 @@
         </w:tc>
         <w:tc>
           <w:tcPr>
-            <w:tcW w:type="dxa" w:w="1281"/>
+            <w:tcW w:type="dxa" w:w="1220"/>
             <w:tcBorders>
               <w:top w:val="single" w:color="E2E8F0" w:sz="4"/>
               <w:left w:val="none" w:color="auto" w:sz="0"/>
@@ -47155,7 +47155,7 @@
         </w:trPr>
         <w:tc>
           <w:tcPr>
-            <w:tcW w:type="dxa" w:w="1525"/>
+            <w:tcW w:type="dxa" w:w="1451"/>
             <w:tcBorders>
               <w:top w:val="single" w:color="E2E8F0" w:sz="4"/>
               <w:left w:val="none" w:color="auto" w:sz="0"/>
@@ -47188,7 +47188,7 @@
         </w:tc>
         <w:tc>
           <w:tcPr>
-            <w:tcW w:type="dxa" w:w="2787"/>
+            <w:tcW w:type="dxa" w:w="2652"/>
             <w:tcBorders>
               <w:top w:val="single" w:color="E2E8F0" w:sz="4"/>
               <w:left w:val="none" w:color="auto" w:sz="0"/>
@@ -47221,7 +47221,7 @@
         </w:tc>
         <w:tc>
           <w:tcPr>
-            <w:tcW w:type="dxa" w:w="3047"/>
+            <w:tcW w:type="dxa" w:w="3317"/>
             <w:tcBorders>
               <w:top w:val="single" w:color="E2E8F0" w:sz="4"/>
               <w:left w:val="none" w:color="auto" w:sz="0"/>
@@ -47254,7 +47254,7 @@
         </w:tc>
         <w:tc>
           <w:tcPr>
-            <w:tcW w:type="dxa" w:w="1281"/>
+            <w:tcW w:type="dxa" w:w="1220"/>
             <w:tcBorders>
               <w:top w:val="single" w:color="E2E8F0" w:sz="4"/>
               <w:left w:val="none" w:color="auto" w:sz="0"/>
@@ -47292,7 +47292,7 @@
         </w:trPr>
         <w:tc>
           <w:tcPr>
-            <w:tcW w:type="dxa" w:w="1525"/>
+            <w:tcW w:type="dxa" w:w="1451"/>
             <w:tcBorders>
               <w:top w:val="single" w:color="E2E8F0" w:sz="4"/>
               <w:left w:val="none" w:color="auto" w:sz="0"/>
@@ -47325,7 +47325,7 @@
         </w:tc>
         <w:tc>
           <w:tcPr>
-            <w:tcW w:type="dxa" w:w="2787"/>
+            <w:tcW w:type="dxa" w:w="2652"/>
             <w:tcBorders>
               <w:top w:val="single" w:color="E2E8F0" w:sz="4"/>
               <w:left w:val="none" w:color="auto" w:sz="0"/>
@@ -47358,7 +47358,7 @@
         </w:tc>
         <w:tc>
           <w:tcPr>
-            <w:tcW w:type="dxa" w:w="3047"/>
+            <w:tcW w:type="dxa" w:w="3317"/>
             <w:tcBorders>
               <w:top w:val="single" w:color="E2E8F0" w:sz="4"/>
               <w:left w:val="none" w:color="auto" w:sz="0"/>
@@ -47391,7 +47391,7 @@
         </w:tc>
         <w:tc>
           <w:tcPr>
-            <w:tcW w:type="dxa" w:w="1281"/>
+            <w:tcW w:type="dxa" w:w="1220"/>
             <w:tcBorders>
               <w:top w:val="single" w:color="E2E8F0" w:sz="4"/>
               <w:left w:val="none" w:color="auto" w:sz="0"/>
@@ -47429,7 +47429,7 @@
         </w:trPr>
         <w:tc>
           <w:tcPr>
-            <w:tcW w:type="dxa" w:w="1525"/>
+            <w:tcW w:type="dxa" w:w="1451"/>
             <w:tcBorders>
               <w:top w:val="single" w:color="E2E8F0" w:sz="4"/>
               <w:left w:val="none" w:color="auto" w:sz="0"/>
@@ -47462,7 +47462,7 @@
         </w:tc>
         <w:tc>
           <w:tcPr>
-            <w:tcW w:type="dxa" w:w="2787"/>
+            <w:tcW w:type="dxa" w:w="2652"/>
             <w:tcBorders>
               <w:top w:val="single" w:color="E2E8F0" w:sz="4"/>
               <w:left w:val="none" w:color="auto" w:sz="0"/>
@@ -47495,7 +47495,7 @@
         </w:tc>
         <w:tc>
           <w:tcPr>
-            <w:tcW w:type="dxa" w:w="3047"/>
+            <w:tcW w:type="dxa" w:w="3317"/>
             <w:tcBorders>
               <w:top w:val="single" w:color="E2E8F0" w:sz="4"/>
               <w:left w:val="none" w:color="auto" w:sz="0"/>
@@ -47528,7 +47528,7 @@
         </w:tc>
         <w:tc>
           <w:tcPr>
-            <w:tcW w:type="dxa" w:w="1281"/>
+            <w:tcW w:type="dxa" w:w="1220"/>
             <w:tcBorders>
               <w:top w:val="single" w:color="E2E8F0" w:sz="4"/>
               <w:left w:val="none" w:color="auto" w:sz="0"/>
@@ -47566,7 +47566,7 @@
         </w:trPr>
         <w:tc>
           <w:tcPr>
-            <w:tcW w:type="dxa" w:w="1525"/>
+            <w:tcW w:type="dxa" w:w="1451"/>
             <w:tcBorders>
               <w:top w:val="single" w:color="E2E8F0" w:sz="4"/>
               <w:left w:val="none" w:color="auto" w:sz="0"/>
@@ -47599,7 +47599,7 @@
         </w:tc>
         <w:tc>
           <w:tcPr>
-            <w:tcW w:type="dxa" w:w="2787"/>
+            <w:tcW w:type="dxa" w:w="2652"/>
             <w:tcBorders>
               <w:top w:val="single" w:color="E2E8F0" w:sz="4"/>
               <w:left w:val="none" w:color="auto" w:sz="0"/>
@@ -47632,7 +47632,7 @@
         </w:tc>
         <w:tc>
           <w:tcPr>
-            <w:tcW w:type="dxa" w:w="3047"/>
+            <w:tcW w:type="dxa" w:w="3317"/>
             <w:tcBorders>
               <w:top w:val="single" w:color="E2E8F0" w:sz="4"/>
               <w:left w:val="none" w:color="auto" w:sz="0"/>
@@ -47665,7 +47665,7 @@
         </w:tc>
         <w:tc>
           <w:tcPr>
-            <w:tcW w:type="dxa" w:w="1281"/>
+            <w:tcW w:type="dxa" w:w="1220"/>
             <w:tcBorders>
               <w:top w:val="single" w:color="E2E8F0" w:sz="4"/>
               <w:left w:val="none" w:color="auto" w:sz="0"/>
@@ -47703,7 +47703,7 @@
         </w:trPr>
         <w:tc>
           <w:tcPr>
-            <w:tcW w:type="dxa" w:w="1525"/>
+            <w:tcW w:type="dxa" w:w="1451"/>
             <w:tcBorders>
               <w:top w:val="single" w:color="E2E8F0" w:sz="4"/>
               <w:left w:val="none" w:color="auto" w:sz="0"/>
@@ -47736,7 +47736,7 @@
         </w:tc>
         <w:tc>
           <w:tcPr>
-            <w:tcW w:type="dxa" w:w="2787"/>
+            <w:tcW w:type="dxa" w:w="2652"/>
             <w:tcBorders>
               <w:top w:val="single" w:color="E2E8F0" w:sz="4"/>
               <w:left w:val="none" w:color="auto" w:sz="0"/>
@@ -47769,7 +47769,7 @@
         </w:tc>
         <w:tc>
           <w:tcPr>
-            <w:tcW w:type="dxa" w:w="3047"/>
+            <w:tcW w:type="dxa" w:w="3317"/>
             <w:tcBorders>
               <w:top w:val="single" w:color="E2E8F0" w:sz="4"/>
               <w:left w:val="none" w:color="auto" w:sz="0"/>
@@ -47802,7 +47802,7 @@
         </w:tc>
         <w:tc>
           <w:tcPr>
-            <w:tcW w:type="dxa" w:w="1281"/>
+            <w:tcW w:type="dxa" w:w="1220"/>
             <w:tcBorders>
               <w:top w:val="single" w:color="E2E8F0" w:sz="4"/>
               <w:left w:val="none" w:color="auto" w:sz="0"/>
@@ -47840,7 +47840,7 @@
         </w:trPr>
         <w:tc>
           <w:tcPr>
-            <w:tcW w:type="dxa" w:w="1525"/>
+            <w:tcW w:type="dxa" w:w="1451"/>
             <w:tcBorders>
               <w:top w:val="single" w:color="E2E8F0" w:sz="4"/>
               <w:left w:val="none" w:color="auto" w:sz="0"/>
@@ -47873,7 +47873,7 @@
         </w:tc>
         <w:tc>
           <w:tcPr>
-            <w:tcW w:type="dxa" w:w="2787"/>
+            <w:tcW w:type="dxa" w:w="2652"/>
             <w:tcBorders>
               <w:top w:val="single" w:color="E2E8F0" w:sz="4"/>
               <w:left w:val="none" w:color="auto" w:sz="0"/>
@@ -47906,7 +47906,7 @@
         </w:tc>
         <w:tc>
           <w:tcPr>
-            <w:tcW w:type="dxa" w:w="3047"/>
+            <w:tcW w:type="dxa" w:w="3317"/>
             <w:tcBorders>
               <w:top w:val="single" w:color="E2E8F0" w:sz="4"/>
               <w:left w:val="none" w:color="auto" w:sz="0"/>
@@ -47939,7 +47939,7 @@
         </w:tc>
         <w:tc>
           <w:tcPr>
-            <w:tcW w:type="dxa" w:w="1281"/>
+            <w:tcW w:type="dxa" w:w="1220"/>
             <w:tcBorders>
               <w:top w:val="single" w:color="E2E8F0" w:sz="4"/>
               <w:left w:val="none" w:color="auto" w:sz="0"/>
@@ -47977,7 +47977,7 @@
         </w:trPr>
         <w:tc>
           <w:tcPr>
-            <w:tcW w:type="dxa" w:w="1525"/>
+            <w:tcW w:type="dxa" w:w="1451"/>
             <w:tcBorders>
               <w:top w:val="single" w:color="E2E8F0" w:sz="4"/>
               <w:left w:val="none" w:color="auto" w:sz="0"/>
@@ -48010,7 +48010,7 @@
         </w:tc>
         <w:tc>
           <w:tcPr>
-            <w:tcW w:type="dxa" w:w="2787"/>
+            <w:tcW w:type="dxa" w:w="2652"/>
             <w:tcBorders>
               <w:top w:val="single" w:color="E2E8F0" w:sz="4"/>
               <w:left w:val="none" w:color="auto" w:sz="0"/>
@@ -48043,7 +48043,7 @@
         </w:tc>
         <w:tc>
           <w:tcPr>
-            <w:tcW w:type="dxa" w:w="3047"/>
+            <w:tcW w:type="dxa" w:w="3317"/>
             <w:tcBorders>
               <w:top w:val="single" w:color="E2E8F0" w:sz="4"/>
               <w:left w:val="none" w:color="auto" w:sz="0"/>
@@ -48076,7 +48076,7 @@
         </w:tc>
         <w:tc>
           <w:tcPr>
-            <w:tcW w:type="dxa" w:w="1281"/>
+            <w:tcW w:type="dxa" w:w="1220"/>
             <w:tcBorders>
               <w:top w:val="single" w:color="E2E8F0" w:sz="4"/>
               <w:left w:val="none" w:color="auto" w:sz="0"/>
@@ -48114,7 +48114,7 @@
         </w:trPr>
         <w:tc>
           <w:tcPr>
-            <w:tcW w:type="dxa" w:w="1525"/>
+            <w:tcW w:type="dxa" w:w="1451"/>
             <w:tcBorders>
               <w:top w:val="single" w:color="E2E8F0" w:sz="4"/>
               <w:left w:val="none" w:color="auto" w:sz="0"/>
@@ -48147,7 +48147,7 @@
         </w:tc>
         <w:tc>
           <w:tcPr>
-            <w:tcW w:type="dxa" w:w="2787"/>
+            <w:tcW w:type="dxa" w:w="2652"/>
             <w:tcBorders>
               <w:top w:val="single" w:color="E2E8F0" w:sz="4"/>
               <w:left w:val="none" w:color="auto" w:sz="0"/>
@@ -48180,7 +48180,7 @@
         </w:tc>
         <w:tc>
           <w:tcPr>
-            <w:tcW w:type="dxa" w:w="3047"/>
+            <w:tcW w:type="dxa" w:w="3317"/>
             <w:tcBorders>
               <w:top w:val="single" w:color="E2E8F0" w:sz="4"/>
               <w:left w:val="none" w:color="auto" w:sz="0"/>
@@ -48213,7 +48213,7 @@
         </w:tc>
         <w:tc>
           <w:tcPr>
-            <w:tcW w:type="dxa" w:w="1281"/>
+            <w:tcW w:type="dxa" w:w="1220"/>
             <w:tcBorders>
               <w:top w:val="single" w:color="E2E8F0" w:sz="4"/>
               <w:left w:val="none" w:color="auto" w:sz="0"/>
@@ -48251,7 +48251,7 @@
         </w:trPr>
         <w:tc>
           <w:tcPr>
-            <w:tcW w:type="dxa" w:w="1525"/>
+            <w:tcW w:type="dxa" w:w="1451"/>
             <w:tcBorders>
               <w:top w:val="single" w:color="E2E8F0" w:sz="4"/>
               <w:left w:val="none" w:color="auto" w:sz="0"/>
@@ -48284,7 +48284,7 @@
         </w:tc>
         <w:tc>
           <w:tcPr>
-            <w:tcW w:type="dxa" w:w="2787"/>
+            <w:tcW w:type="dxa" w:w="2652"/>
             <w:tcBorders>
               <w:top w:val="single" w:color="E2E8F0" w:sz="4"/>
               <w:left w:val="none" w:color="auto" w:sz="0"/>
@@ -48317,7 +48317,7 @@
         </w:tc>
         <w:tc>
           <w:tcPr>
-            <w:tcW w:type="dxa" w:w="3047"/>
+            <w:tcW w:type="dxa" w:w="3317"/>
             <w:tcBorders>
               <w:top w:val="single" w:color="E2E8F0" w:sz="4"/>
               <w:left w:val="none" w:color="auto" w:sz="0"/>
@@ -48350,7 +48350,7 @@
         </w:tc>
         <w:tc>
           <w:tcPr>
-            <w:tcW w:type="dxa" w:w="1281"/>
+            <w:tcW w:type="dxa" w:w="1220"/>
             <w:tcBorders>
               <w:top w:val="single" w:color="E2E8F0" w:sz="4"/>
               <w:left w:val="none" w:color="auto" w:sz="0"/>
@@ -48388,7 +48388,7 @@
         </w:trPr>
         <w:tc>
           <w:tcPr>
-            <w:tcW w:type="dxa" w:w="1525"/>
+            <w:tcW w:type="dxa" w:w="1451"/>
             <w:tcBorders>
               <w:top w:val="single" w:color="E2E8F0" w:sz="4"/>
               <w:left w:val="none" w:color="auto" w:sz="0"/>
@@ -48421,7 +48421,7 @@
         </w:tc>
         <w:tc>
           <w:tcPr>
-            <w:tcW w:type="dxa" w:w="2787"/>
+            <w:tcW w:type="dxa" w:w="2652"/>
             <w:tcBorders>
               <w:top w:val="single" w:color="E2E8F0" w:sz="4"/>
               <w:left w:val="none" w:color="auto" w:sz="0"/>
@@ -48454,7 +48454,7 @@
         </w:tc>
         <w:tc>
           <w:tcPr>
-            <w:tcW w:type="dxa" w:w="3047"/>
+            <w:tcW w:type="dxa" w:w="3317"/>
             <w:tcBorders>
               <w:top w:val="single" w:color="E2E8F0" w:sz="4"/>
               <w:left w:val="none" w:color="auto" w:sz="0"/>
@@ -48487,7 +48487,7 @@
         </w:tc>
         <w:tc>
           <w:tcPr>
-            <w:tcW w:type="dxa" w:w="1281"/>
+            <w:tcW w:type="dxa" w:w="1220"/>
             <w:tcBorders>
               <w:top w:val="single" w:color="E2E8F0" w:sz="4"/>
               <w:left w:val="none" w:color="auto" w:sz="0"/>
@@ -48525,7 +48525,7 @@
         </w:trPr>
         <w:tc>
           <w:tcPr>
-            <w:tcW w:type="dxa" w:w="1525"/>
+            <w:tcW w:type="dxa" w:w="1451"/>
             <w:tcBorders>
               <w:top w:val="single" w:color="E2E8F0" w:sz="4"/>
               <w:left w:val="none" w:color="auto" w:sz="0"/>
@@ -48558,7 +48558,7 @@
         </w:tc>
         <w:tc>
           <w:tcPr>
-            <w:tcW w:type="dxa" w:w="2787"/>
+            <w:tcW w:type="dxa" w:w="2652"/>
             <w:tcBorders>
               <w:top w:val="single" w:color="E2E8F0" w:sz="4"/>
               <w:left w:val="none" w:color="auto" w:sz="0"/>
@@ -48591,7 +48591,7 @@
         </w:tc>
         <w:tc>
           <w:tcPr>
-            <w:tcW w:type="dxa" w:w="3047"/>
+            <w:tcW w:type="dxa" w:w="3317"/>
             <w:tcBorders>
               <w:top w:val="single" w:color="E2E8F0" w:sz="4"/>
               <w:left w:val="none" w:color="auto" w:sz="0"/>
@@ -48624,7 +48624,7 @@
         </w:tc>
         <w:tc>
           <w:tcPr>
-            <w:tcW w:type="dxa" w:w="1281"/>
+            <w:tcW w:type="dxa" w:w="1220"/>
             <w:tcBorders>
               <w:top w:val="single" w:color="E2E8F0" w:sz="4"/>
               <w:left w:val="none" w:color="auto" w:sz="0"/>
@@ -48662,7 +48662,7 @@
         </w:trPr>
         <w:tc>
           <w:tcPr>
-            <w:tcW w:type="dxa" w:w="1525"/>
+            <w:tcW w:type="dxa" w:w="1451"/>
             <w:tcBorders>
               <w:top w:val="single" w:color="E2E8F0" w:sz="4"/>
               <w:left w:val="none" w:color="auto" w:sz="0"/>
@@ -48695,7 +48695,7 @@
         </w:tc>
         <w:tc>
           <w:tcPr>
-            <w:tcW w:type="dxa" w:w="2787"/>
+            <w:tcW w:type="dxa" w:w="2652"/>
             <w:tcBorders>
               <w:top w:val="single" w:color="E2E8F0" w:sz="4"/>
               <w:left w:val="none" w:color="auto" w:sz="0"/>
@@ -48728,7 +48728,7 @@
         </w:tc>
         <w:tc>
           <w:tcPr>
-            <w:tcW w:type="dxa" w:w="3047"/>
+            <w:tcW w:type="dxa" w:w="3317"/>
             <w:tcBorders>
               <w:top w:val="single" w:color="E2E8F0" w:sz="4"/>
               <w:left w:val="none" w:color="auto" w:sz="0"/>
@@ -48761,7 +48761,7 @@
         </w:tc>
         <w:tc>
           <w:tcPr>
-            <w:tcW w:type="dxa" w:w="1281"/>
+            <w:tcW w:type="dxa" w:w="1220"/>
             <w:tcBorders>
               <w:top w:val="single" w:color="E2E8F0" w:sz="4"/>
               <w:left w:val="none" w:color="auto" w:sz="0"/>
@@ -48799,7 +48799,7 @@
         </w:trPr>
         <w:tc>
           <w:tcPr>
-            <w:tcW w:type="dxa" w:w="1525"/>
+            <w:tcW w:type="dxa" w:w="1451"/>
             <w:tcBorders>
               <w:top w:val="single" w:color="E2E8F0" w:sz="4"/>
               <w:left w:val="none" w:color="auto" w:sz="0"/>
@@ -48832,7 +48832,7 @@
         </w:tc>
         <w:tc>
           <w:tcPr>
-            <w:tcW w:type="dxa" w:w="2787"/>
+            <w:tcW w:type="dxa" w:w="2652"/>
             <w:tcBorders>
               <w:top w:val="single" w:color="E2E8F0" w:sz="4"/>
               <w:left w:val="none" w:color="auto" w:sz="0"/>
@@ -48865,7 +48865,7 @@
         </w:tc>
         <w:tc>
           <w:tcPr>
-            <w:tcW w:type="dxa" w:w="3047"/>
+            <w:tcW w:type="dxa" w:w="3317"/>
             <w:tcBorders>
               <w:top w:val="single" w:color="E2E8F0" w:sz="4"/>
               <w:left w:val="none" w:color="auto" w:sz="0"/>
@@ -48898,7 +48898,7 @@
         </w:tc>
         <w:tc>
           <w:tcPr>
-            <w:tcW w:type="dxa" w:w="1281"/>
+            <w:tcW w:type="dxa" w:w="1220"/>
             <w:tcBorders>
               <w:top w:val="single" w:color="E2E8F0" w:sz="4"/>
               <w:left w:val="none" w:color="auto" w:sz="0"/>
@@ -48936,7 +48936,7 @@
         </w:trPr>
         <w:tc>
           <w:tcPr>
-            <w:tcW w:type="dxa" w:w="1525"/>
+            <w:tcW w:type="dxa" w:w="1451"/>
             <w:tcBorders>
               <w:top w:val="single" w:color="E2E8F0" w:sz="4"/>
               <w:left w:val="none" w:color="auto" w:sz="0"/>
@@ -48969,7 +48969,7 @@
         </w:tc>
         <w:tc>
           <w:tcPr>
-            <w:tcW w:type="dxa" w:w="2787"/>
+            <w:tcW w:type="dxa" w:w="2652"/>
             <w:tcBorders>
               <w:top w:val="single" w:color="E2E8F0" w:sz="4"/>
               <w:left w:val="none" w:color="auto" w:sz="0"/>
@@ -49002,7 +49002,7 @@
         </w:tc>
         <w:tc>
           <w:tcPr>
-            <w:tcW w:type="dxa" w:w="3047"/>
+            <w:tcW w:type="dxa" w:w="3317"/>
             <w:tcBorders>
               <w:top w:val="single" w:color="E2E8F0" w:sz="4"/>
               <w:left w:val="none" w:color="auto" w:sz="0"/>
@@ -49035,7 +49035,7 @@
         </w:tc>
         <w:tc>
           <w:tcPr>
-            <w:tcW w:type="dxa" w:w="1281"/>
+            <w:tcW w:type="dxa" w:w="1220"/>
             <w:tcBorders>
               <w:top w:val="single" w:color="E2E8F0" w:sz="4"/>
               <w:left w:val="none" w:color="auto" w:sz="0"/>
@@ -49073,7 +49073,7 @@
         </w:trPr>
         <w:tc>
           <w:tcPr>
-            <w:tcW w:type="dxa" w:w="1525"/>
+            <w:tcW w:type="dxa" w:w="1451"/>
             <w:tcBorders>
               <w:top w:val="single" w:color="E2E8F0" w:sz="4"/>
               <w:left w:val="none" w:color="auto" w:sz="0"/>
@@ -49106,7 +49106,7 @@
         </w:tc>
         <w:tc>
           <w:tcPr>
-            <w:tcW w:type="dxa" w:w="2787"/>
+            <w:tcW w:type="dxa" w:w="2652"/>
             <w:tcBorders>
               <w:top w:val="single" w:color="E2E8F0" w:sz="4"/>
               <w:left w:val="none" w:color="auto" w:sz="0"/>
@@ -49139,7 +49139,7 @@
         </w:tc>
         <w:tc>
           <w:tcPr>
-            <w:tcW w:type="dxa" w:w="3047"/>
+            <w:tcW w:type="dxa" w:w="3317"/>
             <w:tcBorders>
               <w:top w:val="single" w:color="E2E8F0" w:sz="4"/>
               <w:left w:val="none" w:color="auto" w:sz="0"/>
@@ -49172,7 +49172,7 @@
         </w:tc>
         <w:tc>
           <w:tcPr>
-            <w:tcW w:type="dxa" w:w="1281"/>
+            <w:tcW w:type="dxa" w:w="1220"/>
             <w:tcBorders>
               <w:top w:val="single" w:color="E2E8F0" w:sz="4"/>
               <w:left w:val="none" w:color="auto" w:sz="0"/>
@@ -49210,7 +49210,7 @@
         </w:trPr>
         <w:tc>
           <w:tcPr>
-            <w:tcW w:type="dxa" w:w="1525"/>
+            <w:tcW w:type="dxa" w:w="1451"/>
             <w:tcBorders>
               <w:top w:val="single" w:color="E2E8F0" w:sz="4"/>
               <w:left w:val="none" w:color="auto" w:sz="0"/>
@@ -49243,7 +49243,7 @@
         </w:tc>
         <w:tc>
           <w:tcPr>
-            <w:tcW w:type="dxa" w:w="2787"/>
+            <w:tcW w:type="dxa" w:w="2652"/>
             <w:tcBorders>
               <w:top w:val="single" w:color="E2E8F0" w:sz="4"/>
               <w:left w:val="none" w:color="auto" w:sz="0"/>
@@ -49276,7 +49276,7 @@
         </w:tc>
         <w:tc>
           <w:tcPr>
-            <w:tcW w:type="dxa" w:w="3047"/>
+            <w:tcW w:type="dxa" w:w="3317"/>
             <w:tcBorders>
               <w:top w:val="single" w:color="E2E8F0" w:sz="4"/>
               <w:left w:val="none" w:color="auto" w:sz="0"/>
@@ -49309,7 +49309,7 @@
         </w:tc>
         <w:tc>
           <w:tcPr>
-            <w:tcW w:type="dxa" w:w="1281"/>
+            <w:tcW w:type="dxa" w:w="1220"/>
             <w:tcBorders>
               <w:top w:val="single" w:color="E2E8F0" w:sz="4"/>
               <w:left w:val="none" w:color="auto" w:sz="0"/>
@@ -49347,7 +49347,7 @@
         </w:trPr>
         <w:tc>
           <w:tcPr>
-            <w:tcW w:type="dxa" w:w="1525"/>
+            <w:tcW w:type="dxa" w:w="1451"/>
             <w:tcBorders>
               <w:top w:val="single" w:color="E2E8F0" w:sz="4"/>
               <w:left w:val="none" w:color="auto" w:sz="0"/>
@@ -49380,7 +49380,7 @@
         </w:tc>
         <w:tc>
           <w:tcPr>
-            <w:tcW w:type="dxa" w:w="2787"/>
+            <w:tcW w:type="dxa" w:w="2652"/>
             <w:tcBorders>
               <w:top w:val="single" w:color="E2E8F0" w:sz="4"/>
               <w:left w:val="none" w:color="auto" w:sz="0"/>
@@ -49413,7 +49413,7 @@
         </w:tc>
         <w:tc>
           <w:tcPr>
-            <w:tcW w:type="dxa" w:w="3047"/>
+            <w:tcW w:type="dxa" w:w="3317"/>
             <w:tcBorders>
               <w:top w:val="single" w:color="E2E8F0" w:sz="4"/>
               <w:left w:val="none" w:color="auto" w:sz="0"/>
@@ -49446,7 +49446,7 @@
         </w:tc>
         <w:tc>
           <w:tcPr>
-            <w:tcW w:type="dxa" w:w="1281"/>
+            <w:tcW w:type="dxa" w:w="1220"/>
             <w:tcBorders>
               <w:top w:val="single" w:color="E2E8F0" w:sz="4"/>
               <w:left w:val="none" w:color="auto" w:sz="0"/>
@@ -49484,7 +49484,7 @@
         </w:trPr>
         <w:tc>
           <w:tcPr>
-            <w:tcW w:type="dxa" w:w="1525"/>
+            <w:tcW w:type="dxa" w:w="1451"/>
             <w:tcBorders>
               <w:top w:val="single" w:color="E2E8F0" w:sz="4"/>
               <w:left w:val="none" w:color="auto" w:sz="0"/>
@@ -49517,7 +49517,7 @@
         </w:tc>
         <w:tc>
           <w:tcPr>
-            <w:tcW w:type="dxa" w:w="2787"/>
+            <w:tcW w:type="dxa" w:w="2652"/>
             <w:tcBorders>
               <w:top w:val="single" w:color="E2E8F0" w:sz="4"/>
               <w:left w:val="none" w:color="auto" w:sz="0"/>
@@ -49550,40 +49550,40 @@
         </w:tc>
         <w:tc>
           <w:tcPr>
-            <w:tcW w:type="dxa" w:w="3047"/>
-            <w:tcBorders>
-              <w:top w:val="single" w:color="E2E8F0" w:sz="4"/>
-              <w:left w:val="none" w:color="auto" w:sz="0"/>
-              <w:bottom w:val="single" w:color="E2E8F0" w:sz="4"/>
-              <w:right w:val="none" w:color="auto" w:sz="0"/>
-            </w:tcBorders>
-            <w:tcMar>
-              <w:top w:type="dxa" w:w="120"/>
-              <w:left w:type="dxa" w:w="160"/>
-              <w:bottom w:type="dxa" w:w="120"/>
-              <w:right w:type="dxa" w:w="160"/>
-            </w:tcMar>
-          </w:tcPr>
-          <w:p>
-            <w:pPr>
-              <w:spacing w:line="240" w:lineRule="auto"/>
-              <w:jc w:val="left"/>
-            </w:pPr>
-            <w:r>
-              <w:rPr>
-                <w:rFonts w:ascii="Arial" w:cs="Arial" w:eastAsia="Arial" w:hAnsi="Arial"/>
-                <w:b w:val="false"/>
-                <w:bCs w:val="false"/>
-                <w:sz w:val="20"/>
-                <w:szCs w:val="20"/>
-              </w:rPr>
-              <w:t xml:space="preserve">Each person's Overview shows their own last three actions in plain words, each linking to where it happened ("Recorded a payment: 2B, October 2026, ₱8,800."); a refresh that fails for a moment keeps the figures already on screen</w:t>
-            </w:r>
-          </w:p>
-        </w:tc>
-        <w:tc>
-          <w:tcPr>
-            <w:tcW w:type="dxa" w:w="1281"/>
+            <w:tcW w:type="dxa" w:w="3317"/>
+            <w:tcBorders>
+              <w:top w:val="single" w:color="E2E8F0" w:sz="4"/>
+              <w:left w:val="none" w:color="auto" w:sz="0"/>
+              <w:bottom w:val="single" w:color="E2E8F0" w:sz="4"/>
+              <w:right w:val="none" w:color="auto" w:sz="0"/>
+            </w:tcBorders>
+            <w:tcMar>
+              <w:top w:type="dxa" w:w="120"/>
+              <w:left w:type="dxa" w:w="160"/>
+              <w:bottom w:type="dxa" w:w="120"/>
+              <w:right w:type="dxa" w:w="160"/>
+            </w:tcMar>
+          </w:tcPr>
+          <w:p>
+            <w:pPr>
+              <w:spacing w:line="240" w:lineRule="auto"/>
+              <w:jc w:val="left"/>
+            </w:pPr>
+            <w:r>
+              <w:rPr>
+                <w:rFonts w:ascii="Arial" w:cs="Arial" w:eastAsia="Arial" w:hAnsi="Arial"/>
+                <w:b w:val="false"/>
+                <w:bCs w:val="false"/>
+                <w:sz w:val="20"/>
+                <w:szCs w:val="20"/>
+              </w:rPr>
+              <w:t xml:space="preserve">Each person's Overview shows their own last three actions in plain words, each linking to where it happened ("Recorded a payment: 2B, October 2026, ₱8,800."); a refresh that fails for a moment keeps the figures already on screen; when the server refuses an entry, the message names the field and the reason ("Emergency contact phone: Enter a Philippine mobile number") instead of a technical code</w:t>
+            </w:r>
+          </w:p>
+        </w:tc>
+        <w:tc>
+          <w:tcPr>
+            <w:tcW w:type="dxa" w:w="1220"/>
             <w:tcBorders>
               <w:top w:val="single" w:color="E2E8F0" w:sz="4"/>
               <w:left w:val="none" w:color="auto" w:sz="0"/>
@@ -49621,7 +49621,7 @@
         </w:trPr>
         <w:tc>
           <w:tcPr>
-            <w:tcW w:type="dxa" w:w="1525"/>
+            <w:tcW w:type="dxa" w:w="1451"/>
             <w:tcBorders>
               <w:top w:val="single" w:color="E2E8F0" w:sz="4"/>
               <w:left w:val="none" w:color="auto" w:sz="0"/>
@@ -49654,7 +49654,7 @@
         </w:tc>
         <w:tc>
           <w:tcPr>
-            <w:tcW w:type="dxa" w:w="2787"/>
+            <w:tcW w:type="dxa" w:w="2652"/>
             <w:tcBorders>
               <w:top w:val="single" w:color="E2E8F0" w:sz="4"/>
               <w:left w:val="none" w:color="auto" w:sz="0"/>
@@ -49687,7 +49687,7 @@
         </w:tc>
         <w:tc>
           <w:tcPr>
-            <w:tcW w:type="dxa" w:w="3047"/>
+            <w:tcW w:type="dxa" w:w="3317"/>
             <w:tcBorders>
               <w:top w:val="single" w:color="E2E8F0" w:sz="4"/>
               <w:left w:val="none" w:color="auto" w:sz="0"/>
@@ -49720,7 +49720,7 @@
         </w:tc>
         <w:tc>
           <w:tcPr>
-            <w:tcW w:type="dxa" w:w="1281"/>
+            <w:tcW w:type="dxa" w:w="1220"/>
             <w:tcBorders>
               <w:top w:val="single" w:color="E2E8F0" w:sz="4"/>
               <w:left w:val="none" w:color="auto" w:sz="0"/>
@@ -49758,7 +49758,7 @@
         </w:trPr>
         <w:tc>
           <w:tcPr>
-            <w:tcW w:type="dxa" w:w="1525"/>
+            <w:tcW w:type="dxa" w:w="1451"/>
             <w:tcBorders>
               <w:top w:val="single" w:color="E2E8F0" w:sz="4"/>
               <w:left w:val="none" w:color="auto" w:sz="0"/>
@@ -49791,7 +49791,7 @@
         </w:tc>
         <w:tc>
           <w:tcPr>
-            <w:tcW w:type="dxa" w:w="2787"/>
+            <w:tcW w:type="dxa" w:w="2652"/>
             <w:tcBorders>
               <w:top w:val="single" w:color="E2E8F0" w:sz="4"/>
               <w:left w:val="none" w:color="auto" w:sz="0"/>
@@ -49824,7 +49824,7 @@
         </w:tc>
         <w:tc>
           <w:tcPr>
-            <w:tcW w:type="dxa" w:w="3047"/>
+            <w:tcW w:type="dxa" w:w="3317"/>
             <w:tcBorders>
               <w:top w:val="single" w:color="E2E8F0" w:sz="4"/>
               <w:left w:val="none" w:color="auto" w:sz="0"/>
@@ -49857,7 +49857,7 @@
         </w:tc>
         <w:tc>
           <w:tcPr>
-            <w:tcW w:type="dxa" w:w="1281"/>
+            <w:tcW w:type="dxa" w:w="1220"/>
             <w:tcBorders>
               <w:top w:val="single" w:color="E2E8F0" w:sz="4"/>
               <w:left w:val="none" w:color="auto" w:sz="0"/>
@@ -49895,7 +49895,7 @@
         </w:trPr>
         <w:tc>
           <w:tcPr>
-            <w:tcW w:type="dxa" w:w="1525"/>
+            <w:tcW w:type="dxa" w:w="1451"/>
             <w:tcBorders>
               <w:top w:val="single" w:color="E2E8F0" w:sz="4"/>
               <w:left w:val="none" w:color="auto" w:sz="0"/>
@@ -49928,7 +49928,7 @@
         </w:tc>
         <w:tc>
           <w:tcPr>
-            <w:tcW w:type="dxa" w:w="2787"/>
+            <w:tcW w:type="dxa" w:w="2652"/>
             <w:tcBorders>
               <w:top w:val="single" w:color="E2E8F0" w:sz="4"/>
               <w:left w:val="none" w:color="auto" w:sz="0"/>
@@ -49961,7 +49961,7 @@
         </w:tc>
         <w:tc>
           <w:tcPr>
-            <w:tcW w:type="dxa" w:w="3047"/>
+            <w:tcW w:type="dxa" w:w="3317"/>
             <w:tcBorders>
               <w:top w:val="single" w:color="E2E8F0" w:sz="4"/>
               <w:left w:val="none" w:color="auto" w:sz="0"/>
@@ -49984,7 +49984,7 @@
         </w:tc>
         <w:tc>
           <w:tcPr>
-            <w:tcW w:type="dxa" w:w="1281"/>
+            <w:tcW w:type="dxa" w:w="1220"/>
             <w:tcBorders>
               <w:top w:val="single" w:color="E2E8F0" w:sz="4"/>
               <w:left w:val="none" w:color="auto" w:sz="0"/>

</xml_diff>

<commit_message>
Survey: rank and n in Table 22, a worked weighted mean (13A), the lowest characteristic named
The course guide expects a summary table with a rank column and n per characteristic, and one
weighted mean worked in full; Chapter 5's recommendation 6 waits on the lowest-rated
characteristic. compute-survey.mjs now prints all three when the CSV arrives: n counts respondents
who rated the characteristic (not answers), ties share a rank, and 13A uses the indicator with the
most answers, ending in 'WM = sum / N = x, which Table 13 reads as ...'. Chapter 4 has the matching
placeholders (Table 22's two new columns, Table 13A after Table 13).

Tested on a synthetic responses file built from build_survey_form.gs (10 rows, 91 items, all four
groups; never a manuscript source): every item matched, Security n = 5 (owner and evaluators only),
Maintainability n = 4, ranks 1 to 8, 13A's arithmetic 14 / 4 = 3.50 correct.

Co-Authored-By: Claude Opus 5.5 <noreply@anthropic.com>
</commit_message>
<xml_diff>
--- a/docs/FINAL MANUSCRIPT/CHAPTER_4_RESULTS_AND_DISCUSSION.docx
+++ b/docs/FINAL MANUSCRIPT/CHAPTER_4_RESULTS_AND_DISCUSSION.docx
@@ -28141,6 +28141,932 @@
     </w:p>
     <w:p>
       <w:pPr>
+        <w:spacing w:after="0" w:before="0" w:line="480" w:lineRule="auto"/>
+        <w:ind w:firstLine="720"/>
+        <w:jc w:val="both"/>
+      </w:pPr>
+      <w:r>
+        <w:rPr>
+          <w:rFonts w:ascii="Arial" w:cs="Arial" w:eastAsia="Arial" w:hAnsi="Arial"/>
+          <w:b w:val="false"/>
+          <w:bCs w:val="false"/>
+          <w:sz w:val="24"/>
+          <w:szCs w:val="24"/>
+        </w:rPr>
+        <w:t xml:space="preserve">Table 13A works one weighted mean in full, so that every mean in Tables 14 to 21 can be checked the same way: each rating is multiplied by the number of respondents who chose it, and the sum of the products is divided by the number of respondents, WM = Σ(f × w) / N.</w:t>
+      </w:r>
+    </w:p>
+    <w:p>
+      <w:pPr>
+        <w:spacing w:after="0" w:before="0" w:line="480" w:lineRule="auto"/>
+        <w:ind w:firstLine="720"/>
+        <w:jc w:val="both"/>
+      </w:pPr>
+      <w:r>
+        <w:rPr>
+          <w:rFonts w:ascii="Arial" w:cs="Arial" w:eastAsia="Arial" w:hAnsi="Arial"/>
+          <w:b/>
+          <w:bCs/>
+          <w:sz w:val="24"/>
+          <w:szCs w:val="24"/>
+        </w:rPr>
+        <w:t xml:space="preserve">Table 13A.</w:t>
+      </w:r>
+      <w:r>
+        <w:rPr>
+          <w:rFonts w:ascii="Arial" w:cs="Arial" w:eastAsia="Arial" w:hAnsi="Arial"/>
+          <w:b w:val="false"/>
+          <w:bCs w:val="false"/>
+          <w:sz w:val="24"/>
+          <w:szCs w:val="24"/>
+        </w:rPr>
+        <w:t xml:space="preserve"> Worked Computation of a Weighted Mean [DATA PENDING]</w:t>
+      </w:r>
+    </w:p>
+    <w:tbl>
+      <w:tblPr>
+        <w:tblW w:type="dxa" w:w="8640"/>
+        <w:tblBorders>
+          <w:top w:val="single" w:color="auto" w:sz="4"/>
+          <w:left w:val="single" w:color="auto" w:sz="4"/>
+          <w:bottom w:val="single" w:color="auto" w:sz="4"/>
+          <w:right w:val="single" w:color="auto" w:sz="4"/>
+          <w:insideH w:val="single" w:color="auto" w:sz="4"/>
+          <w:insideV w:val="single" w:color="auto" w:sz="4"/>
+        </w:tblBorders>
+      </w:tblPr>
+      <w:tblGrid>
+        <w:gridCol w:w="100"/>
+        <w:gridCol w:w="100"/>
+        <w:gridCol w:w="100"/>
+        <w:gridCol w:w="100"/>
+      </w:tblGrid>
+      <w:tr>
+        <w:trPr>
+          <w:cantSplit/>
+          <w:tblHeader/>
+        </w:trPr>
+        <w:tc>
+          <w:tcPr>
+            <w:tcW w:type="dxa" w:w="2073"/>
+            <w:tcBorders>
+              <w:top w:val="single" w:color="1A202C" w:sz="12"/>
+              <w:left w:val="none" w:color="auto" w:sz="0"/>
+              <w:bottom w:val="single" w:color="1A202C" w:sz="12"/>
+              <w:right w:val="none" w:color="auto" w:sz="0"/>
+            </w:tcBorders>
+            <w:shd w:fill="F8FAFC"/>
+            <w:tcMar>
+              <w:top w:type="dxa" w:w="140"/>
+              <w:left w:type="dxa" w:w="160"/>
+              <w:bottom w:type="dxa" w:w="140"/>
+              <w:right w:type="dxa" w:w="160"/>
+            </w:tcMar>
+          </w:tcPr>
+          <w:p>
+            <w:pPr>
+              <w:spacing w:line="240" w:lineRule="auto"/>
+              <w:jc w:val="left"/>
+            </w:pPr>
+            <w:r>
+              <w:rPr>
+                <w:rFonts w:ascii="Arial" w:cs="Arial" w:eastAsia="Arial" w:hAnsi="Arial"/>
+                <w:b/>
+                <w:bCs/>
+                <w:sz w:val="20"/>
+                <w:szCs w:val="20"/>
+              </w:rPr>
+              <w:t xml:space="preserve">Rating (w)</w:t>
+            </w:r>
+          </w:p>
+        </w:tc>
+        <w:tc>
+          <w:tcPr>
+            <w:tcW w:type="dxa" w:w="2420"/>
+            <w:tcBorders>
+              <w:top w:val="single" w:color="1A202C" w:sz="12"/>
+              <w:left w:val="none" w:color="auto" w:sz="0"/>
+              <w:bottom w:val="single" w:color="1A202C" w:sz="12"/>
+              <w:right w:val="none" w:color="auto" w:sz="0"/>
+            </w:tcBorders>
+            <w:shd w:fill="F8FAFC"/>
+            <w:tcMar>
+              <w:top w:type="dxa" w:w="140"/>
+              <w:left w:type="dxa" w:w="160"/>
+              <w:bottom w:type="dxa" w:w="140"/>
+              <w:right w:type="dxa" w:w="160"/>
+            </w:tcMar>
+          </w:tcPr>
+          <w:p>
+            <w:pPr>
+              <w:spacing w:line="240" w:lineRule="auto"/>
+              <w:jc w:val="center"/>
+            </w:pPr>
+            <w:r>
+              <w:rPr>
+                <w:rFonts w:ascii="Arial" w:cs="Arial" w:eastAsia="Arial" w:hAnsi="Arial"/>
+                <w:b/>
+                <w:bCs/>
+                <w:sz w:val="20"/>
+                <w:szCs w:val="20"/>
+              </w:rPr>
+              <w:t xml:space="preserve">Meaning</w:t>
+            </w:r>
+          </w:p>
+        </w:tc>
+        <w:tc>
+          <w:tcPr>
+            <w:tcW w:type="dxa" w:w="2073"/>
+            <w:tcBorders>
+              <w:top w:val="single" w:color="1A202C" w:sz="12"/>
+              <w:left w:val="none" w:color="auto" w:sz="0"/>
+              <w:bottom w:val="single" w:color="1A202C" w:sz="12"/>
+              <w:right w:val="none" w:color="auto" w:sz="0"/>
+            </w:tcBorders>
+            <w:shd w:fill="F8FAFC"/>
+            <w:tcMar>
+              <w:top w:type="dxa" w:w="140"/>
+              <w:left w:type="dxa" w:w="160"/>
+              <w:bottom w:type="dxa" w:w="140"/>
+              <w:right w:type="dxa" w:w="160"/>
+            </w:tcMar>
+          </w:tcPr>
+          <w:p>
+            <w:pPr>
+              <w:spacing w:line="240" w:lineRule="auto"/>
+              <w:jc w:val="center"/>
+            </w:pPr>
+            <w:r>
+              <w:rPr>
+                <w:rFonts w:ascii="Arial" w:cs="Arial" w:eastAsia="Arial" w:hAnsi="Arial"/>
+                <w:b/>
+                <w:bCs/>
+                <w:sz w:val="20"/>
+                <w:szCs w:val="20"/>
+              </w:rPr>
+              <w:t xml:space="preserve">Frequency (f)</w:t>
+            </w:r>
+          </w:p>
+        </w:tc>
+        <w:tc>
+          <w:tcPr>
+            <w:tcW w:type="dxa" w:w="2074"/>
+            <w:tcBorders>
+              <w:top w:val="single" w:color="1A202C" w:sz="12"/>
+              <w:left w:val="none" w:color="auto" w:sz="0"/>
+              <w:bottom w:val="single" w:color="1A202C" w:sz="12"/>
+              <w:right w:val="none" w:color="auto" w:sz="0"/>
+            </w:tcBorders>
+            <w:shd w:fill="F8FAFC"/>
+            <w:tcMar>
+              <w:top w:type="dxa" w:w="140"/>
+              <w:left w:type="dxa" w:w="160"/>
+              <w:bottom w:type="dxa" w:w="140"/>
+              <w:right w:type="dxa" w:w="160"/>
+            </w:tcMar>
+          </w:tcPr>
+          <w:p>
+            <w:pPr>
+              <w:spacing w:line="240" w:lineRule="auto"/>
+              <w:jc w:val="center"/>
+            </w:pPr>
+            <w:r>
+              <w:rPr>
+                <w:rFonts w:ascii="Arial" w:cs="Arial" w:eastAsia="Arial" w:hAnsi="Arial"/>
+                <w:b/>
+                <w:bCs/>
+                <w:sz w:val="20"/>
+                <w:szCs w:val="20"/>
+              </w:rPr>
+              <w:t xml:space="preserve">f × w</w:t>
+            </w:r>
+          </w:p>
+        </w:tc>
+      </w:tr>
+      <w:tr>
+        <w:trPr>
+          <w:cantSplit/>
+        </w:trPr>
+        <w:tc>
+          <w:tcPr>
+            <w:tcW w:type="dxa" w:w="2073"/>
+            <w:tcBorders>
+              <w:top w:val="single" w:color="E2E8F0" w:sz="4"/>
+              <w:left w:val="none" w:color="auto" w:sz="0"/>
+              <w:bottom w:val="single" w:color="E2E8F0" w:sz="4"/>
+              <w:right w:val="none" w:color="auto" w:sz="0"/>
+            </w:tcBorders>
+            <w:tcMar>
+              <w:top w:type="dxa" w:w="120"/>
+              <w:left w:type="dxa" w:w="160"/>
+              <w:bottom w:type="dxa" w:w="120"/>
+              <w:right w:type="dxa" w:w="160"/>
+            </w:tcMar>
+          </w:tcPr>
+          <w:p>
+            <w:pPr>
+              <w:spacing w:line="240" w:lineRule="auto"/>
+              <w:jc w:val="left"/>
+            </w:pPr>
+            <w:r>
+              <w:rPr>
+                <w:rFonts w:ascii="Arial" w:cs="Arial" w:eastAsia="Arial" w:hAnsi="Arial"/>
+                <w:b w:val="false"/>
+                <w:bCs w:val="false"/>
+                <w:sz w:val="20"/>
+                <w:szCs w:val="20"/>
+              </w:rPr>
+              <w:t xml:space="preserve">5</w:t>
+            </w:r>
+          </w:p>
+        </w:tc>
+        <w:tc>
+          <w:tcPr>
+            <w:tcW w:type="dxa" w:w="2420"/>
+            <w:tcBorders>
+              <w:top w:val="single" w:color="E2E8F0" w:sz="4"/>
+              <w:left w:val="none" w:color="auto" w:sz="0"/>
+              <w:bottom w:val="single" w:color="E2E8F0" w:sz="4"/>
+              <w:right w:val="none" w:color="auto" w:sz="0"/>
+            </w:tcBorders>
+            <w:tcMar>
+              <w:top w:type="dxa" w:w="120"/>
+              <w:left w:type="dxa" w:w="160"/>
+              <w:bottom w:type="dxa" w:w="120"/>
+              <w:right w:type="dxa" w:w="160"/>
+            </w:tcMar>
+          </w:tcPr>
+          <w:p>
+            <w:pPr>
+              <w:spacing w:line="240" w:lineRule="auto"/>
+              <w:jc w:val="left"/>
+            </w:pPr>
+            <w:r>
+              <w:rPr>
+                <w:rFonts w:ascii="Arial" w:cs="Arial" w:eastAsia="Arial" w:hAnsi="Arial"/>
+                <w:b w:val="false"/>
+                <w:bCs w:val="false"/>
+                <w:sz w:val="20"/>
+                <w:szCs w:val="20"/>
+              </w:rPr>
+              <w:t xml:space="preserve">Strongly Agree</w:t>
+            </w:r>
+          </w:p>
+        </w:tc>
+        <w:tc>
+          <w:tcPr>
+            <w:tcW w:type="dxa" w:w="2073"/>
+            <w:tcBorders>
+              <w:top w:val="single" w:color="E2E8F0" w:sz="4"/>
+              <w:left w:val="none" w:color="auto" w:sz="0"/>
+              <w:bottom w:val="single" w:color="E2E8F0" w:sz="4"/>
+              <w:right w:val="none" w:color="auto" w:sz="0"/>
+            </w:tcBorders>
+            <w:tcMar>
+              <w:top w:type="dxa" w:w="120"/>
+              <w:left w:type="dxa" w:w="160"/>
+              <w:bottom w:type="dxa" w:w="120"/>
+              <w:right w:type="dxa" w:w="160"/>
+            </w:tcMar>
+          </w:tcPr>
+          <w:p>
+            <w:pPr>
+              <w:spacing w:line="240" w:lineRule="auto"/>
+              <w:jc w:val="left"/>
+            </w:pPr>
+          </w:p>
+        </w:tc>
+        <w:tc>
+          <w:tcPr>
+            <w:tcW w:type="dxa" w:w="2074"/>
+            <w:tcBorders>
+              <w:top w:val="single" w:color="E2E8F0" w:sz="4"/>
+              <w:left w:val="none" w:color="auto" w:sz="0"/>
+              <w:bottom w:val="single" w:color="E2E8F0" w:sz="4"/>
+              <w:right w:val="none" w:color="auto" w:sz="0"/>
+            </w:tcBorders>
+            <w:tcMar>
+              <w:top w:type="dxa" w:w="120"/>
+              <w:left w:type="dxa" w:w="160"/>
+              <w:bottom w:type="dxa" w:w="120"/>
+              <w:right w:type="dxa" w:w="160"/>
+            </w:tcMar>
+          </w:tcPr>
+          <w:p>
+            <w:pPr>
+              <w:spacing w:line="240" w:lineRule="auto"/>
+              <w:jc w:val="left"/>
+            </w:pPr>
+          </w:p>
+        </w:tc>
+      </w:tr>
+      <w:tr>
+        <w:trPr>
+          <w:cantSplit/>
+        </w:trPr>
+        <w:tc>
+          <w:tcPr>
+            <w:tcW w:type="dxa" w:w="2073"/>
+            <w:tcBorders>
+              <w:top w:val="single" w:color="E2E8F0" w:sz="4"/>
+              <w:left w:val="none" w:color="auto" w:sz="0"/>
+              <w:bottom w:val="single" w:color="E2E8F0" w:sz="4"/>
+              <w:right w:val="none" w:color="auto" w:sz="0"/>
+            </w:tcBorders>
+            <w:tcMar>
+              <w:top w:type="dxa" w:w="120"/>
+              <w:left w:type="dxa" w:w="160"/>
+              <w:bottom w:type="dxa" w:w="120"/>
+              <w:right w:type="dxa" w:w="160"/>
+            </w:tcMar>
+          </w:tcPr>
+          <w:p>
+            <w:pPr>
+              <w:spacing w:line="240" w:lineRule="auto"/>
+              <w:jc w:val="left"/>
+            </w:pPr>
+            <w:r>
+              <w:rPr>
+                <w:rFonts w:ascii="Arial" w:cs="Arial" w:eastAsia="Arial" w:hAnsi="Arial"/>
+                <w:b w:val="false"/>
+                <w:bCs w:val="false"/>
+                <w:sz w:val="20"/>
+                <w:szCs w:val="20"/>
+              </w:rPr>
+              <w:t xml:space="preserve">4</w:t>
+            </w:r>
+          </w:p>
+        </w:tc>
+        <w:tc>
+          <w:tcPr>
+            <w:tcW w:type="dxa" w:w="2420"/>
+            <w:tcBorders>
+              <w:top w:val="single" w:color="E2E8F0" w:sz="4"/>
+              <w:left w:val="none" w:color="auto" w:sz="0"/>
+              <w:bottom w:val="single" w:color="E2E8F0" w:sz="4"/>
+              <w:right w:val="none" w:color="auto" w:sz="0"/>
+            </w:tcBorders>
+            <w:tcMar>
+              <w:top w:type="dxa" w:w="120"/>
+              <w:left w:type="dxa" w:w="160"/>
+              <w:bottom w:type="dxa" w:w="120"/>
+              <w:right w:type="dxa" w:w="160"/>
+            </w:tcMar>
+          </w:tcPr>
+          <w:p>
+            <w:pPr>
+              <w:spacing w:line="240" w:lineRule="auto"/>
+              <w:jc w:val="left"/>
+            </w:pPr>
+            <w:r>
+              <w:rPr>
+                <w:rFonts w:ascii="Arial" w:cs="Arial" w:eastAsia="Arial" w:hAnsi="Arial"/>
+                <w:b w:val="false"/>
+                <w:bCs w:val="false"/>
+                <w:sz w:val="20"/>
+                <w:szCs w:val="20"/>
+              </w:rPr>
+              <w:t xml:space="preserve">Agree</w:t>
+            </w:r>
+          </w:p>
+        </w:tc>
+        <w:tc>
+          <w:tcPr>
+            <w:tcW w:type="dxa" w:w="2073"/>
+            <w:tcBorders>
+              <w:top w:val="single" w:color="E2E8F0" w:sz="4"/>
+              <w:left w:val="none" w:color="auto" w:sz="0"/>
+              <w:bottom w:val="single" w:color="E2E8F0" w:sz="4"/>
+              <w:right w:val="none" w:color="auto" w:sz="0"/>
+            </w:tcBorders>
+            <w:tcMar>
+              <w:top w:type="dxa" w:w="120"/>
+              <w:left w:type="dxa" w:w="160"/>
+              <w:bottom w:type="dxa" w:w="120"/>
+              <w:right w:type="dxa" w:w="160"/>
+            </w:tcMar>
+          </w:tcPr>
+          <w:p>
+            <w:pPr>
+              <w:spacing w:line="240" w:lineRule="auto"/>
+              <w:jc w:val="left"/>
+            </w:pPr>
+          </w:p>
+        </w:tc>
+        <w:tc>
+          <w:tcPr>
+            <w:tcW w:type="dxa" w:w="2074"/>
+            <w:tcBorders>
+              <w:top w:val="single" w:color="E2E8F0" w:sz="4"/>
+              <w:left w:val="none" w:color="auto" w:sz="0"/>
+              <w:bottom w:val="single" w:color="E2E8F0" w:sz="4"/>
+              <w:right w:val="none" w:color="auto" w:sz="0"/>
+            </w:tcBorders>
+            <w:tcMar>
+              <w:top w:type="dxa" w:w="120"/>
+              <w:left w:type="dxa" w:w="160"/>
+              <w:bottom w:type="dxa" w:w="120"/>
+              <w:right w:type="dxa" w:w="160"/>
+            </w:tcMar>
+          </w:tcPr>
+          <w:p>
+            <w:pPr>
+              <w:spacing w:line="240" w:lineRule="auto"/>
+              <w:jc w:val="left"/>
+            </w:pPr>
+          </w:p>
+        </w:tc>
+      </w:tr>
+      <w:tr>
+        <w:trPr>
+          <w:cantSplit/>
+        </w:trPr>
+        <w:tc>
+          <w:tcPr>
+            <w:tcW w:type="dxa" w:w="2073"/>
+            <w:tcBorders>
+              <w:top w:val="single" w:color="E2E8F0" w:sz="4"/>
+              <w:left w:val="none" w:color="auto" w:sz="0"/>
+              <w:bottom w:val="single" w:color="E2E8F0" w:sz="4"/>
+              <w:right w:val="none" w:color="auto" w:sz="0"/>
+            </w:tcBorders>
+            <w:tcMar>
+              <w:top w:type="dxa" w:w="120"/>
+              <w:left w:type="dxa" w:w="160"/>
+              <w:bottom w:type="dxa" w:w="120"/>
+              <w:right w:type="dxa" w:w="160"/>
+            </w:tcMar>
+          </w:tcPr>
+          <w:p>
+            <w:pPr>
+              <w:spacing w:line="240" w:lineRule="auto"/>
+              <w:jc w:val="left"/>
+            </w:pPr>
+            <w:r>
+              <w:rPr>
+                <w:rFonts w:ascii="Arial" w:cs="Arial" w:eastAsia="Arial" w:hAnsi="Arial"/>
+                <w:b w:val="false"/>
+                <w:bCs w:val="false"/>
+                <w:sz w:val="20"/>
+                <w:szCs w:val="20"/>
+              </w:rPr>
+              <w:t xml:space="preserve">3</w:t>
+            </w:r>
+          </w:p>
+        </w:tc>
+        <w:tc>
+          <w:tcPr>
+            <w:tcW w:type="dxa" w:w="2420"/>
+            <w:tcBorders>
+              <w:top w:val="single" w:color="E2E8F0" w:sz="4"/>
+              <w:left w:val="none" w:color="auto" w:sz="0"/>
+              <w:bottom w:val="single" w:color="E2E8F0" w:sz="4"/>
+              <w:right w:val="none" w:color="auto" w:sz="0"/>
+            </w:tcBorders>
+            <w:tcMar>
+              <w:top w:type="dxa" w:w="120"/>
+              <w:left w:type="dxa" w:w="160"/>
+              <w:bottom w:type="dxa" w:w="120"/>
+              <w:right w:type="dxa" w:w="160"/>
+            </w:tcMar>
+          </w:tcPr>
+          <w:p>
+            <w:pPr>
+              <w:spacing w:line="240" w:lineRule="auto"/>
+              <w:jc w:val="left"/>
+            </w:pPr>
+            <w:r>
+              <w:rPr>
+                <w:rFonts w:ascii="Arial" w:cs="Arial" w:eastAsia="Arial" w:hAnsi="Arial"/>
+                <w:b w:val="false"/>
+                <w:bCs w:val="false"/>
+                <w:sz w:val="20"/>
+                <w:szCs w:val="20"/>
+              </w:rPr>
+              <w:t xml:space="preserve">Neutral</w:t>
+            </w:r>
+          </w:p>
+        </w:tc>
+        <w:tc>
+          <w:tcPr>
+            <w:tcW w:type="dxa" w:w="2073"/>
+            <w:tcBorders>
+              <w:top w:val="single" w:color="E2E8F0" w:sz="4"/>
+              <w:left w:val="none" w:color="auto" w:sz="0"/>
+              <w:bottom w:val="single" w:color="E2E8F0" w:sz="4"/>
+              <w:right w:val="none" w:color="auto" w:sz="0"/>
+            </w:tcBorders>
+            <w:tcMar>
+              <w:top w:type="dxa" w:w="120"/>
+              <w:left w:type="dxa" w:w="160"/>
+              <w:bottom w:type="dxa" w:w="120"/>
+              <w:right w:type="dxa" w:w="160"/>
+            </w:tcMar>
+          </w:tcPr>
+          <w:p>
+            <w:pPr>
+              <w:spacing w:line="240" w:lineRule="auto"/>
+              <w:jc w:val="left"/>
+            </w:pPr>
+          </w:p>
+        </w:tc>
+        <w:tc>
+          <w:tcPr>
+            <w:tcW w:type="dxa" w:w="2074"/>
+            <w:tcBorders>
+              <w:top w:val="single" w:color="E2E8F0" w:sz="4"/>
+              <w:left w:val="none" w:color="auto" w:sz="0"/>
+              <w:bottom w:val="single" w:color="E2E8F0" w:sz="4"/>
+              <w:right w:val="none" w:color="auto" w:sz="0"/>
+            </w:tcBorders>
+            <w:tcMar>
+              <w:top w:type="dxa" w:w="120"/>
+              <w:left w:type="dxa" w:w="160"/>
+              <w:bottom w:type="dxa" w:w="120"/>
+              <w:right w:type="dxa" w:w="160"/>
+            </w:tcMar>
+          </w:tcPr>
+          <w:p>
+            <w:pPr>
+              <w:spacing w:line="240" w:lineRule="auto"/>
+              <w:jc w:val="left"/>
+            </w:pPr>
+          </w:p>
+        </w:tc>
+      </w:tr>
+      <w:tr>
+        <w:trPr>
+          <w:cantSplit/>
+        </w:trPr>
+        <w:tc>
+          <w:tcPr>
+            <w:tcW w:type="dxa" w:w="2073"/>
+            <w:tcBorders>
+              <w:top w:val="single" w:color="E2E8F0" w:sz="4"/>
+              <w:left w:val="none" w:color="auto" w:sz="0"/>
+              <w:bottom w:val="single" w:color="E2E8F0" w:sz="4"/>
+              <w:right w:val="none" w:color="auto" w:sz="0"/>
+            </w:tcBorders>
+            <w:tcMar>
+              <w:top w:type="dxa" w:w="120"/>
+              <w:left w:type="dxa" w:w="160"/>
+              <w:bottom w:type="dxa" w:w="120"/>
+              <w:right w:type="dxa" w:w="160"/>
+            </w:tcMar>
+          </w:tcPr>
+          <w:p>
+            <w:pPr>
+              <w:spacing w:line="240" w:lineRule="auto"/>
+              <w:jc w:val="left"/>
+            </w:pPr>
+            <w:r>
+              <w:rPr>
+                <w:rFonts w:ascii="Arial" w:cs="Arial" w:eastAsia="Arial" w:hAnsi="Arial"/>
+                <w:b w:val="false"/>
+                <w:bCs w:val="false"/>
+                <w:sz w:val="20"/>
+                <w:szCs w:val="20"/>
+              </w:rPr>
+              <w:t xml:space="preserve">2</w:t>
+            </w:r>
+          </w:p>
+        </w:tc>
+        <w:tc>
+          <w:tcPr>
+            <w:tcW w:type="dxa" w:w="2420"/>
+            <w:tcBorders>
+              <w:top w:val="single" w:color="E2E8F0" w:sz="4"/>
+              <w:left w:val="none" w:color="auto" w:sz="0"/>
+              <w:bottom w:val="single" w:color="E2E8F0" w:sz="4"/>
+              <w:right w:val="none" w:color="auto" w:sz="0"/>
+            </w:tcBorders>
+            <w:tcMar>
+              <w:top w:type="dxa" w:w="120"/>
+              <w:left w:type="dxa" w:w="160"/>
+              <w:bottom w:type="dxa" w:w="120"/>
+              <w:right w:type="dxa" w:w="160"/>
+            </w:tcMar>
+          </w:tcPr>
+          <w:p>
+            <w:pPr>
+              <w:spacing w:line="240" w:lineRule="auto"/>
+              <w:jc w:val="left"/>
+            </w:pPr>
+            <w:r>
+              <w:rPr>
+                <w:rFonts w:ascii="Arial" w:cs="Arial" w:eastAsia="Arial" w:hAnsi="Arial"/>
+                <w:b w:val="false"/>
+                <w:bCs w:val="false"/>
+                <w:sz w:val="20"/>
+                <w:szCs w:val="20"/>
+              </w:rPr>
+              <w:t xml:space="preserve">Disagree</w:t>
+            </w:r>
+          </w:p>
+        </w:tc>
+        <w:tc>
+          <w:tcPr>
+            <w:tcW w:type="dxa" w:w="2073"/>
+            <w:tcBorders>
+              <w:top w:val="single" w:color="E2E8F0" w:sz="4"/>
+              <w:left w:val="none" w:color="auto" w:sz="0"/>
+              <w:bottom w:val="single" w:color="E2E8F0" w:sz="4"/>
+              <w:right w:val="none" w:color="auto" w:sz="0"/>
+            </w:tcBorders>
+            <w:tcMar>
+              <w:top w:type="dxa" w:w="120"/>
+              <w:left w:type="dxa" w:w="160"/>
+              <w:bottom w:type="dxa" w:w="120"/>
+              <w:right w:type="dxa" w:w="160"/>
+            </w:tcMar>
+          </w:tcPr>
+          <w:p>
+            <w:pPr>
+              <w:spacing w:line="240" w:lineRule="auto"/>
+              <w:jc w:val="left"/>
+            </w:pPr>
+          </w:p>
+        </w:tc>
+        <w:tc>
+          <w:tcPr>
+            <w:tcW w:type="dxa" w:w="2074"/>
+            <w:tcBorders>
+              <w:top w:val="single" w:color="E2E8F0" w:sz="4"/>
+              <w:left w:val="none" w:color="auto" w:sz="0"/>
+              <w:bottom w:val="single" w:color="E2E8F0" w:sz="4"/>
+              <w:right w:val="none" w:color="auto" w:sz="0"/>
+            </w:tcBorders>
+            <w:tcMar>
+              <w:top w:type="dxa" w:w="120"/>
+              <w:left w:type="dxa" w:w="160"/>
+              <w:bottom w:type="dxa" w:w="120"/>
+              <w:right w:type="dxa" w:w="160"/>
+            </w:tcMar>
+          </w:tcPr>
+          <w:p>
+            <w:pPr>
+              <w:spacing w:line="240" w:lineRule="auto"/>
+              <w:jc w:val="left"/>
+            </w:pPr>
+          </w:p>
+        </w:tc>
+      </w:tr>
+      <w:tr>
+        <w:trPr>
+          <w:cantSplit/>
+        </w:trPr>
+        <w:tc>
+          <w:tcPr>
+            <w:tcW w:type="dxa" w:w="2073"/>
+            <w:tcBorders>
+              <w:top w:val="single" w:color="E2E8F0" w:sz="4"/>
+              <w:left w:val="none" w:color="auto" w:sz="0"/>
+              <w:bottom w:val="single" w:color="E2E8F0" w:sz="4"/>
+              <w:right w:val="none" w:color="auto" w:sz="0"/>
+            </w:tcBorders>
+            <w:tcMar>
+              <w:top w:type="dxa" w:w="120"/>
+              <w:left w:type="dxa" w:w="160"/>
+              <w:bottom w:type="dxa" w:w="120"/>
+              <w:right w:type="dxa" w:w="160"/>
+            </w:tcMar>
+          </w:tcPr>
+          <w:p>
+            <w:pPr>
+              <w:spacing w:line="240" w:lineRule="auto"/>
+              <w:jc w:val="left"/>
+            </w:pPr>
+            <w:r>
+              <w:rPr>
+                <w:rFonts w:ascii="Arial" w:cs="Arial" w:eastAsia="Arial" w:hAnsi="Arial"/>
+                <w:b w:val="false"/>
+                <w:bCs w:val="false"/>
+                <w:sz w:val="20"/>
+                <w:szCs w:val="20"/>
+              </w:rPr>
+              <w:t xml:space="preserve">1</w:t>
+            </w:r>
+          </w:p>
+        </w:tc>
+        <w:tc>
+          <w:tcPr>
+            <w:tcW w:type="dxa" w:w="2420"/>
+            <w:tcBorders>
+              <w:top w:val="single" w:color="E2E8F0" w:sz="4"/>
+              <w:left w:val="none" w:color="auto" w:sz="0"/>
+              <w:bottom w:val="single" w:color="E2E8F0" w:sz="4"/>
+              <w:right w:val="none" w:color="auto" w:sz="0"/>
+            </w:tcBorders>
+            <w:tcMar>
+              <w:top w:type="dxa" w:w="120"/>
+              <w:left w:type="dxa" w:w="160"/>
+              <w:bottom w:type="dxa" w:w="120"/>
+              <w:right w:type="dxa" w:w="160"/>
+            </w:tcMar>
+          </w:tcPr>
+          <w:p>
+            <w:pPr>
+              <w:spacing w:line="240" w:lineRule="auto"/>
+              <w:jc w:val="left"/>
+            </w:pPr>
+            <w:r>
+              <w:rPr>
+                <w:rFonts w:ascii="Arial" w:cs="Arial" w:eastAsia="Arial" w:hAnsi="Arial"/>
+                <w:b w:val="false"/>
+                <w:bCs w:val="false"/>
+                <w:sz w:val="20"/>
+                <w:szCs w:val="20"/>
+              </w:rPr>
+              <w:t xml:space="preserve">Strongly Disagree</w:t>
+            </w:r>
+          </w:p>
+        </w:tc>
+        <w:tc>
+          <w:tcPr>
+            <w:tcW w:type="dxa" w:w="2073"/>
+            <w:tcBorders>
+              <w:top w:val="single" w:color="E2E8F0" w:sz="4"/>
+              <w:left w:val="none" w:color="auto" w:sz="0"/>
+              <w:bottom w:val="single" w:color="E2E8F0" w:sz="4"/>
+              <w:right w:val="none" w:color="auto" w:sz="0"/>
+            </w:tcBorders>
+            <w:tcMar>
+              <w:top w:type="dxa" w:w="120"/>
+              <w:left w:type="dxa" w:w="160"/>
+              <w:bottom w:type="dxa" w:w="120"/>
+              <w:right w:type="dxa" w:w="160"/>
+            </w:tcMar>
+          </w:tcPr>
+          <w:p>
+            <w:pPr>
+              <w:spacing w:line="240" w:lineRule="auto"/>
+              <w:jc w:val="left"/>
+            </w:pPr>
+          </w:p>
+        </w:tc>
+        <w:tc>
+          <w:tcPr>
+            <w:tcW w:type="dxa" w:w="2074"/>
+            <w:tcBorders>
+              <w:top w:val="single" w:color="E2E8F0" w:sz="4"/>
+              <w:left w:val="none" w:color="auto" w:sz="0"/>
+              <w:bottom w:val="single" w:color="E2E8F0" w:sz="4"/>
+              <w:right w:val="none" w:color="auto" w:sz="0"/>
+            </w:tcBorders>
+            <w:tcMar>
+              <w:top w:type="dxa" w:w="120"/>
+              <w:left w:type="dxa" w:w="160"/>
+              <w:bottom w:type="dxa" w:w="120"/>
+              <w:right w:type="dxa" w:w="160"/>
+            </w:tcMar>
+          </w:tcPr>
+          <w:p>
+            <w:pPr>
+              <w:spacing w:line="240" w:lineRule="auto"/>
+              <w:jc w:val="left"/>
+            </w:pPr>
+          </w:p>
+        </w:tc>
+      </w:tr>
+      <w:tr>
+        <w:trPr>
+          <w:cantSplit/>
+        </w:trPr>
+        <w:tc>
+          <w:tcPr>
+            <w:tcW w:type="dxa" w:w="2073"/>
+            <w:tcBorders>
+              <w:top w:val="single" w:color="E2E8F0" w:sz="4"/>
+              <w:left w:val="none" w:color="auto" w:sz="0"/>
+              <w:bottom w:val="single" w:color="1A202C" w:sz="12"/>
+              <w:right w:val="none" w:color="auto" w:sz="0"/>
+            </w:tcBorders>
+            <w:shd w:fill="F8FAFC"/>
+            <w:tcMar>
+              <w:top w:type="dxa" w:w="120"/>
+              <w:left w:type="dxa" w:w="160"/>
+              <w:bottom w:type="dxa" w:w="120"/>
+              <w:right w:type="dxa" w:w="160"/>
+            </w:tcMar>
+          </w:tcPr>
+          <w:p>
+            <w:pPr>
+              <w:spacing w:line="240" w:lineRule="auto"/>
+              <w:jc w:val="left"/>
+            </w:pPr>
+            <w:r>
+              <w:rPr>
+                <w:rFonts w:ascii="Arial" w:cs="Arial" w:eastAsia="Arial" w:hAnsi="Arial"/>
+                <w:b/>
+                <w:bCs/>
+                <w:sz w:val="20"/>
+                <w:szCs w:val="20"/>
+              </w:rPr>
+              <w:t xml:space="preserve">Total</w:t>
+            </w:r>
+          </w:p>
+        </w:tc>
+        <w:tc>
+          <w:tcPr>
+            <w:tcW w:type="dxa" w:w="2420"/>
+            <w:tcBorders>
+              <w:top w:val="single" w:color="E2E8F0" w:sz="4"/>
+              <w:left w:val="none" w:color="auto" w:sz="0"/>
+              <w:bottom w:val="single" w:color="1A202C" w:sz="12"/>
+              <w:right w:val="none" w:color="auto" w:sz="0"/>
+            </w:tcBorders>
+            <w:shd w:fill="F8FAFC"/>
+            <w:tcMar>
+              <w:top w:type="dxa" w:w="120"/>
+              <w:left w:type="dxa" w:w="160"/>
+              <w:bottom w:type="dxa" w:w="120"/>
+              <w:right w:type="dxa" w:w="160"/>
+            </w:tcMar>
+          </w:tcPr>
+          <w:p>
+            <w:pPr>
+              <w:spacing w:line="240" w:lineRule="auto"/>
+              <w:jc w:val="left"/>
+            </w:pPr>
+          </w:p>
+        </w:tc>
+        <w:tc>
+          <w:tcPr>
+            <w:tcW w:type="dxa" w:w="2073"/>
+            <w:tcBorders>
+              <w:top w:val="single" w:color="E2E8F0" w:sz="4"/>
+              <w:left w:val="none" w:color="auto" w:sz="0"/>
+              <w:bottom w:val="single" w:color="1A202C" w:sz="12"/>
+              <w:right w:val="none" w:color="auto" w:sz="0"/>
+            </w:tcBorders>
+            <w:shd w:fill="F8FAFC"/>
+            <w:tcMar>
+              <w:top w:type="dxa" w:w="120"/>
+              <w:left w:type="dxa" w:w="160"/>
+              <w:bottom w:type="dxa" w:w="120"/>
+              <w:right w:type="dxa" w:w="160"/>
+            </w:tcMar>
+          </w:tcPr>
+          <w:p>
+            <w:pPr>
+              <w:spacing w:line="240" w:lineRule="auto"/>
+              <w:jc w:val="left"/>
+            </w:pPr>
+            <w:r>
+              <w:rPr>
+                <w:rFonts w:ascii="Arial" w:cs="Arial" w:eastAsia="Arial" w:hAnsi="Arial"/>
+                <w:b/>
+                <w:bCs/>
+                <w:sz w:val="20"/>
+                <w:szCs w:val="20"/>
+              </w:rPr>
+              <w:t xml:space="preserve">N =</w:t>
+            </w:r>
+          </w:p>
+        </w:tc>
+        <w:tc>
+          <w:tcPr>
+            <w:tcW w:type="dxa" w:w="2074"/>
+            <w:tcBorders>
+              <w:top w:val="single" w:color="E2E8F0" w:sz="4"/>
+              <w:left w:val="none" w:color="auto" w:sz="0"/>
+              <w:bottom w:val="single" w:color="1A202C" w:sz="12"/>
+              <w:right w:val="none" w:color="auto" w:sz="0"/>
+            </w:tcBorders>
+            <w:shd w:fill="F8FAFC"/>
+            <w:tcMar>
+              <w:top w:type="dxa" w:w="120"/>
+              <w:left w:type="dxa" w:w="160"/>
+              <w:bottom w:type="dxa" w:w="120"/>
+              <w:right w:type="dxa" w:w="160"/>
+            </w:tcMar>
+          </w:tcPr>
+          <w:p>
+            <w:pPr>
+              <w:spacing w:line="240" w:lineRule="auto"/>
+              <w:jc w:val="left"/>
+            </w:pPr>
+            <w:r>
+              <w:rPr>
+                <w:rFonts w:ascii="Arial" w:cs="Arial" w:eastAsia="Arial" w:hAnsi="Arial"/>
+                <w:b/>
+                <w:bCs/>
+                <w:sz w:val="20"/>
+                <w:szCs w:val="20"/>
+              </w:rPr>
+              <w:t xml:space="preserve">Σ(f × w) =</w:t>
+            </w:r>
+          </w:p>
+        </w:tc>
+      </w:tr>
+    </w:tbl>
+    <w:p>
+      <w:pPr>
+        <w:spacing w:after="240" w:before="120" w:line="480" w:lineRule="auto"/>
+      </w:pPr>
+    </w:p>
+    <w:p>
+      <w:pPr>
         <w:spacing w:after="120" w:before="240" w:line="480" w:lineRule="auto"/>
         <w:jc w:val="left"/>
       </w:pPr>
@@ -42490,6 +43416,8 @@
         <w:gridCol w:w="100"/>
         <w:gridCol w:w="100"/>
         <w:gridCol w:w="100"/>
+        <w:gridCol w:w="100"/>
+        <w:gridCol w:w="100"/>
       </w:tblGrid>
       <w:tr>
         <w:trPr>
@@ -42498,7 +43426,7 @@
         </w:trPr>
         <w:tc>
           <w:tcPr>
-            <w:tcW w:type="dxa" w:w="3587"/>
+            <w:tcW w:type="dxa" w:w="2263"/>
             <w:tcBorders>
               <w:top w:val="single" w:color="1A202C" w:sz="12"/>
               <w:left w:val="none" w:color="auto" w:sz="0"/>
@@ -42532,7 +43460,7 @@
         </w:tc>
         <w:tc>
           <w:tcPr>
-            <w:tcW w:type="dxa" w:w="2527"/>
+            <w:tcW w:type="dxa" w:w="1594"/>
             <w:tcBorders>
               <w:top w:val="single" w:color="1A202C" w:sz="12"/>
               <w:left w:val="none" w:color="auto" w:sz="0"/>
@@ -42560,13 +43488,13 @@
                 <w:sz w:val="20"/>
                 <w:szCs w:val="20"/>
               </w:rPr>
-              <w:t xml:space="preserve">Composite mean</w:t>
-            </w:r>
-          </w:p>
-        </w:tc>
-        <w:tc>
-          <w:tcPr>
-            <w:tcW w:type="dxa" w:w="2526"/>
+              <w:t xml:space="preserve">n</w:t>
+            </w:r>
+          </w:p>
+        </w:tc>
+        <w:tc>
+          <w:tcPr>
+            <w:tcW w:type="dxa" w:w="1594"/>
             <w:tcBorders>
               <w:top w:val="single" w:color="1A202C" w:sz="12"/>
               <w:left w:val="none" w:color="auto" w:sz="0"/>
@@ -42594,7 +43522,75 @@
                 <w:sz w:val="20"/>
                 <w:szCs w:val="20"/>
               </w:rPr>
+              <w:t xml:space="preserve">Composite mean</w:t>
+            </w:r>
+          </w:p>
+        </w:tc>
+        <w:tc>
+          <w:tcPr>
+            <w:tcW w:type="dxa" w:w="1594"/>
+            <w:tcBorders>
+              <w:top w:val="single" w:color="1A202C" w:sz="12"/>
+              <w:left w:val="none" w:color="auto" w:sz="0"/>
+              <w:bottom w:val="single" w:color="1A202C" w:sz="12"/>
+              <w:right w:val="none" w:color="auto" w:sz="0"/>
+            </w:tcBorders>
+            <w:shd w:fill="F8FAFC"/>
+            <w:tcMar>
+              <w:top w:type="dxa" w:w="140"/>
+              <w:left w:type="dxa" w:w="160"/>
+              <w:bottom w:type="dxa" w:w="140"/>
+              <w:right w:type="dxa" w:w="160"/>
+            </w:tcMar>
+          </w:tcPr>
+          <w:p>
+            <w:pPr>
+              <w:spacing w:line="240" w:lineRule="auto"/>
+              <w:jc w:val="center"/>
+            </w:pPr>
+            <w:r>
+              <w:rPr>
+                <w:rFonts w:ascii="Arial" w:cs="Arial" w:eastAsia="Arial" w:hAnsi="Arial"/>
+                <w:b/>
+                <w:bCs/>
+                <w:sz w:val="20"/>
+                <w:szCs w:val="20"/>
+              </w:rPr>
               <w:t xml:space="preserve">Interpretation</w:t>
+            </w:r>
+          </w:p>
+        </w:tc>
+        <w:tc>
+          <w:tcPr>
+            <w:tcW w:type="dxa" w:w="1595"/>
+            <w:tcBorders>
+              <w:top w:val="single" w:color="1A202C" w:sz="12"/>
+              <w:left w:val="none" w:color="auto" w:sz="0"/>
+              <w:bottom w:val="single" w:color="1A202C" w:sz="12"/>
+              <w:right w:val="none" w:color="auto" w:sz="0"/>
+            </w:tcBorders>
+            <w:shd w:fill="F8FAFC"/>
+            <w:tcMar>
+              <w:top w:type="dxa" w:w="140"/>
+              <w:left w:type="dxa" w:w="160"/>
+              <w:bottom w:type="dxa" w:w="140"/>
+              <w:right w:type="dxa" w:w="160"/>
+            </w:tcMar>
+          </w:tcPr>
+          <w:p>
+            <w:pPr>
+              <w:spacing w:line="240" w:lineRule="auto"/>
+              <w:jc w:val="center"/>
+            </w:pPr>
+            <w:r>
+              <w:rPr>
+                <w:rFonts w:ascii="Arial" w:cs="Arial" w:eastAsia="Arial" w:hAnsi="Arial"/>
+                <w:b/>
+                <w:bCs/>
+                <w:sz w:val="20"/>
+                <w:szCs w:val="20"/>
+              </w:rPr>
+              <w:t xml:space="preserve">Rank</w:t>
             </w:r>
           </w:p>
         </w:tc>
@@ -42605,7 +43601,7 @@
         </w:trPr>
         <w:tc>
           <w:tcPr>
-            <w:tcW w:type="dxa" w:w="3587"/>
+            <w:tcW w:type="dxa" w:w="2263"/>
             <w:tcBorders>
               <w:top w:val="single" w:color="E2E8F0" w:sz="4"/>
               <w:left w:val="none" w:color="auto" w:sz="0"/>
@@ -42638,30 +43634,76 @@
         </w:tc>
         <w:tc>
           <w:tcPr>
-            <w:tcW w:type="dxa" w:w="2527"/>
-            <w:tcBorders>
-              <w:top w:val="single" w:color="E2E8F0" w:sz="4"/>
-              <w:left w:val="none" w:color="auto" w:sz="0"/>
-              <w:bottom w:val="single" w:color="E2E8F0" w:sz="4"/>
-              <w:right w:val="none" w:color="auto" w:sz="0"/>
-            </w:tcBorders>
-            <w:tcMar>
-              <w:top w:type="dxa" w:w="120"/>
-              <w:left w:type="dxa" w:w="160"/>
-              <w:bottom w:type="dxa" w:w="120"/>
-              <w:right w:type="dxa" w:w="160"/>
-            </w:tcMar>
-          </w:tcPr>
-          <w:p>
-            <w:pPr>
-              <w:spacing w:line="240" w:lineRule="auto"/>
-              <w:jc w:val="left"/>
-            </w:pPr>
-          </w:p>
-        </w:tc>
-        <w:tc>
-          <w:tcPr>
-            <w:tcW w:type="dxa" w:w="2526"/>
+            <w:tcW w:type="dxa" w:w="1594"/>
+            <w:tcBorders>
+              <w:top w:val="single" w:color="E2E8F0" w:sz="4"/>
+              <w:left w:val="none" w:color="auto" w:sz="0"/>
+              <w:bottom w:val="single" w:color="E2E8F0" w:sz="4"/>
+              <w:right w:val="none" w:color="auto" w:sz="0"/>
+            </w:tcBorders>
+            <w:tcMar>
+              <w:top w:type="dxa" w:w="120"/>
+              <w:left w:type="dxa" w:w="160"/>
+              <w:bottom w:type="dxa" w:w="120"/>
+              <w:right w:type="dxa" w:w="160"/>
+            </w:tcMar>
+          </w:tcPr>
+          <w:p>
+            <w:pPr>
+              <w:spacing w:line="240" w:lineRule="auto"/>
+              <w:jc w:val="left"/>
+            </w:pPr>
+          </w:p>
+        </w:tc>
+        <w:tc>
+          <w:tcPr>
+            <w:tcW w:type="dxa" w:w="1594"/>
+            <w:tcBorders>
+              <w:top w:val="single" w:color="E2E8F0" w:sz="4"/>
+              <w:left w:val="none" w:color="auto" w:sz="0"/>
+              <w:bottom w:val="single" w:color="E2E8F0" w:sz="4"/>
+              <w:right w:val="none" w:color="auto" w:sz="0"/>
+            </w:tcBorders>
+            <w:tcMar>
+              <w:top w:type="dxa" w:w="120"/>
+              <w:left w:type="dxa" w:w="160"/>
+              <w:bottom w:type="dxa" w:w="120"/>
+              <w:right w:type="dxa" w:w="160"/>
+            </w:tcMar>
+          </w:tcPr>
+          <w:p>
+            <w:pPr>
+              <w:spacing w:line="240" w:lineRule="auto"/>
+              <w:jc w:val="left"/>
+            </w:pPr>
+          </w:p>
+        </w:tc>
+        <w:tc>
+          <w:tcPr>
+            <w:tcW w:type="dxa" w:w="1594"/>
+            <w:tcBorders>
+              <w:top w:val="single" w:color="E2E8F0" w:sz="4"/>
+              <w:left w:val="none" w:color="auto" w:sz="0"/>
+              <w:bottom w:val="single" w:color="E2E8F0" w:sz="4"/>
+              <w:right w:val="none" w:color="auto" w:sz="0"/>
+            </w:tcBorders>
+            <w:tcMar>
+              <w:top w:type="dxa" w:w="120"/>
+              <w:left w:type="dxa" w:w="160"/>
+              <w:bottom w:type="dxa" w:w="120"/>
+              <w:right w:type="dxa" w:w="160"/>
+            </w:tcMar>
+          </w:tcPr>
+          <w:p>
+            <w:pPr>
+              <w:spacing w:line="240" w:lineRule="auto"/>
+              <w:jc w:val="left"/>
+            </w:pPr>
+          </w:p>
+        </w:tc>
+        <w:tc>
+          <w:tcPr>
+            <w:tcW w:type="dxa" w:w="1595"/>
             <w:tcBorders>
               <w:top w:val="single" w:color="E2E8F0" w:sz="4"/>
               <w:left w:val="none" w:color="auto" w:sz="0"/>
@@ -42689,7 +43731,7 @@
         </w:trPr>
         <w:tc>
           <w:tcPr>
-            <w:tcW w:type="dxa" w:w="3587"/>
+            <w:tcW w:type="dxa" w:w="2263"/>
             <w:tcBorders>
               <w:top w:val="single" w:color="E2E8F0" w:sz="4"/>
               <w:left w:val="none" w:color="auto" w:sz="0"/>
@@ -42722,30 +43764,76 @@
         </w:tc>
         <w:tc>
           <w:tcPr>
-            <w:tcW w:type="dxa" w:w="2527"/>
-            <w:tcBorders>
-              <w:top w:val="single" w:color="E2E8F0" w:sz="4"/>
-              <w:left w:val="none" w:color="auto" w:sz="0"/>
-              <w:bottom w:val="single" w:color="E2E8F0" w:sz="4"/>
-              <w:right w:val="none" w:color="auto" w:sz="0"/>
-            </w:tcBorders>
-            <w:tcMar>
-              <w:top w:type="dxa" w:w="120"/>
-              <w:left w:type="dxa" w:w="160"/>
-              <w:bottom w:type="dxa" w:w="120"/>
-              <w:right w:type="dxa" w:w="160"/>
-            </w:tcMar>
-          </w:tcPr>
-          <w:p>
-            <w:pPr>
-              <w:spacing w:line="240" w:lineRule="auto"/>
-              <w:jc w:val="left"/>
-            </w:pPr>
-          </w:p>
-        </w:tc>
-        <w:tc>
-          <w:tcPr>
-            <w:tcW w:type="dxa" w:w="2526"/>
+            <w:tcW w:type="dxa" w:w="1594"/>
+            <w:tcBorders>
+              <w:top w:val="single" w:color="E2E8F0" w:sz="4"/>
+              <w:left w:val="none" w:color="auto" w:sz="0"/>
+              <w:bottom w:val="single" w:color="E2E8F0" w:sz="4"/>
+              <w:right w:val="none" w:color="auto" w:sz="0"/>
+            </w:tcBorders>
+            <w:tcMar>
+              <w:top w:type="dxa" w:w="120"/>
+              <w:left w:type="dxa" w:w="160"/>
+              <w:bottom w:type="dxa" w:w="120"/>
+              <w:right w:type="dxa" w:w="160"/>
+            </w:tcMar>
+          </w:tcPr>
+          <w:p>
+            <w:pPr>
+              <w:spacing w:line="240" w:lineRule="auto"/>
+              <w:jc w:val="left"/>
+            </w:pPr>
+          </w:p>
+        </w:tc>
+        <w:tc>
+          <w:tcPr>
+            <w:tcW w:type="dxa" w:w="1594"/>
+            <w:tcBorders>
+              <w:top w:val="single" w:color="E2E8F0" w:sz="4"/>
+              <w:left w:val="none" w:color="auto" w:sz="0"/>
+              <w:bottom w:val="single" w:color="E2E8F0" w:sz="4"/>
+              <w:right w:val="none" w:color="auto" w:sz="0"/>
+            </w:tcBorders>
+            <w:tcMar>
+              <w:top w:type="dxa" w:w="120"/>
+              <w:left w:type="dxa" w:w="160"/>
+              <w:bottom w:type="dxa" w:w="120"/>
+              <w:right w:type="dxa" w:w="160"/>
+            </w:tcMar>
+          </w:tcPr>
+          <w:p>
+            <w:pPr>
+              <w:spacing w:line="240" w:lineRule="auto"/>
+              <w:jc w:val="left"/>
+            </w:pPr>
+          </w:p>
+        </w:tc>
+        <w:tc>
+          <w:tcPr>
+            <w:tcW w:type="dxa" w:w="1594"/>
+            <w:tcBorders>
+              <w:top w:val="single" w:color="E2E8F0" w:sz="4"/>
+              <w:left w:val="none" w:color="auto" w:sz="0"/>
+              <w:bottom w:val="single" w:color="E2E8F0" w:sz="4"/>
+              <w:right w:val="none" w:color="auto" w:sz="0"/>
+            </w:tcBorders>
+            <w:tcMar>
+              <w:top w:type="dxa" w:w="120"/>
+              <w:left w:type="dxa" w:w="160"/>
+              <w:bottom w:type="dxa" w:w="120"/>
+              <w:right w:type="dxa" w:w="160"/>
+            </w:tcMar>
+          </w:tcPr>
+          <w:p>
+            <w:pPr>
+              <w:spacing w:line="240" w:lineRule="auto"/>
+              <w:jc w:val="left"/>
+            </w:pPr>
+          </w:p>
+        </w:tc>
+        <w:tc>
+          <w:tcPr>
+            <w:tcW w:type="dxa" w:w="1595"/>
             <w:tcBorders>
               <w:top w:val="single" w:color="E2E8F0" w:sz="4"/>
               <w:left w:val="none" w:color="auto" w:sz="0"/>
@@ -42773,7 +43861,7 @@
         </w:trPr>
         <w:tc>
           <w:tcPr>
-            <w:tcW w:type="dxa" w:w="3587"/>
+            <w:tcW w:type="dxa" w:w="2263"/>
             <w:tcBorders>
               <w:top w:val="single" w:color="E2E8F0" w:sz="4"/>
               <w:left w:val="none" w:color="auto" w:sz="0"/>
@@ -42806,30 +43894,76 @@
         </w:tc>
         <w:tc>
           <w:tcPr>
-            <w:tcW w:type="dxa" w:w="2527"/>
-            <w:tcBorders>
-              <w:top w:val="single" w:color="E2E8F0" w:sz="4"/>
-              <w:left w:val="none" w:color="auto" w:sz="0"/>
-              <w:bottom w:val="single" w:color="E2E8F0" w:sz="4"/>
-              <w:right w:val="none" w:color="auto" w:sz="0"/>
-            </w:tcBorders>
-            <w:tcMar>
-              <w:top w:type="dxa" w:w="120"/>
-              <w:left w:type="dxa" w:w="160"/>
-              <w:bottom w:type="dxa" w:w="120"/>
-              <w:right w:type="dxa" w:w="160"/>
-            </w:tcMar>
-          </w:tcPr>
-          <w:p>
-            <w:pPr>
-              <w:spacing w:line="240" w:lineRule="auto"/>
-              <w:jc w:val="left"/>
-            </w:pPr>
-          </w:p>
-        </w:tc>
-        <w:tc>
-          <w:tcPr>
-            <w:tcW w:type="dxa" w:w="2526"/>
+            <w:tcW w:type="dxa" w:w="1594"/>
+            <w:tcBorders>
+              <w:top w:val="single" w:color="E2E8F0" w:sz="4"/>
+              <w:left w:val="none" w:color="auto" w:sz="0"/>
+              <w:bottom w:val="single" w:color="E2E8F0" w:sz="4"/>
+              <w:right w:val="none" w:color="auto" w:sz="0"/>
+            </w:tcBorders>
+            <w:tcMar>
+              <w:top w:type="dxa" w:w="120"/>
+              <w:left w:type="dxa" w:w="160"/>
+              <w:bottom w:type="dxa" w:w="120"/>
+              <w:right w:type="dxa" w:w="160"/>
+            </w:tcMar>
+          </w:tcPr>
+          <w:p>
+            <w:pPr>
+              <w:spacing w:line="240" w:lineRule="auto"/>
+              <w:jc w:val="left"/>
+            </w:pPr>
+          </w:p>
+        </w:tc>
+        <w:tc>
+          <w:tcPr>
+            <w:tcW w:type="dxa" w:w="1594"/>
+            <w:tcBorders>
+              <w:top w:val="single" w:color="E2E8F0" w:sz="4"/>
+              <w:left w:val="none" w:color="auto" w:sz="0"/>
+              <w:bottom w:val="single" w:color="E2E8F0" w:sz="4"/>
+              <w:right w:val="none" w:color="auto" w:sz="0"/>
+            </w:tcBorders>
+            <w:tcMar>
+              <w:top w:type="dxa" w:w="120"/>
+              <w:left w:type="dxa" w:w="160"/>
+              <w:bottom w:type="dxa" w:w="120"/>
+              <w:right w:type="dxa" w:w="160"/>
+            </w:tcMar>
+          </w:tcPr>
+          <w:p>
+            <w:pPr>
+              <w:spacing w:line="240" w:lineRule="auto"/>
+              <w:jc w:val="left"/>
+            </w:pPr>
+          </w:p>
+        </w:tc>
+        <w:tc>
+          <w:tcPr>
+            <w:tcW w:type="dxa" w:w="1594"/>
+            <w:tcBorders>
+              <w:top w:val="single" w:color="E2E8F0" w:sz="4"/>
+              <w:left w:val="none" w:color="auto" w:sz="0"/>
+              <w:bottom w:val="single" w:color="E2E8F0" w:sz="4"/>
+              <w:right w:val="none" w:color="auto" w:sz="0"/>
+            </w:tcBorders>
+            <w:tcMar>
+              <w:top w:type="dxa" w:w="120"/>
+              <w:left w:type="dxa" w:w="160"/>
+              <w:bottom w:type="dxa" w:w="120"/>
+              <w:right w:type="dxa" w:w="160"/>
+            </w:tcMar>
+          </w:tcPr>
+          <w:p>
+            <w:pPr>
+              <w:spacing w:line="240" w:lineRule="auto"/>
+              <w:jc w:val="left"/>
+            </w:pPr>
+          </w:p>
+        </w:tc>
+        <w:tc>
+          <w:tcPr>
+            <w:tcW w:type="dxa" w:w="1595"/>
             <w:tcBorders>
               <w:top w:val="single" w:color="E2E8F0" w:sz="4"/>
               <w:left w:val="none" w:color="auto" w:sz="0"/>
@@ -42857,7 +43991,7 @@
         </w:trPr>
         <w:tc>
           <w:tcPr>
-            <w:tcW w:type="dxa" w:w="3587"/>
+            <w:tcW w:type="dxa" w:w="2263"/>
             <w:tcBorders>
               <w:top w:val="single" w:color="E2E8F0" w:sz="4"/>
               <w:left w:val="none" w:color="auto" w:sz="0"/>
@@ -42890,30 +44024,76 @@
         </w:tc>
         <w:tc>
           <w:tcPr>
-            <w:tcW w:type="dxa" w:w="2527"/>
-            <w:tcBorders>
-              <w:top w:val="single" w:color="E2E8F0" w:sz="4"/>
-              <w:left w:val="none" w:color="auto" w:sz="0"/>
-              <w:bottom w:val="single" w:color="E2E8F0" w:sz="4"/>
-              <w:right w:val="none" w:color="auto" w:sz="0"/>
-            </w:tcBorders>
-            <w:tcMar>
-              <w:top w:type="dxa" w:w="120"/>
-              <w:left w:type="dxa" w:w="160"/>
-              <w:bottom w:type="dxa" w:w="120"/>
-              <w:right w:type="dxa" w:w="160"/>
-            </w:tcMar>
-          </w:tcPr>
-          <w:p>
-            <w:pPr>
-              <w:spacing w:line="240" w:lineRule="auto"/>
-              <w:jc w:val="left"/>
-            </w:pPr>
-          </w:p>
-        </w:tc>
-        <w:tc>
-          <w:tcPr>
-            <w:tcW w:type="dxa" w:w="2526"/>
+            <w:tcW w:type="dxa" w:w="1594"/>
+            <w:tcBorders>
+              <w:top w:val="single" w:color="E2E8F0" w:sz="4"/>
+              <w:left w:val="none" w:color="auto" w:sz="0"/>
+              <w:bottom w:val="single" w:color="E2E8F0" w:sz="4"/>
+              <w:right w:val="none" w:color="auto" w:sz="0"/>
+            </w:tcBorders>
+            <w:tcMar>
+              <w:top w:type="dxa" w:w="120"/>
+              <w:left w:type="dxa" w:w="160"/>
+              <w:bottom w:type="dxa" w:w="120"/>
+              <w:right w:type="dxa" w:w="160"/>
+            </w:tcMar>
+          </w:tcPr>
+          <w:p>
+            <w:pPr>
+              <w:spacing w:line="240" w:lineRule="auto"/>
+              <w:jc w:val="left"/>
+            </w:pPr>
+          </w:p>
+        </w:tc>
+        <w:tc>
+          <w:tcPr>
+            <w:tcW w:type="dxa" w:w="1594"/>
+            <w:tcBorders>
+              <w:top w:val="single" w:color="E2E8F0" w:sz="4"/>
+              <w:left w:val="none" w:color="auto" w:sz="0"/>
+              <w:bottom w:val="single" w:color="E2E8F0" w:sz="4"/>
+              <w:right w:val="none" w:color="auto" w:sz="0"/>
+            </w:tcBorders>
+            <w:tcMar>
+              <w:top w:type="dxa" w:w="120"/>
+              <w:left w:type="dxa" w:w="160"/>
+              <w:bottom w:type="dxa" w:w="120"/>
+              <w:right w:type="dxa" w:w="160"/>
+            </w:tcMar>
+          </w:tcPr>
+          <w:p>
+            <w:pPr>
+              <w:spacing w:line="240" w:lineRule="auto"/>
+              <w:jc w:val="left"/>
+            </w:pPr>
+          </w:p>
+        </w:tc>
+        <w:tc>
+          <w:tcPr>
+            <w:tcW w:type="dxa" w:w="1594"/>
+            <w:tcBorders>
+              <w:top w:val="single" w:color="E2E8F0" w:sz="4"/>
+              <w:left w:val="none" w:color="auto" w:sz="0"/>
+              <w:bottom w:val="single" w:color="E2E8F0" w:sz="4"/>
+              <w:right w:val="none" w:color="auto" w:sz="0"/>
+            </w:tcBorders>
+            <w:tcMar>
+              <w:top w:type="dxa" w:w="120"/>
+              <w:left w:type="dxa" w:w="160"/>
+              <w:bottom w:type="dxa" w:w="120"/>
+              <w:right w:type="dxa" w:w="160"/>
+            </w:tcMar>
+          </w:tcPr>
+          <w:p>
+            <w:pPr>
+              <w:spacing w:line="240" w:lineRule="auto"/>
+              <w:jc w:val="left"/>
+            </w:pPr>
+          </w:p>
+        </w:tc>
+        <w:tc>
+          <w:tcPr>
+            <w:tcW w:type="dxa" w:w="1595"/>
             <w:tcBorders>
               <w:top w:val="single" w:color="E2E8F0" w:sz="4"/>
               <w:left w:val="none" w:color="auto" w:sz="0"/>
@@ -42941,7 +44121,7 @@
         </w:trPr>
         <w:tc>
           <w:tcPr>
-            <w:tcW w:type="dxa" w:w="3587"/>
+            <w:tcW w:type="dxa" w:w="2263"/>
             <w:tcBorders>
               <w:top w:val="single" w:color="E2E8F0" w:sz="4"/>
               <w:left w:val="none" w:color="auto" w:sz="0"/>
@@ -42974,30 +44154,76 @@
         </w:tc>
         <w:tc>
           <w:tcPr>
-            <w:tcW w:type="dxa" w:w="2527"/>
-            <w:tcBorders>
-              <w:top w:val="single" w:color="E2E8F0" w:sz="4"/>
-              <w:left w:val="none" w:color="auto" w:sz="0"/>
-              <w:bottom w:val="single" w:color="E2E8F0" w:sz="4"/>
-              <w:right w:val="none" w:color="auto" w:sz="0"/>
-            </w:tcBorders>
-            <w:tcMar>
-              <w:top w:type="dxa" w:w="120"/>
-              <w:left w:type="dxa" w:w="160"/>
-              <w:bottom w:type="dxa" w:w="120"/>
-              <w:right w:type="dxa" w:w="160"/>
-            </w:tcMar>
-          </w:tcPr>
-          <w:p>
-            <w:pPr>
-              <w:spacing w:line="240" w:lineRule="auto"/>
-              <w:jc w:val="left"/>
-            </w:pPr>
-          </w:p>
-        </w:tc>
-        <w:tc>
-          <w:tcPr>
-            <w:tcW w:type="dxa" w:w="2526"/>
+            <w:tcW w:type="dxa" w:w="1594"/>
+            <w:tcBorders>
+              <w:top w:val="single" w:color="E2E8F0" w:sz="4"/>
+              <w:left w:val="none" w:color="auto" w:sz="0"/>
+              <w:bottom w:val="single" w:color="E2E8F0" w:sz="4"/>
+              <w:right w:val="none" w:color="auto" w:sz="0"/>
+            </w:tcBorders>
+            <w:tcMar>
+              <w:top w:type="dxa" w:w="120"/>
+              <w:left w:type="dxa" w:w="160"/>
+              <w:bottom w:type="dxa" w:w="120"/>
+              <w:right w:type="dxa" w:w="160"/>
+            </w:tcMar>
+          </w:tcPr>
+          <w:p>
+            <w:pPr>
+              <w:spacing w:line="240" w:lineRule="auto"/>
+              <w:jc w:val="left"/>
+            </w:pPr>
+          </w:p>
+        </w:tc>
+        <w:tc>
+          <w:tcPr>
+            <w:tcW w:type="dxa" w:w="1594"/>
+            <w:tcBorders>
+              <w:top w:val="single" w:color="E2E8F0" w:sz="4"/>
+              <w:left w:val="none" w:color="auto" w:sz="0"/>
+              <w:bottom w:val="single" w:color="E2E8F0" w:sz="4"/>
+              <w:right w:val="none" w:color="auto" w:sz="0"/>
+            </w:tcBorders>
+            <w:tcMar>
+              <w:top w:type="dxa" w:w="120"/>
+              <w:left w:type="dxa" w:w="160"/>
+              <w:bottom w:type="dxa" w:w="120"/>
+              <w:right w:type="dxa" w:w="160"/>
+            </w:tcMar>
+          </w:tcPr>
+          <w:p>
+            <w:pPr>
+              <w:spacing w:line="240" w:lineRule="auto"/>
+              <w:jc w:val="left"/>
+            </w:pPr>
+          </w:p>
+        </w:tc>
+        <w:tc>
+          <w:tcPr>
+            <w:tcW w:type="dxa" w:w="1594"/>
+            <w:tcBorders>
+              <w:top w:val="single" w:color="E2E8F0" w:sz="4"/>
+              <w:left w:val="none" w:color="auto" w:sz="0"/>
+              <w:bottom w:val="single" w:color="E2E8F0" w:sz="4"/>
+              <w:right w:val="none" w:color="auto" w:sz="0"/>
+            </w:tcBorders>
+            <w:tcMar>
+              <w:top w:type="dxa" w:w="120"/>
+              <w:left w:type="dxa" w:w="160"/>
+              <w:bottom w:type="dxa" w:w="120"/>
+              <w:right w:type="dxa" w:w="160"/>
+            </w:tcMar>
+          </w:tcPr>
+          <w:p>
+            <w:pPr>
+              <w:spacing w:line="240" w:lineRule="auto"/>
+              <w:jc w:val="left"/>
+            </w:pPr>
+          </w:p>
+        </w:tc>
+        <w:tc>
+          <w:tcPr>
+            <w:tcW w:type="dxa" w:w="1595"/>
             <w:tcBorders>
               <w:top w:val="single" w:color="E2E8F0" w:sz="4"/>
               <w:left w:val="none" w:color="auto" w:sz="0"/>
@@ -43025,7 +44251,7 @@
         </w:trPr>
         <w:tc>
           <w:tcPr>
-            <w:tcW w:type="dxa" w:w="3587"/>
+            <w:tcW w:type="dxa" w:w="2263"/>
             <w:tcBorders>
               <w:top w:val="single" w:color="E2E8F0" w:sz="4"/>
               <w:left w:val="none" w:color="auto" w:sz="0"/>
@@ -43058,30 +44284,76 @@
         </w:tc>
         <w:tc>
           <w:tcPr>
-            <w:tcW w:type="dxa" w:w="2527"/>
-            <w:tcBorders>
-              <w:top w:val="single" w:color="E2E8F0" w:sz="4"/>
-              <w:left w:val="none" w:color="auto" w:sz="0"/>
-              <w:bottom w:val="single" w:color="E2E8F0" w:sz="4"/>
-              <w:right w:val="none" w:color="auto" w:sz="0"/>
-            </w:tcBorders>
-            <w:tcMar>
-              <w:top w:type="dxa" w:w="120"/>
-              <w:left w:type="dxa" w:w="160"/>
-              <w:bottom w:type="dxa" w:w="120"/>
-              <w:right w:type="dxa" w:w="160"/>
-            </w:tcMar>
-          </w:tcPr>
-          <w:p>
-            <w:pPr>
-              <w:spacing w:line="240" w:lineRule="auto"/>
-              <w:jc w:val="left"/>
-            </w:pPr>
-          </w:p>
-        </w:tc>
-        <w:tc>
-          <w:tcPr>
-            <w:tcW w:type="dxa" w:w="2526"/>
+            <w:tcW w:type="dxa" w:w="1594"/>
+            <w:tcBorders>
+              <w:top w:val="single" w:color="E2E8F0" w:sz="4"/>
+              <w:left w:val="none" w:color="auto" w:sz="0"/>
+              <w:bottom w:val="single" w:color="E2E8F0" w:sz="4"/>
+              <w:right w:val="none" w:color="auto" w:sz="0"/>
+            </w:tcBorders>
+            <w:tcMar>
+              <w:top w:type="dxa" w:w="120"/>
+              <w:left w:type="dxa" w:w="160"/>
+              <w:bottom w:type="dxa" w:w="120"/>
+              <w:right w:type="dxa" w:w="160"/>
+            </w:tcMar>
+          </w:tcPr>
+          <w:p>
+            <w:pPr>
+              <w:spacing w:line="240" w:lineRule="auto"/>
+              <w:jc w:val="left"/>
+            </w:pPr>
+          </w:p>
+        </w:tc>
+        <w:tc>
+          <w:tcPr>
+            <w:tcW w:type="dxa" w:w="1594"/>
+            <w:tcBorders>
+              <w:top w:val="single" w:color="E2E8F0" w:sz="4"/>
+              <w:left w:val="none" w:color="auto" w:sz="0"/>
+              <w:bottom w:val="single" w:color="E2E8F0" w:sz="4"/>
+              <w:right w:val="none" w:color="auto" w:sz="0"/>
+            </w:tcBorders>
+            <w:tcMar>
+              <w:top w:type="dxa" w:w="120"/>
+              <w:left w:type="dxa" w:w="160"/>
+              <w:bottom w:type="dxa" w:w="120"/>
+              <w:right w:type="dxa" w:w="160"/>
+            </w:tcMar>
+          </w:tcPr>
+          <w:p>
+            <w:pPr>
+              <w:spacing w:line="240" w:lineRule="auto"/>
+              <w:jc w:val="left"/>
+            </w:pPr>
+          </w:p>
+        </w:tc>
+        <w:tc>
+          <w:tcPr>
+            <w:tcW w:type="dxa" w:w="1594"/>
+            <w:tcBorders>
+              <w:top w:val="single" w:color="E2E8F0" w:sz="4"/>
+              <w:left w:val="none" w:color="auto" w:sz="0"/>
+              <w:bottom w:val="single" w:color="E2E8F0" w:sz="4"/>
+              <w:right w:val="none" w:color="auto" w:sz="0"/>
+            </w:tcBorders>
+            <w:tcMar>
+              <w:top w:type="dxa" w:w="120"/>
+              <w:left w:type="dxa" w:w="160"/>
+              <w:bottom w:type="dxa" w:w="120"/>
+              <w:right w:type="dxa" w:w="160"/>
+            </w:tcMar>
+          </w:tcPr>
+          <w:p>
+            <w:pPr>
+              <w:spacing w:line="240" w:lineRule="auto"/>
+              <w:jc w:val="left"/>
+            </w:pPr>
+          </w:p>
+        </w:tc>
+        <w:tc>
+          <w:tcPr>
+            <w:tcW w:type="dxa" w:w="1595"/>
             <w:tcBorders>
               <w:top w:val="single" w:color="E2E8F0" w:sz="4"/>
               <w:left w:val="none" w:color="auto" w:sz="0"/>
@@ -43109,7 +44381,7 @@
         </w:trPr>
         <w:tc>
           <w:tcPr>
-            <w:tcW w:type="dxa" w:w="3587"/>
+            <w:tcW w:type="dxa" w:w="2263"/>
             <w:tcBorders>
               <w:top w:val="single" w:color="E2E8F0" w:sz="4"/>
               <w:left w:val="none" w:color="auto" w:sz="0"/>
@@ -43142,30 +44414,76 @@
         </w:tc>
         <w:tc>
           <w:tcPr>
-            <w:tcW w:type="dxa" w:w="2527"/>
-            <w:tcBorders>
-              <w:top w:val="single" w:color="E2E8F0" w:sz="4"/>
-              <w:left w:val="none" w:color="auto" w:sz="0"/>
-              <w:bottom w:val="single" w:color="E2E8F0" w:sz="4"/>
-              <w:right w:val="none" w:color="auto" w:sz="0"/>
-            </w:tcBorders>
-            <w:tcMar>
-              <w:top w:type="dxa" w:w="120"/>
-              <w:left w:type="dxa" w:w="160"/>
-              <w:bottom w:type="dxa" w:w="120"/>
-              <w:right w:type="dxa" w:w="160"/>
-            </w:tcMar>
-          </w:tcPr>
-          <w:p>
-            <w:pPr>
-              <w:spacing w:line="240" w:lineRule="auto"/>
-              <w:jc w:val="left"/>
-            </w:pPr>
-          </w:p>
-        </w:tc>
-        <w:tc>
-          <w:tcPr>
-            <w:tcW w:type="dxa" w:w="2526"/>
+            <w:tcW w:type="dxa" w:w="1594"/>
+            <w:tcBorders>
+              <w:top w:val="single" w:color="E2E8F0" w:sz="4"/>
+              <w:left w:val="none" w:color="auto" w:sz="0"/>
+              <w:bottom w:val="single" w:color="E2E8F0" w:sz="4"/>
+              <w:right w:val="none" w:color="auto" w:sz="0"/>
+            </w:tcBorders>
+            <w:tcMar>
+              <w:top w:type="dxa" w:w="120"/>
+              <w:left w:type="dxa" w:w="160"/>
+              <w:bottom w:type="dxa" w:w="120"/>
+              <w:right w:type="dxa" w:w="160"/>
+            </w:tcMar>
+          </w:tcPr>
+          <w:p>
+            <w:pPr>
+              <w:spacing w:line="240" w:lineRule="auto"/>
+              <w:jc w:val="left"/>
+            </w:pPr>
+          </w:p>
+        </w:tc>
+        <w:tc>
+          <w:tcPr>
+            <w:tcW w:type="dxa" w:w="1594"/>
+            <w:tcBorders>
+              <w:top w:val="single" w:color="E2E8F0" w:sz="4"/>
+              <w:left w:val="none" w:color="auto" w:sz="0"/>
+              <w:bottom w:val="single" w:color="E2E8F0" w:sz="4"/>
+              <w:right w:val="none" w:color="auto" w:sz="0"/>
+            </w:tcBorders>
+            <w:tcMar>
+              <w:top w:type="dxa" w:w="120"/>
+              <w:left w:type="dxa" w:w="160"/>
+              <w:bottom w:type="dxa" w:w="120"/>
+              <w:right w:type="dxa" w:w="160"/>
+            </w:tcMar>
+          </w:tcPr>
+          <w:p>
+            <w:pPr>
+              <w:spacing w:line="240" w:lineRule="auto"/>
+              <w:jc w:val="left"/>
+            </w:pPr>
+          </w:p>
+        </w:tc>
+        <w:tc>
+          <w:tcPr>
+            <w:tcW w:type="dxa" w:w="1594"/>
+            <w:tcBorders>
+              <w:top w:val="single" w:color="E2E8F0" w:sz="4"/>
+              <w:left w:val="none" w:color="auto" w:sz="0"/>
+              <w:bottom w:val="single" w:color="E2E8F0" w:sz="4"/>
+              <w:right w:val="none" w:color="auto" w:sz="0"/>
+            </w:tcBorders>
+            <w:tcMar>
+              <w:top w:type="dxa" w:w="120"/>
+              <w:left w:type="dxa" w:w="160"/>
+              <w:bottom w:type="dxa" w:w="120"/>
+              <w:right w:type="dxa" w:w="160"/>
+            </w:tcMar>
+          </w:tcPr>
+          <w:p>
+            <w:pPr>
+              <w:spacing w:line="240" w:lineRule="auto"/>
+              <w:jc w:val="left"/>
+            </w:pPr>
+          </w:p>
+        </w:tc>
+        <w:tc>
+          <w:tcPr>
+            <w:tcW w:type="dxa" w:w="1595"/>
             <w:tcBorders>
               <w:top w:val="single" w:color="E2E8F0" w:sz="4"/>
               <w:left w:val="none" w:color="auto" w:sz="0"/>
@@ -43193,7 +44511,7 @@
         </w:trPr>
         <w:tc>
           <w:tcPr>
-            <w:tcW w:type="dxa" w:w="3587"/>
+            <w:tcW w:type="dxa" w:w="2263"/>
             <w:tcBorders>
               <w:top w:val="single" w:color="E2E8F0" w:sz="4"/>
               <w:left w:val="none" w:color="auto" w:sz="0"/>
@@ -43226,30 +44544,76 @@
         </w:tc>
         <w:tc>
           <w:tcPr>
-            <w:tcW w:type="dxa" w:w="2527"/>
-            <w:tcBorders>
-              <w:top w:val="single" w:color="E2E8F0" w:sz="4"/>
-              <w:left w:val="none" w:color="auto" w:sz="0"/>
-              <w:bottom w:val="single" w:color="E2E8F0" w:sz="4"/>
-              <w:right w:val="none" w:color="auto" w:sz="0"/>
-            </w:tcBorders>
-            <w:tcMar>
-              <w:top w:type="dxa" w:w="120"/>
-              <w:left w:type="dxa" w:w="160"/>
-              <w:bottom w:type="dxa" w:w="120"/>
-              <w:right w:type="dxa" w:w="160"/>
-            </w:tcMar>
-          </w:tcPr>
-          <w:p>
-            <w:pPr>
-              <w:spacing w:line="240" w:lineRule="auto"/>
-              <w:jc w:val="left"/>
-            </w:pPr>
-          </w:p>
-        </w:tc>
-        <w:tc>
-          <w:tcPr>
-            <w:tcW w:type="dxa" w:w="2526"/>
+            <w:tcW w:type="dxa" w:w="1594"/>
+            <w:tcBorders>
+              <w:top w:val="single" w:color="E2E8F0" w:sz="4"/>
+              <w:left w:val="none" w:color="auto" w:sz="0"/>
+              <w:bottom w:val="single" w:color="E2E8F0" w:sz="4"/>
+              <w:right w:val="none" w:color="auto" w:sz="0"/>
+            </w:tcBorders>
+            <w:tcMar>
+              <w:top w:type="dxa" w:w="120"/>
+              <w:left w:type="dxa" w:w="160"/>
+              <w:bottom w:type="dxa" w:w="120"/>
+              <w:right w:type="dxa" w:w="160"/>
+            </w:tcMar>
+          </w:tcPr>
+          <w:p>
+            <w:pPr>
+              <w:spacing w:line="240" w:lineRule="auto"/>
+              <w:jc w:val="left"/>
+            </w:pPr>
+          </w:p>
+        </w:tc>
+        <w:tc>
+          <w:tcPr>
+            <w:tcW w:type="dxa" w:w="1594"/>
+            <w:tcBorders>
+              <w:top w:val="single" w:color="E2E8F0" w:sz="4"/>
+              <w:left w:val="none" w:color="auto" w:sz="0"/>
+              <w:bottom w:val="single" w:color="E2E8F0" w:sz="4"/>
+              <w:right w:val="none" w:color="auto" w:sz="0"/>
+            </w:tcBorders>
+            <w:tcMar>
+              <w:top w:type="dxa" w:w="120"/>
+              <w:left w:type="dxa" w:w="160"/>
+              <w:bottom w:type="dxa" w:w="120"/>
+              <w:right w:type="dxa" w:w="160"/>
+            </w:tcMar>
+          </w:tcPr>
+          <w:p>
+            <w:pPr>
+              <w:spacing w:line="240" w:lineRule="auto"/>
+              <w:jc w:val="left"/>
+            </w:pPr>
+          </w:p>
+        </w:tc>
+        <w:tc>
+          <w:tcPr>
+            <w:tcW w:type="dxa" w:w="1594"/>
+            <w:tcBorders>
+              <w:top w:val="single" w:color="E2E8F0" w:sz="4"/>
+              <w:left w:val="none" w:color="auto" w:sz="0"/>
+              <w:bottom w:val="single" w:color="E2E8F0" w:sz="4"/>
+              <w:right w:val="none" w:color="auto" w:sz="0"/>
+            </w:tcBorders>
+            <w:tcMar>
+              <w:top w:type="dxa" w:w="120"/>
+              <w:left w:type="dxa" w:w="160"/>
+              <w:bottom w:type="dxa" w:w="120"/>
+              <w:right w:type="dxa" w:w="160"/>
+            </w:tcMar>
+          </w:tcPr>
+          <w:p>
+            <w:pPr>
+              <w:spacing w:line="240" w:lineRule="auto"/>
+              <w:jc w:val="left"/>
+            </w:pPr>
+          </w:p>
+        </w:tc>
+        <w:tc>
+          <w:tcPr>
+            <w:tcW w:type="dxa" w:w="1595"/>
             <w:tcBorders>
               <w:top w:val="single" w:color="E2E8F0" w:sz="4"/>
               <w:left w:val="none" w:color="auto" w:sz="0"/>
@@ -43277,7 +44641,7 @@
         </w:trPr>
         <w:tc>
           <w:tcPr>
-            <w:tcW w:type="dxa" w:w="3587"/>
+            <w:tcW w:type="dxa" w:w="2263"/>
             <w:tcBorders>
               <w:top w:val="single" w:color="E2E8F0" w:sz="4"/>
               <w:left w:val="none" w:color="auto" w:sz="0"/>
@@ -43311,7 +44675,7 @@
         </w:tc>
         <w:tc>
           <w:tcPr>
-            <w:tcW w:type="dxa" w:w="2527"/>
+            <w:tcW w:type="dxa" w:w="1594"/>
             <w:tcBorders>
               <w:top w:val="single" w:color="E2E8F0" w:sz="4"/>
               <w:left w:val="none" w:color="auto" w:sz="0"/>
@@ -43335,7 +44699,55 @@
         </w:tc>
         <w:tc>
           <w:tcPr>
-            <w:tcW w:type="dxa" w:w="2526"/>
+            <w:tcW w:type="dxa" w:w="1594"/>
+            <w:tcBorders>
+              <w:top w:val="single" w:color="E2E8F0" w:sz="4"/>
+              <w:left w:val="none" w:color="auto" w:sz="0"/>
+              <w:bottom w:val="single" w:color="1A202C" w:sz="12"/>
+              <w:right w:val="none" w:color="auto" w:sz="0"/>
+            </w:tcBorders>
+            <w:shd w:fill="F8FAFC"/>
+            <w:tcMar>
+              <w:top w:type="dxa" w:w="120"/>
+              <w:left w:type="dxa" w:w="160"/>
+              <w:bottom w:type="dxa" w:w="120"/>
+              <w:right w:type="dxa" w:w="160"/>
+            </w:tcMar>
+          </w:tcPr>
+          <w:p>
+            <w:pPr>
+              <w:spacing w:line="240" w:lineRule="auto"/>
+              <w:jc w:val="left"/>
+            </w:pPr>
+          </w:p>
+        </w:tc>
+        <w:tc>
+          <w:tcPr>
+            <w:tcW w:type="dxa" w:w="1594"/>
+            <w:tcBorders>
+              <w:top w:val="single" w:color="E2E8F0" w:sz="4"/>
+              <w:left w:val="none" w:color="auto" w:sz="0"/>
+              <w:bottom w:val="single" w:color="1A202C" w:sz="12"/>
+              <w:right w:val="none" w:color="auto" w:sz="0"/>
+            </w:tcBorders>
+            <w:shd w:fill="F8FAFC"/>
+            <w:tcMar>
+              <w:top w:type="dxa" w:w="120"/>
+              <w:left w:type="dxa" w:w="160"/>
+              <w:bottom w:type="dxa" w:w="120"/>
+              <w:right w:type="dxa" w:w="160"/>
+            </w:tcMar>
+          </w:tcPr>
+          <w:p>
+            <w:pPr>
+              <w:spacing w:line="240" w:lineRule="auto"/>
+              <w:jc w:val="left"/>
+            </w:pPr>
+          </w:p>
+        </w:tc>
+        <w:tc>
+          <w:tcPr>
+            <w:tcW w:type="dxa" w:w="1595"/>
             <w:tcBorders>
               <w:top w:val="single" w:color="E2E8F0" w:sz="4"/>
               <w:left w:val="none" w:color="auto" w:sz="0"/>

</xml_diff>

<commit_message>
Devices named: Table 11 on a Dell XPS 15 and an iPhone 15 (mobile data); the owner's laptop an Acer Nitro V 15
Sean, 13 Oct. Table 11's headings, 4.3.5's first sentence and Table 24's
owner row name them; FIXES H9 gives Chapter 3 the sentence that says which
devices were actually used, since its Table 3 planned an Android phone.

Co-Authored-By: Claude Opus 5.5 <noreply@anthropic.com>
</commit_message>
<xml_diff>
--- a/docs/FINAL MANUSCRIPT/CHAPTER_4_RESULTS_AND_DISCUSSION.docx
+++ b/docs/FINAL MANUSCRIPT/CHAPTER_4_RESULTS_AND_DISCUSSION.docx
@@ -13456,7 +13456,7 @@
           <w:sz w:val="24"/>
           <w:szCs w:val="24"/>
         </w:rPr>
-        <w:t xml:space="preserve">Response times were measured on 30 September 2026 on the live system, on a laptop in Google Chrome over the boarding house's Wi-Fi and on a phone, from the tap until the figures the user came for were on screen (Table 11).</w:t>
+        <w:t xml:space="preserve">Response times were measured on 30 September 2026 on the live system, on a Dell XPS 15 laptop in Google Chrome 154 over the boarding house's Wi-Fi and on an iPhone 15 in Safari over mobile data, from the tap until the figures the user came for were on screen (Table 11).</w:t>
       </w:r>
     </w:p>
     <w:p>
@@ -13510,7 +13510,7 @@
         </w:trPr>
         <w:tc>
           <w:tcPr>
-            <w:tcW w:type="dxa" w:w="4017"/>
+            <w:tcW w:type="dxa" w:w="3205"/>
             <w:tcBorders>
               <w:top w:val="single" w:color="1A202C" w:sz="12"/>
               <w:left w:val="none" w:color="auto" w:sz="0"/>
@@ -13544,7 +13544,7 @@
         </w:tc>
         <w:tc>
           <w:tcPr>
-            <w:tcW w:type="dxa" w:w="2292"/>
+            <w:tcW w:type="dxa" w:w="2684"/>
             <w:tcBorders>
               <w:top w:val="single" w:color="1A202C" w:sz="12"/>
               <w:left w:val="none" w:color="auto" w:sz="0"/>
@@ -13572,13 +13572,13 @@
                 <w:sz w:val="20"/>
                 <w:szCs w:val="20"/>
               </w:rPr>
-              <w:t xml:space="preserve">Laptop</w:t>
-            </w:r>
-          </w:p>
-        </w:tc>
-        <w:tc>
-          <w:tcPr>
-            <w:tcW w:type="dxa" w:w="2331"/>
+              <w:t xml:space="preserve">Laptop (Dell XPS 15, Chrome 154, Wi-Fi)</w:t>
+            </w:r>
+          </w:p>
+        </w:tc>
+        <w:tc>
+          <w:tcPr>
+            <w:tcW w:type="dxa" w:w="2751"/>
             <w:tcBorders>
               <w:top w:val="single" w:color="1A202C" w:sz="12"/>
               <w:left w:val="none" w:color="auto" w:sz="0"/>
@@ -13606,7 +13606,7 @@
                 <w:sz w:val="20"/>
                 <w:szCs w:val="20"/>
               </w:rPr>
-              <w:t xml:space="preserve">Mobile phone</w:t>
+              <w:t xml:space="preserve">Phone (iPhone 15, Safari, mobile data)</w:t>
             </w:r>
           </w:p>
         </w:tc>
@@ -13617,7 +13617,7 @@
         </w:trPr>
         <w:tc>
           <w:tcPr>
-            <w:tcW w:type="dxa" w:w="4017"/>
+            <w:tcW w:type="dxa" w:w="3205"/>
             <w:tcBorders>
               <w:top w:val="single" w:color="E2E8F0" w:sz="4"/>
               <w:left w:val="none" w:color="auto" w:sz="0"/>
@@ -13650,7 +13650,7 @@
         </w:tc>
         <w:tc>
           <w:tcPr>
-            <w:tcW w:type="dxa" w:w="2292"/>
+            <w:tcW w:type="dxa" w:w="2684"/>
             <w:tcBorders>
               <w:top w:val="single" w:color="E2E8F0" w:sz="4"/>
               <w:left w:val="none" w:color="auto" w:sz="0"/>
@@ -13683,7 +13683,7 @@
         </w:tc>
         <w:tc>
           <w:tcPr>
-            <w:tcW w:type="dxa" w:w="2331"/>
+            <w:tcW w:type="dxa" w:w="2751"/>
             <w:tcBorders>
               <w:top w:val="single" w:color="E2E8F0" w:sz="4"/>
               <w:left w:val="none" w:color="auto" w:sz="0"/>
@@ -13721,7 +13721,7 @@
         </w:trPr>
         <w:tc>
           <w:tcPr>
-            <w:tcW w:type="dxa" w:w="4017"/>
+            <w:tcW w:type="dxa" w:w="3205"/>
             <w:tcBorders>
               <w:top w:val="single" w:color="E2E8F0" w:sz="4"/>
               <w:left w:val="none" w:color="auto" w:sz="0"/>
@@ -13754,7 +13754,7 @@
         </w:tc>
         <w:tc>
           <w:tcPr>
-            <w:tcW w:type="dxa" w:w="2292"/>
+            <w:tcW w:type="dxa" w:w="2684"/>
             <w:tcBorders>
               <w:top w:val="single" w:color="E2E8F0" w:sz="4"/>
               <w:left w:val="none" w:color="auto" w:sz="0"/>
@@ -13787,7 +13787,7 @@
         </w:tc>
         <w:tc>
           <w:tcPr>
-            <w:tcW w:type="dxa" w:w="2331"/>
+            <w:tcW w:type="dxa" w:w="2751"/>
             <w:tcBorders>
               <w:top w:val="single" w:color="E2E8F0" w:sz="4"/>
               <w:left w:val="none" w:color="auto" w:sz="0"/>
@@ -13825,7 +13825,7 @@
         </w:trPr>
         <w:tc>
           <w:tcPr>
-            <w:tcW w:type="dxa" w:w="4017"/>
+            <w:tcW w:type="dxa" w:w="3205"/>
             <w:tcBorders>
               <w:top w:val="single" w:color="E2E8F0" w:sz="4"/>
               <w:left w:val="none" w:color="auto" w:sz="0"/>
@@ -13858,7 +13858,7 @@
         </w:tc>
         <w:tc>
           <w:tcPr>
-            <w:tcW w:type="dxa" w:w="2292"/>
+            <w:tcW w:type="dxa" w:w="2684"/>
             <w:tcBorders>
               <w:top w:val="single" w:color="E2E8F0" w:sz="4"/>
               <w:left w:val="none" w:color="auto" w:sz="0"/>
@@ -13891,7 +13891,7 @@
         </w:tc>
         <w:tc>
           <w:tcPr>
-            <w:tcW w:type="dxa" w:w="2331"/>
+            <w:tcW w:type="dxa" w:w="2751"/>
             <w:tcBorders>
               <w:top w:val="single" w:color="E2E8F0" w:sz="4"/>
               <w:left w:val="none" w:color="auto" w:sz="0"/>
@@ -13929,7 +13929,7 @@
         </w:trPr>
         <w:tc>
           <w:tcPr>
-            <w:tcW w:type="dxa" w:w="4017"/>
+            <w:tcW w:type="dxa" w:w="3205"/>
             <w:tcBorders>
               <w:top w:val="single" w:color="E2E8F0" w:sz="4"/>
               <w:left w:val="none" w:color="auto" w:sz="0"/>
@@ -13962,7 +13962,7 @@
         </w:tc>
         <w:tc>
           <w:tcPr>
-            <w:tcW w:type="dxa" w:w="2292"/>
+            <w:tcW w:type="dxa" w:w="2684"/>
             <w:tcBorders>
               <w:top w:val="single" w:color="E2E8F0" w:sz="4"/>
               <w:left w:val="none" w:color="auto" w:sz="0"/>
@@ -13995,7 +13995,7 @@
         </w:tc>
         <w:tc>
           <w:tcPr>
-            <w:tcW w:type="dxa" w:w="2331"/>
+            <w:tcW w:type="dxa" w:w="2751"/>
             <w:tcBorders>
               <w:top w:val="single" w:color="E2E8F0" w:sz="4"/>
               <w:left w:val="none" w:color="auto" w:sz="0"/>
@@ -14033,7 +14033,7 @@
         </w:trPr>
         <w:tc>
           <w:tcPr>
-            <w:tcW w:type="dxa" w:w="4017"/>
+            <w:tcW w:type="dxa" w:w="3205"/>
             <w:tcBorders>
               <w:top w:val="single" w:color="E2E8F0" w:sz="4"/>
               <w:left w:val="none" w:color="auto" w:sz="0"/>
@@ -14066,7 +14066,7 @@
         </w:tc>
         <w:tc>
           <w:tcPr>
-            <w:tcW w:type="dxa" w:w="2292"/>
+            <w:tcW w:type="dxa" w:w="2684"/>
             <w:tcBorders>
               <w:top w:val="single" w:color="E2E8F0" w:sz="4"/>
               <w:left w:val="none" w:color="auto" w:sz="0"/>
@@ -14099,7 +14099,7 @@
         </w:tc>
         <w:tc>
           <w:tcPr>
-            <w:tcW w:type="dxa" w:w="2331"/>
+            <w:tcW w:type="dxa" w:w="2751"/>
             <w:tcBorders>
               <w:top w:val="single" w:color="E2E8F0" w:sz="4"/>
               <w:left w:val="none" w:color="auto" w:sz="0"/>
@@ -14137,7 +14137,7 @@
         </w:trPr>
         <w:tc>
           <w:tcPr>
-            <w:tcW w:type="dxa" w:w="4017"/>
+            <w:tcW w:type="dxa" w:w="3205"/>
             <w:tcBorders>
               <w:top w:val="single" w:color="E2E8F0" w:sz="4"/>
               <w:left w:val="none" w:color="auto" w:sz="0"/>
@@ -14170,7 +14170,7 @@
         </w:tc>
         <w:tc>
           <w:tcPr>
-            <w:tcW w:type="dxa" w:w="2292"/>
+            <w:tcW w:type="dxa" w:w="2684"/>
             <w:tcBorders>
               <w:top w:val="single" w:color="E2E8F0" w:sz="4"/>
               <w:left w:val="none" w:color="auto" w:sz="0"/>
@@ -14203,7 +14203,7 @@
         </w:tc>
         <w:tc>
           <w:tcPr>
-            <w:tcW w:type="dxa" w:w="2331"/>
+            <w:tcW w:type="dxa" w:w="2751"/>
             <w:tcBorders>
               <w:top w:val="single" w:color="E2E8F0" w:sz="4"/>
               <w:left w:val="none" w:color="auto" w:sz="0"/>
@@ -14241,7 +14241,7 @@
         </w:trPr>
         <w:tc>
           <w:tcPr>
-            <w:tcW w:type="dxa" w:w="4017"/>
+            <w:tcW w:type="dxa" w:w="3205"/>
             <w:tcBorders>
               <w:top w:val="single" w:color="E2E8F0" w:sz="4"/>
               <w:left w:val="none" w:color="auto" w:sz="0"/>
@@ -14274,7 +14274,7 @@
         </w:tc>
         <w:tc>
           <w:tcPr>
-            <w:tcW w:type="dxa" w:w="2292"/>
+            <w:tcW w:type="dxa" w:w="2684"/>
             <w:tcBorders>
               <w:top w:val="single" w:color="E2E8F0" w:sz="4"/>
               <w:left w:val="none" w:color="auto" w:sz="0"/>
@@ -14307,7 +14307,7 @@
         </w:tc>
         <w:tc>
           <w:tcPr>
-            <w:tcW w:type="dxa" w:w="2331"/>
+            <w:tcW w:type="dxa" w:w="2751"/>
             <w:tcBorders>
               <w:top w:val="single" w:color="E2E8F0" w:sz="4"/>
               <w:left w:val="none" w:color="auto" w:sz="0"/>
@@ -14345,7 +14345,7 @@
         </w:trPr>
         <w:tc>
           <w:tcPr>
-            <w:tcW w:type="dxa" w:w="4017"/>
+            <w:tcW w:type="dxa" w:w="3205"/>
             <w:tcBorders>
               <w:top w:val="single" w:color="E2E8F0" w:sz="4"/>
               <w:left w:val="none" w:color="auto" w:sz="0"/>
@@ -14378,7 +14378,7 @@
         </w:tc>
         <w:tc>
           <w:tcPr>
-            <w:tcW w:type="dxa" w:w="2292"/>
+            <w:tcW w:type="dxa" w:w="2684"/>
             <w:tcBorders>
               <w:top w:val="single" w:color="E2E8F0" w:sz="4"/>
               <w:left w:val="none" w:color="auto" w:sz="0"/>
@@ -14411,7 +14411,7 @@
         </w:tc>
         <w:tc>
           <w:tcPr>
-            <w:tcW w:type="dxa" w:w="2331"/>
+            <w:tcW w:type="dxa" w:w="2751"/>
             <w:tcBorders>
               <w:top w:val="single" w:color="E2E8F0" w:sz="4"/>
               <w:left w:val="none" w:color="auto" w:sz="0"/>
@@ -32467,7 +32467,7 @@
         </w:trPr>
         <w:tc>
           <w:tcPr>
-            <w:tcW w:type="dxa" w:w="1356"/>
+            <w:tcW w:type="dxa" w:w="1325"/>
             <w:tcBorders>
               <w:top w:val="single" w:color="1A202C" w:sz="12"/>
               <w:left w:val="none" w:color="auto" w:sz="0"/>
@@ -32501,7 +32501,7 @@
         </w:tc>
         <w:tc>
           <w:tcPr>
-            <w:tcW w:type="dxa" w:w="3479"/>
+            <w:tcW w:type="dxa" w:w="3398"/>
             <w:tcBorders>
               <w:top w:val="single" w:color="1A202C" w:sz="12"/>
               <w:left w:val="none" w:color="auto" w:sz="0"/>
@@ -32535,7 +32535,7 @@
         </w:tc>
         <w:tc>
           <w:tcPr>
-            <w:tcW w:type="dxa" w:w="3805"/>
+            <w:tcW w:type="dxa" w:w="3917"/>
             <w:tcBorders>
               <w:top w:val="single" w:color="1A202C" w:sz="12"/>
               <w:left w:val="none" w:color="auto" w:sz="0"/>
@@ -32574,7 +32574,7 @@
         </w:trPr>
         <w:tc>
           <w:tcPr>
-            <w:tcW w:type="dxa" w:w="1356"/>
+            <w:tcW w:type="dxa" w:w="1325"/>
             <w:tcBorders>
               <w:top w:val="single" w:color="E2E8F0" w:sz="4"/>
               <w:left w:val="none" w:color="auto" w:sz="0"/>
@@ -32607,7 +32607,7 @@
         </w:tc>
         <w:tc>
           <w:tcPr>
-            <w:tcW w:type="dxa" w:w="3479"/>
+            <w:tcW w:type="dxa" w:w="3398"/>
             <w:tcBorders>
               <w:top w:val="single" w:color="E2E8F0" w:sz="4"/>
               <w:left w:val="none" w:color="auto" w:sz="0"/>
@@ -32640,34 +32640,34 @@
         </w:tc>
         <w:tc>
           <w:tcPr>
-            <w:tcW w:type="dxa" w:w="3805"/>
-            <w:tcBorders>
-              <w:top w:val="single" w:color="E2E8F0" w:sz="4"/>
-              <w:left w:val="none" w:color="auto" w:sz="0"/>
-              <w:bottom w:val="single" w:color="E2E8F0" w:sz="4"/>
-              <w:right w:val="none" w:color="auto" w:sz="0"/>
-            </w:tcBorders>
-            <w:tcMar>
-              <w:top w:type="dxa" w:w="120"/>
-              <w:left w:type="dxa" w:w="160"/>
-              <w:bottom w:type="dxa" w:w="120"/>
-              <w:right w:type="dxa" w:w="160"/>
-            </w:tcMar>
-          </w:tcPr>
-          <w:p>
-            <w:pPr>
-              <w:spacing w:line="240" w:lineRule="auto"/>
-              <w:jc w:val="left"/>
-            </w:pPr>
-            <w:r>
-              <w:rPr>
-                <w:rFonts w:ascii="Arial" w:cs="Arial" w:eastAsia="Arial" w:hAnsi="Arial"/>
-                <w:b w:val="false"/>
-                <w:bCs w:val="false"/>
-                <w:sz w:val="20"/>
-                <w:szCs w:val="20"/>
-              </w:rPr>
-              <w:t xml:space="preserve">The administrator laptop, Chrome; the team's laptop, a Dell XPS 15 on Windows 11 with Chrome 154, Edge and Firefox 157 (Table 11, §4.4.3)</w:t>
+            <w:tcW w:type="dxa" w:w="3917"/>
+            <w:tcBorders>
+              <w:top w:val="single" w:color="E2E8F0" w:sz="4"/>
+              <w:left w:val="none" w:color="auto" w:sz="0"/>
+              <w:bottom w:val="single" w:color="E2E8F0" w:sz="4"/>
+              <w:right w:val="none" w:color="auto" w:sz="0"/>
+            </w:tcBorders>
+            <w:tcMar>
+              <w:top w:type="dxa" w:w="120"/>
+              <w:left w:type="dxa" w:w="160"/>
+              <w:bottom w:type="dxa" w:w="120"/>
+              <w:right w:type="dxa" w:w="160"/>
+            </w:tcMar>
+          </w:tcPr>
+          <w:p>
+            <w:pPr>
+              <w:spacing w:line="240" w:lineRule="auto"/>
+              <w:jc w:val="left"/>
+            </w:pPr>
+            <w:r>
+              <w:rPr>
+                <w:rFonts w:ascii="Arial" w:cs="Arial" w:eastAsia="Arial" w:hAnsi="Arial"/>
+                <w:b w:val="false"/>
+                <w:bCs w:val="false"/>
+                <w:sz w:val="20"/>
+                <w:szCs w:val="20"/>
+              </w:rPr>
+              <w:t xml:space="preserve">The administrator's laptop, an Acer Nitro V 15 with Chrome; the team's laptop, a Dell XPS 15 on Windows 11 with Chrome 154, Edge and Firefox 157 (Table 11, §4.4.3)</w:t>
             </w:r>
           </w:p>
         </w:tc>
@@ -32678,7 +32678,7 @@
         </w:trPr>
         <w:tc>
           <w:tcPr>
-            <w:tcW w:type="dxa" w:w="1356"/>
+            <w:tcW w:type="dxa" w:w="1325"/>
             <w:tcBorders>
               <w:top w:val="single" w:color="E2E8F0" w:sz="4"/>
               <w:left w:val="none" w:color="auto" w:sz="0"/>
@@ -32711,7 +32711,7 @@
         </w:tc>
         <w:tc>
           <w:tcPr>
-            <w:tcW w:type="dxa" w:w="3479"/>
+            <w:tcW w:type="dxa" w:w="3398"/>
             <w:tcBorders>
               <w:top w:val="single" w:color="E2E8F0" w:sz="4"/>
               <w:left w:val="none" w:color="auto" w:sz="0"/>
@@ -32744,7 +32744,7 @@
         </w:tc>
         <w:tc>
           <w:tcPr>
-            <w:tcW w:type="dxa" w:w="3805"/>
+            <w:tcW w:type="dxa" w:w="3917"/>
             <w:tcBorders>
               <w:top w:val="single" w:color="E2E8F0" w:sz="4"/>
               <w:left w:val="none" w:color="auto" w:sz="0"/>
@@ -32782,7 +32782,7 @@
         </w:trPr>
         <w:tc>
           <w:tcPr>
-            <w:tcW w:type="dxa" w:w="1356"/>
+            <w:tcW w:type="dxa" w:w="1325"/>
             <w:tcBorders>
               <w:top w:val="single" w:color="E2E8F0" w:sz="4"/>
               <w:left w:val="none" w:color="auto" w:sz="0"/>
@@ -32815,7 +32815,7 @@
         </w:tc>
         <w:tc>
           <w:tcPr>
-            <w:tcW w:type="dxa" w:w="3479"/>
+            <w:tcW w:type="dxa" w:w="3398"/>
             <w:tcBorders>
               <w:top w:val="single" w:color="E2E8F0" w:sz="4"/>
               <w:left w:val="none" w:color="auto" w:sz="0"/>
@@ -32848,7 +32848,7 @@
         </w:tc>
         <w:tc>
           <w:tcPr>
-            <w:tcW w:type="dxa" w:w="3805"/>
+            <w:tcW w:type="dxa" w:w="3917"/>
             <w:tcBorders>
               <w:top w:val="single" w:color="E2E8F0" w:sz="4"/>
               <w:left w:val="none" w:color="auto" w:sz="0"/>
@@ -32886,7 +32886,7 @@
         </w:trPr>
         <w:tc>
           <w:tcPr>
-            <w:tcW w:type="dxa" w:w="1356"/>
+            <w:tcW w:type="dxa" w:w="1325"/>
             <w:tcBorders>
               <w:top w:val="single" w:color="E2E8F0" w:sz="4"/>
               <w:left w:val="none" w:color="auto" w:sz="0"/>
@@ -32919,7 +32919,7 @@
         </w:tc>
         <w:tc>
           <w:tcPr>
-            <w:tcW w:type="dxa" w:w="3479"/>
+            <w:tcW w:type="dxa" w:w="3398"/>
             <w:tcBorders>
               <w:top w:val="single" w:color="E2E8F0" w:sz="4"/>
               <w:left w:val="none" w:color="auto" w:sz="0"/>
@@ -32952,7 +32952,7 @@
         </w:tc>
         <w:tc>
           <w:tcPr>
-            <w:tcW w:type="dxa" w:w="3805"/>
+            <w:tcW w:type="dxa" w:w="3917"/>
             <w:tcBorders>
               <w:top w:val="single" w:color="E2E8F0" w:sz="4"/>
               <w:left w:val="none" w:color="auto" w:sz="0"/>

</xml_diff>

<commit_message>
Tenant deposit merged; the two open testing defects closed on re-test (13 Oct)
Sean, 13 Oct: the deposits are right, merge; the re-tests are done and
good. Step 23b (the offline Overview's P0) passed on the owner's laptop,
and the Android "cannot tell whether it was saved" message was on time on
the same phone.

Chapter 4: 4.3.4 and 4.3.7 say so, 4.4.3 calls 23b resolved, Table 23A's
two rows close (resolved 31 to 32, "3 accepted", no open defect), and
4.2.2 says tenants now see their deposit. Chapter 5: conclusion 3 no
longer calls 23b open; recommendation 8 notes the deposit is now shown.
Appendix M's four rows carry the re-test. The sign-off form, B-90 and
START_HERE_LLOYD (3b, 5, 6) updated.

Co-Authored-By: Claude Opus 5.5 <noreply@anthropic.com>
</commit_message>
<xml_diff>
--- a/docs/FINAL MANUSCRIPT/CHAPTER_4_RESULTS_AND_DISCUSSION.docx
+++ b/docs/FINAL MANUSCRIPT/CHAPTER_4_RESULTS_AND_DISCUSSION.docx
@@ -6600,7 +6600,7 @@
           <w:sz w:val="24"/>
           <w:szCs w:val="24"/>
         </w:rPr>
-        <w:t xml:space="preserve">Figure 10 presents the Rooms and rates screen. Each unit carries its cluster, floor, current rate and status, and each tenancy the number of occupants, the move-in date and emergency contacts. When the owner changes a rate, a database trigger records the old rate, the new rate, the date and who made the change, so no path can change a rate without leaving that record. The owner's workbook did not record move-in dates, so for the transferred tenancies the screen says the date is not recorded rather than showing a guessed one.</w:t>
+        <w:t xml:space="preserve">Figure 10 presents the Rooms and rates screen. Each unit carries its cluster, floor, current rate and status, and each tenancy the number of occupants, the move-in date and emergency contacts. When the owner changes a rate, a database trigger records the old rate, the new rate, the date and who made the change, so no path can change a rate without leaving that record. The owner's workbook did not record move-in dates, so for the transferred tenancies the screen says the date is not recorded rather than showing a guessed one. Since 13 October 2026 a tenant also sees the deposit held for their tenancy on their own Overview, as one tenant asked in the survey (Table 23).</w:t>
       </w:r>
     </w:p>
     <w:p>
@@ -13423,7 +13423,7 @@
           <w:sz w:val="24"/>
           <w:szCs w:val="24"/>
         </w:rPr>
-        <w:t xml:space="preserve">A 26-step walkthrough, 30 rows counting its sub-steps, exercises every function that writes data once, on the one unoccupied unit so that no real record is touched. The owner performed it herself on 30 September 2026 on her laptop, signed in to her own account, with a team member reading each step; the full results are in Appendix M, Table M-1. Of the 30 rows, 24 passed the first time, 1 failed and 5 were not performed as written. Every function a tenant uses passed, as did onboarding, the duplicate guards, voiding, inquiry replies, repairs, the Excel export and moving a tenant out. The one failure was step 23b: with the connection cut, the Overview showed ₱0 where the design requires "—", so that a missing figure is never read as a zero balance (Table 23A). A rate change and its reversal were skipped, and an expense split across two areas was entered as two expenses, so splitting, editing and deleting an expense were not exercised by the owner.</w:t>
+        <w:t xml:space="preserve">A 26-step walkthrough, 30 rows counting its sub-steps, exercises every function that writes data once, on the one unoccupied unit so that no real record is touched. The owner performed it herself on 30 September 2026 on her laptop, signed in to her own account, with a team member reading each step; the full results are in Appendix M, Table M-1. Of the 30 rows, 24 passed the first time, 1 failed and 5 were not performed as written. Every function a tenant uses passed, as did onboarding, the duplicate guards, voiding, inquiry replies, repairs, the Excel export and moving a tenant out. The one failure was step 23b: with the connection cut, the Overview showed ₱0 where the design requires "—", so that a missing figure is never read as a zero balance; re-tested on the owner's laptop on 13 October 2026, it passed (Table 23A). A rate change and its reversal were skipped, and an expense split across two areas was entered as two expenses, so splitting, editing and deleting an expense were not exercised by the owner.</w:t>
       </w:r>
     </w:p>
     <w:p>
@@ -19470,7 +19470,7 @@
           <w:sz w:val="24"/>
           <w:szCs w:val="24"/>
         </w:rPr>
-        <w:t xml:space="preserve">Every task the tenants attempted was completed, 31 of 34 attempts without help (91 per cent). Help was needed only at the start: two of the three tenants were helped through their first sign-in and one to find their unit and rent; everything else, from finding payments to reporting a repair and opening the GCash payment, was done alone in one to two minutes. The repairs they sent reached the owner at once, and she acted on them the same evening. Mia et al. (2024) name limited technical capacity as a barrier when small Philippine enterprises adopt digital tools; these results place it precisely, in the first two things a new user does. The tests that needed several tenants saving at once were not performed, because only two attended together; in the session in which the owner and two tenants used the system at the same time, every screen loaded, each tenant saw only their own unit, the owner's full year of Monthly Income opened in about three seconds, and no session affected another (Appendix M, Table M-22). On two phones the offline behavior matched Table 11A, except that the Android phone showed the "cannot tell whether it was saved" message after 60 to 80 seconds instead of 45, recorded as a defect (Table 23A).</w:t>
+        <w:t xml:space="preserve">Every task the tenants attempted was completed, 31 of 34 attempts without help (91 per cent). Help was needed only at the start: two of the three tenants were helped through their first sign-in and one to find their unit and rent; everything else, from finding payments to reporting a repair and opening the GCash payment, was done alone in one to two minutes. The repairs they sent reached the owner at once, and she acted on them the same evening. Mia et al. (2024) name limited technical capacity as a barrier when small Philippine enterprises adopt digital tools; these results place it precisely, in the first two things a new user does. The tests that needed several tenants saving at once were not performed, because only two attended together; in the session in which the owner and two tenants used the system at the same time, every screen loaded, each tenant saw only their own unit, the owner's full year of Monthly Income opened in about three seconds, and no session affected another (Appendix M, Table M-22). On two phones the offline behavior matched Table 11A, except that the Android phone showed the "cannot tell whether it was saved" message after 60 to 80 seconds instead of 45; corrected on 1 October, it was on time when re-tested on that phone on 13 October 2026 (Table 23A).</w:t>
       </w:r>
     </w:p>
     <w:p>
@@ -27139,7 +27139,7 @@
           <w:sz w:val="24"/>
           <w:szCs w:val="24"/>
         </w:rPr>
-        <w:t xml:space="preserve"> (4.62) agrees most closely with the testing: the technical evaluator's 3 for handling a failed request without presenting incorrect data names the one defect the testing left open, the ₱0 of step 23b. </w:t>
+        <w:t xml:space="preserve"> (4.62) agrees most closely with the testing: the technical evaluator's 3 for handling a failed request without presenting incorrect data names the one defect the testing found, the ₱0 of step 23b, since resolved. </w:t>
       </w:r>
       <w:r>
         <w:rPr>
@@ -31011,7 +31011,7 @@
         </w:trPr>
         <w:tc>
           <w:tcPr>
-            <w:tcW w:type="dxa" w:w="2023"/>
+            <w:tcW w:type="dxa" w:w="2028"/>
             <w:tcBorders>
               <w:top w:val="single" w:color="1A202C" w:sz="12"/>
               <w:left w:val="none" w:color="auto" w:sz="0"/>
@@ -31045,7 +31045,7 @@
         </w:tc>
         <w:tc>
           <w:tcPr>
-            <w:tcW w:type="dxa" w:w="863"/>
+            <w:tcW w:type="dxa" w:w="865"/>
             <w:tcBorders>
               <w:top w:val="single" w:color="1A202C" w:sz="12"/>
               <w:left w:val="none" w:color="auto" w:sz="0"/>
@@ -31079,7 +31079,7 @@
         </w:tc>
         <w:tc>
           <w:tcPr>
-            <w:tcW w:type="dxa" w:w="2391"/>
+            <w:tcW w:type="dxa" w:w="2397"/>
             <w:tcBorders>
               <w:top w:val="single" w:color="1A202C" w:sz="12"/>
               <w:left w:val="none" w:color="auto" w:sz="0"/>
@@ -31113,7 +31113,7 @@
         </w:tc>
         <w:tc>
           <w:tcPr>
-            <w:tcW w:type="dxa" w:w="863"/>
+            <w:tcW w:type="dxa" w:w="865"/>
             <w:tcBorders>
               <w:top w:val="single" w:color="1A202C" w:sz="12"/>
               <w:left w:val="none" w:color="auto" w:sz="0"/>
@@ -31147,7 +31147,7 @@
         </w:tc>
         <w:tc>
           <w:tcPr>
-            <w:tcW w:type="dxa" w:w="2500"/>
+            <w:tcW w:type="dxa" w:w="2485"/>
             <w:tcBorders>
               <w:top w:val="single" w:color="1A202C" w:sz="12"/>
               <w:left w:val="none" w:color="auto" w:sz="0"/>
@@ -31186,7 +31186,7 @@
         </w:trPr>
         <w:tc>
           <w:tcPr>
-            <w:tcW w:type="dxa" w:w="2023"/>
+            <w:tcW w:type="dxa" w:w="2028"/>
             <w:tcBorders>
               <w:top w:val="single" w:color="E2E8F0" w:sz="4"/>
               <w:left w:val="none" w:color="auto" w:sz="0"/>
@@ -31219,7 +31219,7 @@
         </w:tc>
         <w:tc>
           <w:tcPr>
-            <w:tcW w:type="dxa" w:w="863"/>
+            <w:tcW w:type="dxa" w:w="865"/>
             <w:tcBorders>
               <w:top w:val="single" w:color="E2E8F0" w:sz="4"/>
               <w:left w:val="none" w:color="auto" w:sz="0"/>
@@ -31252,7 +31252,7 @@
         </w:tc>
         <w:tc>
           <w:tcPr>
-            <w:tcW w:type="dxa" w:w="2391"/>
+            <w:tcW w:type="dxa" w:w="2397"/>
             <w:tcBorders>
               <w:top w:val="single" w:color="E2E8F0" w:sz="4"/>
               <w:left w:val="none" w:color="auto" w:sz="0"/>
@@ -31285,7 +31285,7 @@
         </w:tc>
         <w:tc>
           <w:tcPr>
-            <w:tcW w:type="dxa" w:w="863"/>
+            <w:tcW w:type="dxa" w:w="865"/>
             <w:tcBorders>
               <w:top w:val="single" w:color="E2E8F0" w:sz="4"/>
               <w:left w:val="none" w:color="auto" w:sz="0"/>
@@ -31318,7 +31318,7 @@
         </w:tc>
         <w:tc>
           <w:tcPr>
-            <w:tcW w:type="dxa" w:w="2500"/>
+            <w:tcW w:type="dxa" w:w="2485"/>
             <w:tcBorders>
               <w:top w:val="single" w:color="E2E8F0" w:sz="4"/>
               <w:left w:val="none" w:color="auto" w:sz="0"/>
@@ -31356,7 +31356,7 @@
         </w:trPr>
         <w:tc>
           <w:tcPr>
-            <w:tcW w:type="dxa" w:w="2023"/>
+            <w:tcW w:type="dxa" w:w="2028"/>
             <w:tcBorders>
               <w:top w:val="single" w:color="E2E8F0" w:sz="4"/>
               <w:left w:val="none" w:color="auto" w:sz="0"/>
@@ -31389,7 +31389,7 @@
         </w:tc>
         <w:tc>
           <w:tcPr>
-            <w:tcW w:type="dxa" w:w="863"/>
+            <w:tcW w:type="dxa" w:w="865"/>
             <w:tcBorders>
               <w:top w:val="single" w:color="E2E8F0" w:sz="4"/>
               <w:left w:val="none" w:color="auto" w:sz="0"/>
@@ -31422,7 +31422,7 @@
         </w:tc>
         <w:tc>
           <w:tcPr>
-            <w:tcW w:type="dxa" w:w="2391"/>
+            <w:tcW w:type="dxa" w:w="2397"/>
             <w:tcBorders>
               <w:top w:val="single" w:color="E2E8F0" w:sz="4"/>
               <w:left w:val="none" w:color="auto" w:sz="0"/>
@@ -31455,7 +31455,7 @@
         </w:tc>
         <w:tc>
           <w:tcPr>
-            <w:tcW w:type="dxa" w:w="863"/>
+            <w:tcW w:type="dxa" w:w="865"/>
             <w:tcBorders>
               <w:top w:val="single" w:color="E2E8F0" w:sz="4"/>
               <w:left w:val="none" w:color="auto" w:sz="0"/>
@@ -31482,40 +31482,40 @@
                 <w:sz w:val="20"/>
                 <w:szCs w:val="20"/>
               </w:rPr>
-              <w:t xml:space="preserve">0</w:t>
-            </w:r>
-          </w:p>
-        </w:tc>
-        <w:tc>
-          <w:tcPr>
-            <w:tcW w:type="dxa" w:w="2500"/>
-            <w:tcBorders>
-              <w:top w:val="single" w:color="E2E8F0" w:sz="4"/>
-              <w:left w:val="none" w:color="auto" w:sz="0"/>
-              <w:bottom w:val="single" w:color="E2E8F0" w:sz="4"/>
-              <w:right w:val="none" w:color="auto" w:sz="0"/>
-            </w:tcBorders>
-            <w:tcMar>
-              <w:top w:type="dxa" w:w="120"/>
-              <w:left w:type="dxa" w:w="160"/>
-              <w:bottom w:type="dxa" w:w="120"/>
-              <w:right w:type="dxa" w:w="160"/>
-            </w:tcMar>
-          </w:tcPr>
-          <w:p>
-            <w:pPr>
-              <w:spacing w:line="240" w:lineRule="auto"/>
-              <w:jc w:val="left"/>
-            </w:pPr>
-            <w:r>
-              <w:rPr>
-                <w:rFonts w:ascii="Arial" w:cs="Arial" w:eastAsia="Arial" w:hAnsi="Arial"/>
-                <w:b w:val="false"/>
-                <w:bCs w:val="false"/>
-                <w:sz w:val="20"/>
-                <w:szCs w:val="20"/>
-              </w:rPr>
-              <w:t xml:space="preserve">1 open: not reproduced on 1 October; to be tested again on the owner's laptop</w:t>
+              <w:t xml:space="preserve">1</w:t>
+            </w:r>
+          </w:p>
+        </w:tc>
+        <w:tc>
+          <w:tcPr>
+            <w:tcW w:type="dxa" w:w="2485"/>
+            <w:tcBorders>
+              <w:top w:val="single" w:color="E2E8F0" w:sz="4"/>
+              <w:left w:val="none" w:color="auto" w:sz="0"/>
+              <w:bottom w:val="single" w:color="E2E8F0" w:sz="4"/>
+              <w:right w:val="none" w:color="auto" w:sz="0"/>
+            </w:tcBorders>
+            <w:tcMar>
+              <w:top w:type="dxa" w:w="120"/>
+              <w:left w:type="dxa" w:w="160"/>
+              <w:bottom w:type="dxa" w:w="120"/>
+              <w:right w:type="dxa" w:w="160"/>
+            </w:tcMar>
+          </w:tcPr>
+          <w:p>
+            <w:pPr>
+              <w:spacing w:line="240" w:lineRule="auto"/>
+              <w:jc w:val="left"/>
+            </w:pPr>
+            <w:r>
+              <w:rPr>
+                <w:rFonts w:ascii="Arial" w:cs="Arial" w:eastAsia="Arial" w:hAnsi="Arial"/>
+                <w:b w:val="false"/>
+                <w:bCs w:val="false"/>
+                <w:sz w:val="20"/>
+                <w:szCs w:val="20"/>
+              </w:rPr>
+              <w:t xml:space="preserve">None: passed when re-tested on the owner's laptop, 13 October</w:t>
             </w:r>
           </w:p>
         </w:tc>
@@ -31526,7 +31526,7 @@
         </w:trPr>
         <w:tc>
           <w:tcPr>
-            <w:tcW w:type="dxa" w:w="2023"/>
+            <w:tcW w:type="dxa" w:w="2028"/>
             <w:tcBorders>
               <w:top w:val="single" w:color="E2E8F0" w:sz="4"/>
               <w:left w:val="none" w:color="auto" w:sz="0"/>
@@ -31559,7 +31559,7 @@
         </w:tc>
         <w:tc>
           <w:tcPr>
-            <w:tcW w:type="dxa" w:w="863"/>
+            <w:tcW w:type="dxa" w:w="865"/>
             <w:tcBorders>
               <w:top w:val="single" w:color="E2E8F0" w:sz="4"/>
               <w:left w:val="none" w:color="auto" w:sz="0"/>
@@ -31592,7 +31592,7 @@
         </w:tc>
         <w:tc>
           <w:tcPr>
-            <w:tcW w:type="dxa" w:w="2391"/>
+            <w:tcW w:type="dxa" w:w="2397"/>
             <w:tcBorders>
               <w:top w:val="single" w:color="E2E8F0" w:sz="4"/>
               <w:left w:val="none" w:color="auto" w:sz="0"/>
@@ -31625,7 +31625,7 @@
         </w:tc>
         <w:tc>
           <w:tcPr>
-            <w:tcW w:type="dxa" w:w="863"/>
+            <w:tcW w:type="dxa" w:w="865"/>
             <w:tcBorders>
               <w:top w:val="single" w:color="E2E8F0" w:sz="4"/>
               <w:left w:val="none" w:color="auto" w:sz="0"/>
@@ -31658,34 +31658,34 @@
         </w:tc>
         <w:tc>
           <w:tcPr>
-            <w:tcW w:type="dxa" w:w="2500"/>
-            <w:tcBorders>
-              <w:top w:val="single" w:color="E2E8F0" w:sz="4"/>
-              <w:left w:val="none" w:color="auto" w:sz="0"/>
-              <w:bottom w:val="single" w:color="E2E8F0" w:sz="4"/>
-              <w:right w:val="none" w:color="auto" w:sz="0"/>
-            </w:tcBorders>
-            <w:tcMar>
-              <w:top w:type="dxa" w:w="120"/>
-              <w:left w:type="dxa" w:w="160"/>
-              <w:bottom w:type="dxa" w:w="120"/>
-              <w:right w:type="dxa" w:w="160"/>
-            </w:tcMar>
-          </w:tcPr>
-          <w:p>
-            <w:pPr>
-              <w:spacing w:line="240" w:lineRule="auto"/>
-              <w:jc w:val="left"/>
-            </w:pPr>
-            <w:r>
-              <w:rPr>
-                <w:rFonts w:ascii="Arial" w:cs="Arial" w:eastAsia="Arial" w:hAnsi="Arial"/>
-                <w:b w:val="false"/>
-                <w:bCs w:val="false"/>
-                <w:sz w:val="20"/>
-                <w:szCs w:val="20"/>
-              </w:rPr>
-              <w:t xml:space="preserve">Mitigated; to be tested again on the same phone</w:t>
+            <w:tcW w:type="dxa" w:w="2485"/>
+            <w:tcBorders>
+              <w:top w:val="single" w:color="E2E8F0" w:sz="4"/>
+              <w:left w:val="none" w:color="auto" w:sz="0"/>
+              <w:bottom w:val="single" w:color="E2E8F0" w:sz="4"/>
+              <w:right w:val="none" w:color="auto" w:sz="0"/>
+            </w:tcBorders>
+            <w:tcMar>
+              <w:top w:type="dxa" w:w="120"/>
+              <w:left w:type="dxa" w:w="160"/>
+              <w:bottom w:type="dxa" w:w="120"/>
+              <w:right w:type="dxa" w:w="160"/>
+            </w:tcMar>
+          </w:tcPr>
+          <w:p>
+            <w:pPr>
+              <w:spacing w:line="240" w:lineRule="auto"/>
+              <w:jc w:val="left"/>
+            </w:pPr>
+            <w:r>
+              <w:rPr>
+                <w:rFonts w:ascii="Arial" w:cs="Arial" w:eastAsia="Arial" w:hAnsi="Arial"/>
+                <w:b w:val="false"/>
+                <w:bCs w:val="false"/>
+                <w:sz w:val="20"/>
+                <w:szCs w:val="20"/>
+              </w:rPr>
+              <w:t xml:space="preserve">None: on time when re-tested on the same phone, 13 October</w:t>
             </w:r>
           </w:p>
         </w:tc>
@@ -31696,7 +31696,7 @@
         </w:trPr>
         <w:tc>
           <w:tcPr>
-            <w:tcW w:type="dxa" w:w="2023"/>
+            <w:tcW w:type="dxa" w:w="2028"/>
             <w:tcBorders>
               <w:top w:val="single" w:color="E2E8F0" w:sz="4"/>
               <w:left w:val="none" w:color="auto" w:sz="0"/>
@@ -31729,7 +31729,7 @@
         </w:tc>
         <w:tc>
           <w:tcPr>
-            <w:tcW w:type="dxa" w:w="863"/>
+            <w:tcW w:type="dxa" w:w="865"/>
             <w:tcBorders>
               <w:top w:val="single" w:color="E2E8F0" w:sz="4"/>
               <w:left w:val="none" w:color="auto" w:sz="0"/>
@@ -31762,7 +31762,7 @@
         </w:tc>
         <w:tc>
           <w:tcPr>
-            <w:tcW w:type="dxa" w:w="2391"/>
+            <w:tcW w:type="dxa" w:w="2397"/>
             <w:tcBorders>
               <w:top w:val="single" w:color="E2E8F0" w:sz="4"/>
               <w:left w:val="none" w:color="auto" w:sz="0"/>
@@ -31795,7 +31795,7 @@
         </w:tc>
         <w:tc>
           <w:tcPr>
-            <w:tcW w:type="dxa" w:w="863"/>
+            <w:tcW w:type="dxa" w:w="865"/>
             <w:tcBorders>
               <w:top w:val="single" w:color="E2E8F0" w:sz="4"/>
               <w:left w:val="none" w:color="auto" w:sz="0"/>
@@ -31828,7 +31828,7 @@
         </w:tc>
         <w:tc>
           <w:tcPr>
-            <w:tcW w:type="dxa" w:w="2500"/>
+            <w:tcW w:type="dxa" w:w="2485"/>
             <w:tcBorders>
               <w:top w:val="single" w:color="E2E8F0" w:sz="4"/>
               <w:left w:val="none" w:color="auto" w:sz="0"/>
@@ -31866,7 +31866,7 @@
         </w:trPr>
         <w:tc>
           <w:tcPr>
-            <w:tcW w:type="dxa" w:w="2023"/>
+            <w:tcW w:type="dxa" w:w="2028"/>
             <w:tcBorders>
               <w:top w:val="single" w:color="E2E8F0" w:sz="4"/>
               <w:left w:val="none" w:color="auto" w:sz="0"/>
@@ -31899,7 +31899,7 @@
         </w:tc>
         <w:tc>
           <w:tcPr>
-            <w:tcW w:type="dxa" w:w="863"/>
+            <w:tcW w:type="dxa" w:w="865"/>
             <w:tcBorders>
               <w:top w:val="single" w:color="E2E8F0" w:sz="4"/>
               <w:left w:val="none" w:color="auto" w:sz="0"/>
@@ -31932,7 +31932,7 @@
         </w:tc>
         <w:tc>
           <w:tcPr>
-            <w:tcW w:type="dxa" w:w="2391"/>
+            <w:tcW w:type="dxa" w:w="2397"/>
             <w:tcBorders>
               <w:top w:val="single" w:color="E2E8F0" w:sz="4"/>
               <w:left w:val="none" w:color="auto" w:sz="0"/>
@@ -31965,7 +31965,7 @@
         </w:tc>
         <w:tc>
           <w:tcPr>
-            <w:tcW w:type="dxa" w:w="863"/>
+            <w:tcW w:type="dxa" w:w="865"/>
             <w:tcBorders>
               <w:top w:val="single" w:color="E2E8F0" w:sz="4"/>
               <w:left w:val="none" w:color="auto" w:sz="0"/>
@@ -31998,7 +31998,7 @@
         </w:tc>
         <w:tc>
           <w:tcPr>
-            <w:tcW w:type="dxa" w:w="2500"/>
+            <w:tcW w:type="dxa" w:w="2485"/>
             <w:tcBorders>
               <w:top w:val="single" w:color="E2E8F0" w:sz="4"/>
               <w:left w:val="none" w:color="auto" w:sz="0"/>
@@ -32036,7 +32036,7 @@
         </w:trPr>
         <w:tc>
           <w:tcPr>
-            <w:tcW w:type="dxa" w:w="2023"/>
+            <w:tcW w:type="dxa" w:w="2028"/>
             <w:tcBorders>
               <w:top w:val="single" w:color="E2E8F0" w:sz="4"/>
               <w:left w:val="none" w:color="auto" w:sz="0"/>
@@ -32069,7 +32069,7 @@
         </w:tc>
         <w:tc>
           <w:tcPr>
-            <w:tcW w:type="dxa" w:w="863"/>
+            <w:tcW w:type="dxa" w:w="865"/>
             <w:tcBorders>
               <w:top w:val="single" w:color="E2E8F0" w:sz="4"/>
               <w:left w:val="none" w:color="auto" w:sz="0"/>
@@ -32102,7 +32102,7 @@
         </w:tc>
         <w:tc>
           <w:tcPr>
-            <w:tcW w:type="dxa" w:w="2391"/>
+            <w:tcW w:type="dxa" w:w="2397"/>
             <w:tcBorders>
               <w:top w:val="single" w:color="E2E8F0" w:sz="4"/>
               <w:left w:val="none" w:color="auto" w:sz="0"/>
@@ -32135,7 +32135,7 @@
         </w:tc>
         <w:tc>
           <w:tcPr>
-            <w:tcW w:type="dxa" w:w="863"/>
+            <w:tcW w:type="dxa" w:w="865"/>
             <w:tcBorders>
               <w:top w:val="single" w:color="E2E8F0" w:sz="4"/>
               <w:left w:val="none" w:color="auto" w:sz="0"/>
@@ -32168,7 +32168,7 @@
         </w:tc>
         <w:tc>
           <w:tcPr>
-            <w:tcW w:type="dxa" w:w="2500"/>
+            <w:tcW w:type="dxa" w:w="2485"/>
             <w:tcBorders>
               <w:top w:val="single" w:color="E2E8F0" w:sz="4"/>
               <w:left w:val="none" w:color="auto" w:sz="0"/>
@@ -32206,7 +32206,7 @@
         </w:trPr>
         <w:tc>
           <w:tcPr>
-            <w:tcW w:type="dxa" w:w="2023"/>
+            <w:tcW w:type="dxa" w:w="2028"/>
             <w:tcBorders>
               <w:top w:val="single" w:color="E2E8F0" w:sz="4"/>
               <w:left w:val="none" w:color="auto" w:sz="0"/>
@@ -32239,7 +32239,7 @@
         </w:tc>
         <w:tc>
           <w:tcPr>
-            <w:tcW w:type="dxa" w:w="863"/>
+            <w:tcW w:type="dxa" w:w="865"/>
             <w:tcBorders>
               <w:top w:val="single" w:color="E2E8F0" w:sz="4"/>
               <w:left w:val="none" w:color="auto" w:sz="0"/>
@@ -32272,7 +32272,7 @@
         </w:tc>
         <w:tc>
           <w:tcPr>
-            <w:tcW w:type="dxa" w:w="2391"/>
+            <w:tcW w:type="dxa" w:w="2397"/>
             <w:tcBorders>
               <w:top w:val="single" w:color="E2E8F0" w:sz="4"/>
               <w:left w:val="none" w:color="auto" w:sz="0"/>
@@ -32295,7 +32295,7 @@
         </w:tc>
         <w:tc>
           <w:tcPr>
-            <w:tcW w:type="dxa" w:w="863"/>
+            <w:tcW w:type="dxa" w:w="865"/>
             <w:tcBorders>
               <w:top w:val="single" w:color="E2E8F0" w:sz="4"/>
               <w:left w:val="none" w:color="auto" w:sz="0"/>
@@ -32322,13 +32322,13 @@
                 <w:sz w:val="20"/>
                 <w:szCs w:val="20"/>
               </w:rPr>
-              <w:t xml:space="preserve">31</w:t>
-            </w:r>
-          </w:p>
-        </w:tc>
-        <w:tc>
-          <w:tcPr>
-            <w:tcW w:type="dxa" w:w="2500"/>
+              <w:t xml:space="preserve">32</w:t>
+            </w:r>
+          </w:p>
+        </w:tc>
+        <w:tc>
+          <w:tcPr>
+            <w:tcW w:type="dxa" w:w="2485"/>
             <w:tcBorders>
               <w:top w:val="single" w:color="E2E8F0" w:sz="4"/>
               <w:left w:val="none" w:color="auto" w:sz="0"/>
@@ -32355,7 +32355,7 @@
                 <w:sz w:val="20"/>
                 <w:szCs w:val="20"/>
               </w:rPr>
-              <w:t xml:space="preserve">1 open, 3 accepted</w:t>
+              <w:t xml:space="preserve">3 accepted</w:t>
             </w:r>
           </w:p>
         </w:tc>

</xml_diff>

<commit_message>
Say what installing the PWA means: Add to Home Screen, no store, about 1.2 MB
Sean asked whether the system really installs. It does, in the PWA sense the
paper and ISO/IEC 25010's installability use, but nothing says what that is, so
Section 4.2.7 now does: adding it to the home screen from the browser, nothing
from a store, its own window, application files of about 1.2 MB (the build's
precache, 13 Oct). The abstract said 'installation on any phone or computer';
two phones and the laptops were tested, so it now says 'from the browser on a
phone or computer, without an app store'.

Co-Authored-By: Claude Opus 5.5 <noreply@anthropic.com>
</commit_message>
<xml_diff>
--- a/docs/FINAL MANUSCRIPT/CHAPTER_4_RESULTS_AND_DISCUSSION.docx
+++ b/docs/FINAL MANUSCRIPT/CHAPTER_4_RESULTS_AND_DISCUSSION.docx
@@ -11209,7 +11209,67 @@
           <w:sz w:val="24"/>
           <w:szCs w:val="24"/>
         </w:rPr>
-        <w:t xml:space="preserve">Figure 14 presents the tenant portal on a phone. The client is a Progressive Web Application with a service worker and a manifest, so it installs on a phone or computer without an app store. Since 1 and 2 October 2026 it keeps a read-only copy of the figures, names and notifications the signed-in person last loaded on that person's device, so the installed application can show them without a connection under one notice giving the time they were saved; paying and recording still need the connection, and the copy is removed at sign-out. This stays within the delimitation in Section 1.4. Screens adapt to the device, and tables on a computer become cards on a phone. As Biørn-Hansen et al. (2019) describe, one code base served every device: the owner's laptop, an Android phone in Chrome and an iPhone in Safari (Section 4.3.7).</w:t>
+        <w:t xml:space="preserve">Figure 14 presents the tenant portal on a phone. The client is a Progressive Web Application with a service worker and a manifest, so it installs on a phone or computer without an app store. Installing it means adding it to the home screen from the browser (</w:t>
+      </w:r>
+      <w:r>
+        <w:rPr>
+          <w:rFonts w:ascii="Arial" w:cs="Arial" w:eastAsia="Arial" w:hAnsi="Arial"/>
+          <w:b/>
+          <w:bCs/>
+          <w:sz w:val="24"/>
+          <w:szCs w:val="24"/>
+        </w:rPr>
+        <w:t xml:space="preserve">Add to Home Screen</w:t>
+      </w:r>
+      <w:r>
+        <w:rPr>
+          <w:rFonts w:ascii="Arial" w:cs="Arial" w:eastAsia="Arial" w:hAnsi="Arial"/>
+          <w:b w:val="false"/>
+          <w:bCs w:val="false"/>
+          <w:sz w:val="24"/>
+          <w:szCs w:val="24"/>
+        </w:rPr>
+        <w:t xml:space="preserve"> in Safari, </w:t>
+      </w:r>
+      <w:r>
+        <w:rPr>
+          <w:rFonts w:ascii="Arial" w:cs="Arial" w:eastAsia="Arial" w:hAnsi="Arial"/>
+          <w:b/>
+          <w:bCs/>
+          <w:sz w:val="24"/>
+          <w:szCs w:val="24"/>
+        </w:rPr>
+        <w:t xml:space="preserve">Install app</w:t>
+      </w:r>
+      <w:r>
+        <w:rPr>
+          <w:rFonts w:ascii="Arial" w:cs="Arial" w:eastAsia="Arial" w:hAnsi="Arial"/>
+          <w:b w:val="false"/>
+          <w:bCs w:val="false"/>
+          <w:sz w:val="24"/>
+          <w:szCs w:val="24"/>
+        </w:rPr>
+        <w:t xml:space="preserve"> or </w:t>
+      </w:r>
+      <w:r>
+        <w:rPr>
+          <w:rFonts w:ascii="Arial" w:cs="Arial" w:eastAsia="Arial" w:hAnsi="Arial"/>
+          <w:b/>
+          <w:bCs/>
+          <w:sz w:val="24"/>
+          <w:szCs w:val="24"/>
+        </w:rPr>
+        <w:t xml:space="preserve">Add to Home screen</w:t>
+      </w:r>
+      <w:r>
+        <w:rPr>
+          <w:rFonts w:ascii="Arial" w:cs="Arial" w:eastAsia="Arial" w:hAnsi="Arial"/>
+          <w:b w:val="false"/>
+          <w:bCs w:val="false"/>
+          <w:sz w:val="24"/>
+          <w:szCs w:val="24"/>
+        </w:rPr>
+        <w:t xml:space="preserve"> in Chrome): nothing is downloaded from a store, it opens in its own window like an application, and the application files it keeps on the device come to about 1.2 MB (as built on 13 October 2026). Since 1 and 2 October 2026 it keeps a read-only copy of the figures, names and notifications the signed-in person last loaded on that person's device, so the installed application can show them without a connection under one notice giving the time they were saved; paying and recording still need the connection, and the copy is removed at sign-out. This stays within the delimitation in Section 1.4. Screens adapt to the device, and tables on a computer become cards on a phone. As Biørn-Hansen et al. (2019) describe, one code base served every device: the owner's laptop, an Android phone in Chrome and an iPhone in Safari (Section 4.3.7).</w:t>
       </w:r>
     </w:p>
     <w:p>

</xml_diff>

<commit_message>
Drop Voumick and Monteverde; American spelling throughout; three overstatements in Chapter 2 toned down
Sean asked for the two least-needed references to go: 35 entries remain, all
cited. The paper mixed British and American spelling (enquiry and inquiry,
analysed, per cent, colour, centre); APA 7 is American, so 25 are changed,
leaving ISO/IEC 25010's own 'time behaviour'. 'Consistently identifies' and
'significantly more effective' claimed more than two or three studies carry.

Co-Authored-By: Claude Opus 5.5 <noreply@anthropic.com>
</commit_message>
<xml_diff>
--- a/docs/FINAL MANUSCRIPT/CHAPTER_4_RESULTS_AND_DISCUSSION.docx
+++ b/docs/FINAL MANUSCRIPT/CHAPTER_4_RESULTS_AND_DISCUSSION.docx
@@ -117,7 +117,7 @@
           <w:sz w:val="24"/>
           <w:szCs w:val="24"/>
         </w:rPr>
-        <w:t xml:space="preserve">Before the system, the owner kept a spreadsheet workbook with two sheets, a Monthly Income Report and a Monthly Expenses Report, on a USB flash drive, together with a paper invoice book. Rent was collected in cash on site, and requests arrived by messaging application or in person. Table 5 compares each practice with the problem it caused. Enquiries arrived much as Pernate et al. (2025) found for boarding houses in Ormoc City, through social media and word of mouth, and left no record.</w:t>
+        <w:t xml:space="preserve">Before the system, the owner kept a spreadsheet workbook with two sheets, a Monthly Income Report and a Monthly Expenses Report, on a USB flash drive, together with a paper invoice book. Rent was collected in cash on site, and requests arrived by messaging application or in person. Table 5 compares each practice with the problem it caused. Inquiries arrived much as Pernate et al. (2025) found for boarding houses in Ormoc City, through social media and word of mouth, and left no record.</w:t>
       </w:r>
     </w:p>
     <w:p>
@@ -653,7 +653,7 @@
                 <w:sz w:val="20"/>
                 <w:szCs w:val="20"/>
               </w:rPr>
-              <w:t xml:space="preserve">Enquiries arrived through Facebook, referrals from other people, contact and text messages, or walk-ins in person</w:t>
+              <w:t xml:space="preserve">Inquiries arrived through Facebook, referrals from other people, contact and text messages, or walk-ins in person</w:t>
             </w:r>
           </w:p>
         </w:tc>
@@ -686,7 +686,7 @@
                 <w:sz w:val="20"/>
                 <w:szCs w:val="20"/>
               </w:rPr>
-              <w:t xml:space="preserve">No record of enquiries or which unit an enquiry was about</w:t>
+              <w:t xml:space="preserve">No record of inquiries or which unit an inquiry was about</w:t>
             </w:r>
           </w:p>
         </w:tc>
@@ -1218,7 +1218,7 @@
                 <w:sz w:val="20"/>
                 <w:szCs w:val="20"/>
               </w:rPr>
-              <w:t xml:space="preserve">Enquiries not recorded</w:t>
+              <w:t xml:space="preserve">Inquiries not recorded</w:t>
             </w:r>
           </w:p>
         </w:tc>
@@ -1251,7 +1251,7 @@
                 <w:sz w:val="20"/>
                 <w:szCs w:val="20"/>
               </w:rPr>
-              <w:t xml:space="preserve">Let the public view units and send an enquiry about a specific unit</w:t>
+              <w:t xml:space="preserve">Let the public view units and send an inquiry about a specific unit</w:t>
             </w:r>
           </w:p>
         </w:tc>
@@ -4256,7 +4256,7 @@
           <w:sz w:val="24"/>
           <w:szCs w:val="24"/>
         </w:rPr>
-        <w:t xml:space="preserve">Figure 9, in Crow's Foot notation, is the entity-relationship diagram drawn from the database's own catalogue on 5 October 2026: 21 tables, each with a primary key, and 37 foreign keys. Rooms and profiles are its two centres: every bill, payment, receipt, tenancy, repair request and inquiry belongs to one unit, and every tenancy, bill and payment to one person. The two ledgers are kept as the owner kept them. Several rules live in the database itself, so no screen or script can bypass them: one unit cannot have two active tenancies, one invoice number cannot be used twice for the same unit and month, a gateway reference cannot be recorded twice, and the 50% Share and the remitted amount are computed columns. Table 7A is an extract of the data dictionary for the table the owner reads most; the complete dictionary, every column of all 24 tables, is in Appendix N.</w:t>
+        <w:t xml:space="preserve">Figure 9, in Crow's Foot notation, is the entity-relationship diagram drawn from the database's own catalogue on 5 October 2026: 21 tables, each with a primary key, and 37 foreign keys. Rooms and profiles are its two centers: every bill, payment, receipt, tenancy, repair request and inquiry belongs to one unit, and every tenancy, bill and payment to one person. The two ledgers are kept as the owner kept them. Several rules live in the database itself, so no screen or script can bypass them: one unit cannot have two active tenancies, one invoice number cannot be used twice for the same unit and month, a gateway reference cannot be recorded twice, and the 50% Share and the remitted amount are computed columns. Table 7A is an extract of the data dictionary for the table the owner reads most; the complete dictionary, every column of all 24 tables, is in Appendix N.</w:t>
       </w:r>
     </w:p>
     <w:p>
@@ -20762,7 +20762,7 @@
           <w:sz w:val="24"/>
           <w:szCs w:val="24"/>
         </w:rPr>
-        <w:t xml:space="preserve">Every task the tenants attempted was completed, 31 of 34 attempts without help (91 per cent). Help was needed only at the start: two of the three tenants were helped through their first sign-in and one to find their unit and rent; everything else, from finding payments to reporting a repair and opening the GCash payment, was done alone in one to two minutes. The repairs they sent reached the owner at once, and she acted on them the same evening. Mia et al. (2024) name limited technical capacity as a barrier when small Philippine enterprises adopt digital tools; these results place it precisely, in the first two things a new user does. The tests that needed several tenants saving at once were not performed, because only two attended together; in the session in which the owner and two tenants used the system at the same time, every screen loaded, each tenant saw only their own unit, the owner's full year of Monthly Income opened in about three seconds, and no session affected another (Appendix M, Table M-22). On two phones the offline behavior matched Table 11A, except that the Android phone showed the "cannot tell whether it was saved" message after 60 to 80 seconds instead of 45; corrected on 1 October, it was on time when re-tested on that phone on 13 October 2026 (Table 23A).</w:t>
+        <w:t xml:space="preserve">Every task the tenants attempted was completed, 31 of 34 attempts without help (91 percent). Help was needed only at the start: two of the three tenants were helped through their first sign-in and one to find their unit and rent; everything else, from finding payments to reporting a repair and opening the GCash payment, was done alone in one to two minutes. The repairs they sent reached the owner at once, and she acted on them the same evening. Mia et al. (2024) name limited technical capacity as a barrier when small Philippine enterprises adopt digital tools; these results place it precisely, in the first two things a new user does. The tests that needed several tenants saving at once were not performed, because only two attended together; in the session in which the owner and two tenants used the system at the same time, every screen loaded, each tenant saw only their own unit, the owner's full year of Monthly Income opened in about three seconds, and no session affected another (Appendix M, Table M-22). On two phones the offline behavior matched Table 11A, except that the Android phone showed the "cannot tell whether it was saved" message after 60 to 80 seconds instead of 45; corrected on 1 October, it was on time when re-tested on that phone on 13 October 2026 (Table 23A).</w:t>
       </w:r>
     </w:p>
     <w:p>
@@ -22264,7 +22264,7 @@
           <w:sz w:val="24"/>
           <w:szCs w:val="24"/>
         </w:rPr>
-        <w:t xml:space="preserve">Every level passed at least 96 per cent of the tests executed, against the course standard of 90 per cent. The one failure, at the system level, was not critical, and no critical defect was found in any activity. Table 23A, in Section 4.4.6, lists the defects by activity, severity and disposition.</w:t>
+        <w:t xml:space="preserve">Every level passed at least 96 percent of the tests executed, against the course standard of 90 per cent. The one failure, at the system level, was not critical, and no critical defect was found in any activity. Table 23A, in Section 4.4.6, lists the defects by activity, severity and disposition.</w:t>
       </w:r>
     </w:p>
     <w:p>
@@ -22410,7 +22410,7 @@
         </w:trPr>
         <w:tc>
           <w:tcPr>
-            <w:tcW w:type="dxa" w:w="1821"/>
+            <w:tcW w:type="dxa" w:w="1822"/>
             <w:tcBorders>
               <w:top w:val="single" w:color="1A202C" w:sz="12"/>
               <w:left w:val="none" w:color="auto" w:sz="0"/>
@@ -22444,7 +22444,7 @@
         </w:tc>
         <w:tc>
           <w:tcPr>
-            <w:tcW w:type="dxa" w:w="2520"/>
+            <w:tcW w:type="dxa" w:w="2521"/>
             <w:tcBorders>
               <w:top w:val="single" w:color="1A202C" w:sz="12"/>
               <w:left w:val="none" w:color="auto" w:sz="0"/>
@@ -22478,7 +22478,7 @@
         </w:tc>
         <w:tc>
           <w:tcPr>
-            <w:tcW w:type="dxa" w:w="4299"/>
+            <w:tcW w:type="dxa" w:w="4297"/>
             <w:tcBorders>
               <w:top w:val="single" w:color="1A202C" w:sz="12"/>
               <w:left w:val="none" w:color="auto" w:sz="0"/>
@@ -22517,7 +22517,7 @@
         </w:trPr>
         <w:tc>
           <w:tcPr>
-            <w:tcW w:type="dxa" w:w="1821"/>
+            <w:tcW w:type="dxa" w:w="1822"/>
             <w:tcBorders>
               <w:top w:val="single" w:color="E2E8F0" w:sz="4"/>
               <w:left w:val="none" w:color="auto" w:sz="0"/>
@@ -22550,7 +22550,7 @@
         </w:tc>
         <w:tc>
           <w:tcPr>
-            <w:tcW w:type="dxa" w:w="2520"/>
+            <w:tcW w:type="dxa" w:w="2521"/>
             <w:tcBorders>
               <w:top w:val="single" w:color="E2E8F0" w:sz="4"/>
               <w:left w:val="none" w:color="auto" w:sz="0"/>
@@ -22583,7 +22583,7 @@
         </w:tc>
         <w:tc>
           <w:tcPr>
-            <w:tcW w:type="dxa" w:w="4299"/>
+            <w:tcW w:type="dxa" w:w="4297"/>
             <w:tcBorders>
               <w:top w:val="single" w:color="E2E8F0" w:sz="4"/>
               <w:left w:val="none" w:color="auto" w:sz="0"/>
@@ -22621,7 +22621,7 @@
         </w:trPr>
         <w:tc>
           <w:tcPr>
-            <w:tcW w:type="dxa" w:w="1821"/>
+            <w:tcW w:type="dxa" w:w="1822"/>
             <w:tcBorders>
               <w:top w:val="single" w:color="718096" w:sz="6"/>
               <w:left w:val="none" w:color="auto" w:sz="0"/>
@@ -22655,7 +22655,7 @@
         </w:tc>
         <w:tc>
           <w:tcPr>
-            <w:tcW w:type="dxa" w:w="2520"/>
+            <w:tcW w:type="dxa" w:w="2521"/>
             <w:tcBorders>
               <w:top w:val="single" w:color="718096" w:sz="6"/>
               <w:left w:val="none" w:color="auto" w:sz="0"/>
@@ -22689,7 +22689,7 @@
         </w:tc>
         <w:tc>
           <w:tcPr>
-            <w:tcW w:type="dxa" w:w="4299"/>
+            <w:tcW w:type="dxa" w:w="4297"/>
             <w:tcBorders>
               <w:top w:val="single" w:color="718096" w:sz="6"/>
               <w:left w:val="none" w:color="auto" w:sz="0"/>
@@ -22717,7 +22717,7 @@
                 <w:sz w:val="20"/>
                 <w:szCs w:val="20"/>
               </w:rPr>
-              <w:t xml:space="preserve">Measures from the tests of Section 4.3 (Table 7D); survey items assigned to sub-characteristics (Chapter 3, Table 4B); criteria: Table 13 for every mean, and for tests the course standard of at least 90 per cent passed with no critical defect open</w:t>
+              <w:t xml:space="preserve">Measures from the tests of Section 4.3 (Table 7D); survey items assigned to sub-characteristics (Chapter 3, Table 4B); criteria: Table 13 for every mean, and for tests the course standard of at least 90 percent passed with no critical defect open</w:t>
             </w:r>
           </w:p>
         </w:tc>
@@ -22728,7 +22728,7 @@
         </w:trPr>
         <w:tc>
           <w:tcPr>
-            <w:tcW w:type="dxa" w:w="1821"/>
+            <w:tcW w:type="dxa" w:w="1822"/>
             <w:tcBorders>
               <w:top w:val="single" w:color="E2E8F0" w:sz="4"/>
               <w:left w:val="none" w:color="auto" w:sz="0"/>
@@ -22761,7 +22761,7 @@
         </w:tc>
         <w:tc>
           <w:tcPr>
-            <w:tcW w:type="dxa" w:w="2520"/>
+            <w:tcW w:type="dxa" w:w="2521"/>
             <w:tcBorders>
               <w:top w:val="single" w:color="E2E8F0" w:sz="4"/>
               <w:left w:val="none" w:color="auto" w:sz="0"/>
@@ -22794,7 +22794,7 @@
         </w:tc>
         <w:tc>
           <w:tcPr>
-            <w:tcW w:type="dxa" w:w="4299"/>
+            <w:tcW w:type="dxa" w:w="4297"/>
             <w:tcBorders>
               <w:top w:val="single" w:color="E2E8F0" w:sz="4"/>
               <w:left w:val="none" w:color="auto" w:sz="0"/>
@@ -22832,7 +22832,7 @@
         </w:trPr>
         <w:tc>
           <w:tcPr>
-            <w:tcW w:type="dxa" w:w="1821"/>
+            <w:tcW w:type="dxa" w:w="1822"/>
             <w:tcBorders>
               <w:top w:val="single" w:color="E2E8F0" w:sz="4"/>
               <w:left w:val="none" w:color="auto" w:sz="0"/>
@@ -22865,7 +22865,7 @@
         </w:tc>
         <w:tc>
           <w:tcPr>
-            <w:tcW w:type="dxa" w:w="2520"/>
+            <w:tcW w:type="dxa" w:w="2521"/>
             <w:tcBorders>
               <w:top w:val="single" w:color="E2E8F0" w:sz="4"/>
               <w:left w:val="none" w:color="auto" w:sz="0"/>
@@ -22898,7 +22898,7 @@
         </w:tc>
         <w:tc>
           <w:tcPr>
-            <w:tcW w:type="dxa" w:w="4299"/>
+            <w:tcW w:type="dxa" w:w="4297"/>
             <w:tcBorders>
               <w:top w:val="single" w:color="E2E8F0" w:sz="4"/>
               <w:left w:val="none" w:color="auto" w:sz="0"/>
@@ -22936,7 +22936,7 @@
         </w:trPr>
         <w:tc>
           <w:tcPr>
-            <w:tcW w:type="dxa" w:w="1821"/>
+            <w:tcW w:type="dxa" w:w="1822"/>
             <w:tcBorders>
               <w:top w:val="single" w:color="E2E8F0" w:sz="4"/>
               <w:left w:val="none" w:color="auto" w:sz="0"/>
@@ -22969,7 +22969,7 @@
         </w:tc>
         <w:tc>
           <w:tcPr>
-            <w:tcW w:type="dxa" w:w="2520"/>
+            <w:tcW w:type="dxa" w:w="2521"/>
             <w:tcBorders>
               <w:top w:val="single" w:color="E2E8F0" w:sz="4"/>
               <w:left w:val="none" w:color="auto" w:sz="0"/>
@@ -23002,7 +23002,7 @@
         </w:tc>
         <w:tc>
           <w:tcPr>
-            <w:tcW w:type="dxa" w:w="4299"/>
+            <w:tcW w:type="dxa" w:w="4297"/>
             <w:tcBorders>
               <w:top w:val="single" w:color="E2E8F0" w:sz="4"/>
               <w:left w:val="none" w:color="auto" w:sz="0"/>
@@ -28371,7 +28371,7 @@
           <w:sz w:val="24"/>
           <w:szCs w:val="24"/>
         </w:rPr>
-        <w:t xml:space="preserve"> followed (4.86): every feature the objective names is present, and 96 to 100 per cent of the executed checks of correctness gave the right result. </w:t>
+        <w:t xml:space="preserve"> followed (4.86): every feature the objective names is present, and 96 to 100 percent of the executed checks of correctness gave the right result. </w:t>
       </w:r>
       <w:r>
         <w:rPr>
@@ -28651,7 +28651,7 @@
         </w:trPr>
         <w:tc>
           <w:tcPr>
-            <w:tcW w:type="dxa" w:w="1313"/>
+            <w:tcW w:type="dxa" w:w="1314"/>
             <w:tcBorders>
               <w:top w:val="single" w:color="1A202C" w:sz="12"/>
               <w:left w:val="none" w:color="auto" w:sz="0"/>
@@ -28787,7 +28787,7 @@
         </w:tc>
         <w:tc>
           <w:tcPr>
-            <w:tcW w:type="dxa" w:w="3381"/>
+            <w:tcW w:type="dxa" w:w="3380"/>
             <w:tcBorders>
               <w:top w:val="single" w:color="1A202C" w:sz="12"/>
               <w:left w:val="none" w:color="auto" w:sz="0"/>
@@ -28860,7 +28860,7 @@
         </w:trPr>
         <w:tc>
           <w:tcPr>
-            <w:tcW w:type="dxa" w:w="1313"/>
+            <w:tcW w:type="dxa" w:w="1314"/>
             <w:tcBorders>
               <w:top w:val="single" w:color="E2E8F0" w:sz="4"/>
               <w:left w:val="none" w:color="auto" w:sz="0"/>
@@ -28992,34 +28992,34 @@
         </w:tc>
         <w:tc>
           <w:tcPr>
-            <w:tcW w:type="dxa" w:w="3381"/>
-            <w:tcBorders>
-              <w:top w:val="single" w:color="E2E8F0" w:sz="4"/>
-              <w:left w:val="none" w:color="auto" w:sz="0"/>
-              <w:bottom w:val="single" w:color="E2E8F0" w:sz="4"/>
-              <w:right w:val="none" w:color="auto" w:sz="0"/>
-            </w:tcBorders>
-            <w:tcMar>
-              <w:top w:type="dxa" w:w="120"/>
-              <w:left w:type="dxa" w:w="160"/>
-              <w:bottom w:type="dxa" w:w="120"/>
-              <w:right w:type="dxa" w:w="160"/>
-            </w:tcMar>
-          </w:tcPr>
-          <w:p>
-            <w:pPr>
-              <w:spacing w:line="240" w:lineRule="auto"/>
-              <w:jc w:val="left"/>
-            </w:pPr>
-            <w:r>
-              <w:rPr>
-                <w:rFonts w:ascii="Arial" w:cs="Arial" w:eastAsia="Arial" w:hAnsi="Arial"/>
-                <w:b w:val="false"/>
-                <w:bCs w:val="false"/>
-                <w:sz w:val="20"/>
-                <w:szCs w:val="20"/>
-              </w:rPr>
-              <w:t xml:space="preserve">All six features present; 96 to 100 per cent of correctness checks passed</w:t>
+            <w:tcW w:type="dxa" w:w="3380"/>
+            <w:tcBorders>
+              <w:top w:val="single" w:color="E2E8F0" w:sz="4"/>
+              <w:left w:val="none" w:color="auto" w:sz="0"/>
+              <w:bottom w:val="single" w:color="E2E8F0" w:sz="4"/>
+              <w:right w:val="none" w:color="auto" w:sz="0"/>
+            </w:tcBorders>
+            <w:tcMar>
+              <w:top w:type="dxa" w:w="120"/>
+              <w:left w:type="dxa" w:w="160"/>
+              <w:bottom w:type="dxa" w:w="120"/>
+              <w:right w:type="dxa" w:w="160"/>
+            </w:tcMar>
+          </w:tcPr>
+          <w:p>
+            <w:pPr>
+              <w:spacing w:line="240" w:lineRule="auto"/>
+              <w:jc w:val="left"/>
+            </w:pPr>
+            <w:r>
+              <w:rPr>
+                <w:rFonts w:ascii="Arial" w:cs="Arial" w:eastAsia="Arial" w:hAnsi="Arial"/>
+                <w:b w:val="false"/>
+                <w:bCs w:val="false"/>
+                <w:sz w:val="20"/>
+                <w:szCs w:val="20"/>
+              </w:rPr>
+              <w:t xml:space="preserve">All six features present; 96 to 100 percent of correctness checks passed</w:t>
             </w:r>
           </w:p>
         </w:tc>
@@ -29063,7 +29063,7 @@
         </w:trPr>
         <w:tc>
           <w:tcPr>
-            <w:tcW w:type="dxa" w:w="1313"/>
+            <w:tcW w:type="dxa" w:w="1314"/>
             <w:tcBorders>
               <w:top w:val="single" w:color="E2E8F0" w:sz="4"/>
               <w:left w:val="none" w:color="auto" w:sz="0"/>
@@ -29195,7 +29195,7 @@
         </w:tc>
         <w:tc>
           <w:tcPr>
-            <w:tcW w:type="dxa" w:w="3381"/>
+            <w:tcW w:type="dxa" w:w="3380"/>
             <w:tcBorders>
               <w:top w:val="single" w:color="E2E8F0" w:sz="4"/>
               <w:left w:val="none" w:color="auto" w:sz="0"/>
@@ -29266,7 +29266,7 @@
         </w:trPr>
         <w:tc>
           <w:tcPr>
-            <w:tcW w:type="dxa" w:w="1313"/>
+            <w:tcW w:type="dxa" w:w="1314"/>
             <w:tcBorders>
               <w:top w:val="single" w:color="E2E8F0" w:sz="4"/>
               <w:left w:val="none" w:color="auto" w:sz="0"/>
@@ -29398,7 +29398,7 @@
         </w:tc>
         <w:tc>
           <w:tcPr>
-            <w:tcW w:type="dxa" w:w="3381"/>
+            <w:tcW w:type="dxa" w:w="3380"/>
             <w:tcBorders>
               <w:top w:val="single" w:color="E2E8F0" w:sz="4"/>
               <w:left w:val="none" w:color="auto" w:sz="0"/>
@@ -29469,7 +29469,7 @@
         </w:trPr>
         <w:tc>
           <w:tcPr>
-            <w:tcW w:type="dxa" w:w="1313"/>
+            <w:tcW w:type="dxa" w:w="1314"/>
             <w:tcBorders>
               <w:top w:val="single" w:color="E2E8F0" w:sz="4"/>
               <w:left w:val="none" w:color="auto" w:sz="0"/>
@@ -29601,34 +29601,34 @@
         </w:tc>
         <w:tc>
           <w:tcPr>
-            <w:tcW w:type="dxa" w:w="3381"/>
-            <w:tcBorders>
-              <w:top w:val="single" w:color="E2E8F0" w:sz="4"/>
-              <w:left w:val="none" w:color="auto" w:sz="0"/>
-              <w:bottom w:val="single" w:color="E2E8F0" w:sz="4"/>
-              <w:right w:val="none" w:color="auto" w:sz="0"/>
-            </w:tcBorders>
-            <w:tcMar>
-              <w:top w:type="dxa" w:w="120"/>
-              <w:left w:type="dxa" w:w="160"/>
-              <w:bottom w:type="dxa" w:w="120"/>
-              <w:right w:type="dxa" w:w="160"/>
-            </w:tcMar>
-          </w:tcPr>
-          <w:p>
-            <w:pPr>
-              <w:spacing w:line="240" w:lineRule="auto"/>
-              <w:jc w:val="left"/>
-            </w:pPr>
-            <w:r>
-              <w:rPr>
-                <w:rFonts w:ascii="Arial" w:cs="Arial" w:eastAsia="Arial" w:hAnsi="Arial"/>
-                <w:b w:val="false"/>
-                <w:bCs w:val="false"/>
-                <w:sz w:val="20"/>
-                <w:szCs w:val="20"/>
-              </w:rPr>
-              <w:t xml:space="preserve">91 per cent of tasks without help; 0 accessibility violations in 76 scans</w:t>
+            <w:tcW w:type="dxa" w:w="3380"/>
+            <w:tcBorders>
+              <w:top w:val="single" w:color="E2E8F0" w:sz="4"/>
+              <w:left w:val="none" w:color="auto" w:sz="0"/>
+              <w:bottom w:val="single" w:color="E2E8F0" w:sz="4"/>
+              <w:right w:val="none" w:color="auto" w:sz="0"/>
+            </w:tcBorders>
+            <w:tcMar>
+              <w:top w:type="dxa" w:w="120"/>
+              <w:left w:type="dxa" w:w="160"/>
+              <w:bottom w:type="dxa" w:w="120"/>
+              <w:right w:type="dxa" w:w="160"/>
+            </w:tcMar>
+          </w:tcPr>
+          <w:p>
+            <w:pPr>
+              <w:spacing w:line="240" w:lineRule="auto"/>
+              <w:jc w:val="left"/>
+            </w:pPr>
+            <w:r>
+              <w:rPr>
+                <w:rFonts w:ascii="Arial" w:cs="Arial" w:eastAsia="Arial" w:hAnsi="Arial"/>
+                <w:b w:val="false"/>
+                <w:bCs w:val="false"/>
+                <w:sz w:val="20"/>
+                <w:szCs w:val="20"/>
+              </w:rPr>
+              <w:t xml:space="preserve">91 percent of tasks without help; 0 accessibility violations in 76 scans</w:t>
             </w:r>
           </w:p>
         </w:tc>
@@ -29672,7 +29672,7 @@
         </w:trPr>
         <w:tc>
           <w:tcPr>
-            <w:tcW w:type="dxa" w:w="1313"/>
+            <w:tcW w:type="dxa" w:w="1314"/>
             <w:tcBorders>
               <w:top w:val="single" w:color="E2E8F0" w:sz="4"/>
               <w:left w:val="none" w:color="auto" w:sz="0"/>
@@ -29804,7 +29804,7 @@
         </w:tc>
         <w:tc>
           <w:tcPr>
-            <w:tcW w:type="dxa" w:w="3381"/>
+            <w:tcW w:type="dxa" w:w="3380"/>
             <w:tcBorders>
               <w:top w:val="single" w:color="E2E8F0" w:sz="4"/>
               <w:left w:val="none" w:color="auto" w:sz="0"/>
@@ -29875,7 +29875,7 @@
         </w:trPr>
         <w:tc>
           <w:tcPr>
-            <w:tcW w:type="dxa" w:w="1313"/>
+            <w:tcW w:type="dxa" w:w="1314"/>
             <w:tcBorders>
               <w:top w:val="single" w:color="E2E8F0" w:sz="4"/>
               <w:left w:val="none" w:color="auto" w:sz="0"/>
@@ -30007,7 +30007,7 @@
         </w:tc>
         <w:tc>
           <w:tcPr>
-            <w:tcW w:type="dxa" w:w="3381"/>
+            <w:tcW w:type="dxa" w:w="3380"/>
             <w:tcBorders>
               <w:top w:val="single" w:color="E2E8F0" w:sz="4"/>
               <w:left w:val="none" w:color="auto" w:sz="0"/>
@@ -30078,7 +30078,7 @@
         </w:trPr>
         <w:tc>
           <w:tcPr>
-            <w:tcW w:type="dxa" w:w="1313"/>
+            <w:tcW w:type="dxa" w:w="1314"/>
             <w:tcBorders>
               <w:top w:val="single" w:color="E2E8F0" w:sz="4"/>
               <w:left w:val="none" w:color="auto" w:sz="0"/>
@@ -30210,7 +30210,7 @@
         </w:tc>
         <w:tc>
           <w:tcPr>
-            <w:tcW w:type="dxa" w:w="3381"/>
+            <w:tcW w:type="dxa" w:w="3380"/>
             <w:tcBorders>
               <w:top w:val="single" w:color="E2E8F0" w:sz="4"/>
               <w:left w:val="none" w:color="auto" w:sz="0"/>
@@ -30281,7 +30281,7 @@
         </w:trPr>
         <w:tc>
           <w:tcPr>
-            <w:tcW w:type="dxa" w:w="1313"/>
+            <w:tcW w:type="dxa" w:w="1314"/>
             <w:tcBorders>
               <w:top w:val="single" w:color="E2E8F0" w:sz="4"/>
               <w:left w:val="none" w:color="auto" w:sz="0"/>
@@ -30413,7 +30413,7 @@
         </w:tc>
         <w:tc>
           <w:tcPr>
-            <w:tcW w:type="dxa" w:w="3381"/>
+            <w:tcW w:type="dxa" w:w="3380"/>
             <w:tcBorders>
               <w:top w:val="single" w:color="E2E8F0" w:sz="4"/>
               <w:left w:val="none" w:color="auto" w:sz="0"/>
@@ -30484,7 +30484,7 @@
         </w:trPr>
         <w:tc>
           <w:tcPr>
-            <w:tcW w:type="dxa" w:w="1313"/>
+            <w:tcW w:type="dxa" w:w="1314"/>
             <w:tcBorders>
               <w:top w:val="single" w:color="E2E8F0" w:sz="4"/>
               <w:left w:val="none" w:color="auto" w:sz="0"/>
@@ -30616,7 +30616,7 @@
         </w:tc>
         <w:tc>
           <w:tcPr>
-            <w:tcW w:type="dxa" w:w="3381"/>
+            <w:tcW w:type="dxa" w:w="3380"/>
             <w:tcBorders>
               <w:top w:val="single" w:color="E2E8F0" w:sz="4"/>
               <w:left w:val="none" w:color="auto" w:sz="0"/>

</xml_diff>

<commit_message>
Figure 3-1 redrawn; Chapter 4 52 to 50 pages; Appendix I from the first iteration's screens; Appendices A and B found empty
Figure 3-1 (Agile) redrawn with the six phases Chapter 3 names, 'Review and
Maintenance' included, and the slips ('best fit', 'flowchart use') fixed.

Chapter 4: Tables 7D, 11A, 11B and 11F moved word for word to Appendix M
(M-23 to M-26), each leaving a sentence with its result; Table 13 removed, being
Chapter 3's Table 4A again. Word: 52 to 50 pages; the rest is the twelve
figures the guide expects in the body.

Appendix I was listed as 'in the manuscript', but the 18 September PDF holds no
appendix past B's heading. It now shows four screens of 28 August 2026 with
sample tenants. The first iteration's ledger and overview are left out: they
name a recipient for the 50% Share (BR-035) and carry the owner's figures.
Appendices A and B are headings only; their scans are now P10.

Co-Authored-By: Claude Opus 5.5 <noreply@anthropic.com>
</commit_message>
<xml_diff>
--- a/docs/FINAL MANUSCRIPT/CHAPTER_4_RESULTS_AND_DISCUSSION.docx
+++ b/docs/FINAL MANUSCRIPT/CHAPTER_4_RESULTS_AND_DISCUSSION.docx
@@ -11446,894 +11446,8 @@
           <w:sz w:val="24"/>
           <w:szCs w:val="24"/>
         </w:rPr>
-        <w:t xml:space="preserve">. A test written for one quality often measures others, so Table 7D lists each test activity with every characteristic it measured. The measures are brought together by characteristic in Section 4.4.</w:t>
+        <w:t xml:space="preserve">. A test written for one quality often measures others, so each test was assigned in advance to the sub-characteristics it measures (Chapter 3, Table 4B); Appendix M, Table 7D lists them by test activity. The measures are brought together by characteristic in Section 4.4.</w:t>
       </w:r>
-    </w:p>
-    <w:p>
-      <w:pPr>
-        <w:keepNext/>
-        <w:spacing w:after="120" w:before="360" w:line="480" w:lineRule="auto"/>
-        <w:jc w:val="left"/>
-      </w:pPr>
-      <w:r>
-        <w:rPr>
-          <w:rFonts w:ascii="Arial" w:cs="Arial" w:eastAsia="Arial" w:hAnsi="Arial"/>
-          <w:b/>
-          <w:bCs/>
-          <w:sz w:val="24"/>
-          <w:szCs w:val="24"/>
-        </w:rPr>
-        <w:t xml:space="preserve">Table 7D.</w:t>
-      </w:r>
-      <w:r>
-        <w:rPr>
-          <w:rFonts w:ascii="Arial" w:cs="Arial" w:eastAsia="Arial" w:hAnsi="Arial"/>
-          <w:b/>
-          <w:bCs/>
-          <w:sz w:val="24"/>
-          <w:szCs w:val="24"/>
-        </w:rPr>
-        <w:t xml:space="preserve"> Test activities and the ISO/IEC 25010:2011 characteristics they measured</w:t>
-      </w:r>
-    </w:p>
-    <w:tbl>
-      <w:tblPr>
-        <w:tblW w:type="dxa" w:w="8640"/>
-        <w:tblBorders>
-          <w:top w:val="single" w:color="auto" w:sz="4"/>
-          <w:left w:val="single" w:color="auto" w:sz="4"/>
-          <w:bottom w:val="single" w:color="auto" w:sz="4"/>
-          <w:right w:val="single" w:color="auto" w:sz="4"/>
-          <w:insideH w:val="single" w:color="auto" w:sz="4"/>
-          <w:insideV w:val="single" w:color="auto" w:sz="4"/>
-        </w:tblBorders>
-      </w:tblPr>
-      <w:tblGrid>
-        <w:gridCol w:w="100"/>
-        <w:gridCol w:w="100"/>
-        <w:gridCol w:w="100"/>
-      </w:tblGrid>
-      <w:tr>
-        <w:trPr>
-          <w:cantSplit/>
-          <w:tblHeader/>
-        </w:trPr>
-        <w:tc>
-          <w:tcPr>
-            <w:tcW w:type="dxa" w:w="2733"/>
-            <w:tcBorders>
-              <w:top w:val="single" w:color="1A202C" w:sz="12"/>
-              <w:left w:val="none" w:color="auto" w:sz="0"/>
-              <w:bottom w:val="single" w:color="1A202C" w:sz="12"/>
-              <w:right w:val="none" w:color="auto" w:sz="0"/>
-            </w:tcBorders>
-            <w:shd w:fill="F8FAFC"/>
-            <w:tcMar>
-              <w:top w:type="dxa" w:w="140"/>
-              <w:left w:type="dxa" w:w="160"/>
-              <w:bottom w:type="dxa" w:w="140"/>
-              <w:right w:type="dxa" w:w="160"/>
-            </w:tcMar>
-          </w:tcPr>
-          <w:p>
-            <w:pPr>
-              <w:spacing w:line="240" w:lineRule="auto"/>
-              <w:jc w:val="left"/>
-            </w:pPr>
-            <w:r>
-              <w:rPr>
-                <w:rFonts w:ascii="Arial" w:cs="Arial" w:eastAsia="Arial" w:hAnsi="Arial"/>
-                <w:b/>
-                <w:bCs/>
-                <w:sz w:val="20"/>
-                <w:szCs w:val="20"/>
-              </w:rPr>
-              <w:t xml:space="preserve">Test activity (Section)</w:t>
-            </w:r>
-          </w:p>
-        </w:tc>
-        <w:tc>
-          <w:tcPr>
-            <w:tcW w:type="dxa" w:w="1485"/>
-            <w:tcBorders>
-              <w:top w:val="single" w:color="1A202C" w:sz="12"/>
-              <w:left w:val="none" w:color="auto" w:sz="0"/>
-              <w:bottom w:val="single" w:color="1A202C" w:sz="12"/>
-              <w:right w:val="none" w:color="auto" w:sz="0"/>
-            </w:tcBorders>
-            <w:shd w:fill="F8FAFC"/>
-            <w:tcMar>
-              <w:top w:type="dxa" w:w="140"/>
-              <w:left w:type="dxa" w:w="160"/>
-              <w:bottom w:type="dxa" w:w="140"/>
-              <w:right w:type="dxa" w:w="160"/>
-            </w:tcMar>
-          </w:tcPr>
-          <w:p>
-            <w:pPr>
-              <w:spacing w:line="240" w:lineRule="auto"/>
-              <w:jc w:val="center"/>
-            </w:pPr>
-            <w:r>
-              <w:rPr>
-                <w:rFonts w:ascii="Arial" w:cs="Arial" w:eastAsia="Arial" w:hAnsi="Arial"/>
-                <w:b/>
-                <w:bCs/>
-                <w:sz w:val="20"/>
-                <w:szCs w:val="20"/>
-              </w:rPr>
-              <w:t xml:space="preserve">Test level</w:t>
-            </w:r>
-          </w:p>
-        </w:tc>
-        <w:tc>
-          <w:tcPr>
-            <w:tcW w:type="dxa" w:w="4422"/>
-            <w:tcBorders>
-              <w:top w:val="single" w:color="1A202C" w:sz="12"/>
-              <w:left w:val="none" w:color="auto" w:sz="0"/>
-              <w:bottom w:val="single" w:color="1A202C" w:sz="12"/>
-              <w:right w:val="none" w:color="auto" w:sz="0"/>
-            </w:tcBorders>
-            <w:shd w:fill="F8FAFC"/>
-            <w:tcMar>
-              <w:top w:type="dxa" w:w="140"/>
-              <w:left w:type="dxa" w:w="160"/>
-              <w:bottom w:type="dxa" w:w="140"/>
-              <w:right w:type="dxa" w:w="160"/>
-            </w:tcMar>
-          </w:tcPr>
-          <w:p>
-            <w:pPr>
-              <w:spacing w:line="240" w:lineRule="auto"/>
-              <w:jc w:val="center"/>
-            </w:pPr>
-            <w:r>
-              <w:rPr>
-                <w:rFonts w:ascii="Arial" w:cs="Arial" w:eastAsia="Arial" w:hAnsi="Arial"/>
-                <w:b/>
-                <w:bCs/>
-                <w:sz w:val="20"/>
-                <w:szCs w:val="20"/>
-              </w:rPr>
-              <w:t xml:space="preserve">Characteristics measured (sub-characteristics)</w:t>
-            </w:r>
-          </w:p>
-        </w:tc>
-      </w:tr>
-      <w:tr>
-        <w:trPr>
-          <w:cantSplit/>
-        </w:trPr>
-        <w:tc>
-          <w:tcPr>
-            <w:tcW w:type="dxa" w:w="2733"/>
-            <w:tcBorders>
-              <w:top w:val="single" w:color="E2E8F0" w:sz="4"/>
-              <w:left w:val="none" w:color="auto" w:sz="0"/>
-              <w:bottom w:val="single" w:color="E2E8F0" w:sz="4"/>
-              <w:right w:val="none" w:color="auto" w:sz="0"/>
-            </w:tcBorders>
-            <w:tcMar>
-              <w:top w:type="dxa" w:w="120"/>
-              <w:left w:type="dxa" w:w="160"/>
-              <w:bottom w:type="dxa" w:w="120"/>
-              <w:right w:type="dxa" w:w="160"/>
-            </w:tcMar>
-          </w:tcPr>
-          <w:p>
-            <w:pPr>
-              <w:spacing w:line="240" w:lineRule="auto"/>
-              <w:jc w:val="left"/>
-            </w:pPr>
-            <w:r>
-              <w:rPr>
-                <w:rFonts w:ascii="Arial" w:cs="Arial" w:eastAsia="Arial" w:hAnsi="Arial"/>
-                <w:b w:val="false"/>
-                <w:bCs w:val="false"/>
-                <w:sz w:val="20"/>
-                <w:szCs w:val="20"/>
-              </w:rPr>
-              <w:t xml:space="preserve">Automated verification (4.3.1)</w:t>
-            </w:r>
-          </w:p>
-        </w:tc>
-        <w:tc>
-          <w:tcPr>
-            <w:tcW w:type="dxa" w:w="1485"/>
-            <w:tcBorders>
-              <w:top w:val="single" w:color="E2E8F0" w:sz="4"/>
-              <w:left w:val="none" w:color="auto" w:sz="0"/>
-              <w:bottom w:val="single" w:color="E2E8F0" w:sz="4"/>
-              <w:right w:val="none" w:color="auto" w:sz="0"/>
-            </w:tcBorders>
-            <w:tcMar>
-              <w:top w:type="dxa" w:w="120"/>
-              <w:left w:type="dxa" w:w="160"/>
-              <w:bottom w:type="dxa" w:w="120"/>
-              <w:right w:type="dxa" w:w="160"/>
-            </w:tcMar>
-          </w:tcPr>
-          <w:p>
-            <w:pPr>
-              <w:spacing w:line="240" w:lineRule="auto"/>
-              <w:jc w:val="left"/>
-            </w:pPr>
-            <w:r>
-              <w:rPr>
-                <w:rFonts w:ascii="Arial" w:cs="Arial" w:eastAsia="Arial" w:hAnsi="Arial"/>
-                <w:b w:val="false"/>
-                <w:bCs w:val="false"/>
-                <w:sz w:val="20"/>
-                <w:szCs w:val="20"/>
-              </w:rPr>
-              <w:t xml:space="preserve">Unit and integration</w:t>
-            </w:r>
-          </w:p>
-        </w:tc>
-        <w:tc>
-          <w:tcPr>
-            <w:tcW w:type="dxa" w:w="4422"/>
-            <w:tcBorders>
-              <w:top w:val="single" w:color="E2E8F0" w:sz="4"/>
-              <w:left w:val="none" w:color="auto" w:sz="0"/>
-              <w:bottom w:val="single" w:color="E2E8F0" w:sz="4"/>
-              <w:right w:val="none" w:color="auto" w:sz="0"/>
-            </w:tcBorders>
-            <w:tcMar>
-              <w:top w:type="dxa" w:w="120"/>
-              <w:left w:type="dxa" w:w="160"/>
-              <w:bottom w:type="dxa" w:w="120"/>
-              <w:right w:type="dxa" w:w="160"/>
-            </w:tcMar>
-          </w:tcPr>
-          <w:p>
-            <w:pPr>
-              <w:spacing w:line="240" w:lineRule="auto"/>
-              <w:jc w:val="left"/>
-            </w:pPr>
-            <w:r>
-              <w:rPr>
-                <w:rFonts w:ascii="Arial" w:cs="Arial" w:eastAsia="Arial" w:hAnsi="Arial"/>
-                <w:b w:val="false"/>
-                <w:bCs w:val="false"/>
-                <w:sz w:val="20"/>
-                <w:szCs w:val="20"/>
-              </w:rPr>
-              <w:t xml:space="preserve">Functional Suitability (correctness); Security (confidentiality, integrity, authenticity); Compatibility (interoperability); Maintainability (testability)</w:t>
-            </w:r>
-          </w:p>
-        </w:tc>
-      </w:tr>
-      <w:tr>
-        <w:trPr>
-          <w:cantSplit/>
-        </w:trPr>
-        <w:tc>
-          <w:tcPr>
-            <w:tcW w:type="dxa" w:w="2733"/>
-            <w:tcBorders>
-              <w:top w:val="single" w:color="E2E8F0" w:sz="4"/>
-              <w:left w:val="none" w:color="auto" w:sz="0"/>
-              <w:bottom w:val="single" w:color="E2E8F0" w:sz="4"/>
-              <w:right w:val="none" w:color="auto" w:sz="0"/>
-            </w:tcBorders>
-            <w:tcMar>
-              <w:top w:type="dxa" w:w="120"/>
-              <w:left w:type="dxa" w:w="160"/>
-              <w:bottom w:type="dxa" w:w="120"/>
-              <w:right w:type="dxa" w:w="160"/>
-            </w:tcMar>
-          </w:tcPr>
-          <w:p>
-            <w:pPr>
-              <w:spacing w:line="240" w:lineRule="auto"/>
-              <w:jc w:val="left"/>
-            </w:pPr>
-            <w:r>
-              <w:rPr>
-                <w:rFonts w:ascii="Arial" w:cs="Arial" w:eastAsia="Arial" w:hAnsi="Arial"/>
-                <w:b w:val="false"/>
-                <w:bCs w:val="false"/>
-                <w:sz w:val="20"/>
-                <w:szCs w:val="20"/>
-              </w:rPr>
-              <w:t xml:space="preserve">Use in the live environment (4.3.2)</w:t>
-            </w:r>
-          </w:p>
-        </w:tc>
-        <w:tc>
-          <w:tcPr>
-            <w:tcW w:type="dxa" w:w="1485"/>
-            <w:tcBorders>
-              <w:top w:val="single" w:color="E2E8F0" w:sz="4"/>
-              <w:left w:val="none" w:color="auto" w:sz="0"/>
-              <w:bottom w:val="single" w:color="E2E8F0" w:sz="4"/>
-              <w:right w:val="none" w:color="auto" w:sz="0"/>
-            </w:tcBorders>
-            <w:tcMar>
-              <w:top w:type="dxa" w:w="120"/>
-              <w:left w:type="dxa" w:w="160"/>
-              <w:bottom w:type="dxa" w:w="120"/>
-              <w:right w:type="dxa" w:w="160"/>
-            </w:tcMar>
-          </w:tcPr>
-          <w:p>
-            <w:pPr>
-              <w:spacing w:line="240" w:lineRule="auto"/>
-              <w:jc w:val="left"/>
-            </w:pPr>
-            <w:r>
-              <w:rPr>
-                <w:rFonts w:ascii="Arial" w:cs="Arial" w:eastAsia="Arial" w:hAnsi="Arial"/>
-                <w:b w:val="false"/>
-                <w:bCs w:val="false"/>
-                <w:sz w:val="20"/>
-                <w:szCs w:val="20"/>
-              </w:rPr>
-              <w:t xml:space="preserve">System, in operation</w:t>
-            </w:r>
-          </w:p>
-        </w:tc>
-        <w:tc>
-          <w:tcPr>
-            <w:tcW w:type="dxa" w:w="4422"/>
-            <w:tcBorders>
-              <w:top w:val="single" w:color="E2E8F0" w:sz="4"/>
-              <w:left w:val="none" w:color="auto" w:sz="0"/>
-              <w:bottom w:val="single" w:color="E2E8F0" w:sz="4"/>
-              <w:right w:val="none" w:color="auto" w:sz="0"/>
-            </w:tcBorders>
-            <w:tcMar>
-              <w:top w:type="dxa" w:w="120"/>
-              <w:left w:type="dxa" w:w="160"/>
-              <w:bottom w:type="dxa" w:w="120"/>
-              <w:right w:type="dxa" w:w="160"/>
-            </w:tcMar>
-          </w:tcPr>
-          <w:p>
-            <w:pPr>
-              <w:spacing w:line="240" w:lineRule="auto"/>
-              <w:jc w:val="left"/>
-            </w:pPr>
-            <w:r>
-              <w:rPr>
-                <w:rFonts w:ascii="Arial" w:cs="Arial" w:eastAsia="Arial" w:hAnsi="Arial"/>
-                <w:b w:val="false"/>
-                <w:bCs w:val="false"/>
-                <w:sz w:val="20"/>
-                <w:szCs w:val="20"/>
-              </w:rPr>
-              <w:t xml:space="preserve">Functional Suitability (correctness); Compatibility (interoperability); Reliability (recoverability)</w:t>
-            </w:r>
-          </w:p>
-        </w:tc>
-      </w:tr>
-      <w:tr>
-        <w:trPr>
-          <w:cantSplit/>
-        </w:trPr>
-        <w:tc>
-          <w:tcPr>
-            <w:tcW w:type="dxa" w:w="2733"/>
-            <w:tcBorders>
-              <w:top w:val="single" w:color="E2E8F0" w:sz="4"/>
-              <w:left w:val="none" w:color="auto" w:sz="0"/>
-              <w:bottom w:val="single" w:color="E2E8F0" w:sz="4"/>
-              <w:right w:val="none" w:color="auto" w:sz="0"/>
-            </w:tcBorders>
-            <w:tcMar>
-              <w:top w:type="dxa" w:w="120"/>
-              <w:left w:type="dxa" w:w="160"/>
-              <w:bottom w:type="dxa" w:w="120"/>
-              <w:right w:type="dxa" w:w="160"/>
-            </w:tcMar>
-          </w:tcPr>
-          <w:p>
-            <w:pPr>
-              <w:spacing w:line="240" w:lineRule="auto"/>
-              <w:jc w:val="left"/>
-            </w:pPr>
-            <w:r>
-              <w:rPr>
-                <w:rFonts w:ascii="Arial" w:cs="Arial" w:eastAsia="Arial" w:hAnsi="Arial"/>
-                <w:b w:val="false"/>
-                <w:bCs w:val="false"/>
-                <w:sz w:val="20"/>
-                <w:szCs w:val="20"/>
-              </w:rPr>
-              <w:t xml:space="preserve">Screen-versus-database audit (4.3.3)</w:t>
-            </w:r>
-          </w:p>
-        </w:tc>
-        <w:tc>
-          <w:tcPr>
-            <w:tcW w:type="dxa" w:w="1485"/>
-            <w:tcBorders>
-              <w:top w:val="single" w:color="E2E8F0" w:sz="4"/>
-              <w:left w:val="none" w:color="auto" w:sz="0"/>
-              <w:bottom w:val="single" w:color="E2E8F0" w:sz="4"/>
-              <w:right w:val="none" w:color="auto" w:sz="0"/>
-            </w:tcBorders>
-            <w:tcMar>
-              <w:top w:type="dxa" w:w="120"/>
-              <w:left w:type="dxa" w:w="160"/>
-              <w:bottom w:type="dxa" w:w="120"/>
-              <w:right w:type="dxa" w:w="160"/>
-            </w:tcMar>
-          </w:tcPr>
-          <w:p>
-            <w:pPr>
-              <w:spacing w:line="240" w:lineRule="auto"/>
-              <w:jc w:val="left"/>
-            </w:pPr>
-            <w:r>
-              <w:rPr>
-                <w:rFonts w:ascii="Arial" w:cs="Arial" w:eastAsia="Arial" w:hAnsi="Arial"/>
-                <w:b w:val="false"/>
-                <w:bCs w:val="false"/>
-                <w:sz w:val="20"/>
-                <w:szCs w:val="20"/>
-              </w:rPr>
-              <w:t xml:space="preserve">System</w:t>
-            </w:r>
-          </w:p>
-        </w:tc>
-        <w:tc>
-          <w:tcPr>
-            <w:tcW w:type="dxa" w:w="4422"/>
-            <w:tcBorders>
-              <w:top w:val="single" w:color="E2E8F0" w:sz="4"/>
-              <w:left w:val="none" w:color="auto" w:sz="0"/>
-              <w:bottom w:val="single" w:color="E2E8F0" w:sz="4"/>
-              <w:right w:val="none" w:color="auto" w:sz="0"/>
-            </w:tcBorders>
-            <w:tcMar>
-              <w:top w:type="dxa" w:w="120"/>
-              <w:left w:type="dxa" w:w="160"/>
-              <w:bottom w:type="dxa" w:w="120"/>
-              <w:right w:type="dxa" w:w="160"/>
-            </w:tcMar>
-          </w:tcPr>
-          <w:p>
-            <w:pPr>
-              <w:spacing w:line="240" w:lineRule="auto"/>
-              <w:jc w:val="left"/>
-            </w:pPr>
-            <w:r>
-              <w:rPr>
-                <w:rFonts w:ascii="Arial" w:cs="Arial" w:eastAsia="Arial" w:hAnsi="Arial"/>
-                <w:b w:val="false"/>
-                <w:bCs w:val="false"/>
-                <w:sz w:val="20"/>
-                <w:szCs w:val="20"/>
-              </w:rPr>
-              <w:t xml:space="preserve">Functional Suitability (correctness); Reliability (maturity)</w:t>
-            </w:r>
-          </w:p>
-        </w:tc>
-      </w:tr>
-      <w:tr>
-        <w:trPr>
-          <w:cantSplit/>
-        </w:trPr>
-        <w:tc>
-          <w:tcPr>
-            <w:tcW w:type="dxa" w:w="2733"/>
-            <w:tcBorders>
-              <w:top w:val="single" w:color="E2E8F0" w:sz="4"/>
-              <w:left w:val="none" w:color="auto" w:sz="0"/>
-              <w:bottom w:val="single" w:color="E2E8F0" w:sz="4"/>
-              <w:right w:val="none" w:color="auto" w:sz="0"/>
-            </w:tcBorders>
-            <w:tcMar>
-              <w:top w:type="dxa" w:w="120"/>
-              <w:left w:type="dxa" w:w="160"/>
-              <w:bottom w:type="dxa" w:w="120"/>
-              <w:right w:type="dxa" w:w="160"/>
-            </w:tcMar>
-          </w:tcPr>
-          <w:p>
-            <w:pPr>
-              <w:spacing w:line="240" w:lineRule="auto"/>
-              <w:jc w:val="left"/>
-            </w:pPr>
-            <w:r>
-              <w:rPr>
-                <w:rFonts w:ascii="Arial" w:cs="Arial" w:eastAsia="Arial" w:hAnsi="Arial"/>
-                <w:b w:val="false"/>
-                <w:bCs w:val="false"/>
-                <w:sz w:val="20"/>
-                <w:szCs w:val="20"/>
-              </w:rPr>
-              <w:t xml:space="preserve">Functional walkthrough (4.3.4)</w:t>
-            </w:r>
-          </w:p>
-        </w:tc>
-        <w:tc>
-          <w:tcPr>
-            <w:tcW w:type="dxa" w:w="1485"/>
-            <w:tcBorders>
-              <w:top w:val="single" w:color="E2E8F0" w:sz="4"/>
-              <w:left w:val="none" w:color="auto" w:sz="0"/>
-              <w:bottom w:val="single" w:color="E2E8F0" w:sz="4"/>
-              <w:right w:val="none" w:color="auto" w:sz="0"/>
-            </w:tcBorders>
-            <w:tcMar>
-              <w:top w:type="dxa" w:w="120"/>
-              <w:left w:type="dxa" w:w="160"/>
-              <w:bottom w:type="dxa" w:w="120"/>
-              <w:right w:type="dxa" w:w="160"/>
-            </w:tcMar>
-          </w:tcPr>
-          <w:p>
-            <w:pPr>
-              <w:spacing w:line="240" w:lineRule="auto"/>
-              <w:jc w:val="left"/>
-            </w:pPr>
-            <w:r>
-              <w:rPr>
-                <w:rFonts w:ascii="Arial" w:cs="Arial" w:eastAsia="Arial" w:hAnsi="Arial"/>
-                <w:b w:val="false"/>
-                <w:bCs w:val="false"/>
-                <w:sz w:val="20"/>
-                <w:szCs w:val="20"/>
-              </w:rPr>
-              <w:t xml:space="preserve">System</w:t>
-            </w:r>
-          </w:p>
-        </w:tc>
-        <w:tc>
-          <w:tcPr>
-            <w:tcW w:type="dxa" w:w="4422"/>
-            <w:tcBorders>
-              <w:top w:val="single" w:color="E2E8F0" w:sz="4"/>
-              <w:left w:val="none" w:color="auto" w:sz="0"/>
-              <w:bottom w:val="single" w:color="E2E8F0" w:sz="4"/>
-              <w:right w:val="none" w:color="auto" w:sz="0"/>
-            </w:tcBorders>
-            <w:tcMar>
-              <w:top w:type="dxa" w:w="120"/>
-              <w:left w:type="dxa" w:w="160"/>
-              <w:bottom w:type="dxa" w:w="120"/>
-              <w:right w:type="dxa" w:w="160"/>
-            </w:tcMar>
-          </w:tcPr>
-          <w:p>
-            <w:pPr>
-              <w:spacing w:line="240" w:lineRule="auto"/>
-              <w:jc w:val="left"/>
-            </w:pPr>
-            <w:r>
-              <w:rPr>
-                <w:rFonts w:ascii="Arial" w:cs="Arial" w:eastAsia="Arial" w:hAnsi="Arial"/>
-                <w:b w:val="false"/>
-                <w:bCs w:val="false"/>
-                <w:sz w:val="20"/>
-                <w:szCs w:val="20"/>
-              </w:rPr>
-              <w:t xml:space="preserve">Functional Suitability (completeness, correctness); Usability (user error protection); Security (confidentiality); Reliability (fault tolerance)</w:t>
-            </w:r>
-          </w:p>
-        </w:tc>
-      </w:tr>
-      <w:tr>
-        <w:trPr>
-          <w:cantSplit/>
-        </w:trPr>
-        <w:tc>
-          <w:tcPr>
-            <w:tcW w:type="dxa" w:w="2733"/>
-            <w:tcBorders>
-              <w:top w:val="single" w:color="E2E8F0" w:sz="4"/>
-              <w:left w:val="none" w:color="auto" w:sz="0"/>
-              <w:bottom w:val="single" w:color="E2E8F0" w:sz="4"/>
-              <w:right w:val="none" w:color="auto" w:sz="0"/>
-            </w:tcBorders>
-            <w:tcMar>
-              <w:top w:type="dxa" w:w="120"/>
-              <w:left w:type="dxa" w:w="160"/>
-              <w:bottom w:type="dxa" w:w="120"/>
-              <w:right w:type="dxa" w:w="160"/>
-            </w:tcMar>
-          </w:tcPr>
-          <w:p>
-            <w:pPr>
-              <w:spacing w:line="240" w:lineRule="auto"/>
-              <w:jc w:val="left"/>
-            </w:pPr>
-            <w:r>
-              <w:rPr>
-                <w:rFonts w:ascii="Arial" w:cs="Arial" w:eastAsia="Arial" w:hAnsi="Arial"/>
-                <w:b w:val="false"/>
-                <w:bCs w:val="false"/>
-                <w:sz w:val="20"/>
-                <w:szCs w:val="20"/>
-              </w:rPr>
-              <w:t xml:space="preserve">Responsiveness (4.3.5)</w:t>
-            </w:r>
-          </w:p>
-        </w:tc>
-        <w:tc>
-          <w:tcPr>
-            <w:tcW w:type="dxa" w:w="1485"/>
-            <w:tcBorders>
-              <w:top w:val="single" w:color="E2E8F0" w:sz="4"/>
-              <w:left w:val="none" w:color="auto" w:sz="0"/>
-              <w:bottom w:val="single" w:color="E2E8F0" w:sz="4"/>
-              <w:right w:val="none" w:color="auto" w:sz="0"/>
-            </w:tcBorders>
-            <w:tcMar>
-              <w:top w:type="dxa" w:w="120"/>
-              <w:left w:type="dxa" w:w="160"/>
-              <w:bottom w:type="dxa" w:w="120"/>
-              <w:right w:type="dxa" w:w="160"/>
-            </w:tcMar>
-          </w:tcPr>
-          <w:p>
-            <w:pPr>
-              <w:spacing w:line="240" w:lineRule="auto"/>
-              <w:jc w:val="left"/>
-            </w:pPr>
-            <w:r>
-              <w:rPr>
-                <w:rFonts w:ascii="Arial" w:cs="Arial" w:eastAsia="Arial" w:hAnsi="Arial"/>
-                <w:b w:val="false"/>
-                <w:bCs w:val="false"/>
-                <w:sz w:val="20"/>
-                <w:szCs w:val="20"/>
-              </w:rPr>
-              <w:t xml:space="preserve">System</w:t>
-            </w:r>
-          </w:p>
-        </w:tc>
-        <w:tc>
-          <w:tcPr>
-            <w:tcW w:type="dxa" w:w="4422"/>
-            <w:tcBorders>
-              <w:top w:val="single" w:color="E2E8F0" w:sz="4"/>
-              <w:left w:val="none" w:color="auto" w:sz="0"/>
-              <w:bottom w:val="single" w:color="E2E8F0" w:sz="4"/>
-              <w:right w:val="none" w:color="auto" w:sz="0"/>
-            </w:tcBorders>
-            <w:tcMar>
-              <w:top w:type="dxa" w:w="120"/>
-              <w:left w:type="dxa" w:w="160"/>
-              <w:bottom w:type="dxa" w:w="120"/>
-              <w:right w:type="dxa" w:w="160"/>
-            </w:tcMar>
-          </w:tcPr>
-          <w:p>
-            <w:pPr>
-              <w:spacing w:line="240" w:lineRule="auto"/>
-              <w:jc w:val="left"/>
-            </w:pPr>
-            <w:r>
-              <w:rPr>
-                <w:rFonts w:ascii="Arial" w:cs="Arial" w:eastAsia="Arial" w:hAnsi="Arial"/>
-                <w:b w:val="false"/>
-                <w:bCs w:val="false"/>
-                <w:sz w:val="20"/>
-                <w:szCs w:val="20"/>
-              </w:rPr>
-              <w:t xml:space="preserve">Performance Efficiency (time behavior, resource utilization)</w:t>
-            </w:r>
-          </w:p>
-        </w:tc>
-      </w:tr>
-      <w:tr>
-        <w:trPr>
-          <w:cantSplit/>
-        </w:trPr>
-        <w:tc>
-          <w:tcPr>
-            <w:tcW w:type="dxa" w:w="2733"/>
-            <w:tcBorders>
-              <w:top w:val="single" w:color="E2E8F0" w:sz="4"/>
-              <w:left w:val="none" w:color="auto" w:sz="0"/>
-              <w:bottom w:val="single" w:color="E2E8F0" w:sz="4"/>
-              <w:right w:val="none" w:color="auto" w:sz="0"/>
-            </w:tcBorders>
-            <w:tcMar>
-              <w:top w:type="dxa" w:w="120"/>
-              <w:left w:type="dxa" w:w="160"/>
-              <w:bottom w:type="dxa" w:w="120"/>
-              <w:right w:type="dxa" w:w="160"/>
-            </w:tcMar>
-          </w:tcPr>
-          <w:p>
-            <w:pPr>
-              <w:spacing w:line="240" w:lineRule="auto"/>
-              <w:jc w:val="left"/>
-            </w:pPr>
-            <w:r>
-              <w:rPr>
-                <w:rFonts w:ascii="Arial" w:cs="Arial" w:eastAsia="Arial" w:hAnsi="Arial"/>
-                <w:b w:val="false"/>
-                <w:bCs w:val="false"/>
-                <w:sz w:val="20"/>
-                <w:szCs w:val="20"/>
-              </w:rPr>
-              <w:t xml:space="preserve">Offline, installation, weak connections and simultaneous users (4.3.6)</w:t>
-            </w:r>
-          </w:p>
-        </w:tc>
-        <w:tc>
-          <w:tcPr>
-            <w:tcW w:type="dxa" w:w="1485"/>
-            <w:tcBorders>
-              <w:top w:val="single" w:color="E2E8F0" w:sz="4"/>
-              <w:left w:val="none" w:color="auto" w:sz="0"/>
-              <w:bottom w:val="single" w:color="E2E8F0" w:sz="4"/>
-              <w:right w:val="none" w:color="auto" w:sz="0"/>
-            </w:tcBorders>
-            <w:tcMar>
-              <w:top w:type="dxa" w:w="120"/>
-              <w:left w:type="dxa" w:w="160"/>
-              <w:bottom w:type="dxa" w:w="120"/>
-              <w:right w:type="dxa" w:w="160"/>
-            </w:tcMar>
-          </w:tcPr>
-          <w:p>
-            <w:pPr>
-              <w:spacing w:line="240" w:lineRule="auto"/>
-              <w:jc w:val="left"/>
-            </w:pPr>
-            <w:r>
-              <w:rPr>
-                <w:rFonts w:ascii="Arial" w:cs="Arial" w:eastAsia="Arial" w:hAnsi="Arial"/>
-                <w:b w:val="false"/>
-                <w:bCs w:val="false"/>
-                <w:sz w:val="20"/>
-                <w:szCs w:val="20"/>
-              </w:rPr>
-              <w:t xml:space="preserve">System</w:t>
-            </w:r>
-          </w:p>
-        </w:tc>
-        <w:tc>
-          <w:tcPr>
-            <w:tcW w:type="dxa" w:w="4422"/>
-            <w:tcBorders>
-              <w:top w:val="single" w:color="E2E8F0" w:sz="4"/>
-              <w:left w:val="none" w:color="auto" w:sz="0"/>
-              <w:bottom w:val="single" w:color="E2E8F0" w:sz="4"/>
-              <w:right w:val="none" w:color="auto" w:sz="0"/>
-            </w:tcBorders>
-            <w:tcMar>
-              <w:top w:type="dxa" w:w="120"/>
-              <w:left w:type="dxa" w:w="160"/>
-              <w:bottom w:type="dxa" w:w="120"/>
-              <w:right w:type="dxa" w:w="160"/>
-            </w:tcMar>
-          </w:tcPr>
-          <w:p>
-            <w:pPr>
-              <w:spacing w:line="240" w:lineRule="auto"/>
-              <w:jc w:val="left"/>
-            </w:pPr>
-            <w:r>
-              <w:rPr>
-                <w:rFonts w:ascii="Arial" w:cs="Arial" w:eastAsia="Arial" w:hAnsi="Arial"/>
-                <w:b w:val="false"/>
-                <w:bCs w:val="false"/>
-                <w:sz w:val="20"/>
-                <w:szCs w:val="20"/>
-              </w:rPr>
-              <w:t xml:space="preserve">Reliability (fault tolerance); Performance Efficiency (capacity); Portability (installability, adaptability); Usability (accessibility)</w:t>
-            </w:r>
-          </w:p>
-        </w:tc>
-      </w:tr>
-      <w:tr>
-        <w:trPr>
-          <w:cantSplit/>
-        </w:trPr>
-        <w:tc>
-          <w:tcPr>
-            <w:tcW w:type="dxa" w:w="2733"/>
-            <w:tcBorders>
-              <w:top w:val="single" w:color="E2E8F0" w:sz="4"/>
-              <w:left w:val="none" w:color="auto" w:sz="0"/>
-              <w:bottom w:val="single" w:color="1A202C" w:sz="12"/>
-              <w:right w:val="none" w:color="auto" w:sz="0"/>
-            </w:tcBorders>
-            <w:tcMar>
-              <w:top w:type="dxa" w:w="120"/>
-              <w:left w:type="dxa" w:w="160"/>
-              <w:bottom w:type="dxa" w:w="120"/>
-              <w:right w:type="dxa" w:w="160"/>
-            </w:tcMar>
-          </w:tcPr>
-          <w:p>
-            <w:pPr>
-              <w:spacing w:line="240" w:lineRule="auto"/>
-              <w:jc w:val="left"/>
-            </w:pPr>
-            <w:r>
-              <w:rPr>
-                <w:rFonts w:ascii="Arial" w:cs="Arial" w:eastAsia="Arial" w:hAnsi="Arial"/>
-                <w:b w:val="false"/>
-                <w:bCs w:val="false"/>
-                <w:sz w:val="20"/>
-                <w:szCs w:val="20"/>
-              </w:rPr>
-              <w:t xml:space="preserve">User acceptance testing (4.3.7)</w:t>
-            </w:r>
-          </w:p>
-        </w:tc>
-        <w:tc>
-          <w:tcPr>
-            <w:tcW w:type="dxa" w:w="1485"/>
-            <w:tcBorders>
-              <w:top w:val="single" w:color="E2E8F0" w:sz="4"/>
-              <w:left w:val="none" w:color="auto" w:sz="0"/>
-              <w:bottom w:val="single" w:color="1A202C" w:sz="12"/>
-              <w:right w:val="none" w:color="auto" w:sz="0"/>
-            </w:tcBorders>
-            <w:tcMar>
-              <w:top w:type="dxa" w:w="120"/>
-              <w:left w:type="dxa" w:w="160"/>
-              <w:bottom w:type="dxa" w:w="120"/>
-              <w:right w:type="dxa" w:w="160"/>
-            </w:tcMar>
-          </w:tcPr>
-          <w:p>
-            <w:pPr>
-              <w:spacing w:line="240" w:lineRule="auto"/>
-              <w:jc w:val="left"/>
-            </w:pPr>
-            <w:r>
-              <w:rPr>
-                <w:rFonts w:ascii="Arial" w:cs="Arial" w:eastAsia="Arial" w:hAnsi="Arial"/>
-                <w:b w:val="false"/>
-                <w:bCs w:val="false"/>
-                <w:sz w:val="20"/>
-                <w:szCs w:val="20"/>
-              </w:rPr>
-              <w:t xml:space="preserve">Acceptance</w:t>
-            </w:r>
-          </w:p>
-        </w:tc>
-        <w:tc>
-          <w:tcPr>
-            <w:tcW w:type="dxa" w:w="4422"/>
-            <w:tcBorders>
-              <w:top w:val="single" w:color="E2E8F0" w:sz="4"/>
-              <w:left w:val="none" w:color="auto" w:sz="0"/>
-              <w:bottom w:val="single" w:color="1A202C" w:sz="12"/>
-              <w:right w:val="none" w:color="auto" w:sz="0"/>
-            </w:tcBorders>
-            <w:tcMar>
-              <w:top w:type="dxa" w:w="120"/>
-              <w:left w:type="dxa" w:w="160"/>
-              <w:bottom w:type="dxa" w:w="120"/>
-              <w:right w:type="dxa" w:w="160"/>
-            </w:tcMar>
-          </w:tcPr>
-          <w:p>
-            <w:pPr>
-              <w:spacing w:line="240" w:lineRule="auto"/>
-              <w:jc w:val="left"/>
-            </w:pPr>
-            <w:r>
-              <w:rPr>
-                <w:rFonts w:ascii="Arial" w:cs="Arial" w:eastAsia="Arial" w:hAnsi="Arial"/>
-                <w:b w:val="false"/>
-                <w:bCs w:val="false"/>
-                <w:sz w:val="20"/>
-                <w:szCs w:val="20"/>
-              </w:rPr>
-              <w:t xml:space="preserve">Quality in use (effectiveness, efficiency, context coverage); Usability (learnability, operability); Security (confidentiality)</w:t>
-            </w:r>
-          </w:p>
-        </w:tc>
-      </w:tr>
-    </w:tbl>
-    <w:p>
-      <w:pPr>
-        <w:spacing w:after="240" w:before="120" w:line="480" w:lineRule="auto"/>
-      </w:pPr>
     </w:p>
     <w:p>
       <w:pPr>
@@ -15788,1439 +14902,8 @@
           <w:sz w:val="24"/>
           <w:szCs w:val="24"/>
         </w:rPr>
-        <w:t xml:space="preserve">On 29 September 2026 the live system was measured with no connection, on a weak one, once installed, and with many requests at once, using an automated browser in phone emulation with every save blocked so that nothing was written to the owner's records. Table 11A gives the results without a connection and once installed. Table 11B gives those of a load test in which a script played several users at once, each pausing between requests as a person reading does; these were simulated users, not people (the owner and tenants together are reported in Section 4.3.7).</w:t>
+        <w:t xml:space="preserve">On 29 September 2026 the live system was measured with no connection, on a weak one, once installed, and with many requests at once, using an automated browser in phone emulation with every save blocked so that nothing was written to the owner's records. Without a connection, the installed application opened on all ten addresses tried, in about 1.5 seconds, showed no personal or financial data until sign-in, and said at once what could not be done offline; on a slow connection a returning visitor saw the units after 0.3 seconds instead of 4.6. In a load test a script played 12 simultaneous users on the public pages and 6 on the owner's records, each pausing between requests as a person reading does: none of the 1,085 and 285 requests failed. These were simulated users, not people (the owner and tenants together are reported in Section 4.3.7). Every result is in Appendix M, Tables 11A and 11B.</w:t>
       </w:r>
-    </w:p>
-    <w:p>
-      <w:pPr>
-        <w:keepNext/>
-        <w:spacing w:after="120" w:before="360" w:line="480" w:lineRule="auto"/>
-        <w:jc w:val="left"/>
-      </w:pPr>
-      <w:r>
-        <w:rPr>
-          <w:rFonts w:ascii="Arial" w:cs="Arial" w:eastAsia="Arial" w:hAnsi="Arial"/>
-          <w:b/>
-          <w:bCs/>
-          <w:sz w:val="24"/>
-          <w:szCs w:val="24"/>
-        </w:rPr>
-        <w:t xml:space="preserve">Table 11A.</w:t>
-      </w:r>
-      <w:r>
-        <w:rPr>
-          <w:rFonts w:ascii="Arial" w:cs="Arial" w:eastAsia="Arial" w:hAnsi="Arial"/>
-          <w:b/>
-          <w:bCs/>
-          <w:sz w:val="24"/>
-          <w:szCs w:val="24"/>
-        </w:rPr>
-        <w:t xml:space="preserve"> Offline and installation behavior (29 September 2026)</w:t>
-      </w:r>
-    </w:p>
-    <w:tbl>
-      <w:tblPr>
-        <w:tblW w:type="dxa" w:w="8640"/>
-        <w:tblBorders>
-          <w:top w:val="single" w:color="auto" w:sz="4"/>
-          <w:left w:val="single" w:color="auto" w:sz="4"/>
-          <w:bottom w:val="single" w:color="auto" w:sz="4"/>
-          <w:right w:val="single" w:color="auto" w:sz="4"/>
-          <w:insideH w:val="single" w:color="auto" w:sz="4"/>
-          <w:insideV w:val="single" w:color="auto" w:sz="4"/>
-        </w:tblBorders>
-      </w:tblPr>
-      <w:tblGrid>
-        <w:gridCol w:w="100"/>
-        <w:gridCol w:w="100"/>
-      </w:tblGrid>
-      <w:tr>
-        <w:trPr>
-          <w:cantSplit/>
-          <w:tblHeader/>
-        </w:trPr>
-        <w:tc>
-          <w:tcPr>
-            <w:tcW w:type="dxa" w:w="3789"/>
-            <w:tcBorders>
-              <w:top w:val="single" w:color="1A202C" w:sz="12"/>
-              <w:left w:val="none" w:color="auto" w:sz="0"/>
-              <w:bottom w:val="single" w:color="1A202C" w:sz="12"/>
-              <w:right w:val="none" w:color="auto" w:sz="0"/>
-            </w:tcBorders>
-            <w:shd w:fill="F8FAFC"/>
-            <w:tcMar>
-              <w:top w:type="dxa" w:w="140"/>
-              <w:left w:type="dxa" w:w="160"/>
-              <w:bottom w:type="dxa" w:w="140"/>
-              <w:right w:type="dxa" w:w="160"/>
-            </w:tcMar>
-          </w:tcPr>
-          <w:p>
-            <w:pPr>
-              <w:spacing w:line="240" w:lineRule="auto"/>
-              <w:jc w:val="left"/>
-            </w:pPr>
-            <w:r>
-              <w:rPr>
-                <w:rFonts w:ascii="Arial" w:cs="Arial" w:eastAsia="Arial" w:hAnsi="Arial"/>
-                <w:b/>
-                <w:bCs/>
-                <w:sz w:val="20"/>
-                <w:szCs w:val="20"/>
-              </w:rPr>
-              <w:t xml:space="preserve">Test</w:t>
-            </w:r>
-          </w:p>
-        </w:tc>
-        <w:tc>
-          <w:tcPr>
-            <w:tcW w:type="dxa" w:w="4851"/>
-            <w:tcBorders>
-              <w:top w:val="single" w:color="1A202C" w:sz="12"/>
-              <w:left w:val="none" w:color="auto" w:sz="0"/>
-              <w:bottom w:val="single" w:color="1A202C" w:sz="12"/>
-              <w:right w:val="none" w:color="auto" w:sz="0"/>
-            </w:tcBorders>
-            <w:shd w:fill="F8FAFC"/>
-            <w:tcMar>
-              <w:top w:type="dxa" w:w="140"/>
-              <w:left w:type="dxa" w:w="160"/>
-              <w:bottom w:type="dxa" w:w="140"/>
-              <w:right w:type="dxa" w:w="160"/>
-            </w:tcMar>
-          </w:tcPr>
-          <w:p>
-            <w:pPr>
-              <w:spacing w:line="240" w:lineRule="auto"/>
-              <w:jc w:val="center"/>
-            </w:pPr>
-            <w:r>
-              <w:rPr>
-                <w:rFonts w:ascii="Arial" w:cs="Arial" w:eastAsia="Arial" w:hAnsi="Arial"/>
-                <w:b/>
-                <w:bCs/>
-                <w:sz w:val="20"/>
-                <w:szCs w:val="20"/>
-              </w:rPr>
-              <w:t xml:space="preserve">Result</w:t>
-            </w:r>
-          </w:p>
-        </w:tc>
-      </w:tr>
-      <w:tr>
-        <w:trPr>
-          <w:cantSplit/>
-        </w:trPr>
-        <w:tc>
-          <w:tcPr>
-            <w:tcW w:type="dxa" w:w="3789"/>
-            <w:tcBorders>
-              <w:top w:val="single" w:color="E2E8F0" w:sz="4"/>
-              <w:left w:val="none" w:color="auto" w:sz="0"/>
-              <w:bottom w:val="single" w:color="E2E8F0" w:sz="4"/>
-              <w:right w:val="none" w:color="auto" w:sz="0"/>
-            </w:tcBorders>
-            <w:tcMar>
-              <w:top w:type="dxa" w:w="120"/>
-              <w:left w:type="dxa" w:w="160"/>
-              <w:bottom w:type="dxa" w:w="120"/>
-              <w:right w:type="dxa" w:w="160"/>
-            </w:tcMar>
-          </w:tcPr>
-          <w:p>
-            <w:pPr>
-              <w:spacing w:line="240" w:lineRule="auto"/>
-              <w:jc w:val="left"/>
-            </w:pPr>
-            <w:r>
-              <w:rPr>
-                <w:rFonts w:ascii="Arial" w:cs="Arial" w:eastAsia="Arial" w:hAnsi="Arial"/>
-                <w:b w:val="false"/>
-                <w:bCs w:val="false"/>
-                <w:sz w:val="20"/>
-                <w:szCs w:val="20"/>
-              </w:rPr>
-              <w:t xml:space="preserve">Installation requirements (manifest, service worker, icons)</w:t>
-            </w:r>
-          </w:p>
-        </w:tc>
-        <w:tc>
-          <w:tcPr>
-            <w:tcW w:type="dxa" w:w="4851"/>
-            <w:tcBorders>
-              <w:top w:val="single" w:color="E2E8F0" w:sz="4"/>
-              <w:left w:val="none" w:color="auto" w:sz="0"/>
-              <w:bottom w:val="single" w:color="E2E8F0" w:sz="4"/>
-              <w:right w:val="none" w:color="auto" w:sz="0"/>
-            </w:tcBorders>
-            <w:tcMar>
-              <w:top w:type="dxa" w:w="120"/>
-              <w:left w:type="dxa" w:w="160"/>
-              <w:bottom w:type="dxa" w:w="120"/>
-              <w:right w:type="dxa" w:w="160"/>
-            </w:tcMar>
-          </w:tcPr>
-          <w:p>
-            <w:pPr>
-              <w:spacing w:line="240" w:lineRule="auto"/>
-              <w:jc w:val="left"/>
-            </w:pPr>
-            <w:r>
-              <w:rPr>
-                <w:rFonts w:ascii="Arial" w:cs="Arial" w:eastAsia="Arial" w:hAnsi="Arial"/>
-                <w:b w:val="false"/>
-                <w:bCs w:val="false"/>
-                <w:sz w:val="20"/>
-                <w:szCs w:val="20"/>
-              </w:rPr>
-              <w:t xml:space="preserve">Met; the service worker keeps 67 application files on the device after the first visit</w:t>
-            </w:r>
-          </w:p>
-        </w:tc>
-      </w:tr>
-      <w:tr>
-        <w:trPr>
-          <w:cantSplit/>
-        </w:trPr>
-        <w:tc>
-          <w:tcPr>
-            <w:tcW w:type="dxa" w:w="3789"/>
-            <w:tcBorders>
-              <w:top w:val="single" w:color="E2E8F0" w:sz="4"/>
-              <w:left w:val="none" w:color="auto" w:sz="0"/>
-              <w:bottom w:val="single" w:color="E2E8F0" w:sz="4"/>
-              <w:right w:val="none" w:color="auto" w:sz="0"/>
-            </w:tcBorders>
-            <w:tcMar>
-              <w:top w:type="dxa" w:w="120"/>
-              <w:left w:type="dxa" w:w="160"/>
-              <w:bottom w:type="dxa" w:w="120"/>
-              <w:right w:type="dxa" w:w="160"/>
-            </w:tcMar>
-          </w:tcPr>
-          <w:p>
-            <w:pPr>
-              <w:spacing w:line="240" w:lineRule="auto"/>
-              <w:jc w:val="left"/>
-            </w:pPr>
-            <w:r>
-              <w:rPr>
-                <w:rFonts w:ascii="Arial" w:cs="Arial" w:eastAsia="Arial" w:hAnsi="Arial"/>
-                <w:b w:val="false"/>
-                <w:bCs w:val="false"/>
-                <w:sz w:val="20"/>
-                <w:szCs w:val="20"/>
-              </w:rPr>
-              <w:t xml:space="preserve">Opening ten addresses with no connection</w:t>
-            </w:r>
-          </w:p>
-        </w:tc>
-        <w:tc>
-          <w:tcPr>
-            <w:tcW w:type="dxa" w:w="4851"/>
-            <w:tcBorders>
-              <w:top w:val="single" w:color="E2E8F0" w:sz="4"/>
-              <w:left w:val="none" w:color="auto" w:sz="0"/>
-              <w:bottom w:val="single" w:color="E2E8F0" w:sz="4"/>
-              <w:right w:val="none" w:color="auto" w:sz="0"/>
-            </w:tcBorders>
-            <w:tcMar>
-              <w:top w:type="dxa" w:w="120"/>
-              <w:left w:type="dxa" w:w="160"/>
-              <w:bottom w:type="dxa" w:w="120"/>
-              <w:right w:type="dxa" w:w="160"/>
-            </w:tcMar>
-          </w:tcPr>
-          <w:p>
-            <w:pPr>
-              <w:spacing w:line="240" w:lineRule="auto"/>
-              <w:jc w:val="left"/>
-            </w:pPr>
-            <w:r>
-              <w:rPr>
-                <w:rFonts w:ascii="Arial" w:cs="Arial" w:eastAsia="Arial" w:hAnsi="Arial"/>
-                <w:b w:val="false"/>
-                <w:bCs w:val="false"/>
-                <w:sz w:val="20"/>
-                <w:szCs w:val="20"/>
-              </w:rPr>
-              <w:t xml:space="preserve">The application opened on all ten in about 1.5 seconds instead of the browser's "no internet" page</w:t>
-            </w:r>
-          </w:p>
-        </w:tc>
-      </w:tr>
-      <w:tr>
-        <w:trPr>
-          <w:cantSplit/>
-        </w:trPr>
-        <w:tc>
-          <w:tcPr>
-            <w:tcW w:type="dxa" w:w="3789"/>
-            <w:tcBorders>
-              <w:top w:val="single" w:color="E2E8F0" w:sz="4"/>
-              <w:left w:val="none" w:color="auto" w:sz="0"/>
-              <w:bottom w:val="single" w:color="E2E8F0" w:sz="4"/>
-              <w:right w:val="none" w:color="auto" w:sz="0"/>
-            </w:tcBorders>
-            <w:tcMar>
-              <w:top w:type="dxa" w:w="120"/>
-              <w:left w:type="dxa" w:w="160"/>
-              <w:bottom w:type="dxa" w:w="120"/>
-              <w:right w:type="dxa" w:w="160"/>
-            </w:tcMar>
-          </w:tcPr>
-          <w:p>
-            <w:pPr>
-              <w:spacing w:line="240" w:lineRule="auto"/>
-              <w:jc w:val="left"/>
-            </w:pPr>
-            <w:r>
-              <w:rPr>
-                <w:rFonts w:ascii="Arial" w:cs="Arial" w:eastAsia="Arial" w:hAnsi="Arial"/>
-                <w:b w:val="false"/>
-                <w:bCs w:val="false"/>
-                <w:sz w:val="20"/>
-                <w:szCs w:val="20"/>
-              </w:rPr>
-              <w:t xml:space="preserve">Tenant and administrator pages with no connection, signed out</w:t>
-            </w:r>
-          </w:p>
-        </w:tc>
-        <w:tc>
-          <w:tcPr>
-            <w:tcW w:type="dxa" w:w="4851"/>
-            <w:tcBorders>
-              <w:top w:val="single" w:color="E2E8F0" w:sz="4"/>
-              <w:left w:val="none" w:color="auto" w:sz="0"/>
-              <w:bottom w:val="single" w:color="E2E8F0" w:sz="4"/>
-              <w:right w:val="none" w:color="auto" w:sz="0"/>
-            </w:tcBorders>
-            <w:tcMar>
-              <w:top w:type="dxa" w:w="120"/>
-              <w:left w:type="dxa" w:w="160"/>
-              <w:bottom w:type="dxa" w:w="120"/>
-              <w:right w:type="dxa" w:w="160"/>
-            </w:tcMar>
-          </w:tcPr>
-          <w:p>
-            <w:pPr>
-              <w:spacing w:line="240" w:lineRule="auto"/>
-              <w:jc w:val="left"/>
-            </w:pPr>
-            <w:r>
-              <w:rPr>
-                <w:rFonts w:ascii="Arial" w:cs="Arial" w:eastAsia="Arial" w:hAnsi="Arial"/>
-                <w:b w:val="false"/>
-                <w:bCs w:val="false"/>
-                <w:sz w:val="20"/>
-                <w:szCs w:val="20"/>
-              </w:rPr>
-              <w:t xml:space="preserve">The application opened and asked for sign-in; no personal or financial data was shown</w:t>
-            </w:r>
-          </w:p>
-        </w:tc>
-      </w:tr>
-      <w:tr>
-        <w:trPr>
-          <w:cantSplit/>
-        </w:trPr>
-        <w:tc>
-          <w:tcPr>
-            <w:tcW w:type="dxa" w:w="3789"/>
-            <w:tcBorders>
-              <w:top w:val="single" w:color="E2E8F0" w:sz="4"/>
-              <w:left w:val="none" w:color="auto" w:sz="0"/>
-              <w:bottom w:val="single" w:color="E2E8F0" w:sz="4"/>
-              <w:right w:val="none" w:color="auto" w:sz="0"/>
-            </w:tcBorders>
-            <w:tcMar>
-              <w:top w:type="dxa" w:w="120"/>
-              <w:left w:type="dxa" w:w="160"/>
-              <w:bottom w:type="dxa" w:w="120"/>
-              <w:right w:type="dxa" w:w="160"/>
-            </w:tcMar>
-          </w:tcPr>
-          <w:p>
-            <w:pPr>
-              <w:spacing w:line="240" w:lineRule="auto"/>
-              <w:jc w:val="left"/>
-            </w:pPr>
-            <w:r>
-              <w:rPr>
-                <w:rFonts w:ascii="Arial" w:cs="Arial" w:eastAsia="Arial" w:hAnsi="Arial"/>
-                <w:b w:val="false"/>
-                <w:bCs w:val="false"/>
-                <w:sz w:val="20"/>
-                <w:szCs w:val="20"/>
-              </w:rPr>
-              <w:t xml:space="preserve">Notice when the connection drops</w:t>
-            </w:r>
-          </w:p>
-        </w:tc>
-        <w:tc>
-          <w:tcPr>
-            <w:tcW w:type="dxa" w:w="4851"/>
-            <w:tcBorders>
-              <w:top w:val="single" w:color="E2E8F0" w:sz="4"/>
-              <w:left w:val="none" w:color="auto" w:sz="0"/>
-              <w:bottom w:val="single" w:color="E2E8F0" w:sz="4"/>
-              <w:right w:val="none" w:color="auto" w:sz="0"/>
-            </w:tcBorders>
-            <w:tcMar>
-              <w:top w:type="dxa" w:w="120"/>
-              <w:left w:type="dxa" w:w="160"/>
-              <w:bottom w:type="dxa" w:w="120"/>
-              <w:right w:type="dxa" w:w="160"/>
-            </w:tcMar>
-          </w:tcPr>
-          <w:p>
-            <w:pPr>
-              <w:spacing w:line="240" w:lineRule="auto"/>
-              <w:jc w:val="left"/>
-            </w:pPr>
-            <w:r>
-              <w:rPr>
-                <w:rFonts w:ascii="Arial" w:cs="Arial" w:eastAsia="Arial" w:hAnsi="Arial"/>
-                <w:b w:val="false"/>
-                <w:bCs w:val="false"/>
-                <w:sz w:val="20"/>
-                <w:szCs w:val="20"/>
-              </w:rPr>
-              <w:t xml:space="preserve">Shown at once: "No connection. You can read what is already loaded, but nothing can be saved or paid until it is back."</w:t>
-            </w:r>
-          </w:p>
-        </w:tc>
-      </w:tr>
-      <w:tr>
-        <w:trPr>
-          <w:cantSplit/>
-        </w:trPr>
-        <w:tc>
-          <w:tcPr>
-            <w:tcW w:type="dxa" w:w="3789"/>
-            <w:tcBorders>
-              <w:top w:val="single" w:color="E2E8F0" w:sz="4"/>
-              <w:left w:val="none" w:color="auto" w:sz="0"/>
-              <w:bottom w:val="single" w:color="E2E8F0" w:sz="4"/>
-              <w:right w:val="none" w:color="auto" w:sz="0"/>
-            </w:tcBorders>
-            <w:tcMar>
-              <w:top w:type="dxa" w:w="120"/>
-              <w:left w:type="dxa" w:w="160"/>
-              <w:bottom w:type="dxa" w:w="120"/>
-              <w:right w:type="dxa" w:w="160"/>
-            </w:tcMar>
-          </w:tcPr>
-          <w:p>
-            <w:pPr>
-              <w:spacing w:line="240" w:lineRule="auto"/>
-              <w:jc w:val="left"/>
-            </w:pPr>
-            <w:r>
-              <w:rPr>
-                <w:rFonts w:ascii="Arial" w:cs="Arial" w:eastAsia="Arial" w:hAnsi="Arial"/>
-                <w:b w:val="false"/>
-                <w:bCs w:val="false"/>
-                <w:sz w:val="20"/>
-                <w:szCs w:val="20"/>
-              </w:rPr>
-              <w:t xml:space="preserve">Notice when the connection returns</w:t>
-            </w:r>
-          </w:p>
-        </w:tc>
-        <w:tc>
-          <w:tcPr>
-            <w:tcW w:type="dxa" w:w="4851"/>
-            <w:tcBorders>
-              <w:top w:val="single" w:color="E2E8F0" w:sz="4"/>
-              <w:left w:val="none" w:color="auto" w:sz="0"/>
-              <w:bottom w:val="single" w:color="E2E8F0" w:sz="4"/>
-              <w:right w:val="none" w:color="auto" w:sz="0"/>
-            </w:tcBorders>
-            <w:tcMar>
-              <w:top w:type="dxa" w:w="120"/>
-              <w:left w:type="dxa" w:w="160"/>
-              <w:bottom w:type="dxa" w:w="120"/>
-              <w:right w:type="dxa" w:w="160"/>
-            </w:tcMar>
-          </w:tcPr>
-          <w:p>
-            <w:pPr>
-              <w:spacing w:line="240" w:lineRule="auto"/>
-              <w:jc w:val="left"/>
-            </w:pPr>
-            <w:r>
-              <w:rPr>
-                <w:rFonts w:ascii="Arial" w:cs="Arial" w:eastAsia="Arial" w:hAnsi="Arial"/>
-                <w:b w:val="false"/>
-                <w:bCs w:val="false"/>
-                <w:sz w:val="20"/>
-                <w:szCs w:val="20"/>
-              </w:rPr>
-              <w:t xml:space="preserve">"Back online"</w:t>
-            </w:r>
-          </w:p>
-        </w:tc>
-      </w:tr>
-      <w:tr>
-        <w:trPr>
-          <w:cantSplit/>
-        </w:trPr>
-        <w:tc>
-          <w:tcPr>
-            <w:tcW w:type="dxa" w:w="3789"/>
-            <w:tcBorders>
-              <w:top w:val="single" w:color="E2E8F0" w:sz="4"/>
-              <w:left w:val="none" w:color="auto" w:sz="0"/>
-              <w:bottom w:val="single" w:color="E2E8F0" w:sz="4"/>
-              <w:right w:val="none" w:color="auto" w:sz="0"/>
-            </w:tcBorders>
-            <w:tcMar>
-              <w:top w:type="dxa" w:w="120"/>
-              <w:left w:type="dxa" w:w="160"/>
-              <w:bottom w:type="dxa" w:w="120"/>
-              <w:right w:type="dxa" w:w="160"/>
-            </w:tcMar>
-          </w:tcPr>
-          <w:p>
-            <w:pPr>
-              <w:spacing w:line="240" w:lineRule="auto"/>
-              <w:jc w:val="left"/>
-            </w:pPr>
-            <w:r>
-              <w:rPr>
-                <w:rFonts w:ascii="Arial" w:cs="Arial" w:eastAsia="Arial" w:hAnsi="Arial"/>
-                <w:b w:val="false"/>
-                <w:bCs w:val="false"/>
-                <w:sz w:val="20"/>
-                <w:szCs w:val="20"/>
-              </w:rPr>
-              <w:t xml:space="preserve">Public unit list with no connection</w:t>
-            </w:r>
-          </w:p>
-        </w:tc>
-        <w:tc>
-          <w:tcPr>
-            <w:tcW w:type="dxa" w:w="4851"/>
-            <w:tcBorders>
-              <w:top w:val="single" w:color="E2E8F0" w:sz="4"/>
-              <w:left w:val="none" w:color="auto" w:sz="0"/>
-              <w:bottom w:val="single" w:color="E2E8F0" w:sz="4"/>
-              <w:right w:val="none" w:color="auto" w:sz="0"/>
-            </w:tcBorders>
-            <w:tcMar>
-              <w:top w:type="dxa" w:w="120"/>
-              <w:left w:type="dxa" w:w="160"/>
-              <w:bottom w:type="dxa" w:w="120"/>
-              <w:right w:type="dxa" w:w="160"/>
-            </w:tcMar>
-          </w:tcPr>
-          <w:p>
-            <w:pPr>
-              <w:spacing w:line="240" w:lineRule="auto"/>
-              <w:jc w:val="left"/>
-            </w:pPr>
-            <w:r>
-              <w:rPr>
-                <w:rFonts w:ascii="Arial" w:cs="Arial" w:eastAsia="Arial" w:hAnsi="Arial"/>
-                <w:b w:val="false"/>
-                <w:bCs w:val="false"/>
-                <w:sz w:val="20"/>
-                <w:szCs w:val="20"/>
-              </w:rPr>
-              <w:t xml:space="preserve">Shown from the device's memory</w:t>
-            </w:r>
-          </w:p>
-        </w:tc>
-      </w:tr>
-      <w:tr>
-        <w:trPr>
-          <w:cantSplit/>
-        </w:trPr>
-        <w:tc>
-          <w:tcPr>
-            <w:tcW w:type="dxa" w:w="3789"/>
-            <w:tcBorders>
-              <w:top w:val="single" w:color="E2E8F0" w:sz="4"/>
-              <w:left w:val="none" w:color="auto" w:sz="0"/>
-              <w:bottom w:val="single" w:color="E2E8F0" w:sz="4"/>
-              <w:right w:val="none" w:color="auto" w:sz="0"/>
-            </w:tcBorders>
-            <w:tcMar>
-              <w:top w:type="dxa" w:w="120"/>
-              <w:left w:type="dxa" w:w="160"/>
-              <w:bottom w:type="dxa" w:w="120"/>
-              <w:right w:type="dxa" w:w="160"/>
-            </w:tcMar>
-          </w:tcPr>
-          <w:p>
-            <w:pPr>
-              <w:spacing w:line="240" w:lineRule="auto"/>
-              <w:jc w:val="left"/>
-            </w:pPr>
-            <w:r>
-              <w:rPr>
-                <w:rFonts w:ascii="Arial" w:cs="Arial" w:eastAsia="Arial" w:hAnsi="Arial"/>
-                <w:b w:val="false"/>
-                <w:bCs w:val="false"/>
-                <w:sz w:val="20"/>
-                <w:szCs w:val="20"/>
-              </w:rPr>
-              <w:t xml:space="preserve">Public unit list when the server stops answering</w:t>
-            </w:r>
-          </w:p>
-        </w:tc>
-        <w:tc>
-          <w:tcPr>
-            <w:tcW w:type="dxa" w:w="4851"/>
-            <w:tcBorders>
-              <w:top w:val="single" w:color="E2E8F0" w:sz="4"/>
-              <w:left w:val="none" w:color="auto" w:sz="0"/>
-              <w:bottom w:val="single" w:color="E2E8F0" w:sz="4"/>
-              <w:right w:val="none" w:color="auto" w:sz="0"/>
-            </w:tcBorders>
-            <w:tcMar>
-              <w:top w:type="dxa" w:w="120"/>
-              <w:left w:type="dxa" w:w="160"/>
-              <w:bottom w:type="dxa" w:w="120"/>
-              <w:right w:type="dxa" w:w="160"/>
-            </w:tcMar>
-          </w:tcPr>
-          <w:p>
-            <w:pPr>
-              <w:spacing w:line="240" w:lineRule="auto"/>
-              <w:jc w:val="left"/>
-            </w:pPr>
-            <w:r>
-              <w:rPr>
-                <w:rFonts w:ascii="Arial" w:cs="Arial" w:eastAsia="Arial" w:hAnsi="Arial"/>
-                <w:b w:val="false"/>
-                <w:bCs w:val="false"/>
-                <w:sz w:val="20"/>
-                <w:szCs w:val="20"/>
-              </w:rPr>
-              <w:t xml:space="preserve">Shown from the device's memory after 3.1 seconds</w:t>
-            </w:r>
-          </w:p>
-        </w:tc>
-      </w:tr>
-      <w:tr>
-        <w:trPr>
-          <w:cantSplit/>
-        </w:trPr>
-        <w:tc>
-          <w:tcPr>
-            <w:tcW w:type="dxa" w:w="3789"/>
-            <w:tcBorders>
-              <w:top w:val="single" w:color="E2E8F0" w:sz="4"/>
-              <w:left w:val="none" w:color="auto" w:sz="0"/>
-              <w:bottom w:val="single" w:color="E2E8F0" w:sz="4"/>
-              <w:right w:val="none" w:color="auto" w:sz="0"/>
-            </w:tcBorders>
-            <w:tcMar>
-              <w:top w:type="dxa" w:w="120"/>
-              <w:left w:type="dxa" w:w="160"/>
-              <w:bottom w:type="dxa" w:w="120"/>
-              <w:right w:type="dxa" w:w="160"/>
-            </w:tcMar>
-          </w:tcPr>
-          <w:p>
-            <w:pPr>
-              <w:spacing w:line="240" w:lineRule="auto"/>
-              <w:jc w:val="left"/>
-            </w:pPr>
-            <w:r>
-              <w:rPr>
-                <w:rFonts w:ascii="Arial" w:cs="Arial" w:eastAsia="Arial" w:hAnsi="Arial"/>
-                <w:b w:val="false"/>
-                <w:bCs w:val="false"/>
-                <w:sz w:val="20"/>
-                <w:szCs w:val="20"/>
-              </w:rPr>
-              <w:t xml:space="preserve">Public page on a slow connection (400 kbps, 400 ms), first visit</w:t>
-            </w:r>
-          </w:p>
-        </w:tc>
-        <w:tc>
-          <w:tcPr>
-            <w:tcW w:type="dxa" w:w="4851"/>
-            <w:tcBorders>
-              <w:top w:val="single" w:color="E2E8F0" w:sz="4"/>
-              <w:left w:val="none" w:color="auto" w:sz="0"/>
-              <w:bottom w:val="single" w:color="E2E8F0" w:sz="4"/>
-              <w:right w:val="none" w:color="auto" w:sz="0"/>
-            </w:tcBorders>
-            <w:tcMar>
-              <w:top w:type="dxa" w:w="120"/>
-              <w:left w:type="dxa" w:w="160"/>
-              <w:bottom w:type="dxa" w:w="120"/>
-              <w:right w:type="dxa" w:w="160"/>
-            </w:tcMar>
-          </w:tcPr>
-          <w:p>
-            <w:pPr>
-              <w:spacing w:line="240" w:lineRule="auto"/>
-              <w:jc w:val="left"/>
-            </w:pPr>
-            <w:r>
-              <w:rPr>
-                <w:rFonts w:ascii="Arial" w:cs="Arial" w:eastAsia="Arial" w:hAnsi="Arial"/>
-                <w:b w:val="false"/>
-                <w:bCs w:val="false"/>
-                <w:sz w:val="20"/>
-                <w:szCs w:val="20"/>
-              </w:rPr>
-              <w:t xml:space="preserve">Units on screen after 4.6 seconds</w:t>
-            </w:r>
-          </w:p>
-        </w:tc>
-      </w:tr>
-      <w:tr>
-        <w:trPr>
-          <w:cantSplit/>
-        </w:trPr>
-        <w:tc>
-          <w:tcPr>
-            <w:tcW w:type="dxa" w:w="3789"/>
-            <w:tcBorders>
-              <w:top w:val="single" w:color="E2E8F0" w:sz="4"/>
-              <w:left w:val="none" w:color="auto" w:sz="0"/>
-              <w:bottom w:val="single" w:color="1A202C" w:sz="12"/>
-              <w:right w:val="none" w:color="auto" w:sz="0"/>
-            </w:tcBorders>
-            <w:tcMar>
-              <w:top w:type="dxa" w:w="120"/>
-              <w:left w:type="dxa" w:w="160"/>
-              <w:bottom w:type="dxa" w:w="120"/>
-              <w:right w:type="dxa" w:w="160"/>
-            </w:tcMar>
-          </w:tcPr>
-          <w:p>
-            <w:pPr>
-              <w:spacing w:line="240" w:lineRule="auto"/>
-              <w:jc w:val="left"/>
-            </w:pPr>
-            <w:r>
-              <w:rPr>
-                <w:rFonts w:ascii="Arial" w:cs="Arial" w:eastAsia="Arial" w:hAnsi="Arial"/>
-                <w:b w:val="false"/>
-                <w:bCs w:val="false"/>
-                <w:sz w:val="20"/>
-                <w:szCs w:val="20"/>
-              </w:rPr>
-              <w:t xml:space="preserve">The same page, returning visitor</w:t>
-            </w:r>
-          </w:p>
-        </w:tc>
-        <w:tc>
-          <w:tcPr>
-            <w:tcW w:type="dxa" w:w="4851"/>
-            <w:tcBorders>
-              <w:top w:val="single" w:color="E2E8F0" w:sz="4"/>
-              <w:left w:val="none" w:color="auto" w:sz="0"/>
-              <w:bottom w:val="single" w:color="1A202C" w:sz="12"/>
-              <w:right w:val="none" w:color="auto" w:sz="0"/>
-            </w:tcBorders>
-            <w:tcMar>
-              <w:top w:type="dxa" w:w="120"/>
-              <w:left w:type="dxa" w:w="160"/>
-              <w:bottom w:type="dxa" w:w="120"/>
-              <w:right w:type="dxa" w:w="160"/>
-            </w:tcMar>
-          </w:tcPr>
-          <w:p>
-            <w:pPr>
-              <w:spacing w:line="240" w:lineRule="auto"/>
-              <w:jc w:val="left"/>
-            </w:pPr>
-            <w:r>
-              <w:rPr>
-                <w:rFonts w:ascii="Arial" w:cs="Arial" w:eastAsia="Arial" w:hAnsi="Arial"/>
-                <w:b w:val="false"/>
-                <w:bCs w:val="false"/>
-                <w:sz w:val="20"/>
-                <w:szCs w:val="20"/>
-              </w:rPr>
-              <w:t xml:space="preserve">Units on screen after 0.3 seconds, because the installed application already holds its files</w:t>
-            </w:r>
-          </w:p>
-        </w:tc>
-      </w:tr>
-    </w:tbl>
-    <w:p>
-      <w:pPr>
-        <w:spacing w:after="240" w:before="120" w:line="480" w:lineRule="auto"/>
-      </w:pPr>
-    </w:p>
-    <w:p>
-      <w:pPr>
-        <w:keepNext/>
-        <w:spacing w:after="120" w:before="360" w:line="480" w:lineRule="auto"/>
-        <w:jc w:val="left"/>
-      </w:pPr>
-      <w:r>
-        <w:rPr>
-          <w:rFonts w:ascii="Arial" w:cs="Arial" w:eastAsia="Arial" w:hAnsi="Arial"/>
-          <w:b/>
-          <w:bCs/>
-          <w:sz w:val="24"/>
-          <w:szCs w:val="24"/>
-        </w:rPr>
-        <w:t xml:space="preserve">Table 11B.</w:t>
-      </w:r>
-      <w:r>
-        <w:rPr>
-          <w:rFonts w:ascii="Arial" w:cs="Arial" w:eastAsia="Arial" w:hAnsi="Arial"/>
-          <w:b/>
-          <w:bCs/>
-          <w:sz w:val="24"/>
-          <w:szCs w:val="24"/>
-        </w:rPr>
-        <w:t xml:space="preserve"> Simulated simultaneous users, read operations (29 September 2026)</w:t>
-      </w:r>
-    </w:p>
-    <w:tbl>
-      <w:tblPr>
-        <w:tblW w:type="dxa" w:w="8640"/>
-        <w:tblBorders>
-          <w:top w:val="single" w:color="auto" w:sz="4"/>
-          <w:left w:val="single" w:color="auto" w:sz="4"/>
-          <w:bottom w:val="single" w:color="auto" w:sz="4"/>
-          <w:right w:val="single" w:color="auto" w:sz="4"/>
-          <w:insideH w:val="single" w:color="auto" w:sz="4"/>
-          <w:insideV w:val="single" w:color="auto" w:sz="4"/>
-        </w:tblBorders>
-      </w:tblPr>
-      <w:tblGrid>
-        <w:gridCol w:w="100"/>
-        <w:gridCol w:w="100"/>
-        <w:gridCol w:w="100"/>
-        <w:gridCol w:w="100"/>
-        <w:gridCol w:w="100"/>
-        <w:gridCol w:w="100"/>
-      </w:tblGrid>
-      <w:tr>
-        <w:trPr>
-          <w:cantSplit/>
-          <w:tblHeader/>
-        </w:trPr>
-        <w:tc>
-          <w:tcPr>
-            <w:tcW w:type="dxa" w:w="2336"/>
-            <w:tcBorders>
-              <w:top w:val="single" w:color="1A202C" w:sz="12"/>
-              <w:left w:val="none" w:color="auto" w:sz="0"/>
-              <w:bottom w:val="single" w:color="1A202C" w:sz="12"/>
-              <w:right w:val="none" w:color="auto" w:sz="0"/>
-            </w:tcBorders>
-            <w:shd w:fill="F8FAFC"/>
-            <w:tcMar>
-              <w:top w:type="dxa" w:w="140"/>
-              <w:left w:type="dxa" w:w="160"/>
-              <w:bottom w:type="dxa" w:w="140"/>
-              <w:right w:type="dxa" w:w="160"/>
-            </w:tcMar>
-          </w:tcPr>
-          <w:p>
-            <w:pPr>
-              <w:spacing w:line="240" w:lineRule="auto"/>
-              <w:jc w:val="left"/>
-            </w:pPr>
-            <w:r>
-              <w:rPr>
-                <w:rFonts w:ascii="Arial" w:cs="Arial" w:eastAsia="Arial" w:hAnsi="Arial"/>
-                <w:b/>
-                <w:bCs/>
-                <w:sz w:val="20"/>
-                <w:szCs w:val="20"/>
-              </w:rPr>
-              <w:t xml:space="preserve">Test</w:t>
-            </w:r>
-          </w:p>
-        </w:tc>
-        <w:tc>
-          <w:tcPr>
-            <w:tcW w:type="dxa" w:w="1398"/>
-            <w:tcBorders>
-              <w:top w:val="single" w:color="1A202C" w:sz="12"/>
-              <w:left w:val="none" w:color="auto" w:sz="0"/>
-              <w:bottom w:val="single" w:color="1A202C" w:sz="12"/>
-              <w:right w:val="none" w:color="auto" w:sz="0"/>
-            </w:tcBorders>
-            <w:shd w:fill="F8FAFC"/>
-            <w:tcMar>
-              <w:top w:type="dxa" w:w="140"/>
-              <w:left w:type="dxa" w:w="160"/>
-              <w:bottom w:type="dxa" w:w="140"/>
-              <w:right w:type="dxa" w:w="160"/>
-            </w:tcMar>
-          </w:tcPr>
-          <w:p>
-            <w:pPr>
-              <w:spacing w:line="240" w:lineRule="auto"/>
-              <w:jc w:val="center"/>
-            </w:pPr>
-            <w:r>
-              <w:rPr>
-                <w:rFonts w:ascii="Arial" w:cs="Arial" w:eastAsia="Arial" w:hAnsi="Arial"/>
-                <w:b/>
-                <w:bCs/>
-                <w:sz w:val="20"/>
-                <w:szCs w:val="20"/>
-              </w:rPr>
-              <w:t xml:space="preserve">Simulated users at once</w:t>
-            </w:r>
-          </w:p>
-        </w:tc>
-        <w:tc>
-          <w:tcPr>
-            <w:tcW w:type="dxa" w:w="1098"/>
-            <w:tcBorders>
-              <w:top w:val="single" w:color="1A202C" w:sz="12"/>
-              <w:left w:val="none" w:color="auto" w:sz="0"/>
-              <w:bottom w:val="single" w:color="1A202C" w:sz="12"/>
-              <w:right w:val="none" w:color="auto" w:sz="0"/>
-            </w:tcBorders>
-            <w:shd w:fill="F8FAFC"/>
-            <w:tcMar>
-              <w:top w:type="dxa" w:w="140"/>
-              <w:left w:type="dxa" w:w="160"/>
-              <w:bottom w:type="dxa" w:w="140"/>
-              <w:right w:type="dxa" w:w="160"/>
-            </w:tcMar>
-          </w:tcPr>
-          <w:p>
-            <w:pPr>
-              <w:spacing w:line="240" w:lineRule="auto"/>
-              <w:jc w:val="center"/>
-            </w:pPr>
-            <w:r>
-              <w:rPr>
-                <w:rFonts w:ascii="Arial" w:cs="Arial" w:eastAsia="Arial" w:hAnsi="Arial"/>
-                <w:b/>
-                <w:bCs/>
-                <w:sz w:val="20"/>
-                <w:szCs w:val="20"/>
-              </w:rPr>
-              <w:t xml:space="preserve">Duration</w:t>
-            </w:r>
-          </w:p>
-        </w:tc>
-        <w:tc>
-          <w:tcPr>
-            <w:tcW w:type="dxa" w:w="1098"/>
-            <w:tcBorders>
-              <w:top w:val="single" w:color="1A202C" w:sz="12"/>
-              <w:left w:val="none" w:color="auto" w:sz="0"/>
-              <w:bottom w:val="single" w:color="1A202C" w:sz="12"/>
-              <w:right w:val="none" w:color="auto" w:sz="0"/>
-            </w:tcBorders>
-            <w:shd w:fill="F8FAFC"/>
-            <w:tcMar>
-              <w:top w:type="dxa" w:w="140"/>
-              <w:left w:type="dxa" w:w="160"/>
-              <w:bottom w:type="dxa" w:w="140"/>
-              <w:right w:type="dxa" w:w="160"/>
-            </w:tcMar>
-          </w:tcPr>
-          <w:p>
-            <w:pPr>
-              <w:spacing w:line="240" w:lineRule="auto"/>
-              <w:jc w:val="center"/>
-            </w:pPr>
-            <w:r>
-              <w:rPr>
-                <w:rFonts w:ascii="Arial" w:cs="Arial" w:eastAsia="Arial" w:hAnsi="Arial"/>
-                <w:b/>
-                <w:bCs/>
-                <w:sz w:val="20"/>
-                <w:szCs w:val="20"/>
-              </w:rPr>
-              <w:t xml:space="preserve">Requests</w:t>
-            </w:r>
-          </w:p>
-        </w:tc>
-        <w:tc>
-          <w:tcPr>
-            <w:tcW w:type="dxa" w:w="1098"/>
-            <w:tcBorders>
-              <w:top w:val="single" w:color="1A202C" w:sz="12"/>
-              <w:left w:val="none" w:color="auto" w:sz="0"/>
-              <w:bottom w:val="single" w:color="1A202C" w:sz="12"/>
-              <w:right w:val="none" w:color="auto" w:sz="0"/>
-            </w:tcBorders>
-            <w:shd w:fill="F8FAFC"/>
-            <w:tcMar>
-              <w:top w:type="dxa" w:w="140"/>
-              <w:left w:type="dxa" w:w="160"/>
-              <w:bottom w:type="dxa" w:w="140"/>
-              <w:right w:type="dxa" w:w="160"/>
-            </w:tcMar>
-          </w:tcPr>
-          <w:p>
-            <w:pPr>
-              <w:spacing w:line="240" w:lineRule="auto"/>
-              <w:jc w:val="center"/>
-            </w:pPr>
-            <w:r>
-              <w:rPr>
-                <w:rFonts w:ascii="Arial" w:cs="Arial" w:eastAsia="Arial" w:hAnsi="Arial"/>
-                <w:b/>
-                <w:bCs/>
-                <w:sz w:val="20"/>
-                <w:szCs w:val="20"/>
-              </w:rPr>
-              <w:t xml:space="preserve">Errors</w:t>
-            </w:r>
-          </w:p>
-        </w:tc>
-        <w:tc>
-          <w:tcPr>
-            <w:tcW w:type="dxa" w:w="1612"/>
-            <w:tcBorders>
-              <w:top w:val="single" w:color="1A202C" w:sz="12"/>
-              <w:left w:val="none" w:color="auto" w:sz="0"/>
-              <w:bottom w:val="single" w:color="1A202C" w:sz="12"/>
-              <w:right w:val="none" w:color="auto" w:sz="0"/>
-            </w:tcBorders>
-            <w:shd w:fill="F8FAFC"/>
-            <w:tcMar>
-              <w:top w:type="dxa" w:w="140"/>
-              <w:left w:type="dxa" w:w="160"/>
-              <w:bottom w:type="dxa" w:w="140"/>
-              <w:right w:type="dxa" w:w="160"/>
-            </w:tcMar>
-          </w:tcPr>
-          <w:p>
-            <w:pPr>
-              <w:spacing w:line="240" w:lineRule="auto"/>
-              <w:jc w:val="center"/>
-            </w:pPr>
-            <w:r>
-              <w:rPr>
-                <w:rFonts w:ascii="Arial" w:cs="Arial" w:eastAsia="Arial" w:hAnsi="Arial"/>
-                <w:b/>
-                <w:bCs/>
-                <w:sz w:val="20"/>
-                <w:szCs w:val="20"/>
-              </w:rPr>
-              <w:t xml:space="preserve">Slowest 5% took longer than</w:t>
-            </w:r>
-          </w:p>
-        </w:tc>
-      </w:tr>
-      <w:tr>
-        <w:trPr>
-          <w:cantSplit/>
-        </w:trPr>
-        <w:tc>
-          <w:tcPr>
-            <w:tcW w:type="dxa" w:w="2336"/>
-            <w:tcBorders>
-              <w:top w:val="single" w:color="E2E8F0" w:sz="4"/>
-              <w:left w:val="none" w:color="auto" w:sz="0"/>
-              <w:bottom w:val="single" w:color="E2E8F0" w:sz="4"/>
-              <w:right w:val="none" w:color="auto" w:sz="0"/>
-            </w:tcBorders>
-            <w:tcMar>
-              <w:top w:type="dxa" w:w="120"/>
-              <w:left w:type="dxa" w:w="160"/>
-              <w:bottom w:type="dxa" w:w="120"/>
-              <w:right w:type="dxa" w:w="160"/>
-            </w:tcMar>
-          </w:tcPr>
-          <w:p>
-            <w:pPr>
-              <w:spacing w:line="240" w:lineRule="auto"/>
-              <w:jc w:val="left"/>
-            </w:pPr>
-            <w:r>
-              <w:rPr>
-                <w:rFonts w:ascii="Arial" w:cs="Arial" w:eastAsia="Arial" w:hAnsi="Arial"/>
-                <w:b w:val="false"/>
-                <w:bCs w:val="false"/>
-                <w:sz w:val="20"/>
-                <w:szCs w:val="20"/>
-              </w:rPr>
-              <w:t xml:space="preserve">Public pages and public data, live site</w:t>
-            </w:r>
-          </w:p>
-        </w:tc>
-        <w:tc>
-          <w:tcPr>
-            <w:tcW w:type="dxa" w:w="1398"/>
-            <w:tcBorders>
-              <w:top w:val="single" w:color="E2E8F0" w:sz="4"/>
-              <w:left w:val="none" w:color="auto" w:sz="0"/>
-              <w:bottom w:val="single" w:color="E2E8F0" w:sz="4"/>
-              <w:right w:val="none" w:color="auto" w:sz="0"/>
-            </w:tcBorders>
-            <w:tcMar>
-              <w:top w:type="dxa" w:w="120"/>
-              <w:left w:type="dxa" w:w="160"/>
-              <w:bottom w:type="dxa" w:w="120"/>
-              <w:right w:type="dxa" w:w="160"/>
-            </w:tcMar>
-          </w:tcPr>
-          <w:p>
-            <w:pPr>
-              <w:spacing w:line="240" w:lineRule="auto"/>
-              <w:jc w:val="center"/>
-            </w:pPr>
-            <w:r>
-              <w:rPr>
-                <w:rFonts w:ascii="Arial" w:cs="Arial" w:eastAsia="Arial" w:hAnsi="Arial"/>
-                <w:b w:val="false"/>
-                <w:bCs w:val="false"/>
-                <w:sz w:val="20"/>
-                <w:szCs w:val="20"/>
-              </w:rPr>
-              <w:t xml:space="preserve">12</w:t>
-            </w:r>
-          </w:p>
-        </w:tc>
-        <w:tc>
-          <w:tcPr>
-            <w:tcW w:type="dxa" w:w="1098"/>
-            <w:tcBorders>
-              <w:top w:val="single" w:color="E2E8F0" w:sz="4"/>
-              <w:left w:val="none" w:color="auto" w:sz="0"/>
-              <w:bottom w:val="single" w:color="E2E8F0" w:sz="4"/>
-              <w:right w:val="none" w:color="auto" w:sz="0"/>
-            </w:tcBorders>
-            <w:tcMar>
-              <w:top w:type="dxa" w:w="120"/>
-              <w:left w:type="dxa" w:w="160"/>
-              <w:bottom w:type="dxa" w:w="120"/>
-              <w:right w:type="dxa" w:w="160"/>
-            </w:tcMar>
-          </w:tcPr>
-          <w:p>
-            <w:pPr>
-              <w:spacing w:line="240" w:lineRule="auto"/>
-              <w:jc w:val="left"/>
-            </w:pPr>
-            <w:r>
-              <w:rPr>
-                <w:rFonts w:ascii="Arial" w:cs="Arial" w:eastAsia="Arial" w:hAnsi="Arial"/>
-                <w:b w:val="false"/>
-                <w:bCs w:val="false"/>
-                <w:sz w:val="20"/>
-                <w:szCs w:val="20"/>
-              </w:rPr>
-              <w:t xml:space="preserve">60 s</w:t>
-            </w:r>
-          </w:p>
-        </w:tc>
-        <w:tc>
-          <w:tcPr>
-            <w:tcW w:type="dxa" w:w="1098"/>
-            <w:tcBorders>
-              <w:top w:val="single" w:color="E2E8F0" w:sz="4"/>
-              <w:left w:val="none" w:color="auto" w:sz="0"/>
-              <w:bottom w:val="single" w:color="E2E8F0" w:sz="4"/>
-              <w:right w:val="none" w:color="auto" w:sz="0"/>
-            </w:tcBorders>
-            <w:tcMar>
-              <w:top w:type="dxa" w:w="120"/>
-              <w:left w:type="dxa" w:w="160"/>
-              <w:bottom w:type="dxa" w:w="120"/>
-              <w:right w:type="dxa" w:w="160"/>
-            </w:tcMar>
-          </w:tcPr>
-          <w:p>
-            <w:pPr>
-              <w:spacing w:line="240" w:lineRule="auto"/>
-              <w:jc w:val="center"/>
-            </w:pPr>
-            <w:r>
-              <w:rPr>
-                <w:rFonts w:ascii="Arial" w:cs="Arial" w:eastAsia="Arial" w:hAnsi="Arial"/>
-                <w:b w:val="false"/>
-                <w:bCs w:val="false"/>
-                <w:sz w:val="20"/>
-                <w:szCs w:val="20"/>
-              </w:rPr>
-              <w:t xml:space="preserve">1,085</w:t>
-            </w:r>
-          </w:p>
-        </w:tc>
-        <w:tc>
-          <w:tcPr>
-            <w:tcW w:type="dxa" w:w="1098"/>
-            <w:tcBorders>
-              <w:top w:val="single" w:color="E2E8F0" w:sz="4"/>
-              <w:left w:val="none" w:color="auto" w:sz="0"/>
-              <w:bottom w:val="single" w:color="E2E8F0" w:sz="4"/>
-              <w:right w:val="none" w:color="auto" w:sz="0"/>
-            </w:tcBorders>
-            <w:tcMar>
-              <w:top w:type="dxa" w:w="120"/>
-              <w:left w:type="dxa" w:w="160"/>
-              <w:bottom w:type="dxa" w:w="120"/>
-              <w:right w:type="dxa" w:w="160"/>
-            </w:tcMar>
-          </w:tcPr>
-          <w:p>
-            <w:pPr>
-              <w:spacing w:line="240" w:lineRule="auto"/>
-              <w:jc w:val="center"/>
-            </w:pPr>
-            <w:r>
-              <w:rPr>
-                <w:rFonts w:ascii="Arial" w:cs="Arial" w:eastAsia="Arial" w:hAnsi="Arial"/>
-                <w:b w:val="false"/>
-                <w:bCs w:val="false"/>
-                <w:sz w:val="20"/>
-                <w:szCs w:val="20"/>
-              </w:rPr>
-              <w:t xml:space="preserve">0</w:t>
-            </w:r>
-          </w:p>
-        </w:tc>
-        <w:tc>
-          <w:tcPr>
-            <w:tcW w:type="dxa" w:w="1612"/>
-            <w:tcBorders>
-              <w:top w:val="single" w:color="E2E8F0" w:sz="4"/>
-              <w:left w:val="none" w:color="auto" w:sz="0"/>
-              <w:bottom w:val="single" w:color="E2E8F0" w:sz="4"/>
-              <w:right w:val="none" w:color="auto" w:sz="0"/>
-            </w:tcBorders>
-            <w:tcMar>
-              <w:top w:type="dxa" w:w="120"/>
-              <w:left w:type="dxa" w:w="160"/>
-              <w:bottom w:type="dxa" w:w="120"/>
-              <w:right w:type="dxa" w:w="160"/>
-            </w:tcMar>
-          </w:tcPr>
-          <w:p>
-            <w:pPr>
-              <w:spacing w:line="240" w:lineRule="auto"/>
-              <w:jc w:val="left"/>
-            </w:pPr>
-            <w:r>
-              <w:rPr>
-                <w:rFonts w:ascii="Arial" w:cs="Arial" w:eastAsia="Arial" w:hAnsi="Arial"/>
-                <w:b w:val="false"/>
-                <w:bCs w:val="false"/>
-                <w:sz w:val="20"/>
-                <w:szCs w:val="20"/>
-              </w:rPr>
-              <w:t xml:space="preserve">0.52 s</w:t>
-            </w:r>
-          </w:p>
-        </w:tc>
-      </w:tr>
-      <w:tr>
-        <w:trPr>
-          <w:cantSplit/>
-        </w:trPr>
-        <w:tc>
-          <w:tcPr>
-            <w:tcW w:type="dxa" w:w="2336"/>
-            <w:tcBorders>
-              <w:top w:val="single" w:color="E2E8F0" w:sz="4"/>
-              <w:left w:val="none" w:color="auto" w:sz="0"/>
-              <w:bottom w:val="single" w:color="1A202C" w:sz="12"/>
-              <w:right w:val="none" w:color="auto" w:sz="0"/>
-            </w:tcBorders>
-            <w:tcMar>
-              <w:top w:type="dxa" w:w="120"/>
-              <w:left w:type="dxa" w:w="160"/>
-              <w:bottom w:type="dxa" w:w="120"/>
-              <w:right w:type="dxa" w:w="160"/>
-            </w:tcMar>
-          </w:tcPr>
-          <w:p>
-            <w:pPr>
-              <w:spacing w:line="240" w:lineRule="auto"/>
-              <w:jc w:val="left"/>
-            </w:pPr>
-            <w:r>
-              <w:rPr>
-                <w:rFonts w:ascii="Arial" w:cs="Arial" w:eastAsia="Arial" w:hAnsi="Arial"/>
-                <w:b w:val="false"/>
-                <w:bCs w:val="false"/>
-                <w:sz w:val="20"/>
-                <w:szCs w:val="20"/>
-              </w:rPr>
-              <w:t xml:space="preserve">The owner's ten main data requests, live database</w:t>
-            </w:r>
-          </w:p>
-        </w:tc>
-        <w:tc>
-          <w:tcPr>
-            <w:tcW w:type="dxa" w:w="1398"/>
-            <w:tcBorders>
-              <w:top w:val="single" w:color="E2E8F0" w:sz="4"/>
-              <w:left w:val="none" w:color="auto" w:sz="0"/>
-              <w:bottom w:val="single" w:color="1A202C" w:sz="12"/>
-              <w:right w:val="none" w:color="auto" w:sz="0"/>
-            </w:tcBorders>
-            <w:tcMar>
-              <w:top w:type="dxa" w:w="120"/>
-              <w:left w:type="dxa" w:w="160"/>
-              <w:bottom w:type="dxa" w:w="120"/>
-              <w:right w:type="dxa" w:w="160"/>
-            </w:tcMar>
-          </w:tcPr>
-          <w:p>
-            <w:pPr>
-              <w:spacing w:line="240" w:lineRule="auto"/>
-              <w:jc w:val="center"/>
-            </w:pPr>
-            <w:r>
-              <w:rPr>
-                <w:rFonts w:ascii="Arial" w:cs="Arial" w:eastAsia="Arial" w:hAnsi="Arial"/>
-                <w:b w:val="false"/>
-                <w:bCs w:val="false"/>
-                <w:sz w:val="20"/>
-                <w:szCs w:val="20"/>
-              </w:rPr>
-              <w:t xml:space="preserve">6</w:t>
-            </w:r>
-          </w:p>
-        </w:tc>
-        <w:tc>
-          <w:tcPr>
-            <w:tcW w:type="dxa" w:w="1098"/>
-            <w:tcBorders>
-              <w:top w:val="single" w:color="E2E8F0" w:sz="4"/>
-              <w:left w:val="none" w:color="auto" w:sz="0"/>
-              <w:bottom w:val="single" w:color="1A202C" w:sz="12"/>
-              <w:right w:val="none" w:color="auto" w:sz="0"/>
-            </w:tcBorders>
-            <w:tcMar>
-              <w:top w:type="dxa" w:w="120"/>
-              <w:left w:type="dxa" w:w="160"/>
-              <w:bottom w:type="dxa" w:w="120"/>
-              <w:right w:type="dxa" w:w="160"/>
-            </w:tcMar>
-          </w:tcPr>
-          <w:p>
-            <w:pPr>
-              <w:spacing w:line="240" w:lineRule="auto"/>
-              <w:jc w:val="left"/>
-            </w:pPr>
-            <w:r>
-              <w:rPr>
-                <w:rFonts w:ascii="Arial" w:cs="Arial" w:eastAsia="Arial" w:hAnsi="Arial"/>
-                <w:b w:val="false"/>
-                <w:bCs w:val="false"/>
-                <w:sz w:val="20"/>
-                <w:szCs w:val="20"/>
-              </w:rPr>
-              <w:t xml:space="preserve">45 s</w:t>
-            </w:r>
-          </w:p>
-        </w:tc>
-        <w:tc>
-          <w:tcPr>
-            <w:tcW w:type="dxa" w:w="1098"/>
-            <w:tcBorders>
-              <w:top w:val="single" w:color="E2E8F0" w:sz="4"/>
-              <w:left w:val="none" w:color="auto" w:sz="0"/>
-              <w:bottom w:val="single" w:color="1A202C" w:sz="12"/>
-              <w:right w:val="none" w:color="auto" w:sz="0"/>
-            </w:tcBorders>
-            <w:tcMar>
-              <w:top w:type="dxa" w:w="120"/>
-              <w:left w:type="dxa" w:w="160"/>
-              <w:bottom w:type="dxa" w:w="120"/>
-              <w:right w:type="dxa" w:w="160"/>
-            </w:tcMar>
-          </w:tcPr>
-          <w:p>
-            <w:pPr>
-              <w:spacing w:line="240" w:lineRule="auto"/>
-              <w:jc w:val="center"/>
-            </w:pPr>
-            <w:r>
-              <w:rPr>
-                <w:rFonts w:ascii="Arial" w:cs="Arial" w:eastAsia="Arial" w:hAnsi="Arial"/>
-                <w:b w:val="false"/>
-                <w:bCs w:val="false"/>
-                <w:sz w:val="20"/>
-                <w:szCs w:val="20"/>
-              </w:rPr>
-              <w:t xml:space="preserve">285</w:t>
-            </w:r>
-          </w:p>
-        </w:tc>
-        <w:tc>
-          <w:tcPr>
-            <w:tcW w:type="dxa" w:w="1098"/>
-            <w:tcBorders>
-              <w:top w:val="single" w:color="E2E8F0" w:sz="4"/>
-              <w:left w:val="none" w:color="auto" w:sz="0"/>
-              <w:bottom w:val="single" w:color="1A202C" w:sz="12"/>
-              <w:right w:val="none" w:color="auto" w:sz="0"/>
-            </w:tcBorders>
-            <w:tcMar>
-              <w:top w:type="dxa" w:w="120"/>
-              <w:left w:type="dxa" w:w="160"/>
-              <w:bottom w:type="dxa" w:w="120"/>
-              <w:right w:type="dxa" w:w="160"/>
-            </w:tcMar>
-          </w:tcPr>
-          <w:p>
-            <w:pPr>
-              <w:spacing w:line="240" w:lineRule="auto"/>
-              <w:jc w:val="center"/>
-            </w:pPr>
-            <w:r>
-              <w:rPr>
-                <w:rFonts w:ascii="Arial" w:cs="Arial" w:eastAsia="Arial" w:hAnsi="Arial"/>
-                <w:b w:val="false"/>
-                <w:bCs w:val="false"/>
-                <w:sz w:val="20"/>
-                <w:szCs w:val="20"/>
-              </w:rPr>
-              <w:t xml:space="preserve">0</w:t>
-            </w:r>
-          </w:p>
-        </w:tc>
-        <w:tc>
-          <w:tcPr>
-            <w:tcW w:type="dxa" w:w="1612"/>
-            <w:tcBorders>
-              <w:top w:val="single" w:color="E2E8F0" w:sz="4"/>
-              <w:left w:val="none" w:color="auto" w:sz="0"/>
-              <w:bottom w:val="single" w:color="1A202C" w:sz="12"/>
-              <w:right w:val="none" w:color="auto" w:sz="0"/>
-            </w:tcBorders>
-            <w:tcMar>
-              <w:top w:type="dxa" w:w="120"/>
-              <w:left w:type="dxa" w:w="160"/>
-              <w:bottom w:type="dxa" w:w="120"/>
-              <w:right w:type="dxa" w:w="160"/>
-            </w:tcMar>
-          </w:tcPr>
-          <w:p>
-            <w:pPr>
-              <w:spacing w:line="240" w:lineRule="auto"/>
-              <w:jc w:val="left"/>
-            </w:pPr>
-            <w:r>
-              <w:rPr>
-                <w:rFonts w:ascii="Arial" w:cs="Arial" w:eastAsia="Arial" w:hAnsi="Arial"/>
-                <w:b w:val="false"/>
-                <w:bCs w:val="false"/>
-                <w:sz w:val="20"/>
-                <w:szCs w:val="20"/>
-              </w:rPr>
-              <w:t xml:space="preserve">0.80 s</w:t>
-            </w:r>
-          </w:p>
-        </w:tc>
-      </w:tr>
-    </w:tbl>
-    <w:p>
-      <w:pPr>
-        <w:spacing w:after="240" w:before="120" w:line="480" w:lineRule="auto"/>
-      </w:pPr>
     </w:p>
     <w:p>
       <w:pPr>
@@ -17283,666 +14966,8 @@
           <w:sz w:val="24"/>
           <w:szCs w:val="24"/>
         </w:rPr>
-        <w:t xml:space="preserve"> Reading at the same time tests capacity; saving at the same time tests correctness, because two requests that arrive together can each pass a check before either has been saved. This was tested by sending the same request several times in the same instant, which reproduces a double click, a retry after a timeout, or two people pressing Save together, with closer timing than people can produce by hand (Table 11F).</w:t>
+        <w:t xml:space="preserve"> Reading at the same time tests capacity; saving at the same time tests correctness, because two requests that arrive together can each pass a check before either has been saved. This was tested by sending the same request several times in the same instant, which reproduces a double click, a retry after a timeout, or two people pressing Save together, with closer timing than people can produce by hand. Before the change, the same receipt sent twice or five times at once was saved every time, and two GCash checkouts could open on one bill; after it, one was saved and every other refused, and a checkout abandoned for more than 15 minutes no longer held the bill (Appendix M, Table 11F).</w:t>
       </w:r>
-    </w:p>
-    <w:p>
-      <w:pPr>
-        <w:keepNext/>
-        <w:spacing w:after="120" w:before="360" w:line="480" w:lineRule="auto"/>
-        <w:jc w:val="left"/>
-      </w:pPr>
-      <w:r>
-        <w:rPr>
-          <w:rFonts w:ascii="Arial" w:cs="Arial" w:eastAsia="Arial" w:hAnsi="Arial"/>
-          <w:b/>
-          <w:bCs/>
-          <w:sz w:val="24"/>
-          <w:szCs w:val="24"/>
-        </w:rPr>
-        <w:t xml:space="preserve">Table 11F.</w:t>
-      </w:r>
-      <w:r>
-        <w:rPr>
-          <w:rFonts w:ascii="Arial" w:cs="Arial" w:eastAsia="Arial" w:hAnsi="Arial"/>
-          <w:b/>
-          <w:bCs/>
-          <w:sz w:val="24"/>
-          <w:szCs w:val="24"/>
-        </w:rPr>
-        <w:t xml:space="preserve"> Simultaneous saves (19 and 24 September 2026)</w:t>
-      </w:r>
-    </w:p>
-    <w:tbl>
-      <w:tblPr>
-        <w:tblW w:type="dxa" w:w="8640"/>
-        <w:tblBorders>
-          <w:top w:val="single" w:color="auto" w:sz="4"/>
-          <w:left w:val="single" w:color="auto" w:sz="4"/>
-          <w:bottom w:val="single" w:color="auto" w:sz="4"/>
-          <w:right w:val="single" w:color="auto" w:sz="4"/>
-          <w:insideH w:val="single" w:color="auto" w:sz="4"/>
-          <w:insideV w:val="single" w:color="auto" w:sz="4"/>
-        </w:tblBorders>
-      </w:tblPr>
-      <w:tblGrid>
-        <w:gridCol w:w="100"/>
-        <w:gridCol w:w="100"/>
-        <w:gridCol w:w="100"/>
-      </w:tblGrid>
-      <w:tr>
-        <w:trPr>
-          <w:cantSplit/>
-          <w:tblHeader/>
-        </w:trPr>
-        <w:tc>
-          <w:tcPr>
-            <w:tcW w:type="dxa" w:w="3378"/>
-            <w:tcBorders>
-              <w:top w:val="single" w:color="1A202C" w:sz="12"/>
-              <w:left w:val="none" w:color="auto" w:sz="0"/>
-              <w:bottom w:val="single" w:color="1A202C" w:sz="12"/>
-              <w:right w:val="none" w:color="auto" w:sz="0"/>
-            </w:tcBorders>
-            <w:shd w:fill="F8FAFC"/>
-            <w:tcMar>
-              <w:top w:type="dxa" w:w="140"/>
-              <w:left w:type="dxa" w:w="160"/>
-              <w:bottom w:type="dxa" w:w="140"/>
-              <w:right w:type="dxa" w:w="160"/>
-            </w:tcMar>
-          </w:tcPr>
-          <w:p>
-            <w:pPr>
-              <w:spacing w:line="240" w:lineRule="auto"/>
-              <w:jc w:val="left"/>
-            </w:pPr>
-            <w:r>
-              <w:rPr>
-                <w:rFonts w:ascii="Arial" w:cs="Arial" w:eastAsia="Arial" w:hAnsi="Arial"/>
-                <w:b/>
-                <w:bCs/>
-                <w:sz w:val="20"/>
-                <w:szCs w:val="20"/>
-              </w:rPr>
-              <w:t xml:space="preserve">Test</w:t>
-            </w:r>
-          </w:p>
-        </w:tc>
-        <w:tc>
-          <w:tcPr>
-            <w:tcW w:type="dxa" w:w="2266"/>
-            <w:tcBorders>
-              <w:top w:val="single" w:color="1A202C" w:sz="12"/>
-              <w:left w:val="none" w:color="auto" w:sz="0"/>
-              <w:bottom w:val="single" w:color="1A202C" w:sz="12"/>
-              <w:right w:val="none" w:color="auto" w:sz="0"/>
-            </w:tcBorders>
-            <w:shd w:fill="F8FAFC"/>
-            <w:tcMar>
-              <w:top w:type="dxa" w:w="140"/>
-              <w:left w:type="dxa" w:w="160"/>
-              <w:bottom w:type="dxa" w:w="140"/>
-              <w:right w:type="dxa" w:w="160"/>
-            </w:tcMar>
-          </w:tcPr>
-          <w:p>
-            <w:pPr>
-              <w:spacing w:line="240" w:lineRule="auto"/>
-              <w:jc w:val="center"/>
-            </w:pPr>
-            <w:r>
-              <w:rPr>
-                <w:rFonts w:ascii="Arial" w:cs="Arial" w:eastAsia="Arial" w:hAnsi="Arial"/>
-                <w:b/>
-                <w:bCs/>
-                <w:sz w:val="20"/>
-                <w:szCs w:val="20"/>
-              </w:rPr>
-              <w:t xml:space="preserve">Before the change</w:t>
-            </w:r>
-          </w:p>
-        </w:tc>
-        <w:tc>
-          <w:tcPr>
-            <w:tcW w:type="dxa" w:w="2996"/>
-            <w:tcBorders>
-              <w:top w:val="single" w:color="1A202C" w:sz="12"/>
-              <w:left w:val="none" w:color="auto" w:sz="0"/>
-              <w:bottom w:val="single" w:color="1A202C" w:sz="12"/>
-              <w:right w:val="none" w:color="auto" w:sz="0"/>
-            </w:tcBorders>
-            <w:shd w:fill="F8FAFC"/>
-            <w:tcMar>
-              <w:top w:type="dxa" w:w="140"/>
-              <w:left w:type="dxa" w:w="160"/>
-              <w:bottom w:type="dxa" w:w="140"/>
-              <w:right w:type="dxa" w:w="160"/>
-            </w:tcMar>
-          </w:tcPr>
-          <w:p>
-            <w:pPr>
-              <w:spacing w:line="240" w:lineRule="auto"/>
-              <w:jc w:val="center"/>
-            </w:pPr>
-            <w:r>
-              <w:rPr>
-                <w:rFonts w:ascii="Arial" w:cs="Arial" w:eastAsia="Arial" w:hAnsi="Arial"/>
-                <w:b/>
-                <w:bCs/>
-                <w:sz w:val="20"/>
-                <w:szCs w:val="20"/>
-              </w:rPr>
-              <w:t xml:space="preserve">After the change</w:t>
-            </w:r>
-          </w:p>
-        </w:tc>
-      </w:tr>
-      <w:tr>
-        <w:trPr>
-          <w:cantSplit/>
-        </w:trPr>
-        <w:tc>
-          <w:tcPr>
-            <w:tcW w:type="dxa" w:w="3378"/>
-            <w:tcBorders>
-              <w:top w:val="single" w:color="E2E8F0" w:sz="4"/>
-              <w:left w:val="none" w:color="auto" w:sz="0"/>
-              <w:bottom w:val="single" w:color="E2E8F0" w:sz="4"/>
-              <w:right w:val="none" w:color="auto" w:sz="0"/>
-            </w:tcBorders>
-            <w:tcMar>
-              <w:top w:type="dxa" w:w="120"/>
-              <w:left w:type="dxa" w:w="160"/>
-              <w:bottom w:type="dxa" w:w="120"/>
-              <w:right w:type="dxa" w:w="160"/>
-            </w:tcMar>
-          </w:tcPr>
-          <w:p>
-            <w:pPr>
-              <w:spacing w:line="240" w:lineRule="auto"/>
-              <w:jc w:val="left"/>
-            </w:pPr>
-            <w:r>
-              <w:rPr>
-                <w:rFonts w:ascii="Arial" w:cs="Arial" w:eastAsia="Arial" w:hAnsi="Arial"/>
-                <w:b w:val="false"/>
-                <w:bCs w:val="false"/>
-                <w:sz w:val="20"/>
-                <w:szCs w:val="20"/>
-              </w:rPr>
-              <w:t xml:space="preserve">The same receipt sent twice at once, live system</w:t>
-            </w:r>
-          </w:p>
-        </w:tc>
-        <w:tc>
-          <w:tcPr>
-            <w:tcW w:type="dxa" w:w="2266"/>
-            <w:tcBorders>
-              <w:top w:val="single" w:color="E2E8F0" w:sz="4"/>
-              <w:left w:val="none" w:color="auto" w:sz="0"/>
-              <w:bottom w:val="single" w:color="E2E8F0" w:sz="4"/>
-              <w:right w:val="none" w:color="auto" w:sz="0"/>
-            </w:tcBorders>
-            <w:tcMar>
-              <w:top w:type="dxa" w:w="120"/>
-              <w:left w:type="dxa" w:w="160"/>
-              <w:bottom w:type="dxa" w:w="120"/>
-              <w:right w:type="dxa" w:w="160"/>
-            </w:tcMar>
-          </w:tcPr>
-          <w:p>
-            <w:pPr>
-              <w:spacing w:line="240" w:lineRule="auto"/>
-              <w:jc w:val="left"/>
-            </w:pPr>
-            <w:r>
-              <w:rPr>
-                <w:rFonts w:ascii="Arial" w:cs="Arial" w:eastAsia="Arial" w:hAnsi="Arial"/>
-                <w:b w:val="false"/>
-                <w:bCs w:val="false"/>
-                <w:sz w:val="20"/>
-                <w:szCs w:val="20"/>
-              </w:rPr>
-              <w:t xml:space="preserve">Both saved: 2 rows</w:t>
-            </w:r>
-          </w:p>
-        </w:tc>
-        <w:tc>
-          <w:tcPr>
-            <w:tcW w:type="dxa" w:w="2996"/>
-            <w:tcBorders>
-              <w:top w:val="single" w:color="E2E8F0" w:sz="4"/>
-              <w:left w:val="none" w:color="auto" w:sz="0"/>
-              <w:bottom w:val="single" w:color="E2E8F0" w:sz="4"/>
-              <w:right w:val="none" w:color="auto" w:sz="0"/>
-            </w:tcBorders>
-            <w:tcMar>
-              <w:top w:type="dxa" w:w="120"/>
-              <w:left w:type="dxa" w:w="160"/>
-              <w:bottom w:type="dxa" w:w="120"/>
-              <w:right w:type="dxa" w:w="160"/>
-            </w:tcMar>
-          </w:tcPr>
-          <w:p>
-            <w:pPr>
-              <w:spacing w:line="240" w:lineRule="auto"/>
-              <w:jc w:val="left"/>
-            </w:pPr>
-            <w:r>
-              <w:rPr>
-                <w:rFonts w:ascii="Arial" w:cs="Arial" w:eastAsia="Arial" w:hAnsi="Arial"/>
-                <w:b w:val="false"/>
-                <w:bCs w:val="false"/>
-                <w:sz w:val="20"/>
-                <w:szCs w:val="20"/>
-              </w:rPr>
-              <w:t xml:space="preserve">1 saved, 1 refused: 1 row</w:t>
-            </w:r>
-          </w:p>
-        </w:tc>
-      </w:tr>
-      <w:tr>
-        <w:trPr>
-          <w:cantSplit/>
-        </w:trPr>
-        <w:tc>
-          <w:tcPr>
-            <w:tcW w:type="dxa" w:w="3378"/>
-            <w:tcBorders>
-              <w:top w:val="single" w:color="E2E8F0" w:sz="4"/>
-              <w:left w:val="none" w:color="auto" w:sz="0"/>
-              <w:bottom w:val="single" w:color="E2E8F0" w:sz="4"/>
-              <w:right w:val="none" w:color="auto" w:sz="0"/>
-            </w:tcBorders>
-            <w:tcMar>
-              <w:top w:type="dxa" w:w="120"/>
-              <w:left w:type="dxa" w:w="160"/>
-              <w:bottom w:type="dxa" w:w="120"/>
-              <w:right w:type="dxa" w:w="160"/>
-            </w:tcMar>
-          </w:tcPr>
-          <w:p>
-            <w:pPr>
-              <w:spacing w:line="240" w:lineRule="auto"/>
-              <w:jc w:val="left"/>
-            </w:pPr>
-            <w:r>
-              <w:rPr>
-                <w:rFonts w:ascii="Arial" w:cs="Arial" w:eastAsia="Arial" w:hAnsi="Arial"/>
-                <w:b w:val="false"/>
-                <w:bCs w:val="false"/>
-                <w:sz w:val="20"/>
-                <w:szCs w:val="20"/>
-              </w:rPr>
-              <w:t xml:space="preserve">The same receipt sent five times at once, live system</w:t>
-            </w:r>
-          </w:p>
-        </w:tc>
-        <w:tc>
-          <w:tcPr>
-            <w:tcW w:type="dxa" w:w="2266"/>
-            <w:tcBorders>
-              <w:top w:val="single" w:color="E2E8F0" w:sz="4"/>
-              <w:left w:val="none" w:color="auto" w:sz="0"/>
-              <w:bottom w:val="single" w:color="E2E8F0" w:sz="4"/>
-              <w:right w:val="none" w:color="auto" w:sz="0"/>
-            </w:tcBorders>
-            <w:tcMar>
-              <w:top w:type="dxa" w:w="120"/>
-              <w:left w:type="dxa" w:w="160"/>
-              <w:bottom w:type="dxa" w:w="120"/>
-              <w:right w:type="dxa" w:w="160"/>
-            </w:tcMar>
-          </w:tcPr>
-          <w:p>
-            <w:pPr>
-              <w:spacing w:line="240" w:lineRule="auto"/>
-              <w:jc w:val="left"/>
-            </w:pPr>
-            <w:r>
-              <w:rPr>
-                <w:rFonts w:ascii="Arial" w:cs="Arial" w:eastAsia="Arial" w:hAnsi="Arial"/>
-                <w:b w:val="false"/>
-                <w:bCs w:val="false"/>
-                <w:sz w:val="20"/>
-                <w:szCs w:val="20"/>
-              </w:rPr>
-              <w:t xml:space="preserve">All five saved: 5 rows</w:t>
-            </w:r>
-          </w:p>
-        </w:tc>
-        <w:tc>
-          <w:tcPr>
-            <w:tcW w:type="dxa" w:w="2996"/>
-            <w:tcBorders>
-              <w:top w:val="single" w:color="E2E8F0" w:sz="4"/>
-              <w:left w:val="none" w:color="auto" w:sz="0"/>
-              <w:bottom w:val="single" w:color="E2E8F0" w:sz="4"/>
-              <w:right w:val="none" w:color="auto" w:sz="0"/>
-            </w:tcBorders>
-            <w:tcMar>
-              <w:top w:type="dxa" w:w="120"/>
-              <w:left w:type="dxa" w:w="160"/>
-              <w:bottom w:type="dxa" w:w="120"/>
-              <w:right w:type="dxa" w:w="160"/>
-            </w:tcMar>
-          </w:tcPr>
-          <w:p>
-            <w:pPr>
-              <w:spacing w:line="240" w:lineRule="auto"/>
-              <w:jc w:val="left"/>
-            </w:pPr>
-            <w:r>
-              <w:rPr>
-                <w:rFonts w:ascii="Arial" w:cs="Arial" w:eastAsia="Arial" w:hAnsi="Arial"/>
-                <w:b w:val="false"/>
-                <w:bCs w:val="false"/>
-                <w:sz w:val="20"/>
-                <w:szCs w:val="20"/>
-              </w:rPr>
-              <w:t xml:space="preserve">1 saved, 4 refused: 1 row</w:t>
-            </w:r>
-          </w:p>
-        </w:tc>
-      </w:tr>
-      <w:tr>
-        <w:trPr>
-          <w:cantSplit/>
-        </w:trPr>
-        <w:tc>
-          <w:tcPr>
-            <w:tcW w:type="dxa" w:w="3378"/>
-            <w:tcBorders>
-              <w:top w:val="single" w:color="E2E8F0" w:sz="4"/>
-              <w:left w:val="none" w:color="auto" w:sz="0"/>
-              <w:bottom w:val="single" w:color="E2E8F0" w:sz="4"/>
-              <w:right w:val="none" w:color="auto" w:sz="0"/>
-            </w:tcBorders>
-            <w:tcMar>
-              <w:top w:type="dxa" w:w="120"/>
-              <w:left w:type="dxa" w:w="160"/>
-              <w:bottom w:type="dxa" w:w="120"/>
-              <w:right w:type="dxa" w:w="160"/>
-            </w:tcMar>
-          </w:tcPr>
-          <w:p>
-            <w:pPr>
-              <w:spacing w:line="240" w:lineRule="auto"/>
-              <w:jc w:val="left"/>
-            </w:pPr>
-            <w:r>
-              <w:rPr>
-                <w:rFonts w:ascii="Arial" w:cs="Arial" w:eastAsia="Arial" w:hAnsi="Arial"/>
-                <w:b w:val="false"/>
-                <w:bCs w:val="false"/>
-                <w:sz w:val="20"/>
-                <w:szCs w:val="20"/>
-              </w:rPr>
-              <w:t xml:space="preserve">One receipt covering three months, live system</w:t>
-            </w:r>
-          </w:p>
-        </w:tc>
-        <w:tc>
-          <w:tcPr>
-            <w:tcW w:type="dxa" w:w="2266"/>
-            <w:tcBorders>
-              <w:top w:val="single" w:color="E2E8F0" w:sz="4"/>
-              <w:left w:val="none" w:color="auto" w:sz="0"/>
-              <w:bottom w:val="single" w:color="E2E8F0" w:sz="4"/>
-              <w:right w:val="none" w:color="auto" w:sz="0"/>
-            </w:tcBorders>
-            <w:tcMar>
-              <w:top w:type="dxa" w:w="120"/>
-              <w:left w:type="dxa" w:w="160"/>
-              <w:bottom w:type="dxa" w:w="120"/>
-              <w:right w:type="dxa" w:w="160"/>
-            </w:tcMar>
-          </w:tcPr>
-          <w:p>
-            <w:pPr>
-              <w:spacing w:line="240" w:lineRule="auto"/>
-              <w:jc w:val="left"/>
-            </w:pPr>
-          </w:p>
-        </w:tc>
-        <w:tc>
-          <w:tcPr>
-            <w:tcW w:type="dxa" w:w="2996"/>
-            <w:tcBorders>
-              <w:top w:val="single" w:color="E2E8F0" w:sz="4"/>
-              <w:left w:val="none" w:color="auto" w:sz="0"/>
-              <w:bottom w:val="single" w:color="E2E8F0" w:sz="4"/>
-              <w:right w:val="none" w:color="auto" w:sz="0"/>
-            </w:tcBorders>
-            <w:tcMar>
-              <w:top w:type="dxa" w:w="120"/>
-              <w:left w:type="dxa" w:w="160"/>
-              <w:bottom w:type="dxa" w:w="120"/>
-              <w:right w:type="dxa" w:w="160"/>
-            </w:tcMar>
-          </w:tcPr>
-          <w:p>
-            <w:pPr>
-              <w:spacing w:line="240" w:lineRule="auto"/>
-              <w:jc w:val="left"/>
-            </w:pPr>
-            <w:r>
-              <w:rPr>
-                <w:rFonts w:ascii="Arial" w:cs="Arial" w:eastAsia="Arial" w:hAnsi="Arial"/>
-                <w:b w:val="false"/>
-                <w:bCs w:val="false"/>
-                <w:sz w:val="20"/>
-                <w:szCs w:val="20"/>
-              </w:rPr>
-              <w:t xml:space="preserve">Saved as 3 rows, June to August 2026, as before</w:t>
-            </w:r>
-          </w:p>
-        </w:tc>
-      </w:tr>
-      <w:tr>
-        <w:trPr>
-          <w:cantSplit/>
-        </w:trPr>
-        <w:tc>
-          <w:tcPr>
-            <w:tcW w:type="dxa" w:w="3378"/>
-            <w:tcBorders>
-              <w:top w:val="single" w:color="E2E8F0" w:sz="4"/>
-              <w:left w:val="none" w:color="auto" w:sz="0"/>
-              <w:bottom w:val="single" w:color="E2E8F0" w:sz="4"/>
-              <w:right w:val="none" w:color="auto" w:sz="0"/>
-            </w:tcBorders>
-            <w:tcMar>
-              <w:top w:type="dxa" w:w="120"/>
-              <w:left w:type="dxa" w:w="160"/>
-              <w:bottom w:type="dxa" w:w="120"/>
-              <w:right w:type="dxa" w:w="160"/>
-            </w:tcMar>
-          </w:tcPr>
-          <w:p>
-            <w:pPr>
-              <w:spacing w:line="240" w:lineRule="auto"/>
-              <w:jc w:val="left"/>
-            </w:pPr>
-            <w:r>
-              <w:rPr>
-                <w:rFonts w:ascii="Arial" w:cs="Arial" w:eastAsia="Arial" w:hAnsi="Arial"/>
-                <w:b w:val="false"/>
-                <w:bCs w:val="false"/>
-                <w:sz w:val="20"/>
-                <w:szCs w:val="20"/>
-              </w:rPr>
-              <w:t xml:space="preserve">Two GCash checkouts opened on one bill at once, payment code with a stand-in database</w:t>
-            </w:r>
-          </w:p>
-        </w:tc>
-        <w:tc>
-          <w:tcPr>
-            <w:tcW w:type="dxa" w:w="2266"/>
-            <w:tcBorders>
-              <w:top w:val="single" w:color="E2E8F0" w:sz="4"/>
-              <w:left w:val="none" w:color="auto" w:sz="0"/>
-              <w:bottom w:val="single" w:color="E2E8F0" w:sz="4"/>
-              <w:right w:val="none" w:color="auto" w:sz="0"/>
-            </w:tcBorders>
-            <w:tcMar>
-              <w:top w:type="dxa" w:w="120"/>
-              <w:left w:type="dxa" w:w="160"/>
-              <w:bottom w:type="dxa" w:w="120"/>
-              <w:right w:type="dxa" w:w="160"/>
-            </w:tcMar>
-          </w:tcPr>
-          <w:p>
-            <w:pPr>
-              <w:spacing w:line="240" w:lineRule="auto"/>
-              <w:jc w:val="left"/>
-            </w:pPr>
-            <w:r>
-              <w:rPr>
-                <w:rFonts w:ascii="Arial" w:cs="Arial" w:eastAsia="Arial" w:hAnsi="Arial"/>
-                <w:b w:val="false"/>
-                <w:bCs w:val="false"/>
-                <w:sz w:val="20"/>
-                <w:szCs w:val="20"/>
-              </w:rPr>
-              <w:t xml:space="preserve">Both opened, so both payments could be recorded</w:t>
-            </w:r>
-          </w:p>
-        </w:tc>
-        <w:tc>
-          <w:tcPr>
-            <w:tcW w:type="dxa" w:w="2996"/>
-            <w:tcBorders>
-              <w:top w:val="single" w:color="E2E8F0" w:sz="4"/>
-              <w:left w:val="none" w:color="auto" w:sz="0"/>
-              <w:bottom w:val="single" w:color="E2E8F0" w:sz="4"/>
-              <w:right w:val="none" w:color="auto" w:sz="0"/>
-            </w:tcBorders>
-            <w:tcMar>
-              <w:top w:type="dxa" w:w="120"/>
-              <w:left w:type="dxa" w:w="160"/>
-              <w:bottom w:type="dxa" w:w="120"/>
-              <w:right w:type="dxa" w:w="160"/>
-            </w:tcMar>
-          </w:tcPr>
-          <w:p>
-            <w:pPr>
-              <w:spacing w:line="240" w:lineRule="auto"/>
-              <w:jc w:val="left"/>
-            </w:pPr>
-            <w:r>
-              <w:rPr>
-                <w:rFonts w:ascii="Arial" w:cs="Arial" w:eastAsia="Arial" w:hAnsi="Arial"/>
-                <w:b w:val="false"/>
-                <w:bCs w:val="false"/>
-                <w:sz w:val="20"/>
-                <w:szCs w:val="20"/>
-              </w:rPr>
-              <w:t xml:space="preserve">1 opened, 1 refused</w:t>
-            </w:r>
-          </w:p>
-        </w:tc>
-      </w:tr>
-      <w:tr>
-        <w:trPr>
-          <w:cantSplit/>
-        </w:trPr>
-        <w:tc>
-          <w:tcPr>
-            <w:tcW w:type="dxa" w:w="3378"/>
-            <w:tcBorders>
-              <w:top w:val="single" w:color="E2E8F0" w:sz="4"/>
-              <w:left w:val="none" w:color="auto" w:sz="0"/>
-              <w:bottom w:val="single" w:color="1A202C" w:sz="12"/>
-              <w:right w:val="none" w:color="auto" w:sz="0"/>
-            </w:tcBorders>
-            <w:tcMar>
-              <w:top w:type="dxa" w:w="120"/>
-              <w:left w:type="dxa" w:w="160"/>
-              <w:bottom w:type="dxa" w:w="120"/>
-              <w:right w:type="dxa" w:w="160"/>
-            </w:tcMar>
-          </w:tcPr>
-          <w:p>
-            <w:pPr>
-              <w:spacing w:line="240" w:lineRule="auto"/>
-              <w:jc w:val="left"/>
-            </w:pPr>
-            <w:r>
-              <w:rPr>
-                <w:rFonts w:ascii="Arial" w:cs="Arial" w:eastAsia="Arial" w:hAnsi="Arial"/>
-                <w:b w:val="false"/>
-                <w:bCs w:val="false"/>
-                <w:sz w:val="20"/>
-                <w:szCs w:val="20"/>
-              </w:rPr>
-              <w:t xml:space="preserve">A checkout 16 minutes after one was abandoned</w:t>
-            </w:r>
-          </w:p>
-        </w:tc>
-        <w:tc>
-          <w:tcPr>
-            <w:tcW w:type="dxa" w:w="2266"/>
-            <w:tcBorders>
-              <w:top w:val="single" w:color="E2E8F0" w:sz="4"/>
-              <w:left w:val="none" w:color="auto" w:sz="0"/>
-              <w:bottom w:val="single" w:color="1A202C" w:sz="12"/>
-              <w:right w:val="none" w:color="auto" w:sz="0"/>
-            </w:tcBorders>
-            <w:tcMar>
-              <w:top w:type="dxa" w:w="120"/>
-              <w:left w:type="dxa" w:w="160"/>
-              <w:bottom w:type="dxa" w:w="120"/>
-              <w:right w:type="dxa" w:w="160"/>
-            </w:tcMar>
-          </w:tcPr>
-          <w:p>
-            <w:pPr>
-              <w:spacing w:line="240" w:lineRule="auto"/>
-              <w:jc w:val="left"/>
-            </w:pPr>
-          </w:p>
-        </w:tc>
-        <w:tc>
-          <w:tcPr>
-            <w:tcW w:type="dxa" w:w="2996"/>
-            <w:tcBorders>
-              <w:top w:val="single" w:color="E2E8F0" w:sz="4"/>
-              <w:left w:val="none" w:color="auto" w:sz="0"/>
-              <w:bottom w:val="single" w:color="1A202C" w:sz="12"/>
-              <w:right w:val="none" w:color="auto" w:sz="0"/>
-            </w:tcBorders>
-            <w:tcMar>
-              <w:top w:type="dxa" w:w="120"/>
-              <w:left w:type="dxa" w:w="160"/>
-              <w:bottom w:type="dxa" w:w="120"/>
-              <w:right w:type="dxa" w:w="160"/>
-            </w:tcMar>
-          </w:tcPr>
-          <w:p>
-            <w:pPr>
-              <w:spacing w:line="240" w:lineRule="auto"/>
-              <w:jc w:val="left"/>
-            </w:pPr>
-            <w:r>
-              <w:rPr>
-                <w:rFonts w:ascii="Arial" w:cs="Arial" w:eastAsia="Arial" w:hAnsi="Arial"/>
-                <w:b w:val="false"/>
-                <w:bCs w:val="false"/>
-                <w:sz w:val="20"/>
-                <w:szCs w:val="20"/>
-              </w:rPr>
-              <w:t xml:space="preserve">Opened: an abandoned checkout holds the bill for 15 minutes, not for good</w:t>
-            </w:r>
-          </w:p>
-        </w:tc>
-      </w:tr>
-    </w:tbl>
-    <w:p>
-      <w:pPr>
-        <w:spacing w:after="240" w:before="120" w:line="480" w:lineRule="auto"/>
-      </w:pPr>
     </w:p>
     <w:p>
       <w:pPr>
@@ -20762,7 +17787,7 @@
           <w:sz w:val="24"/>
           <w:szCs w:val="24"/>
         </w:rPr>
-        <w:t xml:space="preserve">Every task the tenants attempted was completed, 31 of 34 attempts without help (91 percent). Help was needed only at the start: two of the three tenants were helped through their first sign-in and one to find their unit and rent; everything else, from finding payments to reporting a repair and opening the GCash payment, was done alone in one to two minutes. The repairs they sent reached the owner at once, and she acted on them the same evening. Mia et al. (2024) name limited technical capacity as a barrier when small Philippine enterprises adopt digital tools; these results place it precisely, in the first two things a new user does. The tests that needed several tenants saving at once were not performed, because only two attended together; in the session in which the owner and two tenants used the system at the same time, every screen loaded, each tenant saw only their own unit, the owner's full year of Monthly Income opened in about three seconds, and no session affected another (Appendix M, Table M-22). On two phones the offline behavior matched Table 11A, except that the Android phone showed the "cannot tell whether it was saved" message after 60 to 80 seconds instead of 45; corrected on 1 October, it was on time when re-tested on that phone on 13 October 2026 (Table 23A).</w:t>
+        <w:t xml:space="preserve">Every task the tenants attempted was completed, 31 of 34 attempts without help (91 percent). Help was needed only at the start: two of the three tenants were helped through their first sign-in and one to find their unit and rent; everything else, from finding payments to reporting a repair and opening the GCash payment, was done alone in one to two minutes. The repairs they sent reached the owner at once, and she acted on them the same evening. Mia et al. (2024) name limited technical capacity as a barrier when small Philippine enterprises adopt digital tools; these results place it precisely, in the first two things a new user does. The tests that needed several tenants saving at once were not performed, because only two attended together; in the session in which the owner and two tenants used the system at the same time, every screen loaded, each tenant saw only their own unit, the owner's full year of Monthly Income opened in about three seconds, and no session affected another (Appendix M, Table M-22). On two phones the offline behavior matched Appendix M, Table 11A, except that the Android phone showed the "cannot tell whether it was saved" message after 60 to 80 seconds instead of 45; corrected on 1 October, it was on time when re-tested on that phone on 13 October 2026 (Table 23A).</w:t>
       </w:r>
     </w:p>
     <w:p>
@@ -22410,7 +19435,7 @@
         </w:trPr>
         <w:tc>
           <w:tcPr>
-            <w:tcW w:type="dxa" w:w="1822"/>
+            <w:tcW w:type="dxa" w:w="1808"/>
             <w:tcBorders>
               <w:top w:val="single" w:color="1A202C" w:sz="12"/>
               <w:left w:val="none" w:color="auto" w:sz="0"/>
@@ -22444,7 +19469,7 @@
         </w:tc>
         <w:tc>
           <w:tcPr>
-            <w:tcW w:type="dxa" w:w="2521"/>
+            <w:tcW w:type="dxa" w:w="2502"/>
             <w:tcBorders>
               <w:top w:val="single" w:color="1A202C" w:sz="12"/>
               <w:left w:val="none" w:color="auto" w:sz="0"/>
@@ -22478,7 +19503,7 @@
         </w:tc>
         <w:tc>
           <w:tcPr>
-            <w:tcW w:type="dxa" w:w="4297"/>
+            <w:tcW w:type="dxa" w:w="4330"/>
             <w:tcBorders>
               <w:top w:val="single" w:color="1A202C" w:sz="12"/>
               <w:left w:val="none" w:color="auto" w:sz="0"/>
@@ -22517,7 +19542,7 @@
         </w:trPr>
         <w:tc>
           <w:tcPr>
-            <w:tcW w:type="dxa" w:w="1822"/>
+            <w:tcW w:type="dxa" w:w="1808"/>
             <w:tcBorders>
               <w:top w:val="single" w:color="E2E8F0" w:sz="4"/>
               <w:left w:val="none" w:color="auto" w:sz="0"/>
@@ -22550,7 +19575,7 @@
         </w:tc>
         <w:tc>
           <w:tcPr>
-            <w:tcW w:type="dxa" w:w="2521"/>
+            <w:tcW w:type="dxa" w:w="2502"/>
             <w:tcBorders>
               <w:top w:val="single" w:color="E2E8F0" w:sz="4"/>
               <w:left w:val="none" w:color="auto" w:sz="0"/>
@@ -22583,7 +19608,7 @@
         </w:tc>
         <w:tc>
           <w:tcPr>
-            <w:tcW w:type="dxa" w:w="4297"/>
+            <w:tcW w:type="dxa" w:w="4330"/>
             <w:tcBorders>
               <w:top w:val="single" w:color="E2E8F0" w:sz="4"/>
               <w:left w:val="none" w:color="auto" w:sz="0"/>
@@ -22621,7 +19646,7 @@
         </w:trPr>
         <w:tc>
           <w:tcPr>
-            <w:tcW w:type="dxa" w:w="1822"/>
+            <w:tcW w:type="dxa" w:w="1808"/>
             <w:tcBorders>
               <w:top w:val="single" w:color="718096" w:sz="6"/>
               <w:left w:val="none" w:color="auto" w:sz="0"/>
@@ -22655,7 +19680,7 @@
         </w:tc>
         <w:tc>
           <w:tcPr>
-            <w:tcW w:type="dxa" w:w="2521"/>
+            <w:tcW w:type="dxa" w:w="2502"/>
             <w:tcBorders>
               <w:top w:val="single" w:color="718096" w:sz="6"/>
               <w:left w:val="none" w:color="auto" w:sz="0"/>
@@ -22689,7 +19714,7 @@
         </w:tc>
         <w:tc>
           <w:tcPr>
-            <w:tcW w:type="dxa" w:w="4297"/>
+            <w:tcW w:type="dxa" w:w="4330"/>
             <w:tcBorders>
               <w:top w:val="single" w:color="718096" w:sz="6"/>
               <w:left w:val="none" w:color="auto" w:sz="0"/>
@@ -22717,7 +19742,7 @@
                 <w:sz w:val="20"/>
                 <w:szCs w:val="20"/>
               </w:rPr>
-              <w:t xml:space="preserve">Measures from the tests of Section 4.3 (Table 7D); survey items assigned to sub-characteristics (Chapter 3, Table 4B); criteria: Table 13 for every mean, and for tests the course standard of at least 90 percent passed with no critical defect open</w:t>
+              <w:t xml:space="preserve">Measures from the tests of Section 4.3 (Table 7D); survey items assigned to sub-characteristics (Chapter 3, Table 4B); criteria: Chapter 3's Table 4A for every mean, and for tests the course standard of at least 90 percent passed with no critical defect open</w:t>
             </w:r>
           </w:p>
         </w:tc>
@@ -22728,7 +19753,7 @@
         </w:trPr>
         <w:tc>
           <w:tcPr>
-            <w:tcW w:type="dxa" w:w="1822"/>
+            <w:tcW w:type="dxa" w:w="1808"/>
             <w:tcBorders>
               <w:top w:val="single" w:color="E2E8F0" w:sz="4"/>
               <w:left w:val="none" w:color="auto" w:sz="0"/>
@@ -22761,7 +19786,7 @@
         </w:tc>
         <w:tc>
           <w:tcPr>
-            <w:tcW w:type="dxa" w:w="2521"/>
+            <w:tcW w:type="dxa" w:w="2502"/>
             <w:tcBorders>
               <w:top w:val="single" w:color="E2E8F0" w:sz="4"/>
               <w:left w:val="none" w:color="auto" w:sz="0"/>
@@ -22794,7 +19819,7 @@
         </w:tc>
         <w:tc>
           <w:tcPr>
-            <w:tcW w:type="dxa" w:w="4297"/>
+            <w:tcW w:type="dxa" w:w="4330"/>
             <w:tcBorders>
               <w:top w:val="single" w:color="E2E8F0" w:sz="4"/>
               <w:left w:val="none" w:color="auto" w:sz="0"/>
@@ -22832,7 +19857,7 @@
         </w:trPr>
         <w:tc>
           <w:tcPr>
-            <w:tcW w:type="dxa" w:w="1822"/>
+            <w:tcW w:type="dxa" w:w="1808"/>
             <w:tcBorders>
               <w:top w:val="single" w:color="E2E8F0" w:sz="4"/>
               <w:left w:val="none" w:color="auto" w:sz="0"/>
@@ -22865,7 +19890,7 @@
         </w:tc>
         <w:tc>
           <w:tcPr>
-            <w:tcW w:type="dxa" w:w="2521"/>
+            <w:tcW w:type="dxa" w:w="2502"/>
             <w:tcBorders>
               <w:top w:val="single" w:color="E2E8F0" w:sz="4"/>
               <w:left w:val="none" w:color="auto" w:sz="0"/>
@@ -22898,7 +19923,7 @@
         </w:tc>
         <w:tc>
           <w:tcPr>
-            <w:tcW w:type="dxa" w:w="4297"/>
+            <w:tcW w:type="dxa" w:w="4330"/>
             <w:tcBorders>
               <w:top w:val="single" w:color="E2E8F0" w:sz="4"/>
               <w:left w:val="none" w:color="auto" w:sz="0"/>
@@ -22936,7 +19961,7 @@
         </w:trPr>
         <w:tc>
           <w:tcPr>
-            <w:tcW w:type="dxa" w:w="1822"/>
+            <w:tcW w:type="dxa" w:w="1808"/>
             <w:tcBorders>
               <w:top w:val="single" w:color="E2E8F0" w:sz="4"/>
               <w:left w:val="none" w:color="auto" w:sz="0"/>
@@ -22969,7 +19994,7 @@
         </w:tc>
         <w:tc>
           <w:tcPr>
-            <w:tcW w:type="dxa" w:w="2521"/>
+            <w:tcW w:type="dxa" w:w="2502"/>
             <w:tcBorders>
               <w:top w:val="single" w:color="E2E8F0" w:sz="4"/>
               <w:left w:val="none" w:color="auto" w:sz="0"/>
@@ -23002,7 +20027,7 @@
         </w:tc>
         <w:tc>
           <w:tcPr>
-            <w:tcW w:type="dxa" w:w="4297"/>
+            <w:tcW w:type="dxa" w:w="4330"/>
             <w:tcBorders>
               <w:top w:val="single" w:color="E2E8F0" w:sz="4"/>
               <w:left w:val="none" w:color="auto" w:sz="0"/>
@@ -24967,486 +21992,8 @@
           <w:sz w:val="24"/>
           <w:szCs w:val="24"/>
         </w:rPr>
-        <w:t xml:space="preserve">Each item was rated on the five-point scale in Table 4, and means are read using Table 13. The composite of each characteristic is the mean of its group means, so that one owner is not outweighed by three tenants on functions only she uses, and the overall mean is the mean of the eight composites. Averaging every response together instead gives 4.55 rather than 4.53, with the same interpretation and ranking. Table 13A works one weighted mean in full, WM = Σ(f × w) / N.</w:t>
+        <w:t xml:space="preserve">Each item was rated on the five-point scale in Table 4, and means are read using Chapter 3's Table 4A. The composite of each characteristic is the mean of its group means, so that one owner is not outweighed by three tenants on functions only she uses, and the overall mean is the mean of the eight composites. Averaging every response together instead gives 4.55 rather than 4.53, with the same interpretation and ranking. Table 13A works one weighted mean in full, WM = Σ(f × w) / N.</w:t>
       </w:r>
-    </w:p>
-    <w:p>
-      <w:pPr>
-        <w:keepNext/>
-        <w:spacing w:after="120" w:before="360" w:line="480" w:lineRule="auto"/>
-        <w:jc w:val="left"/>
-      </w:pPr>
-      <w:r>
-        <w:rPr>
-          <w:rFonts w:ascii="Arial" w:cs="Arial" w:eastAsia="Arial" w:hAnsi="Arial"/>
-          <w:b/>
-          <w:bCs/>
-          <w:sz w:val="24"/>
-          <w:szCs w:val="24"/>
-        </w:rPr>
-        <w:t xml:space="preserve">Table 13.</w:t>
-      </w:r>
-      <w:r>
-        <w:rPr>
-          <w:rFonts w:ascii="Arial" w:cs="Arial" w:eastAsia="Arial" w:hAnsi="Arial"/>
-          <w:b/>
-          <w:bCs/>
-          <w:sz w:val="24"/>
-          <w:szCs w:val="24"/>
-        </w:rPr>
-        <w:t xml:space="preserve"> Interpretation of mean scores</w:t>
-      </w:r>
-    </w:p>
-    <w:tbl>
-      <w:tblPr>
-        <w:tblW w:type="dxa" w:w="8640"/>
-        <w:tblBorders>
-          <w:top w:val="single" w:color="auto" w:sz="4"/>
-          <w:left w:val="single" w:color="auto" w:sz="4"/>
-          <w:bottom w:val="single" w:color="auto" w:sz="4"/>
-          <w:right w:val="single" w:color="auto" w:sz="4"/>
-          <w:insideH w:val="single" w:color="auto" w:sz="4"/>
-          <w:insideV w:val="single" w:color="auto" w:sz="4"/>
-        </w:tblBorders>
-      </w:tblPr>
-      <w:tblGrid>
-        <w:gridCol w:w="100"/>
-        <w:gridCol w:w="100"/>
-      </w:tblGrid>
-      <w:tr>
-        <w:trPr>
-          <w:cantSplit/>
-          <w:tblHeader/>
-        </w:trPr>
-        <w:tc>
-          <w:tcPr>
-            <w:tcW w:type="dxa" w:w="3831"/>
-            <w:tcBorders>
-              <w:top w:val="single" w:color="1A202C" w:sz="12"/>
-              <w:left w:val="none" w:color="auto" w:sz="0"/>
-              <w:bottom w:val="single" w:color="1A202C" w:sz="12"/>
-              <w:right w:val="none" w:color="auto" w:sz="0"/>
-            </w:tcBorders>
-            <w:shd w:fill="F8FAFC"/>
-            <w:tcMar>
-              <w:top w:type="dxa" w:w="140"/>
-              <w:left w:type="dxa" w:w="160"/>
-              <w:bottom w:type="dxa" w:w="140"/>
-              <w:right w:type="dxa" w:w="160"/>
-            </w:tcMar>
-          </w:tcPr>
-          <w:p>
-            <w:pPr>
-              <w:spacing w:line="240" w:lineRule="auto"/>
-              <w:jc w:val="left"/>
-            </w:pPr>
-            <w:r>
-              <w:rPr>
-                <w:rFonts w:ascii="Arial" w:cs="Arial" w:eastAsia="Arial" w:hAnsi="Arial"/>
-                <w:b/>
-                <w:bCs/>
-                <w:sz w:val="20"/>
-                <w:szCs w:val="20"/>
-              </w:rPr>
-              <w:t xml:space="preserve">Mean score</w:t>
-            </w:r>
-          </w:p>
-        </w:tc>
-        <w:tc>
-          <w:tcPr>
-            <w:tcW w:type="dxa" w:w="4809"/>
-            <w:tcBorders>
-              <w:top w:val="single" w:color="1A202C" w:sz="12"/>
-              <w:left w:val="none" w:color="auto" w:sz="0"/>
-              <w:bottom w:val="single" w:color="1A202C" w:sz="12"/>
-              <w:right w:val="none" w:color="auto" w:sz="0"/>
-            </w:tcBorders>
-            <w:shd w:fill="F8FAFC"/>
-            <w:tcMar>
-              <w:top w:type="dxa" w:w="140"/>
-              <w:left w:type="dxa" w:w="160"/>
-              <w:bottom w:type="dxa" w:w="140"/>
-              <w:right w:type="dxa" w:w="160"/>
-            </w:tcMar>
-          </w:tcPr>
-          <w:p>
-            <w:pPr>
-              <w:spacing w:line="240" w:lineRule="auto"/>
-              <w:jc w:val="center"/>
-            </w:pPr>
-            <w:r>
-              <w:rPr>
-                <w:rFonts w:ascii="Arial" w:cs="Arial" w:eastAsia="Arial" w:hAnsi="Arial"/>
-                <w:b/>
-                <w:bCs/>
-                <w:sz w:val="20"/>
-                <w:szCs w:val="20"/>
-              </w:rPr>
-              <w:t xml:space="preserve">Verbal interpretation</w:t>
-            </w:r>
-          </w:p>
-        </w:tc>
-      </w:tr>
-      <w:tr>
-        <w:trPr>
-          <w:cantSplit/>
-        </w:trPr>
-        <w:tc>
-          <w:tcPr>
-            <w:tcW w:type="dxa" w:w="3831"/>
-            <w:tcBorders>
-              <w:top w:val="single" w:color="E2E8F0" w:sz="4"/>
-              <w:left w:val="none" w:color="auto" w:sz="0"/>
-              <w:bottom w:val="single" w:color="E2E8F0" w:sz="4"/>
-              <w:right w:val="none" w:color="auto" w:sz="0"/>
-            </w:tcBorders>
-            <w:tcMar>
-              <w:top w:type="dxa" w:w="120"/>
-              <w:left w:type="dxa" w:w="160"/>
-              <w:bottom w:type="dxa" w:w="120"/>
-              <w:right w:type="dxa" w:w="160"/>
-            </w:tcMar>
-          </w:tcPr>
-          <w:p>
-            <w:pPr>
-              <w:spacing w:line="240" w:lineRule="auto"/>
-              <w:jc w:val="left"/>
-            </w:pPr>
-            <w:r>
-              <w:rPr>
-                <w:rFonts w:ascii="Arial" w:cs="Arial" w:eastAsia="Arial" w:hAnsi="Arial"/>
-                <w:b w:val="false"/>
-                <w:bCs w:val="false"/>
-                <w:sz w:val="20"/>
-                <w:szCs w:val="20"/>
-              </w:rPr>
-              <w:t xml:space="preserve">4.21 – 5.00</w:t>
-            </w:r>
-          </w:p>
-        </w:tc>
-        <w:tc>
-          <w:tcPr>
-            <w:tcW w:type="dxa" w:w="4809"/>
-            <w:tcBorders>
-              <w:top w:val="single" w:color="E2E8F0" w:sz="4"/>
-              <w:left w:val="none" w:color="auto" w:sz="0"/>
-              <w:bottom w:val="single" w:color="E2E8F0" w:sz="4"/>
-              <w:right w:val="none" w:color="auto" w:sz="0"/>
-            </w:tcBorders>
-            <w:tcMar>
-              <w:top w:type="dxa" w:w="120"/>
-              <w:left w:type="dxa" w:w="160"/>
-              <w:bottom w:type="dxa" w:w="120"/>
-              <w:right w:type="dxa" w:w="160"/>
-            </w:tcMar>
-          </w:tcPr>
-          <w:p>
-            <w:pPr>
-              <w:spacing w:line="240" w:lineRule="auto"/>
-              <w:jc w:val="left"/>
-            </w:pPr>
-            <w:r>
-              <w:rPr>
-                <w:rFonts w:ascii="Arial" w:cs="Arial" w:eastAsia="Arial" w:hAnsi="Arial"/>
-                <w:b w:val="false"/>
-                <w:bCs w:val="false"/>
-                <w:sz w:val="20"/>
-                <w:szCs w:val="20"/>
-              </w:rPr>
-              <w:t xml:space="preserve">Very High Quality</w:t>
-            </w:r>
-          </w:p>
-        </w:tc>
-      </w:tr>
-      <w:tr>
-        <w:trPr>
-          <w:cantSplit/>
-        </w:trPr>
-        <w:tc>
-          <w:tcPr>
-            <w:tcW w:type="dxa" w:w="3831"/>
-            <w:tcBorders>
-              <w:top w:val="single" w:color="E2E8F0" w:sz="4"/>
-              <w:left w:val="none" w:color="auto" w:sz="0"/>
-              <w:bottom w:val="single" w:color="E2E8F0" w:sz="4"/>
-              <w:right w:val="none" w:color="auto" w:sz="0"/>
-            </w:tcBorders>
-            <w:tcMar>
-              <w:top w:type="dxa" w:w="120"/>
-              <w:left w:type="dxa" w:w="160"/>
-              <w:bottom w:type="dxa" w:w="120"/>
-              <w:right w:type="dxa" w:w="160"/>
-            </w:tcMar>
-          </w:tcPr>
-          <w:p>
-            <w:pPr>
-              <w:spacing w:line="240" w:lineRule="auto"/>
-              <w:jc w:val="left"/>
-            </w:pPr>
-            <w:r>
-              <w:rPr>
-                <w:rFonts w:ascii="Arial" w:cs="Arial" w:eastAsia="Arial" w:hAnsi="Arial"/>
-                <w:b w:val="false"/>
-                <w:bCs w:val="false"/>
-                <w:sz w:val="20"/>
-                <w:szCs w:val="20"/>
-              </w:rPr>
-              <w:t xml:space="preserve">3.41 – 4.20</w:t>
-            </w:r>
-          </w:p>
-        </w:tc>
-        <w:tc>
-          <w:tcPr>
-            <w:tcW w:type="dxa" w:w="4809"/>
-            <w:tcBorders>
-              <w:top w:val="single" w:color="E2E8F0" w:sz="4"/>
-              <w:left w:val="none" w:color="auto" w:sz="0"/>
-              <w:bottom w:val="single" w:color="E2E8F0" w:sz="4"/>
-              <w:right w:val="none" w:color="auto" w:sz="0"/>
-            </w:tcBorders>
-            <w:tcMar>
-              <w:top w:type="dxa" w:w="120"/>
-              <w:left w:type="dxa" w:w="160"/>
-              <w:bottom w:type="dxa" w:w="120"/>
-              <w:right w:type="dxa" w:w="160"/>
-            </w:tcMar>
-          </w:tcPr>
-          <w:p>
-            <w:pPr>
-              <w:spacing w:line="240" w:lineRule="auto"/>
-              <w:jc w:val="left"/>
-            </w:pPr>
-            <w:r>
-              <w:rPr>
-                <w:rFonts w:ascii="Arial" w:cs="Arial" w:eastAsia="Arial" w:hAnsi="Arial"/>
-                <w:b w:val="false"/>
-                <w:bCs w:val="false"/>
-                <w:sz w:val="20"/>
-                <w:szCs w:val="20"/>
-              </w:rPr>
-              <w:t xml:space="preserve">High Quality</w:t>
-            </w:r>
-          </w:p>
-        </w:tc>
-      </w:tr>
-      <w:tr>
-        <w:trPr>
-          <w:cantSplit/>
-        </w:trPr>
-        <w:tc>
-          <w:tcPr>
-            <w:tcW w:type="dxa" w:w="3831"/>
-            <w:tcBorders>
-              <w:top w:val="single" w:color="E2E8F0" w:sz="4"/>
-              <w:left w:val="none" w:color="auto" w:sz="0"/>
-              <w:bottom w:val="single" w:color="E2E8F0" w:sz="4"/>
-              <w:right w:val="none" w:color="auto" w:sz="0"/>
-            </w:tcBorders>
-            <w:tcMar>
-              <w:top w:type="dxa" w:w="120"/>
-              <w:left w:type="dxa" w:w="160"/>
-              <w:bottom w:type="dxa" w:w="120"/>
-              <w:right w:type="dxa" w:w="160"/>
-            </w:tcMar>
-          </w:tcPr>
-          <w:p>
-            <w:pPr>
-              <w:spacing w:line="240" w:lineRule="auto"/>
-              <w:jc w:val="left"/>
-            </w:pPr>
-            <w:r>
-              <w:rPr>
-                <w:rFonts w:ascii="Arial" w:cs="Arial" w:eastAsia="Arial" w:hAnsi="Arial"/>
-                <w:b w:val="false"/>
-                <w:bCs w:val="false"/>
-                <w:sz w:val="20"/>
-                <w:szCs w:val="20"/>
-              </w:rPr>
-              <w:t xml:space="preserve">2.61 – 3.40</w:t>
-            </w:r>
-          </w:p>
-        </w:tc>
-        <w:tc>
-          <w:tcPr>
-            <w:tcW w:type="dxa" w:w="4809"/>
-            <w:tcBorders>
-              <w:top w:val="single" w:color="E2E8F0" w:sz="4"/>
-              <w:left w:val="none" w:color="auto" w:sz="0"/>
-              <w:bottom w:val="single" w:color="E2E8F0" w:sz="4"/>
-              <w:right w:val="none" w:color="auto" w:sz="0"/>
-            </w:tcBorders>
-            <w:tcMar>
-              <w:top w:type="dxa" w:w="120"/>
-              <w:left w:type="dxa" w:w="160"/>
-              <w:bottom w:type="dxa" w:w="120"/>
-              <w:right w:type="dxa" w:w="160"/>
-            </w:tcMar>
-          </w:tcPr>
-          <w:p>
-            <w:pPr>
-              <w:spacing w:line="240" w:lineRule="auto"/>
-              <w:jc w:val="left"/>
-            </w:pPr>
-            <w:r>
-              <w:rPr>
-                <w:rFonts w:ascii="Arial" w:cs="Arial" w:eastAsia="Arial" w:hAnsi="Arial"/>
-                <w:b w:val="false"/>
-                <w:bCs w:val="false"/>
-                <w:sz w:val="20"/>
-                <w:szCs w:val="20"/>
-              </w:rPr>
-              <w:t xml:space="preserve">Moderate Quality</w:t>
-            </w:r>
-          </w:p>
-        </w:tc>
-      </w:tr>
-      <w:tr>
-        <w:trPr>
-          <w:cantSplit/>
-        </w:trPr>
-        <w:tc>
-          <w:tcPr>
-            <w:tcW w:type="dxa" w:w="3831"/>
-            <w:tcBorders>
-              <w:top w:val="single" w:color="E2E8F0" w:sz="4"/>
-              <w:left w:val="none" w:color="auto" w:sz="0"/>
-              <w:bottom w:val="single" w:color="E2E8F0" w:sz="4"/>
-              <w:right w:val="none" w:color="auto" w:sz="0"/>
-            </w:tcBorders>
-            <w:tcMar>
-              <w:top w:type="dxa" w:w="120"/>
-              <w:left w:type="dxa" w:w="160"/>
-              <w:bottom w:type="dxa" w:w="120"/>
-              <w:right w:type="dxa" w:w="160"/>
-            </w:tcMar>
-          </w:tcPr>
-          <w:p>
-            <w:pPr>
-              <w:spacing w:line="240" w:lineRule="auto"/>
-              <w:jc w:val="left"/>
-            </w:pPr>
-            <w:r>
-              <w:rPr>
-                <w:rFonts w:ascii="Arial" w:cs="Arial" w:eastAsia="Arial" w:hAnsi="Arial"/>
-                <w:b w:val="false"/>
-                <w:bCs w:val="false"/>
-                <w:sz w:val="20"/>
-                <w:szCs w:val="20"/>
-              </w:rPr>
-              <w:t xml:space="preserve">1.81 – 2.60</w:t>
-            </w:r>
-          </w:p>
-        </w:tc>
-        <w:tc>
-          <w:tcPr>
-            <w:tcW w:type="dxa" w:w="4809"/>
-            <w:tcBorders>
-              <w:top w:val="single" w:color="E2E8F0" w:sz="4"/>
-              <w:left w:val="none" w:color="auto" w:sz="0"/>
-              <w:bottom w:val="single" w:color="E2E8F0" w:sz="4"/>
-              <w:right w:val="none" w:color="auto" w:sz="0"/>
-            </w:tcBorders>
-            <w:tcMar>
-              <w:top w:type="dxa" w:w="120"/>
-              <w:left w:type="dxa" w:w="160"/>
-              <w:bottom w:type="dxa" w:w="120"/>
-              <w:right w:type="dxa" w:w="160"/>
-            </w:tcMar>
-          </w:tcPr>
-          <w:p>
-            <w:pPr>
-              <w:spacing w:line="240" w:lineRule="auto"/>
-              <w:jc w:val="left"/>
-            </w:pPr>
-            <w:r>
-              <w:rPr>
-                <w:rFonts w:ascii="Arial" w:cs="Arial" w:eastAsia="Arial" w:hAnsi="Arial"/>
-                <w:b w:val="false"/>
-                <w:bCs w:val="false"/>
-                <w:sz w:val="20"/>
-                <w:szCs w:val="20"/>
-              </w:rPr>
-              <w:t xml:space="preserve">Low Quality</w:t>
-            </w:r>
-          </w:p>
-        </w:tc>
-      </w:tr>
-      <w:tr>
-        <w:trPr>
-          <w:cantSplit/>
-        </w:trPr>
-        <w:tc>
-          <w:tcPr>
-            <w:tcW w:type="dxa" w:w="3831"/>
-            <w:tcBorders>
-              <w:top w:val="single" w:color="E2E8F0" w:sz="4"/>
-              <w:left w:val="none" w:color="auto" w:sz="0"/>
-              <w:bottom w:val="single" w:color="1A202C" w:sz="12"/>
-              <w:right w:val="none" w:color="auto" w:sz="0"/>
-            </w:tcBorders>
-            <w:tcMar>
-              <w:top w:type="dxa" w:w="120"/>
-              <w:left w:type="dxa" w:w="160"/>
-              <w:bottom w:type="dxa" w:w="120"/>
-              <w:right w:type="dxa" w:w="160"/>
-            </w:tcMar>
-          </w:tcPr>
-          <w:p>
-            <w:pPr>
-              <w:spacing w:line="240" w:lineRule="auto"/>
-              <w:jc w:val="left"/>
-            </w:pPr>
-            <w:r>
-              <w:rPr>
-                <w:rFonts w:ascii="Arial" w:cs="Arial" w:eastAsia="Arial" w:hAnsi="Arial"/>
-                <w:b w:val="false"/>
-                <w:bCs w:val="false"/>
-                <w:sz w:val="20"/>
-                <w:szCs w:val="20"/>
-              </w:rPr>
-              <w:t xml:space="preserve">1.00 – 1.80</w:t>
-            </w:r>
-          </w:p>
-        </w:tc>
-        <w:tc>
-          <w:tcPr>
-            <w:tcW w:type="dxa" w:w="4809"/>
-            <w:tcBorders>
-              <w:top w:val="single" w:color="E2E8F0" w:sz="4"/>
-              <w:left w:val="none" w:color="auto" w:sz="0"/>
-              <w:bottom w:val="single" w:color="1A202C" w:sz="12"/>
-              <w:right w:val="none" w:color="auto" w:sz="0"/>
-            </w:tcBorders>
-            <w:tcMar>
-              <w:top w:type="dxa" w:w="120"/>
-              <w:left w:type="dxa" w:w="160"/>
-              <w:bottom w:type="dxa" w:w="120"/>
-              <w:right w:type="dxa" w:w="160"/>
-            </w:tcMar>
-          </w:tcPr>
-          <w:p>
-            <w:pPr>
-              <w:spacing w:line="240" w:lineRule="auto"/>
-              <w:jc w:val="left"/>
-            </w:pPr>
-            <w:r>
-              <w:rPr>
-                <w:rFonts w:ascii="Arial" w:cs="Arial" w:eastAsia="Arial" w:hAnsi="Arial"/>
-                <w:b w:val="false"/>
-                <w:bCs w:val="false"/>
-                <w:sz w:val="20"/>
-                <w:szCs w:val="20"/>
-              </w:rPr>
-              <w:t xml:space="preserve">Very Low Quality</w:t>
-            </w:r>
-          </w:p>
-        </w:tc>
-      </w:tr>
-    </w:tbl>
-    <w:p>
-      <w:pPr>
-        <w:spacing w:after="240" w:before="120" w:line="480" w:lineRule="auto"/>
-      </w:pPr>
     </w:p>
     <w:p>
       <w:pPr>
@@ -26491,7 +23038,7 @@
           <w:sz w:val="24"/>
           <w:szCs w:val="24"/>
         </w:rPr>
-        <w:t xml:space="preserve">, which Table 13 reads as </w:t>
+        <w:t xml:space="preserve">, which Table 4A reads as </w:t>
       </w:r>
       <w:r>
         <w:rPr>

</xml_diff>